<commit_message>
Reorder authors and corresponding emails
</commit_message>
<xml_diff>
--- a/paper/Revon_Final_Research_Paper.docx
+++ b/paper/Revon_Final_Research_Paper.docx
@@ -28,7 +28,24 @@
           <w:color w:val="000000"/>
           <w:sz w:val="24"/>
         </w:rPr>
-        <w:t>[Adhyan Jain]</w:t>
+        <w:t>[Atharva Sheersh Pandey]</w:t>
+      </w:r>
+      <w:r>
+        <w:rPr>
+          <w:rFonts w:ascii="Times New Roman" w:hAnsi="Times New Roman" w:eastAsia="Times New Roman" w:cs="Times New Roman"/>
+          <w:color w:val="000000"/>
+          <w:sz w:val="16"/>
+          <w:vertAlign w:val="superscript"/>
+        </w:rPr>
+        <w:t>1</w:t>
+      </w:r>
+      <w:r>
+        <w:rPr>
+          <w:rFonts w:ascii="Times New Roman" w:hAnsi="Times New Roman" w:eastAsia="Times New Roman" w:cs="Times New Roman"/>
+          <w:color w:val="000000"/>
+          <w:sz w:val="24"/>
+        </w:rPr>
+        <w:t>, [Adhyan Jain]</w:t>
       </w:r>
       <w:r>
         <w:rPr>
@@ -56,23 +73,6 @@
         </w:rPr>
         <w:t>2</w:t>
       </w:r>
-      <w:r>
-        <w:rPr>
-          <w:rFonts w:ascii="Times New Roman" w:hAnsi="Times New Roman" w:eastAsia="Times New Roman" w:cs="Times New Roman"/>
-          <w:color w:val="000000"/>
-          <w:sz w:val="24"/>
-        </w:rPr>
-        <w:t>, [Atharva Sheersh Pandey]</w:t>
-      </w:r>
-      <w:r>
-        <w:rPr>
-          <w:rFonts w:ascii="Times New Roman" w:hAnsi="Times New Roman" w:eastAsia="Times New Roman" w:cs="Times New Roman"/>
-          <w:color w:val="000000"/>
-          <w:sz w:val="16"/>
-          <w:vertAlign w:val="superscript"/>
-        </w:rPr>
-        <w:t>1</w:t>
-      </w:r>
     </w:p>
     <w:p>
       <w:pPr>
@@ -89,7 +89,7 @@
             <w:sz w:val="21"/>
             <w:u w:val="none"/>
           </w:rPr>
-          <w:t>adhyan.jain2024@vitstudent.ac.in</w:t>
+          <w:t>atharva.sheersh2024@vitstudent.ac.in</w:t>
         </w:r>
       </w:hyperlink>
       <w:r>
@@ -108,7 +108,7 @@
             <w:sz w:val="21"/>
             <w:u w:val="none"/>
           </w:rPr>
-          <w:t>atharva.sheersh2024@vitstudent.ac.in</w:t>
+          <w:t>adhyan.jain2024@vitstudent.ac.in</w:t>
         </w:r>
       </w:hyperlink>
       <w:r>

</xml_diff>

<commit_message>
Finalize Revon paper and repository structure
</commit_message>
<xml_diff>
--- a/paper/Revon_Final_Research_Paper.docx
+++ b/paper/Revon_Final_Research_Paper.docx
@@ -28,7 +28,7 @@
           <w:color w:val="000000"/>
           <w:sz w:val="24"/>
         </w:rPr>
-        <w:t>[Atharva Sheersh Pandey]</w:t>
+        <w:t>Atharva Sheersh Pandey</w:t>
       </w:r>
       <w:r>
         <w:rPr>
@@ -45,7 +45,7 @@
           <w:color w:val="000000"/>
           <w:sz w:val="24"/>
         </w:rPr>
-        <w:t>, [Adhyan Jain]</w:t>
+        <w:t>, Adhyan Jain</w:t>
       </w:r>
       <w:r>
         <w:rPr>
@@ -62,7 +62,7 @@
           <w:color w:val="000000"/>
           <w:sz w:val="24"/>
         </w:rPr>
-        <w:t>, [Poornima Nedunchezhian]</w:t>
+        <w:t>, Poornima Nedunchezhian</w:t>
       </w:r>
       <w:r>
         <w:rPr>
@@ -251,7 +251,7 @@
             <w:color w:val="0000FF"/>
             <w:u w:val="none"/>
           </w:rPr>
-          <w:t>[7]</w:t>
+          <w:t>[1]</w:t>
         </w:r>
       </w:hyperlink>
       <w:r>
@@ -297,7 +297,7 @@
             <w:color w:val="0000FF"/>
             <w:u w:val="none"/>
           </w:rPr>
-          <w:t>[8]</w:t>
+          <w:t>[2]</w:t>
         </w:r>
       </w:hyperlink>
       <w:r>
@@ -313,7 +313,7 @@
             <w:color w:val="0000FF"/>
             <w:u w:val="none"/>
           </w:rPr>
-          <w:t>[9]</w:t>
+          <w:t>[3]</w:t>
         </w:r>
       </w:hyperlink>
       <w:r>
@@ -504,7 +504,7 @@
             <w:color w:val="0000FF"/>
             <w:u w:val="none"/>
           </w:rPr>
-          <w:t>[13]</w:t>
+          <w:t>[4]</w:t>
         </w:r>
       </w:hyperlink>
       <w:r>
@@ -520,7 +520,7 @@
             <w:color w:val="0000FF"/>
             <w:u w:val="none"/>
           </w:rPr>
-          <w:t>[10]</w:t>
+          <w:t>[5]</w:t>
         </w:r>
       </w:hyperlink>
       <w:r>
@@ -536,7 +536,7 @@
             <w:color w:val="0000FF"/>
             <w:u w:val="none"/>
           </w:rPr>
-          <w:t>[7]</w:t>
+          <w:t>[1]</w:t>
         </w:r>
       </w:hyperlink>
       <w:r>
@@ -552,7 +552,7 @@
             <w:color w:val="0000FF"/>
             <w:u w:val="none"/>
           </w:rPr>
-          <w:t>[4]</w:t>
+          <w:t>[6]</w:t>
         </w:r>
       </w:hyperlink>
       <w:r>
@@ -583,7 +583,7 @@
             <w:color w:val="0000FF"/>
             <w:u w:val="none"/>
           </w:rPr>
-          <w:t>[3]</w:t>
+          <w:t>[7]</w:t>
         </w:r>
       </w:hyperlink>
       <w:r>
@@ -599,7 +599,7 @@
             <w:color w:val="0000FF"/>
             <w:u w:val="none"/>
           </w:rPr>
-          <w:t>[14]</w:t>
+          <w:t>[8]</w:t>
         </w:r>
       </w:hyperlink>
       <w:r>
@@ -644,7 +644,7 @@
             <w:color w:val="0000FF"/>
             <w:u w:val="none"/>
           </w:rPr>
-          <w:t>[5]</w:t>
+          <w:t>[9]</w:t>
         </w:r>
       </w:hyperlink>
       <w:r>
@@ -660,7 +660,7 @@
             <w:color w:val="0000FF"/>
             <w:u w:val="none"/>
           </w:rPr>
-          <w:t>[12]</w:t>
+          <w:t>[10]</w:t>
         </w:r>
       </w:hyperlink>
       <w:r>
@@ -692,7 +692,7 @@
             <w:color w:val="0000FF"/>
             <w:u w:val="none"/>
           </w:rPr>
-          <w:t>[6]</w:t>
+          <w:t>[12]</w:t>
         </w:r>
       </w:hyperlink>
       <w:r>
@@ -708,7 +708,7 @@
             <w:color w:val="0000FF"/>
             <w:u w:val="none"/>
           </w:rPr>
-          <w:t>[1]</w:t>
+          <w:t>[13]</w:t>
         </w:r>
       </w:hyperlink>
       <w:r>
@@ -753,7 +753,7 @@
             <w:color w:val="0000FF"/>
             <w:u w:val="none"/>
           </w:rPr>
-          <w:t>[2]</w:t>
+          <w:t>[14]</w:t>
         </w:r>
       </w:hyperlink>
       <w:r>
@@ -785,7 +785,7 @@
             <w:color w:val="0000FF"/>
             <w:u w:val="none"/>
           </w:rPr>
-          <w:t>[8]</w:t>
+          <w:t>[2]</w:t>
         </w:r>
       </w:hyperlink>
       <w:r>
@@ -801,7 +801,7 @@
             <w:color w:val="0000FF"/>
             <w:u w:val="none"/>
           </w:rPr>
-          <w:t>[9]</w:t>
+          <w:t>[3]</w:t>
         </w:r>
       </w:hyperlink>
       <w:r>
@@ -981,7 +981,7 @@
                 <w:color w:val="000000"/>
                 <w:sz w:val="18"/>
               </w:rPr>
-              <w:t>Persistent DS [10]</w:t>
+              <w:t>Persistent DS [5]</w:t>
             </w:r>
           </w:p>
         </w:tc>
@@ -1094,7 +1094,7 @@
                 <w:color w:val="000000"/>
                 <w:sz w:val="18"/>
               </w:rPr>
-              <w:t>Git [7]</w:t>
+              <w:t>Git [1]</w:t>
             </w:r>
           </w:p>
         </w:tc>
@@ -1207,7 +1207,7 @@
                 <w:color w:val="000000"/>
                 <w:sz w:val="18"/>
               </w:rPr>
-              <w:t>IPFS [4]</w:t>
+              <w:t>IPFS [6]</w:t>
             </w:r>
           </w:p>
         </w:tc>
@@ -1320,7 +1320,7 @@
                 <w:color w:val="000000"/>
                 <w:sz w:val="18"/>
               </w:rPr>
-              <w:t>MST [3]</w:t>
+              <w:t>MST [7]</w:t>
             </w:r>
           </w:p>
         </w:tc>
@@ -1433,7 +1433,7 @@
                 <w:color w:val="000000"/>
                 <w:sz w:val="18"/>
               </w:rPr>
-              <w:t>DataHub [5]</w:t>
+              <w:t>DataHub [9]</w:t>
             </w:r>
           </w:p>
         </w:tc>
@@ -1546,7 +1546,7 @@
                 <w:color w:val="000000"/>
                 <w:sz w:val="18"/>
               </w:rPr>
-              <w:t>Decibel [12]</w:t>
+              <w:t>Decibel [10]</w:t>
             </w:r>
           </w:p>
         </w:tc>
@@ -1772,7 +1772,7 @@
                 <w:color w:val="000000"/>
                 <w:sz w:val="18"/>
               </w:rPr>
-              <w:t>Delta Lake [1]</w:t>
+              <w:t>Delta Lake [13]</w:t>
             </w:r>
           </w:p>
         </w:tc>
@@ -1885,7 +1885,7 @@
                 <w:color w:val="000000"/>
                 <w:sz w:val="18"/>
               </w:rPr>
-              <w:t>Noms [2]</w:t>
+              <w:t>Noms [14]</w:t>
             </w:r>
           </w:p>
         </w:tc>
@@ -2111,7 +2111,7 @@
                 <w:color w:val="000000"/>
                 <w:sz w:val="18"/>
               </w:rPr>
-              <w:t>DoltHub [8,9]</w:t>
+              <w:t>DoltHub [2,3]</w:t>
             </w:r>
           </w:p>
         </w:tc>
@@ -2237,7 +2237,7 @@
             <w:color w:val="0000FF"/>
             <w:u w:val="none"/>
           </w:rPr>
-          <w:t>[10]</w:t>
+          <w:t>[5]</w:t>
         </w:r>
       </w:hyperlink>
       <w:r>
@@ -2253,7 +2253,7 @@
             <w:color w:val="0000FF"/>
             <w:u w:val="none"/>
           </w:rPr>
-          <w:t>[6]</w:t>
+          <w:t>[12]</w:t>
         </w:r>
       </w:hyperlink>
       <w:r>
@@ -2263,13 +2263,13 @@
         </w:rPr>
         <w:t xml:space="preserve"> makes this trade-off explicit. Decibel and OrpheusDB likewise show that one physical layout does not dominate scans, version retrieval, and storage for every branching workload </w:t>
       </w:r>
-      <w:hyperlink w:anchor="ref_orpheus" w:history="1">
+      <w:hyperlink w:anchor="ref_decibel" w:history="1">
         <w:r>
           <w:rPr>
             <w:color w:val="0000FF"/>
             <w:u w:val="none"/>
           </w:rPr>
-          <w:t>[11]</w:t>
+          <w:t>[10]</w:t>
         </w:r>
       </w:hyperlink>
       <w:r>
@@ -2279,13 +2279,13 @@
         </w:rPr>
         <w:t xml:space="preserve">, </w:t>
       </w:r>
-      <w:hyperlink w:anchor="ref_decibel" w:history="1">
+      <w:hyperlink w:anchor="ref_orpheus" w:history="1">
         <w:r>
           <w:rPr>
             <w:color w:val="0000FF"/>
             <w:u w:val="none"/>
           </w:rPr>
-          <w:t>[12]</w:t>
+          <w:t>[11]</w:t>
         </w:r>
       </w:hyperlink>
       <w:r>
@@ -2316,7 +2316,7 @@
             <w:color w:val="0000FF"/>
             <w:u w:val="none"/>
           </w:rPr>
-          <w:t>[3]</w:t>
+          <w:t>[7]</w:t>
         </w:r>
       </w:hyperlink>
       <w:r>
@@ -2332,7 +2332,7 @@
             <w:color w:val="0000FF"/>
             <w:u w:val="none"/>
           </w:rPr>
-          <w:t>[2]</w:t>
+          <w:t>[14]</w:t>
         </w:r>
       </w:hyperlink>
       <w:r>
@@ -2348,7 +2348,7 @@
             <w:color w:val="0000FF"/>
             <w:u w:val="none"/>
           </w:rPr>
-          <w:t>[9]</w:t>
+          <w:t>[3]</w:t>
         </w:r>
       </w:hyperlink>
       <w:r>
@@ -5446,7 +5446,7 @@
           <w:rFonts w:ascii="Times New Roman" w:hAnsi="Times New Roman" w:eastAsia="Times New Roman" w:cs="Times New Roman"/>
           <w:color w:val="000000"/>
         </w:rPr>
-        <w:t>All 45 sensitivity trials were correct. The b8-d3 configuration delivered the lowest median diff latency (20.15 ms versus 44.43 ms for b8-d4) and compared 84.3% fewer node pairs, but consumed 61.2% more storage and examined three times as many leaf entries. The current b8-d4 default used the least storage (4.27 MiB). The over-deep b8-d5 design was slower for every timed operation and used 44.8% more storage. Thus b8-d4 is a storage-conscious balanced default, not a universal optimum.</w:t>
+        <w:t>All 45 sensitivity trials were correct. The b8-d3 configuration delivered the lowest median diff latency (36.09 ms versus 52.65 ms for b8-d4) and compared 84.3% fewer node pairs, but consumed 61.9% more storage and examined three times as many leaf entries. The current b8-d4 default used the least storage (4.26 MiB). The over-deep b8-d5 design was slower for every timed operation and used 44.9% more storage. Thus b8-d4 is a storage-conscious balanced default, not a universal optimum.</w:t>
       </w:r>
     </w:p>
     <w:p>
@@ -5786,7 +5786,7 @@
       </w:r>
     </w:p>
     <w:p>
-      <w:bookmarkStart w:id="1" w:name="ref_delta"/>
+      <w:bookmarkStart w:id="1" w:name="ref_git"/>
       <w:pPr>
         <w:pStyle w:val="IEEEReference"/>
         <w:widowControl/>
@@ -5796,12 +5796,12 @@
           <w:rFonts w:ascii="Times New Roman" w:hAnsi="Times New Roman" w:eastAsia="Times New Roman" w:cs="Times New Roman"/>
           <w:color w:val="000000"/>
         </w:rPr>
-        <w:t>[1] Michael Armbrust et al. 2020. Delta Lake: High-Performance ACID Table Storage over Cloud Object Stores. Proceedings of the VLDB Endowment, 13(12):3411-3424. doi:10.14778/3415478.3415560.</w:t>
+        <w:t>[1] Scott Chacon and Ben Straub. 2014. Git Internals - Git Objects. In Pro Git, 2nd edition. https://git-scm.com/book/en/v2/Git-Internals-Git-Objects.</w:t>
       </w:r>
       <w:bookmarkEnd w:id="1"/>
     </w:p>
     <w:p>
-      <w:bookmarkStart w:id="2" w:name="ref_noms"/>
+      <w:bookmarkStart w:id="2" w:name="ref_dolt_block"/>
       <w:pPr>
         <w:pStyle w:val="IEEEReference"/>
         <w:widowControl/>
@@ -5811,12 +5811,12 @@
           <w:rFonts w:ascii="Times New Roman" w:hAnsi="Times New Roman" w:eastAsia="Times New Roman" w:cs="Times New Roman"/>
           <w:color w:val="000000"/>
         </w:rPr>
-        <w:t>[2] Attic Labs. n.d. Noms technical overview. GitHub. https://github.com/attic-labs/noms/blob/master/doc/intro.md.</w:t>
+        <w:t>[2] DoltHub. 2024. Dolt Storage Engine: Block Store. Dolt Documentation. https://www.dolthub.com/docs/architecture/storage-engine/block-store/.</w:t>
       </w:r>
       <w:bookmarkEnd w:id="2"/>
     </w:p>
     <w:p>
-      <w:bookmarkStart w:id="3" w:name="ref_mst"/>
+      <w:bookmarkStart w:id="3" w:name="ref_dolt_prolly"/>
       <w:pPr>
         <w:pStyle w:val="IEEEReference"/>
         <w:widowControl/>
@@ -5826,12 +5826,12 @@
           <w:rFonts w:ascii="Times New Roman" w:hAnsi="Times New Roman" w:eastAsia="Times New Roman" w:cs="Times New Roman"/>
           <w:color w:val="000000"/>
         </w:rPr>
-        <w:t>[3] Alex Auvolat and Francois Taiani. 2019. Merkle Search Trees: Efficient State-Based CRDTs in Open Networks. 38th IEEE International Symposium on Reliable Distributed Systems, pages 1-10. doi:10.1109/SRDS47363.2019.00032.</w:t>
+        <w:t>[3] Tim Sehn. 2024. Dolt's Storage Engine. DoltHub Blog, February 29, 2024. https://www.dolthub.com/blog/2024-02-29-storage-engine/.</w:t>
       </w:r>
       <w:bookmarkEnd w:id="3"/>
     </w:p>
     <w:p>
-      <w:bookmarkStart w:id="4" w:name="ref_ipfs"/>
+      <w:bookmarkStart w:id="4" w:name="ref_merkle"/>
       <w:pPr>
         <w:pStyle w:val="IEEEReference"/>
         <w:widowControl/>
@@ -5841,12 +5841,12 @@
           <w:rFonts w:ascii="Times New Roman" w:hAnsi="Times New Roman" w:eastAsia="Times New Roman" w:cs="Times New Roman"/>
           <w:color w:val="000000"/>
         </w:rPr>
-        <w:t>[4] Juan Benet. 2014. IPFS - Content Addressed, Versioned, P2P File System. arXiv:1407.3561.</w:t>
+        <w:t>[4] Ralph C. Merkle. 1988. A Digital Signature Based on a Conventional Encryption Function. In Advances in Cryptology - CRYPTO '87, LNCS 293, pages 369-378. doi:10.1007/3-540-48184-2_32.</w:t>
       </w:r>
       <w:bookmarkEnd w:id="4"/>
     </w:p>
     <w:p>
-      <w:bookmarkStart w:id="5" w:name="ref_datahub"/>
+      <w:bookmarkStart w:id="5" w:name="ref_persistent"/>
       <w:pPr>
         <w:pStyle w:val="IEEEReference"/>
         <w:widowControl/>
@@ -5856,12 +5856,12 @@
           <w:rFonts w:ascii="Times New Roman" w:hAnsi="Times New Roman" w:eastAsia="Times New Roman" w:cs="Times New Roman"/>
           <w:color w:val="000000"/>
         </w:rPr>
-        <w:t>[5] Anant Bhardwaj, Souvik Bhattacherjee, Amit Chavan, Amol Deshpande, Aaron J. Elmore, Samuel Madden, and Aditya G. Parameswaran. 2015. DataHub: Collaborative Data Science and Dataset Version Management at Scale. 7th Biennial Conference on Innovative Data Systems Research.</w:t>
+        <w:t>[5] James R. Driscoll, Neil Sarnak, Daniel D. Sleator, and Robert E. Tarjan. 1989. Making Data Structures Persistent. Journal of Computer and System Sciences, 38(1):86-124. doi:10.1016/0022-0000(89)90034-2.</w:t>
       </w:r>
       <w:bookmarkEnd w:id="5"/>
     </w:p>
     <w:p>
-      <w:bookmarkStart w:id="6" w:name="ref_versioning"/>
+      <w:bookmarkStart w:id="6" w:name="ref_ipfs"/>
       <w:pPr>
         <w:pStyle w:val="IEEEReference"/>
         <w:widowControl/>
@@ -5871,12 +5871,12 @@
           <w:rFonts w:ascii="Times New Roman" w:hAnsi="Times New Roman" w:eastAsia="Times New Roman" w:cs="Times New Roman"/>
           <w:color w:val="000000"/>
         </w:rPr>
-        <w:t>[6] Souvik Bhattacherjee, Amit Chavan, Silu Huang, Amol Deshpande, and Aditya Parameswaran. 2015. Principles of Dataset Versioning: Exploring the Recreation/Storage Tradeoff. Proceedings of the VLDB Endowment, 8(12):1346-1357. doi:10.14778/2824032.2824035.</w:t>
+        <w:t>[6] Juan Benet. 2014. IPFS - Content Addressed, Versioned, P2P File System. arXiv:1407.3561.</w:t>
       </w:r>
       <w:bookmarkEnd w:id="6"/>
     </w:p>
     <w:p>
-      <w:bookmarkStart w:id="7" w:name="ref_git"/>
+      <w:bookmarkStart w:id="7" w:name="ref_mst"/>
       <w:pPr>
         <w:pStyle w:val="IEEEReference"/>
         <w:widowControl/>
@@ -5886,12 +5886,12 @@
           <w:rFonts w:ascii="Times New Roman" w:hAnsi="Times New Roman" w:eastAsia="Times New Roman" w:cs="Times New Roman"/>
           <w:color w:val="000000"/>
         </w:rPr>
-        <w:t>[7] Scott Chacon and Ben Straub. 2014. Git Internals - Git Objects. In Pro Git, 2nd edition. https://git-scm.com/book/en/v2/Git-Internals-Git-Objects.</w:t>
+        <w:t>[7] Alex Auvolat and François Taïani. 2019. Merkle Search Trees: Efficient State-Based CRDTs in Open Networks. 38th IEEE International Symposium on Reliable Distributed Systems, pages 221-230. doi:10.1109/SRDS47363.2019.00032.</w:t>
       </w:r>
       <w:bookmarkEnd w:id="7"/>
     </w:p>
     <w:p>
-      <w:bookmarkStart w:id="8" w:name="ref_dolt_block"/>
+      <w:bookmarkStart w:id="8" w:name="ref_lbfs"/>
       <w:pPr>
         <w:pStyle w:val="IEEEReference"/>
         <w:widowControl/>
@@ -5901,12 +5901,12 @@
           <w:rFonts w:ascii="Times New Roman" w:hAnsi="Times New Roman" w:eastAsia="Times New Roman" w:cs="Times New Roman"/>
           <w:color w:val="000000"/>
         </w:rPr>
-        <w:t>[8] DoltHub. 2024a. Dolt Storage Engine: Block Store. Dolt Documentation. https://www.dolthub.com/docs/architecture/storage-engine/block-store/.</w:t>
+        <w:t>[8] Athicha Muthitacharoen, Benjie Chen, and David Mazières. 2001. A Low-Bandwidth Network File System. Proceedings of the 18th ACM Symposium on Operating Systems Principles, pages 174-187. doi:10.1145/502034.502052.</w:t>
       </w:r>
       <w:bookmarkEnd w:id="8"/>
     </w:p>
     <w:p>
-      <w:bookmarkStart w:id="9" w:name="ref_dolt_prolly"/>
+      <w:bookmarkStart w:id="9" w:name="ref_datahub"/>
       <w:pPr>
         <w:pStyle w:val="IEEEReference"/>
         <w:widowControl/>
@@ -5916,12 +5916,12 @@
           <w:rFonts w:ascii="Times New Roman" w:hAnsi="Times New Roman" w:eastAsia="Times New Roman" w:cs="Times New Roman"/>
           <w:color w:val="000000"/>
         </w:rPr>
-        <w:t>[9] DoltHub. 2024b. Dolt's Storage Engine: Prolly Trees and Commit Graph. https://www.dolthub.com/blog/2024-02-29-storage-engine/.</w:t>
+        <w:t>[9] Anant Bhardwaj, Souvik Bhattacherjee, Amit Chavan, Amol Deshpande, Aaron J. Elmore, Samuel Madden, and Aditya G. Parameswaran. 2015. DataHub: Collaborative Data Science and Dataset Version Management at Scale. 7th Biennial Conference on Innovative Data Systems Research.</w:t>
       </w:r>
       <w:bookmarkEnd w:id="9"/>
     </w:p>
     <w:p>
-      <w:bookmarkStart w:id="10" w:name="ref_persistent"/>
+      <w:bookmarkStart w:id="10" w:name="ref_decibel"/>
       <w:pPr>
         <w:pStyle w:val="IEEEReference"/>
         <w:widowControl/>
@@ -5931,7 +5931,7 @@
           <w:rFonts w:ascii="Times New Roman" w:hAnsi="Times New Roman" w:eastAsia="Times New Roman" w:cs="Times New Roman"/>
           <w:color w:val="000000"/>
         </w:rPr>
-        <w:t>[10] James R. Driscoll, Neil Sarnak, Daniel D. Sleator, and Robert E. Tarjan. 1989. Making Data Structures Persistent. Journal of Computer and System Sciences, 38(1):86-124. doi:10.1016/0022-0000(89)90034-2.</w:t>
+        <w:t>[10] Michael Maddox, David Goehring, Aaron J. Elmore, Samuel Madden, Aditya G. Parameswaran, and Amol Deshpande. 2016. Decibel: The Relational Dataset Branching System. Proceedings of the VLDB Endowment, 9(9):624-635. doi:10.14778/2947618.2947619.</w:t>
       </w:r>
       <w:bookmarkEnd w:id="10"/>
     </w:p>
@@ -5951,7 +5951,7 @@
       <w:bookmarkEnd w:id="11"/>
     </w:p>
     <w:p>
-      <w:bookmarkStart w:id="12" w:name="ref_decibel"/>
+      <w:bookmarkStart w:id="12" w:name="ref_versioning"/>
       <w:pPr>
         <w:pStyle w:val="IEEEReference"/>
         <w:widowControl/>
@@ -5961,12 +5961,12 @@
           <w:rFonts w:ascii="Times New Roman" w:hAnsi="Times New Roman" w:eastAsia="Times New Roman" w:cs="Times New Roman"/>
           <w:color w:val="000000"/>
         </w:rPr>
-        <w:t>[12] Michael A. Maddox et al. 2016. Decibel: The Relational Dataset Branching System. Proceedings of the VLDB Endowment, 9(9):624-635. doi:10.14778/2947618.2947619.</w:t>
+        <w:t>[12] Souvik Bhattacherjee, Amit Chavan, Silu Huang, Amol Deshpande, and Aditya Parameswaran. 2015. Principles of Dataset Versioning: Exploring the Recreation/Storage Tradeoff. Proceedings of the VLDB Endowment, 8(12):1346-1357. doi:10.14778/2824032.2824035.</w:t>
       </w:r>
       <w:bookmarkEnd w:id="12"/>
     </w:p>
     <w:p>
-      <w:bookmarkStart w:id="13" w:name="ref_merkle"/>
+      <w:bookmarkStart w:id="13" w:name="ref_delta"/>
       <w:pPr>
         <w:pStyle w:val="IEEEReference"/>
         <w:widowControl/>
@@ -5976,12 +5976,12 @@
           <w:rFonts w:ascii="Times New Roman" w:hAnsi="Times New Roman" w:eastAsia="Times New Roman" w:cs="Times New Roman"/>
           <w:color w:val="000000"/>
         </w:rPr>
-        <w:t>[13] Ralph C. Merkle. 1988. A Digital Signature Based on a Conventional Encryption Function. In Advances in Cryptology - CRYPTO '87, LNCS 293, pages 369-378. doi:10.1007/3-540-48184-2_32.</w:t>
+        <w:t>[13] Michael Armbrust et al. 2020. Delta Lake: High-Performance ACID Table Storage over Cloud Object Stores. Proceedings of the VLDB Endowment, 13(12):3411-3424. doi:10.14778/3415478.3415560.</w:t>
       </w:r>
       <w:bookmarkEnd w:id="13"/>
     </w:p>
     <w:p>
-      <w:bookmarkStart w:id="14" w:name="ref_lbfs"/>
+      <w:bookmarkStart w:id="14" w:name="ref_noms"/>
       <w:pPr>
         <w:pStyle w:val="IEEEReference"/>
         <w:widowControl/>
@@ -5991,7 +5991,7 @@
           <w:rFonts w:ascii="Times New Roman" w:hAnsi="Times New Roman" w:eastAsia="Times New Roman" w:cs="Times New Roman"/>
           <w:color w:val="000000"/>
         </w:rPr>
-        <w:t>[14] Athicha Muthitacharoen, Benjie Chen, and David Mazieres. 2001. A Low-Bandwidth Network File System. Proceedings of the 18th ACM Symposium on Operating Systems Principles, pages 174-187. doi:10.1145/502034.502052.</w:t>
+        <w:t>[14] Attic Labs. n.d. Noms technical overview. GitHub. https://github.com/attic-labs/noms/blob/master/doc/intro.md.</w:t>
       </w:r>
       <w:bookmarkEnd w:id="14"/>
     </w:p>
@@ -6036,7 +6036,7 @@
           <w:rFonts w:ascii="Times New Roman" w:hAnsi="Times New Roman" w:eastAsia="Times New Roman" w:cs="Times New Roman"/>
           <w:color w:val="000000"/>
         </w:rPr>
-        <w:t xml:space="preserve">The repository contains the benchmark harness, evidence audit, trie-sensitivity harness, and paper generator. Source code, artifacts, and reproduction instructions are available at </w:t>
+        <w:t xml:space="preserve">The repository contains the benchmark harness, evidence audit, trie-sensitivity harness, and manuscript-formatting and validation tools. Source code, artifacts, and reproduction instructions are available at </w:t>
       </w:r>
       <w:hyperlink r:id="rId20" w:history="1">
         <w:r>
@@ -6054,7 +6054,7 @@
           <w:rFonts w:ascii="Times New Roman" w:hAnsi="Times New Roman" w:eastAsia="Times New Roman" w:cs="Times New Roman"/>
           <w:color w:val="000000"/>
         </w:rPr>
-        <w:t>. The final evidence bundle is evidence/paper-final-20260824; the sensitivity bundle is evidence/trie-sensitivity-20260824. Results in this paper are generated programmatically from their summary CSV files and verified against raw results and manifests; no table or graph uses an earlier validation export.</w:t>
+        <w:t>. The final evidence bundle is evidence/paper-final-20260824; the sensitivity bundle is evidence/trie-sensitivity-20260824. Tables and figures are produced from the audited summary CSV files and verified against raw results and manifests; no table or graph uses an earlier validation export.</w:t>
       </w:r>
     </w:p>
     <w:p>

</xml_diff>

<commit_message>
paper: convert manuscript to single-column format
</commit_message>
<xml_diff>
--- a/paper/Revon_Final_Research_Paper.docx
+++ b/paper/Revon_Final_Research_Paper.docx
@@ -2419,7 +2419,7 @@
         </w:rPr>
         <w:drawing>
           <wp:inline xmlns:a="http://schemas.openxmlformats.org/drawingml/2006/main" xmlns:pic="http://schemas.openxmlformats.org/drawingml/2006/picture">
-            <wp:extent cx="2706624" cy="1587886"/>
+            <wp:extent cx="5029200" cy="2950464"/>
             <wp:docPr id="1" name="Picture 1" descr="Revon layered architecture showing the frontend, REST API, Revon-H core, SQLite object store, and the research contribution boundary." title="Revon layered architecture showing the frontend, REST API, Revon-H core, SQLite object store, and the research contribution boundary"/>
             <wp:cNvGraphicFramePr>
               <a:graphicFrameLocks noChangeAspect="1"/>
@@ -2440,7 +2440,7 @@
                   <pic:spPr>
                     <a:xfrm>
                       <a:off x="0" y="0"/>
-                      <a:ext cx="2706624" cy="1587886"/>
+                      <a:ext cx="5029200" cy="2950464"/>
                     </a:xfrm>
                     <a:prstGeom prst="rect"/>
                   </pic:spPr>
@@ -2567,7 +2567,7 @@
         </w:rPr>
         <w:drawing>
           <wp:inline xmlns:a="http://schemas.openxmlformats.org/drawingml/2006/main" xmlns:pic="http://schemas.openxmlformats.org/drawingml/2006/picture">
-            <wp:extent cx="2706624" cy="1407444"/>
+            <wp:extent cx="5029200" cy="2615183"/>
             <wp:docPr id="2" name="Picture 2" descr="Incremental commit workflow followed by Revon-H selection between addressed changeset aggregation and hash-pruned Merkle comparison." title="Incremental commit workflow followed by Revon-H selection between addressed changeset aggregation and hash-pruned Merkle comparison"/>
             <wp:cNvGraphicFramePr>
               <a:graphicFrameLocks noChangeAspect="1"/>
@@ -2588,7 +2588,7 @@
                   <pic:spPr>
                     <a:xfrm>
                       <a:off x="0" y="0"/>
-                      <a:ext cx="2706624" cy="1407444"/>
+                      <a:ext cx="5029200" cy="2615183"/>
                     </a:xfrm>
                     <a:prstGeom prst="rect"/>
                   </pic:spPr>
@@ -3909,7 +3909,7 @@
         </w:rPr>
         <w:drawing>
           <wp:inline xmlns:a="http://schemas.openxmlformats.org/drawingml/2006/main" xmlns:pic="http://schemas.openxmlformats.org/drawingml/2006/picture">
-            <wp:extent cx="2706624" cy="1522476"/>
+            <wp:extent cx="5029200" cy="2828925"/>
             <wp:docPr id="3" name="Picture 3" descr="Calibration plot comparing log aggregation and forced-Merkle diff latency across accumulated operation counts, with the frozen 4,096-operation boundary." title="Calibration plot comparing log aggregation and forced-Merkle diff latency across accumulated operation counts, with the frozen 4,096-operation boundary"/>
             <wp:cNvGraphicFramePr>
               <a:graphicFrameLocks noChangeAspect="1"/>
@@ -3930,7 +3930,7 @@
                   <pic:spPr>
                     <a:xfrm>
                       <a:off x="0" y="0"/>
-                      <a:ext cx="2706624" cy="1522476"/>
+                      <a:ext cx="5029200" cy="2828925"/>
                     </a:xfrm>
                     <a:prstGeom prst="rect"/>
                   </pic:spPr>
@@ -4013,7 +4013,7 @@
         </w:rPr>
         <w:drawing>
           <wp:inline xmlns:a="http://schemas.openxmlformats.org/drawingml/2006/main" xmlns:pic="http://schemas.openxmlformats.org/drawingml/2006/picture">
-            <wp:extent cx="2578608" cy="1465735"/>
+            <wp:extent cx="5029200" cy="2858703"/>
             <wp:docPr id="4" name="Picture 4" descr="Log-scale grouped bar chart of final median diff latency with interquartile whiskers for Snapshot, Log-only, Revon-M, Revon-H, and Dolt across five workloads." title="Log-scale grouped bar chart of final median diff latency with interquartile whiskers for Snapshot, Log-only, Revon-M, Revon-H, and Dolt across five workloads"/>
             <wp:cNvGraphicFramePr>
               <a:graphicFrameLocks noChangeAspect="1"/>
@@ -4034,7 +4034,7 @@
                   <pic:spPr>
                     <a:xfrm>
                       <a:off x="0" y="0"/>
-                      <a:ext cx="2578608" cy="1465735"/>
+                      <a:ext cx="5029200" cy="2858703"/>
                     </a:xfrm>
                     <a:prstGeom prst="rect"/>
                   </pic:spPr>
@@ -4050,6 +4050,7 @@
         <w:pStyle w:val="Caption"/>
         <w:keepNext w:val="0"/>
         <w:widowControl/>
+        <w:spacing w:before="80"/>
       </w:pPr>
       <w:r>
         <w:rPr>
@@ -5283,7 +5284,7 @@
         </w:rPr>
         <w:drawing>
           <wp:inline xmlns:a="http://schemas.openxmlformats.org/drawingml/2006/main" xmlns:pic="http://schemas.openxmlformats.org/drawingml/2006/picture">
-            <wp:extent cx="2706624" cy="1396048"/>
+            <wp:extent cx="5029200" cy="2594008"/>
             <wp:docPr id="5" name="Picture 5" descr="Two-panel log-scale chart comparing Revon-H and Dolt median incremental commit and historical checkout latency with interquartile whiskers." title="Two-panel log-scale chart comparing Revon-H and Dolt median incremental commit and historical checkout latency with interquartile whiskers"/>
             <wp:cNvGraphicFramePr>
               <a:graphicFrameLocks noChangeAspect="1"/>
@@ -5304,7 +5305,7 @@
                   <pic:spPr>
                     <a:xfrm>
                       <a:off x="0" y="0"/>
-                      <a:ext cx="2706624" cy="1396048"/>
+                      <a:ext cx="5029200" cy="2594008"/>
                     </a:xfrm>
                     <a:prstGeom prst="rect"/>
                   </pic:spPr>
@@ -5388,7 +5389,7 @@
         </w:rPr>
         <w:drawing>
           <wp:inline xmlns:a="http://schemas.openxmlformats.org/drawingml/2006/main" xmlns:pic="http://schemas.openxmlformats.org/drawingml/2006/picture">
-            <wp:extent cx="2706624" cy="1522476"/>
+            <wp:extent cx="5029200" cy="2828925"/>
             <wp:docPr id="6" name="Picture 6" descr="Scatter plot of forced-Merkle median diff latency against repository storage for five branching-factor and depth configurations, highlighting b8-d4." title="Scatter plot of forced-Merkle median diff latency against repository storage for five branching-factor and depth configurations, highlighting b8-d4"/>
             <wp:cNvGraphicFramePr>
               <a:graphicFrameLocks noChangeAspect="1"/>
@@ -5409,7 +5410,7 @@
                   <pic:spPr>
                     <a:xfrm>
                       <a:off x="0" y="0"/>
-                      <a:ext cx="2706624" cy="1522476"/>
+                      <a:ext cx="5029200" cy="2828925"/>
                     </a:xfrm>
                     <a:prstGeom prst="rect"/>
                   </pic:spPr>
@@ -5425,6 +5426,7 @@
         <w:pStyle w:val="Caption"/>
         <w:keepNext w:val="0"/>
         <w:widowControl/>
+        <w:spacing w:before="80"/>
       </w:pPr>
       <w:r>
         <w:rPr>
@@ -6064,7 +6066,7 @@
           <w:type w:val="continuous"/>
           <w:pgSz w:w="11906" w:h="16838"/>
           <w:pgMar w:top="1440" w:right="1440" w:bottom="1440" w:left="1440" w:header="432" w:footer="504" w:gutter="0"/>
-          <w:cols w:num="2" w:space="346" w:equalWidth="1"/>
+          <w:cols w:num="1" w:space="346" w:equalWidth="1"/>
           <w:docGrid w:linePitch="360"/>
         </w:sectPr>
       </w:pPr>

</xml_diff>

<commit_message>
paper: fit figures to single-column layout
</commit_message>
<xml_diff>
--- a/paper/Revon_Final_Research_Paper.docx
+++ b/paper/Revon_Final_Research_Paper.docx
@@ -3909,7 +3909,7 @@
         </w:rPr>
         <w:drawing>
           <wp:inline xmlns:a="http://schemas.openxmlformats.org/drawingml/2006/main" xmlns:pic="http://schemas.openxmlformats.org/drawingml/2006/picture">
-            <wp:extent cx="5029200" cy="2828925"/>
+            <wp:extent cx="4800600" cy="2700338"/>
             <wp:docPr id="3" name="Picture 3" descr="Calibration plot comparing log aggregation and forced-Merkle diff latency across accumulated operation counts, with the frozen 4,096-operation boundary." title="Calibration plot comparing log aggregation and forced-Merkle diff latency across accumulated operation counts, with the frozen 4,096-operation boundary"/>
             <wp:cNvGraphicFramePr>
               <a:graphicFrameLocks noChangeAspect="1"/>
@@ -3930,7 +3930,7 @@
                   <pic:spPr>
                     <a:xfrm>
                       <a:off x="0" y="0"/>
-                      <a:ext cx="5029200" cy="2828925"/>
+                      <a:ext cx="4800600" cy="2700338"/>
                     </a:xfrm>
                     <a:prstGeom prst="rect"/>
                   </pic:spPr>
@@ -4013,7 +4013,7 @@
         </w:rPr>
         <w:drawing>
           <wp:inline xmlns:a="http://schemas.openxmlformats.org/drawingml/2006/main" xmlns:pic="http://schemas.openxmlformats.org/drawingml/2006/picture">
-            <wp:extent cx="5029200" cy="2858703"/>
+            <wp:extent cx="4800600" cy="2728762"/>
             <wp:docPr id="4" name="Picture 4" descr="Log-scale grouped bar chart of final median diff latency with interquartile whiskers for Snapshot, Log-only, Revon-M, Revon-H, and Dolt across five workloads." title="Log-scale grouped bar chart of final median diff latency with interquartile whiskers for Snapshot, Log-only, Revon-M, Revon-H, and Dolt across five workloads"/>
             <wp:cNvGraphicFramePr>
               <a:graphicFrameLocks noChangeAspect="1"/>
@@ -4034,7 +4034,7 @@
                   <pic:spPr>
                     <a:xfrm>
                       <a:off x="0" y="0"/>
-                      <a:ext cx="5029200" cy="2858703"/>
+                      <a:ext cx="4800600" cy="2728762"/>
                     </a:xfrm>
                     <a:prstGeom prst="rect"/>
                   </pic:spPr>
@@ -5284,7 +5284,7 @@
         </w:rPr>
         <w:drawing>
           <wp:inline xmlns:a="http://schemas.openxmlformats.org/drawingml/2006/main" xmlns:pic="http://schemas.openxmlformats.org/drawingml/2006/picture">
-            <wp:extent cx="5029200" cy="2594008"/>
+            <wp:extent cx="5120640" cy="2641172"/>
             <wp:docPr id="5" name="Picture 5" descr="Two-panel log-scale chart comparing Revon-H and Dolt median incremental commit and historical checkout latency with interquartile whiskers." title="Two-panel log-scale chart comparing Revon-H and Dolt median incremental commit and historical checkout latency with interquartile whiskers"/>
             <wp:cNvGraphicFramePr>
               <a:graphicFrameLocks noChangeAspect="1"/>
@@ -5305,7 +5305,7 @@
                   <pic:spPr>
                     <a:xfrm>
                       <a:off x="0" y="0"/>
-                      <a:ext cx="5029200" cy="2594008"/>
+                      <a:ext cx="5120640" cy="2641172"/>
                     </a:xfrm>
                     <a:prstGeom prst="rect"/>
                   </pic:spPr>
@@ -5389,7 +5389,7 @@
         </w:rPr>
         <w:drawing>
           <wp:inline xmlns:a="http://schemas.openxmlformats.org/drawingml/2006/main" xmlns:pic="http://schemas.openxmlformats.org/drawingml/2006/picture">
-            <wp:extent cx="5029200" cy="2828925"/>
+            <wp:extent cx="4800600" cy="2700338"/>
             <wp:docPr id="6" name="Picture 6" descr="Scatter plot of forced-Merkle median diff latency against repository storage for five branching-factor and depth configurations, highlighting b8-d4." title="Scatter plot of forced-Merkle median diff latency against repository storage for five branching-factor and depth configurations, highlighting b8-d4"/>
             <wp:cNvGraphicFramePr>
               <a:graphicFrameLocks noChangeAspect="1"/>
@@ -5410,7 +5410,7 @@
                   <pic:spPr>
                     <a:xfrm>
                       <a:off x="0" y="0"/>
-                      <a:ext cx="5029200" cy="2828925"/>
+                      <a:ext cx="4800600" cy="2700338"/>
                     </a:xfrm>
                     <a:prstGeom prst="rect"/>
                   </pic:spPr>

</xml_diff>

<commit_message>
docs(paper): publish corrected claims and final artifacts
Update repository guidance to point at the audited 540-execution evidence and retain older bundles as historical records. Revise the final manuscript's ratios, uncertainty, storage, workload, and generalization boundaries; regenerate the DOCX and 11-page PDF. Add maintenance scripts for the corrected text and layout.

Ignore the author's local all-issues recheck note and generated evidence .work directories; keep the requested recheck document on disk but out of Git.
</commit_message>
<xml_diff>
--- a/paper/Revon_Final_Research_Paper.docx
+++ b/paper/Revon_Final_Research_Paper.docx
@@ -178,7 +178,7 @@
           <w:rFonts w:eastAsia="Times New Roman" w:cs="Times New Roman"/>
           <w:sz w:val="20"/>
         </w:rPr>
-        <w:t>Versioning structured datasets requires durable history, efficient sparse updates, historical reconstruction, and comparison without copying or scanning every record. Revon is a Python prototype built around an immutable fixed-depth Merkle hash trie. A commit rewrites only affected leaf buckets and the union of their ancestor paths; unchanged subtrees are reused by content hash. Revon-H adds addressed changesets and selects between log aggregation and hash-pruned tree differencing using a separately calibrated threshold. We evaluate Snapshot, Log-only, forced-Merkle Revon-M, Revon-H, and Dolt 2.3.1 on identical deterministic workloads up to 100,000 rows. The audited paper run contains 333 successful and correct trials. Under the CLI-facing protocol, Revon-H diff latency was 5.8x to 554.2x lower than Dolt and its incremental commit latency was 2.3x to 37.4x lower, while Revon-H consumed 1.83x to 6.43x more repository storage. Against forced Merkle, the hybrid log path reduced median sparse or hot diff latency by 6.0x to 10.0x. A five-configuration sensitivity study shows that the current b=8, d=4 trie minimizes storage in the tested set, whereas b=8, d=3 favors latency. The results support a workload-dependent hybrid design, not universal superiority over a production SQL system.</w:t>
+        <w:t>Versioning structured datasets requires durable history, efficient sparse updates, historical reconstruction, and comparison without copying every record. Revon is a Python prototype built around an immutable fixed-depth Merkle hash trie; Revon-H adds addressed changesets and adaptively selects log aggregation or hash-pruned differencing. We evaluate Snapshot, Log-only, forced-Merkle Revon-M, Revon-H, and Dolt 2.3.1 on deterministic workloads up to 100,000 rows. The primary run contains 540 executions. Across eight workloads, median paired Dolt/Revon-H diff ratios range from 7.14 to 625.10; all seven-trial 95% bootstrap intervals favor Revon-H latency in this tested workflow. A separate three-seed study across payload sizes, history lengths, and update patterns finds the 50-commit result inconclusive. These measurements compare the declared workflows on one Windows host and WSL2 on the same physical computer. They support a workload-dependent prototype design, not general or production-level superiority.</w:t>
       </w:r>
     </w:p>
     <w:p>
@@ -258,7 +258,7 @@
         <w:rPr>
           <w:rFonts w:eastAsia="Times New Roman" w:cs="Times New Roman"/>
         </w:rPr>
-        <w:t>. Revon is not presented as a feature replacement for Dolt. The comparison instead identifies the performance and storage trade-offs of a smaller instrumentable mechanism under a reproducible CLI-facing protocol.</w:t>
+        <w:t>. Revon is not presented as a feature replacement for Dolt. The comparison measures a smaller in-process Python prototype against a Dolt CLI workflow and does not isolate their tree algorithms.</w:t>
       </w:r>
     </w:p>
     <w:p>
@@ -358,7 +358,7 @@
         <w:rPr>
           <w:rFonts w:eastAsia="Times New Roman" w:cs="Times New Roman"/>
         </w:rPr>
-        <w:t>A five-variant benchmark with shared deterministic workloads, correctness oracles, Dolt integration, raw evidence, and an independently audited summary.</w:t>
+        <w:t>A five-system benchmark with shared deterministic workloads, common canonical diff and checkout outputs, two separately reported Dolt initial-import workflows, balanced randomized execution order, external process-tree RSS sampling, raw evidence, and an internal evidence-integrity audit.</w:t>
       </w:r>
     </w:p>
     <w:p>
@@ -2345,7 +2345,7 @@
         <w:rPr>
           <w:rFonts w:eastAsia="Times New Roman" w:cs="Times New Roman"/>
         </w:rPr>
-        <w:t>Five implementations receive identical logical states and mutation batches: a complete Snapshot per version, an initial state plus operation-log baseline, forced-Merkle Revon-M, adaptive Revon-H, and Dolt 2.3.1 using a keyed SQL table and native diff. Revon-M is not a headline product variant; it isolates the selector.</w:t>
+        <w:t>Five comparison systems receive identical logical states and mutation batches: a complete Snapshot per version, an initial state plus operation-log baseline, forced-Merkle Revon-M, adaptive Revon-H, and Dolt 2.3.1 using a keyed SQL table and native JSON diff. Dolt initial import is tested two ways: batched SQL INSERT and CSV loaded with `dolt table import -r`; CSV serialization is included in the latter workflow's initial-import time. The import variants share the same Dolt engine for later operations, and their import times are kept distinct.</w:t>
       </w:r>
     </w:p>
     <w:tbl>
@@ -3257,7 +3257,7 @@
                 <w:rFonts w:eastAsia="Times New Roman" w:cs="Times New Roman"/>
                 <w:sz w:val="18"/>
               </w:rPr>
-              <w:t>Large hot</w:t>
+              <w:t>Application-key local</w:t>
             </w:r>
           </w:p>
         </w:tc>
@@ -3389,7 +3389,163 @@
                 <w:rFonts w:eastAsia="Times New Roman" w:cs="Times New Roman"/>
                 <w:sz w:val="18"/>
               </w:rPr>
-              <w:t>hot</w:t>
+              <w:t>lexically adjacent keys</w:t>
+            </w:r>
+          </w:p>
+        </w:tc>
+      </w:tr>
+      <w:tr>
+        <w:tc>
+          <w:tcPr>
+            <w:tcW w:type="dxa" w:w="2500"/>
+          </w:tcPr>
+          <w:p>
+            <w:r>
+              <w:t>Range local</w:t>
+            </w:r>
+          </w:p>
+        </w:tc>
+        <w:tc>
+          <w:tcPr>
+            <w:tcW w:type="dxa" w:w="1300"/>
+          </w:tcPr>
+          <w:p>
+            <w:r>
+              <w:t>100,000</w:t>
+            </w:r>
+          </w:p>
+        </w:tc>
+        <w:tc>
+          <w:tcPr>
+            <w:tcW w:type="dxa" w:w="1200"/>
+          </w:tcPr>
+          <w:p>
+            <w:r>
+              <w:t>10</w:t>
+            </w:r>
+          </w:p>
+        </w:tc>
+        <w:tc>
+          <w:tcPr>
+            <w:tcW w:type="dxa" w:w="1700"/>
+          </w:tcPr>
+          <w:p>
+            <w:r>
+              <w:t>100</w:t>
+            </w:r>
+          </w:p>
+        </w:tc>
+        <w:tc>
+          <w:tcPr>
+            <w:tcW w:type="dxa" w:w="1800"/>
+          </w:tcPr>
+          <w:p>
+            <w:r>
+              <w:t>contiguous sorted-key intervals</w:t>
+            </w:r>
+          </w:p>
+        </w:tc>
+      </w:tr>
+      <w:tr>
+        <w:tc>
+          <w:tcPr>
+            <w:tcW w:type="dxa" w:w="2500"/>
+          </w:tcPr>
+          <w:p>
+            <w:r>
+              <w:t>Repeated key</w:t>
+            </w:r>
+          </w:p>
+        </w:tc>
+        <w:tc>
+          <w:tcPr>
+            <w:tcW w:type="dxa" w:w="1300"/>
+          </w:tcPr>
+          <w:p>
+            <w:r>
+              <w:t>100,000</w:t>
+            </w:r>
+          </w:p>
+        </w:tc>
+        <w:tc>
+          <w:tcPr>
+            <w:tcW w:type="dxa" w:w="1200"/>
+          </w:tcPr>
+          <w:p>
+            <w:r>
+              <w:t>10</w:t>
+            </w:r>
+          </w:p>
+        </w:tc>
+        <w:tc>
+          <w:tcPr>
+            <w:tcW w:type="dxa" w:w="1700"/>
+          </w:tcPr>
+          <w:p>
+            <w:r>
+              <w:t>100</w:t>
+            </w:r>
+          </w:p>
+        </w:tc>
+        <w:tc>
+          <w:tcPr>
+            <w:tcW w:type="dxa" w:w="1800"/>
+          </w:tcPr>
+          <w:p>
+            <w:r>
+              <w:t>repeated small key set</w:t>
+            </w:r>
+          </w:p>
+        </w:tc>
+      </w:tr>
+      <w:tr>
+        <w:tc>
+          <w:tcPr>
+            <w:tcW w:type="dxa" w:w="2500"/>
+          </w:tcPr>
+          <w:p>
+            <w:r>
+              <w:t>Hash-route local</w:t>
+            </w:r>
+          </w:p>
+        </w:tc>
+        <w:tc>
+          <w:tcPr>
+            <w:tcW w:type="dxa" w:w="1300"/>
+          </w:tcPr>
+          <w:p>
+            <w:r>
+              <w:t>100,000</w:t>
+            </w:r>
+          </w:p>
+        </w:tc>
+        <w:tc>
+          <w:tcPr>
+            <w:tcW w:type="dxa" w:w="1200"/>
+          </w:tcPr>
+          <w:p>
+            <w:r>
+              <w:t>10</w:t>
+            </w:r>
+          </w:p>
+        </w:tc>
+        <w:tc>
+          <w:tcPr>
+            <w:tcW w:type="dxa" w:w="1700"/>
+          </w:tcPr>
+          <w:p>
+            <w:r>
+              <w:t>100</w:t>
+            </w:r>
+          </w:p>
+        </w:tc>
+        <w:tc>
+          <w:tcPr>
+            <w:tcW w:type="dxa" w:w="1800"/>
+          </w:tcPr>
+          <w:p>
+            <w:r>
+              <w:t>shared 9-bit SHA-256 prefix</w:t>
             </w:r>
           </w:p>
         </w:tc>
@@ -3425,7 +3581,7 @@
         <w:rPr>
           <w:rFonts w:eastAsia="Times New Roman" w:cs="Times New Roman"/>
         </w:rPr>
-        <w:t>Initial import measures creation of the first durable state; incremental commit is the within-trial median across ten durable commits; diff consumes the complete initial-to-final comparison; checkout fully materializes the target version; storage is the sum of regular repository-file bytes. Correctness requires exact initial and final states plus a changed-key oracle. Work examined uses each system's natural unit and is not normalized across keys, operations, and trie-node pairs.</w:t>
+        <w:t>Initial import measures the first durable state; incremental commit is the within-trial median across ten commits; diff and checkout both materialize common outputs inside their timed regions. Diff is sorted changed keys with old/new SHA-256 value hashes encoded as canonical JSON. Checkout is the complete sorted key/value state encoded as canonical UTF-8 JSON. Dolt JSON parsing and normalization are included. Correctness compares the full state and hash contract with the workload oracle. Dolt SQL-path commit timing includes SQL mutation, add, and commit; commit hashes are retained for historical checkout and no version tags are created. Timed operations run without tracemalloc. An external parent process samples process-tree RSS every 10 ms for each isolated trial, including Dolt children; sampling is outside timed operations. Work-examined units differ by system and are not normalized.</w:t>
       </w:r>
     </w:p>
     <w:p>
@@ -3447,14 +3603,12 @@
         <w:rPr>
           <w:rFonts w:eastAsia="Times New Roman" w:cs="Times New Roman"/>
         </w:rPr>
-        <w:t>Before measurement, each configuration runs twice without contributing samples. The next seven trials are recorded, using base seed 20260822. For every adapter we regenerate the workload and compare its SHA-256 digest with the manifest before execution. Calibration uses a separate workload set. Reported medians and quartiles exclude warmups. The recorded run identifier is 7048cc1674dc4038a8e42c87818b9088; it was produced on Windows-11-10.0.26200-SP0 with Py</w:t>
+        <w:t>The primary matrix has two warm-ups and seven measured trials per configuration: 120 warm-ups and 420 measured runs across calibration and evaluation. The primary five-system evaluation contains 280 measured runs, including 56 SQL-path Dolt runs; 56 additional measured runs use Dolt bulk import. Model order is counterbalanced and recorded. Each system/trial runs in a clean worker. The primary run reuses one deterministic workload per scenario, regenerated and digest-checked by the internal audit. Run b7a4ec7b610742d9b827f43fd5092fe2 used Windows-11-10.0.26200-SP0 and Python 3.14.3. For each scenario and comparison, latency ratios are formed from matching trial numbers; a 20,000-resample percentile bootstrap of the seven paired ratios supplies a 95% interval. These intervals describe run-to-run variation conditional on the fixed workload and host, not variation across datasets or machines. Intervals that include parity are classified as inconclusive; a 5% practical margin is used as an analyst-selected label, not as an external standard.</w:t>
       </w:r>
       <w:r>
         <w:rPr>
           <w:rFonts w:eastAsia="Times New Roman" w:cs="Times New Roman"/>
         </w:rPr>
-        <w:lastRenderedPageBreak/>
-        <w:t>thon 3.14.3. A separate audit rebuilt the trial matrix from the raw CSV and recalculated every summary value.</w:t>
       </w:r>
     </w:p>
     <w:p>
@@ -3522,7 +3676,7 @@
         <w:rPr>
           <w:rFonts w:eastAsia="Times New Roman" w:cs="Times New Roman"/>
         </w:rPr>
-        <w:t>The boundary is a frozen policy for this machine, not proof that the true crossover is exactly 4,096. All 333 paper-profile rows completed with status ok and correctness true. The audit retained all 83 Tukey outlier candidates; no observation was manually deleted.</w:t>
+        <w:t>The 4,096-operation boundary is a frozen policy for this machine, not a universal crossover. All 540 primary executions completed successfully and passed state and diff checks. The audit retained all 127 Tukey outlier candidates; no observation was deleted. A separate sensitivity run varies seed, payload size, history length, and update pattern; it is kept separate from the primary tables.</w:t>
       </w:r>
     </w:p>
     <w:p>
@@ -3628,13 +3782,11 @@
         <w:rPr>
           <w:rFonts w:eastAsia="Times New Roman" w:cs="Times New Roman"/>
         </w:rPr>
-        <w:t>Figure 4: Final diff latency from the audited CSV bundle; lower is better.</w:t>
+        <w:t>Figure 4: Diff latency across eight scenarios, including separate application-key, range, repeated-key, and hash-route update locality; lower is better.</w:t>
       </w:r>
     </w:p>
     <w:p>
-      <w:r>
-        <w:br w:type="page"/>
-      </w:r>
+      <w:r/>
     </w:p>
     <w:tbl>
       <w:tblPr>
@@ -3644,11 +3796,11 @@
         <w:tblLook w:val="04A0" w:firstRow="1" w:lastRow="0" w:firstColumn="1" w:lastColumn="0" w:noHBand="0" w:noVBand="1"/>
       </w:tblPr>
       <w:tblGrid>
-        <w:gridCol w:w="2500"/>
-        <w:gridCol w:w="1250"/>
-        <w:gridCol w:w="1450"/>
-        <w:gridCol w:w="1700"/>
-        <w:gridCol w:w="1600"/>
+        <w:gridCol w:w="2246"/>
+        <w:gridCol w:w="936"/>
+        <w:gridCol w:w="1368"/>
+        <w:gridCol w:w="1584"/>
+        <w:gridCol w:w="2088"/>
       </w:tblGrid>
       <w:tr>
         <w:trPr>
@@ -3658,7 +3810,7 @@
         </w:trPr>
         <w:tc>
           <w:tcPr>
-            <w:tcW w:w="2500" w:type="dxa"/>
+            <w:tcW w:w="2246" w:type="dxa"/>
             <w:tcBorders>
               <w:top w:val="single" w:sz="6" w:space="0" w:color="000000"/>
               <w:left w:val="nil"/>
@@ -3693,7 +3845,7 @@
         </w:tc>
         <w:tc>
           <w:tcPr>
-            <w:tcW w:w="1250" w:type="dxa"/>
+            <w:tcW w:w="936" w:type="dxa"/>
             <w:tcBorders>
               <w:top w:val="single" w:sz="6" w:space="0" w:color="000000"/>
               <w:left w:val="nil"/>
@@ -3727,7 +3879,7 @@
         </w:tc>
         <w:tc>
           <w:tcPr>
-            <w:tcW w:w="1450" w:type="dxa"/>
+            <w:tcW w:w="1368" w:type="dxa"/>
             <w:tcBorders>
               <w:top w:val="single" w:sz="6" w:space="0" w:color="000000"/>
               <w:left w:val="nil"/>
@@ -3761,7 +3913,7 @@
         </w:tc>
         <w:tc>
           <w:tcPr>
-            <w:tcW w:w="1700" w:type="dxa"/>
+            <w:tcW w:w="1584" w:type="dxa"/>
             <w:tcBorders>
               <w:top w:val="single" w:sz="6" w:space="0" w:color="000000"/>
               <w:left w:val="nil"/>
@@ -3795,7 +3947,7 @@
         </w:tc>
         <w:tc>
           <w:tcPr>
-            <w:tcW w:w="1600" w:type="dxa"/>
+            <w:tcW w:w="2088" w:type="dxa"/>
             <w:tcBorders>
               <w:top w:val="single" w:sz="6" w:space="0" w:color="000000"/>
               <w:left w:val="nil"/>
@@ -3823,7 +3975,7 @@
                 <w:b/>
                 <w:sz w:val="18"/>
               </w:rPr>
-              <w:t>Ratio</w:t>
+              <w:t>Dolt/H ratio [95% CI]</w:t>
             </w:r>
           </w:p>
         </w:tc>
@@ -3835,7 +3987,7 @@
         </w:trPr>
         <w:tc>
           <w:tcPr>
-            <w:tcW w:w="2500" w:type="dxa"/>
+            <w:tcW w:w="2246" w:type="dxa"/>
             <w:tcBorders>
               <w:top w:val="nil"/>
               <w:left w:val="nil"/>
@@ -3868,7 +4020,7 @@
         </w:tc>
         <w:tc>
           <w:tcPr>
-            <w:tcW w:w="1250" w:type="dxa"/>
+            <w:tcW w:w="936" w:type="dxa"/>
             <w:tcBorders>
               <w:top w:val="nil"/>
               <w:left w:val="nil"/>
@@ -3901,7 +4053,7 @@
         </w:tc>
         <w:tc>
           <w:tcPr>
-            <w:tcW w:w="1450" w:type="dxa"/>
+            <w:tcW w:w="1368" w:type="dxa"/>
             <w:tcBorders>
               <w:top w:val="nil"/>
               <w:left w:val="nil"/>
@@ -3928,13 +4080,13 @@
                 <w:rFonts w:eastAsia="Times New Roman" w:cs="Times New Roman"/>
                 <w:sz w:val="18"/>
               </w:rPr>
-              <w:t>0.417</w:t>
+              <w:t>0.659</w:t>
             </w:r>
           </w:p>
         </w:tc>
         <w:tc>
           <w:tcPr>
-            <w:tcW w:w="1700" w:type="dxa"/>
+            <w:tcW w:w="1584" w:type="dxa"/>
             <w:tcBorders>
               <w:top w:val="nil"/>
               <w:left w:val="nil"/>
@@ -3961,13 +4113,13 @@
                 <w:rFonts w:eastAsia="Times New Roman" w:cs="Times New Roman"/>
                 <w:sz w:val="18"/>
               </w:rPr>
-              <w:t>188.91</w:t>
+              <w:t>411.69</w:t>
             </w:r>
           </w:p>
         </w:tc>
         <w:tc>
           <w:tcPr>
-            <w:tcW w:w="1600" w:type="dxa"/>
+            <w:tcW w:w="2088" w:type="dxa"/>
             <w:tcBorders>
               <w:top w:val="nil"/>
               <w:left w:val="nil"/>
@@ -3992,9 +4144,9 @@
             <w:r>
               <w:rPr>
                 <w:rFonts w:eastAsia="Times New Roman" w:cs="Times New Roman"/>
-                <w:sz w:val="18"/>
+                <w:sz w:val="16"/>
               </w:rPr>
-              <w:t>453.3x</w:t>
+              <w:t>625.1 (537.1-658.7)</w:t>
             </w:r>
           </w:p>
         </w:tc>
@@ -4006,7 +4158,7 @@
         </w:trPr>
         <w:tc>
           <w:tcPr>
-            <w:tcW w:w="2500" w:type="dxa"/>
+            <w:tcW w:w="2246" w:type="dxa"/>
             <w:tcBorders>
               <w:top w:val="nil"/>
               <w:left w:val="nil"/>
@@ -4039,7 +4191,7 @@
         </w:tc>
         <w:tc>
           <w:tcPr>
-            <w:tcW w:w="1250" w:type="dxa"/>
+            <w:tcW w:w="936" w:type="dxa"/>
             <w:tcBorders>
               <w:top w:val="nil"/>
               <w:left w:val="nil"/>
@@ -4072,7 +4224,7 @@
         </w:tc>
         <w:tc>
           <w:tcPr>
-            <w:tcW w:w="1450" w:type="dxa"/>
+            <w:tcW w:w="1368" w:type="dxa"/>
             <w:tcBorders>
               <w:top w:val="nil"/>
               <w:left w:val="nil"/>
@@ -4099,13 +4251,13 @@
                 <w:rFonts w:eastAsia="Times New Roman" w:cs="Times New Roman"/>
                 <w:sz w:val="18"/>
               </w:rPr>
-              <w:t>0.553</w:t>
+              <w:t>0.814</w:t>
             </w:r>
           </w:p>
         </w:tc>
         <w:tc>
           <w:tcPr>
-            <w:tcW w:w="1700" w:type="dxa"/>
+            <w:tcW w:w="1584" w:type="dxa"/>
             <w:tcBorders>
               <w:top w:val="nil"/>
               <w:left w:val="nil"/>
@@ -4132,13 +4284,13 @@
                 <w:rFonts w:eastAsia="Times New Roman" w:cs="Times New Roman"/>
                 <w:sz w:val="18"/>
               </w:rPr>
-              <w:t>306.47</w:t>
+              <w:t>503.31</w:t>
             </w:r>
           </w:p>
         </w:tc>
         <w:tc>
           <w:tcPr>
-            <w:tcW w:w="1600" w:type="dxa"/>
+            <w:tcW w:w="2088" w:type="dxa"/>
             <w:tcBorders>
               <w:top w:val="nil"/>
               <w:left w:val="nil"/>
@@ -4163,9 +4315,9 @@
             <w:r>
               <w:rPr>
                 <w:rFonts w:eastAsia="Times New Roman" w:cs="Times New Roman"/>
-                <w:sz w:val="18"/>
+                <w:sz w:val="16"/>
               </w:rPr>
-              <w:t>554.2x</w:t>
+              <w:t>482.5 (393.4-652.0)</w:t>
             </w:r>
           </w:p>
         </w:tc>
@@ -4177,7 +4329,7 @@
         </w:trPr>
         <w:tc>
           <w:tcPr>
-            <w:tcW w:w="2500" w:type="dxa"/>
+            <w:tcW w:w="2246" w:type="dxa"/>
             <w:tcBorders>
               <w:top w:val="nil"/>
               <w:left w:val="nil"/>
@@ -4210,7 +4362,7 @@
         </w:tc>
         <w:tc>
           <w:tcPr>
-            <w:tcW w:w="1250" w:type="dxa"/>
+            <w:tcW w:w="936" w:type="dxa"/>
             <w:tcBorders>
               <w:top w:val="nil"/>
               <w:left w:val="nil"/>
@@ -4243,7 +4395,7 @@
         </w:tc>
         <w:tc>
           <w:tcPr>
-            <w:tcW w:w="1450" w:type="dxa"/>
+            <w:tcW w:w="1368" w:type="dxa"/>
             <w:tcBorders>
               <w:top w:val="nil"/>
               <w:left w:val="nil"/>
@@ -4270,13 +4422,13 @@
                 <w:rFonts w:eastAsia="Times New Roman" w:cs="Times New Roman"/>
                 <w:sz w:val="18"/>
               </w:rPr>
-              <w:t>56.496</w:t>
+              <w:t>50.391</w:t>
             </w:r>
           </w:p>
         </w:tc>
         <w:tc>
           <w:tcPr>
-            <w:tcW w:w="1700" w:type="dxa"/>
+            <w:tcW w:w="1584" w:type="dxa"/>
             <w:tcBorders>
               <w:top w:val="nil"/>
               <w:left w:val="nil"/>
@@ -4303,13 +4455,13 @@
                 <w:rFonts w:eastAsia="Times New Roman" w:cs="Times New Roman"/>
                 <w:sz w:val="18"/>
               </w:rPr>
-              <w:t>326.01</w:t>
+              <w:t>488.42</w:t>
             </w:r>
           </w:p>
         </w:tc>
         <w:tc>
           <w:tcPr>
-            <w:tcW w:w="1600" w:type="dxa"/>
+            <w:tcW w:w="2088" w:type="dxa"/>
             <w:tcBorders>
               <w:top w:val="nil"/>
               <w:left w:val="nil"/>
@@ -4334,9 +4486,9 @@
             <w:r>
               <w:rPr>
                 <w:rFonts w:eastAsia="Times New Roman" w:cs="Times New Roman"/>
-                <w:sz w:val="18"/>
+                <w:sz w:val="16"/>
               </w:rPr>
-              <w:t>5.8x</w:t>
+              <w:t>10.3 (9.0-10.8)</w:t>
             </w:r>
           </w:p>
         </w:tc>
@@ -4348,7 +4500,7 @@
         </w:trPr>
         <w:tc>
           <w:tcPr>
-            <w:tcW w:w="2500" w:type="dxa"/>
+            <w:tcW w:w="2246" w:type="dxa"/>
             <w:tcBorders>
               <w:top w:val="nil"/>
               <w:left w:val="nil"/>
@@ -4381,7 +4533,7 @@
         </w:tc>
         <w:tc>
           <w:tcPr>
-            <w:tcW w:w="1250" w:type="dxa"/>
+            <w:tcW w:w="936" w:type="dxa"/>
             <w:tcBorders>
               <w:top w:val="nil"/>
               <w:left w:val="nil"/>
@@ -4414,7 +4566,7 @@
         </w:tc>
         <w:tc>
           <w:tcPr>
-            <w:tcW w:w="1450" w:type="dxa"/>
+            <w:tcW w:w="1368" w:type="dxa"/>
             <w:tcBorders>
               <w:top w:val="nil"/>
               <w:left w:val="nil"/>
@@ -4441,13 +4593,13 @@
                 <w:rFonts w:eastAsia="Times New Roman" w:cs="Times New Roman"/>
                 <w:sz w:val="18"/>
               </w:rPr>
-              <w:t>3.082</w:t>
+              <w:t>46.834</w:t>
             </w:r>
           </w:p>
         </w:tc>
         <w:tc>
           <w:tcPr>
-            <w:tcW w:w="1700" w:type="dxa"/>
+            <w:tcW w:w="1584" w:type="dxa"/>
             <w:tcBorders>
               <w:top w:val="nil"/>
               <w:left w:val="nil"/>
@@ -4474,13 +4626,13 @@
                 <w:rFonts w:eastAsia="Times New Roman" w:cs="Times New Roman"/>
                 <w:sz w:val="18"/>
               </w:rPr>
-              <w:t>180.77</w:t>
+              <w:t>483.08</w:t>
             </w:r>
           </w:p>
         </w:tc>
         <w:tc>
           <w:tcPr>
-            <w:tcW w:w="1600" w:type="dxa"/>
+            <w:tcW w:w="2088" w:type="dxa"/>
             <w:tcBorders>
               <w:top w:val="nil"/>
               <w:left w:val="nil"/>
@@ -4505,9 +4657,9 @@
             <w:r>
               <w:rPr>
                 <w:rFonts w:eastAsia="Times New Roman" w:cs="Times New Roman"/>
-                <w:sz w:val="18"/>
+                <w:sz w:val="16"/>
               </w:rPr>
-              <w:t>58.7x</w:t>
+              <w:t>10.8 (8.2-12.4)</w:t>
             </w:r>
           </w:p>
         </w:tc>
@@ -4519,7 +4671,7 @@
         </w:trPr>
         <w:tc>
           <w:tcPr>
-            <w:tcW w:w="2500" w:type="dxa"/>
+            <w:tcW w:w="2246" w:type="dxa"/>
             <w:tcBorders>
               <w:top w:val="nil"/>
               <w:left w:val="nil"/>
@@ -4546,13 +4698,13 @@
                 <w:rFonts w:eastAsia="Times New Roman" w:cs="Times New Roman"/>
                 <w:sz w:val="18"/>
               </w:rPr>
-              <w:t>Large hot</w:t>
+              <w:t>Application-key local</w:t>
             </w:r>
           </w:p>
         </w:tc>
         <w:tc>
           <w:tcPr>
-            <w:tcW w:w="1250" w:type="dxa"/>
+            <w:tcW w:w="936" w:type="dxa"/>
             <w:tcBorders>
               <w:top w:val="nil"/>
               <w:left w:val="nil"/>
@@ -4585,7 +4737,7 @@
         </w:tc>
         <w:tc>
           <w:tcPr>
-            <w:tcW w:w="1450" w:type="dxa"/>
+            <w:tcW w:w="1368" w:type="dxa"/>
             <w:tcBorders>
               <w:top w:val="nil"/>
               <w:left w:val="nil"/>
@@ -4612,13 +4764,13 @@
                 <w:rFonts w:eastAsia="Times New Roman" w:cs="Times New Roman"/>
                 <w:sz w:val="18"/>
               </w:rPr>
-              <w:t>2.031</w:t>
+              <w:t>39.361</w:t>
             </w:r>
           </w:p>
         </w:tc>
         <w:tc>
           <w:tcPr>
-            <w:tcW w:w="1700" w:type="dxa"/>
+            <w:tcW w:w="1584" w:type="dxa"/>
             <w:tcBorders>
               <w:top w:val="nil"/>
               <w:left w:val="nil"/>
@@ -4645,13 +4797,13 @@
                 <w:rFonts w:eastAsia="Times New Roman" w:cs="Times New Roman"/>
                 <w:sz w:val="18"/>
               </w:rPr>
-              <w:t>182.41</w:t>
+              <w:t>289.87</w:t>
             </w:r>
           </w:p>
         </w:tc>
         <w:tc>
           <w:tcPr>
-            <w:tcW w:w="1600" w:type="dxa"/>
+            <w:tcW w:w="2088" w:type="dxa"/>
             <w:tcBorders>
               <w:top w:val="nil"/>
               <w:left w:val="nil"/>
@@ -4676,9 +4828,174 @@
             <w:r>
               <w:rPr>
                 <w:rFonts w:eastAsia="Times New Roman" w:cs="Times New Roman"/>
-                <w:sz w:val="18"/>
+                <w:sz w:val="16"/>
               </w:rPr>
-              <w:t>89.8x</w:t>
+              <w:t>7.1 (6.8-9.8)</w:t>
+            </w:r>
+          </w:p>
+        </w:tc>
+      </w:tr>
+      <w:tr>
+        <w:tc>
+          <w:tcPr>
+            <w:tcW w:type="dxa" w:w="2246"/>
+          </w:tcPr>
+          <w:p>
+            <w:r>
+              <w:t>Range local</w:t>
+            </w:r>
+          </w:p>
+        </w:tc>
+        <w:tc>
+          <w:tcPr>
+            <w:tcW w:type="dxa" w:w="936"/>
+          </w:tcPr>
+          <w:p>
+            <w:r>
+              <w:t>log</w:t>
+            </w:r>
+          </w:p>
+        </w:tc>
+        <w:tc>
+          <w:tcPr>
+            <w:tcW w:type="dxa" w:w="1368"/>
+          </w:tcPr>
+          <w:p>
+            <w:r>
+              <w:t>41.359</w:t>
+            </w:r>
+          </w:p>
+        </w:tc>
+        <w:tc>
+          <w:tcPr>
+            <w:tcW w:type="dxa" w:w="1584"/>
+          </w:tcPr>
+          <w:p>
+            <w:r>
+              <w:t>325.04</w:t>
+            </w:r>
+          </w:p>
+        </w:tc>
+        <w:tc>
+          <w:tcPr>
+            <w:tcW w:type="dxa" w:w="2088"/>
+          </w:tcPr>
+          <w:p>
+            <w:r>
+              <w:rPr>
+                <w:sz w:val="16"/>
+              </w:rPr>
+              <w:t>7.8 (6.8-11.2)</w:t>
+            </w:r>
+          </w:p>
+        </w:tc>
+      </w:tr>
+      <w:tr>
+        <w:tc>
+          <w:tcPr>
+            <w:tcW w:type="dxa" w:w="2246"/>
+          </w:tcPr>
+          <w:p>
+            <w:r>
+              <w:t>Repeated key</w:t>
+            </w:r>
+          </w:p>
+        </w:tc>
+        <w:tc>
+          <w:tcPr>
+            <w:tcW w:type="dxa" w:w="936"/>
+          </w:tcPr>
+          <w:p>
+            <w:r>
+              <w:t>log</w:t>
+            </w:r>
+          </w:p>
+        </w:tc>
+        <w:tc>
+          <w:tcPr>
+            <w:tcW w:type="dxa" w:w="1368"/>
+          </w:tcPr>
+          <w:p>
+            <w:r>
+              <w:t>1.992</w:t>
+            </w:r>
+          </w:p>
+        </w:tc>
+        <w:tc>
+          <w:tcPr>
+            <w:tcW w:type="dxa" w:w="1584"/>
+          </w:tcPr>
+          <w:p>
+            <w:r>
+              <w:t>293.72</w:t>
+            </w:r>
+          </w:p>
+        </w:tc>
+        <w:tc>
+          <w:tcPr>
+            <w:tcW w:type="dxa" w:w="2088"/>
+          </w:tcPr>
+          <w:p>
+            <w:r>
+              <w:rPr>
+                <w:sz w:val="16"/>
+              </w:rPr>
+              <w:t>141.6 (109.5-173.2)</w:t>
+            </w:r>
+          </w:p>
+        </w:tc>
+      </w:tr>
+      <w:tr>
+        <w:tc>
+          <w:tcPr>
+            <w:tcW w:type="dxa" w:w="2246"/>
+          </w:tcPr>
+          <w:p>
+            <w:r>
+              <w:t>Hash-route local</w:t>
+            </w:r>
+          </w:p>
+        </w:tc>
+        <w:tc>
+          <w:tcPr>
+            <w:tcW w:type="dxa" w:w="936"/>
+          </w:tcPr>
+          <w:p>
+            <w:r>
+              <w:t>log</w:t>
+            </w:r>
+          </w:p>
+        </w:tc>
+        <w:tc>
+          <w:tcPr>
+            <w:tcW w:type="dxa" w:w="1368"/>
+          </w:tcPr>
+          <w:p>
+            <w:r>
+              <w:t>2.620</w:t>
+            </w:r>
+          </w:p>
+        </w:tc>
+        <w:tc>
+          <w:tcPr>
+            <w:tcW w:type="dxa" w:w="1584"/>
+          </w:tcPr>
+          <w:p>
+            <w:r>
+              <w:t>278.22</w:t>
+            </w:r>
+          </w:p>
+        </w:tc>
+        <w:tc>
+          <w:tcPr>
+            <w:tcW w:type="dxa" w:w="2088"/>
+          </w:tcPr>
+          <w:p>
+            <w:r>
+              <w:rPr>
+                <w:sz w:val="16"/>
+              </w:rPr>
+              <w:t>102.4 (97.5-104.0)</w:t>
             </w:r>
           </w:p>
         </w:tc>
@@ -4692,7 +5009,7 @@
         <w:rPr>
           <w:rFonts w:eastAsia="Times New Roman" w:cs="Times New Roman"/>
         </w:rPr>
-        <w:t>Table 3: Revon-H versus Dolt median diff latency.</w:t>
+        <w:t>Table 3: Revon-H versus SQL-path Dolt diff latency; the final column reports the median paired trial ratio and percentile-bootstrap 95% interval.</w:t>
       </w:r>
     </w:p>
     <w:p>
@@ -4700,7 +5017,7 @@
         <w:rPr>
           <w:rFonts w:eastAsia="Times New Roman" w:cs="Times New Roman"/>
         </w:rPr>
-        <w:t>Revon-H selected log for the four sparse or hot workloads and Merkle for the 10,000-operation medium-dense workload. Relative to Dolt, its median diff was 5.8x lower in medium-dense and 58.7x to 554.2x lower in the other workloads. These ratios include repeated Dolt CLI and SQL invocation costs and therefore describe the evaluated system protocol, not isolated Prolly Tree algorithm speed.</w:t>
+        <w:t>Across the eight scenarios, every paired Dolt/Revon-H diff ratio is above one and its 95% interval excludes parity, indicating lower Revon-H latency for this tested workflow. Table 3 reports the median of the seven same-trial ratios and its bootstrap interval. This remains an in-process Revon API versus Dolt CLI workflow comparison: Dolt's CLI and SQL costs are included, so the ratios are not engine-only speedups. The lexical-key case is application-key local; range-local, repeated-key, and hash-route-local updates remain distinct workloads.</w:t>
       </w:r>
     </w:p>
     <w:p>
@@ -4722,7 +5039,7 @@
         <w:rPr>
           <w:rFonts w:eastAsia="Times New Roman" w:cs="Times New Roman"/>
         </w:rPr>
-        <w:t>For log-selected workloads, Revon-H reduced median diff latency relative to forced-Merkle Revon-M by 6.0x (small sparse), 8.7x (medium sparse), 8.8x (large sparse), and 10.0x (large hot). In medium-dense, both used Merkle and Revon-H was within 7.3% of the forced variant. This supports the selector's intended mechanism without claiming that its threshold is hardware-independent.</w:t>
+        <w:t>In the primary run, 3 of eight paired Revon-M/Revon-H diff intervals include parity and are inconclusive. A separate robustness matrix covers 10,000 rows, three seeds, 32- and 128-byte values, 10- and 50-commit histories, and spread, range-local, and repeated-key updates. Revon-M/Revon-H diff ratios above one mean Revon-M was slower. On Windows, baseline, 128-byte payload, range-local, and repeated-key ratios were 1.58 [1.23, 1.87], 1.62 [1.38, 1.72], 1.64 [1.38, 1.77], and 2.24 [2.02, 2.38]. The 50-commit interval crossed parity. WSL2 showed the same direction for those four factors and parity overlap for the 50-commit history. The paired ablation is more direct evidence about adaptive selection than cross-system ratios, but this three-seed, one-host sensitivity study does not establish general superiority.</w:t>
       </w:r>
     </w:p>
     <w:p>
@@ -4801,7 +5118,7 @@
         <w:rPr>
           <w:rFonts w:eastAsia="Times New Roman" w:cs="Times New Roman"/>
         </w:rPr>
-        <w:t>Revon-H incremental commit medians were 2.3x to 37.4x lower than Dolt, and checkout medians were 35.8x to 123.4x lower. Initial import was mixed: Revon-H was 4.9x faster for small sparse and 1.14x faster for medium sparse, approximately tied for medium dense, and 2.73x to 2.79x slower at 100,000 rows. The latency advantage is therefore not uniform.</w:t>
+        <w:t>Across all eight scenarios, paired Dolt/Revon-H intervals exclude parity for initial import, incremental commit, diff, and historical checkout. The full paired ratios and intervals are in paired_ratio_uncertainty.csv. Initial-import workflow medians across scenario medians were 1,814.83 ms for batched SQL INSERT, 1,701.25 ms for Dolt bulk import, and 1,131.24 ms for Revon-H. In the paired SQL/bulk-import analysis, four scenario intervals favor bulk import and four include parity; there is no general bulk-import advantage. These are workflow measurements; they do not establish engine-level or production-system superiority.</w:t>
       </w:r>
     </w:p>
     <w:p>
@@ -4809,7 +5126,7 @@
         <w:rPr>
           <w:rFonts w:eastAsia="Times New Roman" w:cs="Times New Roman"/>
         </w:rPr>
-        <w:t>Revon-H paid a consistent storage cost. Its median repository footprint was 1.83x, 3.16x, 2.19x, 4.10x, and 6.43x Dolt's for small sparse through large hot, respectively. The 100,000-row Revon repositories occupied about 34.4 MiB. This reflects inline values, JSON object encoding, and the absence of compact chunk packing and garbage collection.</w:t>
+        <w:t>Repository directory size is a whole-workflow footprint, not normalized algorithm storage. Across the eight scenarios, Revon-H/Dolt repository-footprint ratios ranged from 1.99 to 6.90. Median Revon-H/Dolt ratios after dividing each directory by final UTF-8 logical key/value payload bytes were 3.82; the corresponding residual ratio was 6.82. The residual is not pure metadata: it includes serialization, indexes, metadata, and compression effects. Post-compaction mean footprints for one measured sample per scenario were Revon-M 22.08 MiB, Revon-H 22.08 MiB, Dolt SQL 2.17 MiB, and Dolt bulk import 2.19 MiB. Dolt was compacted offline with `dolt gc` and Revon SQLite repositories with `VACUUM`; compaction time is outside latency and RSS. These are sampled outcomes, not a pure metadata comparison or universal steady-state result.</w:t>
       </w:r>
     </w:p>
     <w:p>
@@ -4882,7 +5199,7 @@
         <w:rPr>
           <w:rFonts w:eastAsia="Times New Roman" w:cs="Times New Roman"/>
         </w:rPr>
-        <w:t>Figure 6: Fixed-trie sensitivity; the preferred point depends on the objective.</w:t>
+        <w:t>Figure 6: Fixed-trie sensitivity; dots show median diff latency, and the axis extends above the largest measured p75.</w:t>
       </w:r>
     </w:p>
     <w:p>
@@ -4890,7 +5207,7 @@
         <w:rPr>
           <w:rFonts w:eastAsia="Times New Roman" w:cs="Times New Roman"/>
         </w:rPr>
-        <w:t>All 45 sensitivity trials were correct. The b8-d3 configuration delivered the lowest median diff latency (36.09 ms versus 52.65 ms for b8-d4) and compared 84.3% fewer node pairs, but consumed 61.9% more storage and examined three times as many leaf entries. The current b8-d4 default used the least storage (4.26 MiB). The over-deep b8-d5 design was slower for every timed operation and used 44.9% more storage. Thus b8-d4 is a storage-conscious balanced default, not a universal optimum.</w:t>
+        <w:t>The corrected fixed-trie sensitivity run contains 45 successful executions: 10 warm-ups and 35 measured runs. b16-d3 had the lowest median diff (21.46 ms) but used 8.12 MiB; b8-d4 measured 26.74 ms and used the least storage (4.26 MiB). The over-deep b8-d5 design measured 33.68 ms for diff and used 44.5% more storage than b8-d4. Thus b8-d4 is a storage-conscious balanced default, not a universal optimum.</w:t>
       </w:r>
     </w:p>
     <w:p>
@@ -4912,7 +5229,7 @@
         <w:rPr>
           <w:rFonts w:eastAsia="Times New Roman" w:cs="Times New Roman"/>
         </w:rPr>
-        <w:t>The results answer RQ1 with a trade-off rather than a single winner. Revon-H offered low diff, commit, and checkout latency under the benchmark interface, but its import advantage disappeared at 100,000 rows and its repository was always larger than Dolt's. Snapshot and Log-only also remain relevant baselines: their simpler representations often reduced import or storage cost. Snapshot comparison, however, grew with the number of materialized keys.</w:t>
+        <w:t>RQ1 shows scenario-dependent workflow latency and storage trade-offs across the declared synthetic update patterns. A separate three-seed sensitivity study found consistent Revon-H diff advantages over the forced-Merkle ablation for four tested factors on Windows and WSL2. The 50-commit case remained inconclusive on both. Lexically adjacent application keys, sorted-range updates, repeated-key updates, and hash-route locality are different update patterns. None of these experiments measures ordered range queries, concurrent reads or writes, or production throughput.</w:t>
       </w:r>
     </w:p>
     <w:p>
@@ -4920,7 +5237,7 @@
         <w:rPr>
           <w:rFonts w:eastAsia="Times New Roman" w:cs="Times New Roman"/>
         </w:rPr>
-        <w:t>RQ2 is supported more directly. Because Revon-H and Revon-M share the same durable trie, their sparse-workload diff gap isolates adaptive selection more cleanly than an absolute comparison with Dolt. The log path avoided thousands of trie comparisons when only 100 or 1,000 operations separated the endpoints; the dense case switched to Merkle.</w:t>
+        <w:t>RQ2 is supported more directly for the tested short and sparse histories: the paired Revon-M/Revon-H ablation shares the durable trie, while the added 50-commit case that crossed the frozen operation boundary showed no resolved difference. This does not establish a universal selector advantage.</w:t>
       </w:r>
     </w:p>
     <w:p>
@@ -4980,8 +5297,7 @@
         <w:rPr>
           <w:rFonts w:eastAsia="Times New Roman" w:cs="Times New Roman"/>
         </w:rPr>
-        <w:lastRenderedPageBreak/>
-        <w:t>Synthetic scope: the deterministic key/value workloads reach 100,000 rows, but cannot represent every real schema, key skew, payload size, or history length.</w:t>
+        <w:t>Synthetic scope: the primary study reaches 100,000 rows; the additional sensitivity study uses 10,000-row flat key-value tables, three seeds, 32- and 128-byte values, 10- and 50-commit histories, and three update patterns. It does not cover alternate schemas, public multi-table datasets, or one-million-row data.</w:t>
       </w:r>
     </w:p>
     <w:p>
@@ -4992,7 +5308,7 @@
         <w:rPr>
           <w:rFonts w:eastAsia="Times New Roman" w:cs="Times New Roman"/>
         </w:rPr>
-        <w:t>Single environment: all results were obtained on one Windows 11 machine, where cache state, scheduling, filesystem behavior, and antivirus activity can affect short measurements.</w:t>
+        <w:t>Environment scope: the primary run used one Windows 11 host. The sensitivity run also used WSL2 Ubuntu on that same physical computer; this checks a second software environment but is not an independent-machine replication.</w:t>
       </w:r>
     </w:p>
     <w:p>
@@ -5014,7 +5330,7 @@
         <w:rPr>
           <w:rFonts w:eastAsia="Times New Roman" w:cs="Times New Roman"/>
         </w:rPr>
-        <w:t>Memory comparability: Python tracemalloc and Dolt process-memory readings are not equivalent, so no cross-system memory graph is reported.</w:t>
+        <w:t>Memory result: Across eight primary-evaluation scenarios, median sampled whole-worker process-tree RSS was collected for Snapshot, Log-only, Revon-M, Revon-H, and SQL-path Dolt. The values include common workload/oracle state and adapter processes, so they are not product-only memory. The parent sampled every 10 ms outside timed operations; peaks shorter than 10 ms may be missed, and the monitor can create small system-level scheduling pressure. Dolt bulk-import rows are not pooled with SQL-path Dolt for this comparison.</w:t>
       </w:r>
     </w:p>
     <w:p>
@@ -5036,7 +5352,7 @@
         <w:rPr>
           <w:rFonts w:eastAsia="Times New Roman" w:cs="Times New Roman"/>
         </w:rPr>
-        <w:t>Outlier policy: all 83 Tukey candidates were kept. Medians and interquartile ranges limit their influence, but seven measured trials do not demonstrate normality.</w:t>
+        <w:t>Uncertainty: all Tukey candidates were retained. The primary seven-trial ratio intervals are paired bootstrap intervals conditional on each fixed scenario. The additional seed-cluster bootstrap used only three seeds. Neither analysis establishes performance over a population of datasets or machines.</w:t>
       </w:r>
     </w:p>
     <w:p>
@@ -5074,38 +5390,29 @@
         <w:rPr>
           <w:rFonts w:eastAsia="Times New Roman" w:cs="Times New Roman"/>
         </w:rPr>
-        <w:t>To move beyond a linear prototype, Revon still needs named branches, merge commits, conflict reporting, schema-aware records, concurrent readers and writers, and remote synchronization. Evaluation should add public structured datasets, one-million-row and longer-history workloads, Linux replication, and unified external process telemetry for time, CPU, I/O, and peak resident memory.</w:t>
+        <w:t>To move beyond a linear prototype, Revon still needs named branches, merge commits, conflict reporting, schema-aware records, concurrent readers and writers, ordered range scans, and remote synchronization. Evaluation still needs public structured datasets, one-million-row workloads, and an independent Linux machine. WSL2 added process-tree CPU sampling and serial commit-operation throughput; its I/O byte counters were not available for every trial and included setup and correctness work, not only the timed database operation. A full cross-system resource study therefore remains open.</w:t>
       </w:r>
     </w:p>
     <w:p>
+      <w:pPr>
+        <w:pStyle w:val="Heading1"/>
+      </w:pPr>
+      <w:r>
+        <w:rPr>
+          <w:rFonts w:ascii="Times New Roman" w:eastAsia="Times New Roman" w:hAnsi="Times New Roman" w:cs="Times New Roman"/>
+        </w:rPr>
+        <w:t>9  Conclusion</w:t>
+      </w:r>
+    </w:p>
+    <w:p>
+      <w:pPr>
+        <w:ind w:firstLine="0"/>
+      </w:pPr>
       <w:r>
         <w:rPr>
           <w:rFonts w:eastAsia="Times New Roman" w:cs="Times New Roman"/>
         </w:rPr>
-        <w:br w:type="page"/>
-      </w:r>
-    </w:p>
-    <w:p>
-      <w:pPr>
-        <w:pStyle w:val="Heading1"/>
-      </w:pPr>
-      <w:r>
-        <w:rPr>
-          <w:rFonts w:ascii="Times New Roman" w:eastAsia="Times New Roman" w:hAnsi="Times New Roman" w:cs="Times New Roman"/>
-        </w:rPr>
-        <w:lastRenderedPageBreak/>
-        <w:t>9  Conclusion</w:t>
-      </w:r>
-    </w:p>
-    <w:p>
-      <w:pPr>
-        <w:ind w:firstLine="0"/>
-      </w:pPr>
-      <w:r>
-        <w:rPr>
-          <w:rFonts w:eastAsia="Times New Roman" w:cs="Times New Roman"/>
-        </w:rPr>
-        <w:t>Revon demonstrates a complete content-addressed versioning path for structured key/value data: canonical immutable objects, incremental copy-on-write Merkle trie updates, atomic SQLite persistence, historical checkout, and adaptive differencing. The audited 333-trial comparison shows that Revon-H can substantially reduce CLI-facing diff, commit, and checkout latency relative to Dolt 2.3.1, but it also exposes slower large imports, higher storage consumption, a narrower feature set, and runtime/interface asymmetry. The ablation supports hybrid log/Merkle selection, while the sensitivity experiment shows that trie geometry must be chosen by workload objective. The defensible contribution is therefore an instrumentable hybrid design and reproducible evidence of its trade-offs, not a claim of universal replacement for a production version-controlled SQL database.</w:t>
+        <w:t>Revon demonstrates a content-addressed versioning path for structured key/value data through immutable objects, incremental Merkle updates, SQLite persistence, historical checkout, and adaptive differencing. Paired intervals and a three-seed sensitivity study support workload-specific differences between Revon-H and the forced-Merkle ablation; the long-history result remains inconclusive. The primary benchmark and follow-up runs do not establish performance across real schemas, public datasets, independent hardware, concurrent workloads, or ordered range queries. These measurements describe a reproducible prototype, not a production-system replacement.</w:t>
       </w:r>
     </w:p>
     <w:p>
@@ -5133,6 +5440,7 @@
     <w:p>
       <w:pPr>
         <w:pStyle w:val="Heading1"/>
+        <w:pageBreakBefore/>
       </w:pPr>
       <w:r>
         <w:rPr>
@@ -5365,12 +5673,13 @@
     <w:p>
       <w:pPr>
         <w:ind w:firstLine="0"/>
+        <w:jc w:val="left"/>
       </w:pPr>
       <w:r>
         <w:rPr>
           <w:rFonts w:eastAsia="Times New Roman" w:cs="Times New Roman"/>
         </w:rPr>
-        <w:t xml:space="preserve">The repository contains the benchmark harness, evidence audit, trie-sensitivity harness, and manuscript-formatting and validation tools. Source code, artifacts, and reproduction instructions are available at </w:t>
+        <w:t xml:space="preserve">The repository contains the benchmark harness, evidence audit, paired-ratio analysis, multi-seed robustness study, and manuscript validation tools. The primary corrected paper-profile bundle is evidence/paper-corrected-issues13-17-counterbalanced-final-20260923. The primary paired ratio intervals are in evidence/paper-corrected-issues13-17-counterbalanced-final-20260923/paired_ratio_uncertainty.csv. The separate Windows and WSL2 sensitivity bundles are evidence/paper-issues18-20-robustness-20260923 and evidence/paper-issues18-20-linux-wsl-20260923; their raw rows, manifests, audits, summaries, and seed-cluster intervals are retained. The trie-sensitivity bundle is evidence/trie-sensitivity-issues8-20260923. These artifacts validate evidence consistency; they do not independently reproduce timings. Project repository: </w:t>
       </w:r>
       <w:hyperlink r:id="rId19" w:history="1">
         <w:r>
@@ -5384,14 +5693,11 @@
         <w:rPr>
           <w:rFonts w:eastAsia="Times New Roman" w:cs="Times New Roman"/>
         </w:rPr>
-        <w:t>. The final evidence bundle is evidence/paper-final-20260824; the sensitivity bundle is evidence/trie-sensitivity-20260824. Tables and figures are pro</w:t>
       </w:r>
       <w:r>
         <w:rPr>
           <w:rFonts w:eastAsia="Times New Roman" w:cs="Times New Roman"/>
         </w:rPr>
-        <w:lastRenderedPageBreak/>
-        <w:t>duced from the audited summary CSV files and verified against raw results and manifests; no table or graph uses an earlier validation export.</w:t>
       </w:r>
     </w:p>
     <w:p>

</xml_diff>

<commit_message>
Add complete Windows telemetry evidence for issue 14
Record the separate 405-row Windows robustness rerun with all correctness checks passing and process-tree RSS, CPU, read/write bytes, and serial commit throughput available on every row. Refresh the experiment and evidence indexes, correction note, and manuscript DOCX/PDF. Clarify that telemetry covers full workflows and does not close cross-platform I/O, concurrency, range-scan, independent-reproduction, or workload-breadth gaps.
</commit_message>
<xml_diff>
--- a/paper/Revon_Final_Research_Paper.docx
+++ b/paper/Revon_Final_Research_Paper.docx
@@ -5387,10 +5387,7 @@
     </w:p>
     <w:p>
       <w:r>
-        <w:rPr>
-          <w:rFonts w:eastAsia="Times New Roman" w:cs="Times New Roman"/>
-        </w:rPr>
-        <w:t>To move beyond a linear prototype, Revon still needs named branches, merge commits, conflict reporting, schema-aware records, concurrent readers and writers, ordered range scans, and remote synchronization. Evaluation still needs public structured datasets, one-million-row workloads, and an independent Linux machine. WSL2 added process-tree CPU sampling and serial commit-operation throughput; its I/O byte counters were not available for every trial and included setup and correctness work, not only the timed database operation. A full cross-system resource study therefore remains open.</w:t>
+        <w:t>To move beyond a linear prototype, Revon still needs named branches, merge commits, conflict reporting, schema-aware records, concurrent readers and writers, ordered range scans, and remote synchronization. Evaluation still needs public structured datasets, one-million-row workloads, and an independent Linux machine. A separate Windows sensitivity run recorded process-tree RSS, CPU, read/write bytes, and serial commit throughput in all 405 rows (90 warm-ups, 315 measured; audit and correctness passed). These workflow totals include setup and correctness checks, not per-operation costs. WSL2 I/O remains incomplete.</w:t>
       </w:r>
     </w:p>
     <w:p>
@@ -5676,28 +5673,7 @@
         <w:jc w:val="left"/>
       </w:pPr>
       <w:r>
-        <w:rPr>
-          <w:rFonts w:eastAsia="Times New Roman" w:cs="Times New Roman"/>
-        </w:rPr>
-        <w:t xml:space="preserve">The repository contains the benchmark harness, evidence audit, paired-ratio analysis, multi-seed robustness study, and manuscript validation tools. The primary corrected paper-profile bundle is evidence/paper-corrected-issues13-17-counterbalanced-final-20260923. The primary paired ratio intervals are in evidence/paper-corrected-issues13-17-counterbalanced-final-20260923/paired_ratio_uncertainty.csv. The separate Windows and WSL2 sensitivity bundles are evidence/paper-issues18-20-robustness-20260923 and evidence/paper-issues18-20-linux-wsl-20260923; their raw rows, manifests, audits, summaries, and seed-cluster intervals are retained. The trie-sensitivity bundle is evidence/trie-sensitivity-issues8-20260923. These artifacts validate evidence consistency; they do not independently reproduce timings. Project repository: </w:t>
-      </w:r>
-      <w:hyperlink r:id="rId19" w:history="1">
-        <w:r>
-          <w:rPr>
-            <w:rFonts w:eastAsia="Times New Roman" w:cs="Times New Roman"/>
-          </w:rPr>
-          <w:t>https://github.com/atharvasheersh/Revon</w:t>
-        </w:r>
-      </w:hyperlink>
-      <w:r>
-        <w:rPr>
-          <w:rFonts w:eastAsia="Times New Roman" w:cs="Times New Roman"/>
-        </w:rPr>
-      </w:r>
-      <w:r>
-        <w:rPr>
-          <w:rFonts w:eastAsia="Times New Roman" w:cs="Times New Roman"/>
-        </w:rPr>
+        <w:t>The repository contains the benchmark harness, evidence audit, paired-ratio analysis, multi-seed robustness study, and manuscript validation tools. The primary corrected paper-profile bundle is evidence/paper-corrected-issues13-17-counterbalanced-final-20260923. The primary paired ratio intervals are in evidence/paper-corrected-issues13-17-counterbalanced-final-20260923/paired_ratio_uncertainty.csv. The Windows and WSL2 sensitivity bundles are evidence/paper-issues18-20-robustness-20260923 and evidence/paper-issues18-20-linux-wsl-20260923; the supplemental Windows telemetry bundle is evidence/paper-issues14-windows-telemetry-20260924. Their raw rows, manifests, audits, summaries, and seed-cluster intervals are retained. The trie-sensitivity bundle is evidence/trie-sensitivity-issues8-20260923. These artifacts validate evidence consistency; they do not independently reproduce timings. Project repository: https://github.com/atharvasheersh/Revon</w:t>
       </w:r>
     </w:p>
     <w:p>

</xml_diff>

<commit_message>
paper: disclose supplemental telemetry and reproduction limits
Update the manuscript methodology with the audited Windows sensitivity telemetry matrix and state that its process totals include setup and correctness work. Clarify that WSL2 I/O coverage is incomplete and neither environment is an independent hardware replication. State directly that no external researcher or clean-clone timing reproduction has been completed. Re-export the 11-page PDF and inspect every rendered page.
</commit_message>
<xml_diff>
--- a/paper/Revon_Final_Research_Paper.docx
+++ b/paper/Revon_Final_Research_Paper.docx
@@ -3581,7 +3581,7 @@
         <w:rPr>
           <w:rFonts w:eastAsia="Times New Roman" w:cs="Times New Roman"/>
         </w:rPr>
-        <w:t>Initial import measures the first durable state; incremental commit is the within-trial median across ten commits; diff and checkout both materialize common outputs inside their timed regions. Diff is sorted changed keys with old/new SHA-256 value hashes encoded as canonical JSON. Checkout is the complete sorted key/value state encoded as canonical UTF-8 JSON. Dolt JSON parsing and normalization are included. Correctness compares the full state and hash contract with the workload oracle. Dolt SQL-path commit timing includes SQL mutation, add, and commit; commit hashes are retained for historical checkout and no version tags are created. Timed operations run without tracemalloc. An external parent process samples process-tree RSS every 10 ms for each isolated trial, including Dolt children; sampling is outside timed operations. Work-examined units differ by system and are not normalized.</w:t>
+        <w:t>Initial import measures the first durable state; incremental commit is the within-trial median across ten commits; diff and checkout both materialize common outputs inside their timed regions. Diff is sorted changed keys with old/new SHA-256 value hashes encoded as canonical JSON. Checkout is the complete sorted key/value state encoded as canonical UTF-8 JSON. Dolt JSON parsing and normalization are included. Correctness compares the full state and hash contract with the workload oracle. Dolt SQL-path commit timing includes SQL mutation, add, and commit; commit hashes are retained for historical checkout and no version tags are created. Timed operations run without tracemalloc. An external parent process samples process-tree RSS every 10 ms for each isolated primary trial, including Dolt children; sampling is outside timed operations. A separate Windows sensitivity telemetry run has 405 rows (315 measured) with RSS, CPU, read/write bytes, and serial commit throughput in every row; all rows passed correctness checks and the schema-2 audit. These counters include setup and correctness work, not only timed operations. The WSL2 replication has incomplete I/O coverage and used the same physical host. Work-examined units differ by system and are not normalized.</w:t>
       </w:r>
     </w:p>
     <w:p>
@@ -5308,7 +5308,7 @@
         <w:rPr>
           <w:rFonts w:eastAsia="Times New Roman" w:cs="Times New Roman"/>
         </w:rPr>
-        <w:t>Environment scope: the primary run used one Windows 11 host. The sensitivity run also used WSL2 Ubuntu on that same physical computer; this checks a second software environment but is not an independent-machine replication.</w:t>
+        <w:t>Environment scope: the primary run used one Windows 11 host. The sensitivity run also used WSL2 Ubuntu on that same physical computer, not an independent Linux machine. No external researcher or clean clone has independently reproduced the timings; the internal audit checks evidence consistency but does not reproduce wall-clock results.</w:t>
       </w:r>
     </w:p>
     <w:p>
@@ -5387,7 +5387,7 @@
     </w:p>
     <w:p>
       <w:r>
-        <w:t>To move beyond a linear prototype, Revon still needs named branches, merge commits, conflict reporting, schema-aware records, concurrent readers and writers, ordered range scans, and remote synchronization. Evaluation still needs public structured datasets, one-million-row workloads, and an independent Linux machine. A separate Windows sensitivity run recorded process-tree RSS, CPU, read/write bytes, and serial commit throughput in all 405 rows (90 warm-ups, 315 measured; audit and correctness passed). These workflow totals include setup and correctness checks, not per-operation costs. WSL2 I/O remains incomplete.</w:t>
+        <w:t>To move beyond a linear prototype, Revon still needs named branches, merge commits, conflict reporting, schema-aware records, concurrent readers and writers, ordered range scans, and remote synchronization. Evaluation still needs public structured datasets, one-million-row workloads, and independent researcher and hardware replications. WSL2 I/O counters remain incomplete; Windows sensitivity counters are workflow-level and do not isolate operation costs.</w:t>
       </w:r>
     </w:p>
     <w:p>

</xml_diff>

<commit_message>
paper: apply IEEE conference layout to final manuscript
Reflow the corrected Revon study into an IEEE-style two-column manuscript with full-width front matter and tables, Roman-numbered sections, IEEE captions, and numeric references. Preserve the bounded workflow-level claims and restore all 15 bibliography anchors.
</commit_message>
<xml_diff>
--- a/paper/Revon_Final_Research_Paper.docx
+++ b/paper/Revon_Final_Research_Paper.docx
@@ -5,60 +5,78 @@
     <w:p>
       <w:pPr>
         <w:pStyle w:val="Title"/>
+        <w:spacing w:before="0" w:after="160"/>
+        <w:jc w:val="center"/>
       </w:pPr>
       <w:r>
         <w:rPr>
-          <w:rFonts w:ascii="Times New Roman" w:eastAsia="Times New Roman" w:hAnsi="Times New Roman" w:cs="Times New Roman"/>
+          <w:rFonts w:ascii="Times New Roman" w:hAnsi="Times New Roman"/>
+          <w:b w:val="0"/>
+          <w:i w:val="0"/>
+          <w:sz w:val="48"/>
         </w:rPr>
-        <w:t>Revon: A Content-Addressed Versioned Data Store: A Git-Inspired Approach to Structured Data Versioning Using Merkle Hash Tries</w:t>
+        <w:t>Revon: Evaluating Hybrid Diffing in a Versioned Key-Value Prototype</w:t>
       </w:r>
     </w:p>
     <w:p>
       <w:pPr>
+        <w:spacing w:before="0" w:after="0" w:line="240" w:lineRule="auto"/>
         <w:ind w:firstLine="0"/>
         <w:jc w:val="center"/>
       </w:pPr>
       <w:r>
         <w:rPr>
-          <w:rFonts w:eastAsia="Times New Roman" w:cs="Times New Roman"/>
-          <w:sz w:val="24"/>
+          <w:rFonts w:eastAsia="Times New Roman" w:cs="Times New Roman" w:ascii="Times New Roman" w:hAnsi="Times New Roman"/>
+          <w:b w:val="0"/>
+          <w:i w:val="0"/>
+          <w:sz w:val="20"/>
         </w:rPr>
         <w:t>Atharva Sheersh Pandey</w:t>
       </w:r>
       <w:r>
         <w:rPr>
-          <w:rFonts w:eastAsia="Times New Roman" w:cs="Times New Roman"/>
-          <w:sz w:val="16"/>
+          <w:rFonts w:eastAsia="Times New Roman" w:cs="Times New Roman" w:ascii="Times New Roman" w:hAnsi="Times New Roman"/>
+          <w:b w:val="0"/>
+          <w:i w:val="0"/>
+          <w:sz w:val="20"/>
           <w:vertAlign w:val="superscript"/>
         </w:rPr>
         <w:t>1</w:t>
       </w:r>
       <w:r>
         <w:rPr>
-          <w:rFonts w:eastAsia="Times New Roman" w:cs="Times New Roman"/>
-          <w:sz w:val="24"/>
+          <w:rFonts w:eastAsia="Times New Roman" w:cs="Times New Roman" w:ascii="Times New Roman" w:hAnsi="Times New Roman"/>
+          <w:b w:val="0"/>
+          <w:i w:val="0"/>
+          <w:sz w:val="20"/>
         </w:rPr>
         <w:t>, Adhyan Jain</w:t>
       </w:r>
       <w:r>
         <w:rPr>
-          <w:rFonts w:eastAsia="Times New Roman" w:cs="Times New Roman"/>
-          <w:sz w:val="16"/>
+          <w:rFonts w:eastAsia="Times New Roman" w:cs="Times New Roman" w:ascii="Times New Roman" w:hAnsi="Times New Roman"/>
+          <w:b w:val="0"/>
+          <w:i w:val="0"/>
+          <w:sz w:val="20"/>
           <w:vertAlign w:val="superscript"/>
         </w:rPr>
         <w:t>1</w:t>
       </w:r>
       <w:r>
         <w:rPr>
-          <w:rFonts w:eastAsia="Times New Roman" w:cs="Times New Roman"/>
-          <w:sz w:val="24"/>
+          <w:rFonts w:eastAsia="Times New Roman" w:cs="Times New Roman" w:ascii="Times New Roman" w:hAnsi="Times New Roman"/>
+          <w:b w:val="0"/>
+          <w:i w:val="0"/>
+          <w:sz w:val="20"/>
         </w:rPr>
         <w:t>, Poornima Nedunchezhian</w:t>
       </w:r>
       <w:r>
         <w:rPr>
-          <w:rFonts w:eastAsia="Times New Roman" w:cs="Times New Roman"/>
-          <w:sz w:val="16"/>
+          <w:rFonts w:eastAsia="Times New Roman" w:cs="Times New Roman" w:ascii="Times New Roman" w:hAnsi="Times New Roman"/>
+          <w:b w:val="0"/>
+          <w:i w:val="0"/>
+          <w:sz w:val="20"/>
           <w:vertAlign w:val="superscript"/>
         </w:rPr>
         <w:t>2</w:t>
@@ -66,6 +84,7 @@
     </w:p>
     <w:p>
       <w:pPr>
+        <w:spacing w:before="0" w:after="0" w:line="240" w:lineRule="auto"/>
         <w:ind w:firstLine="0"/>
         <w:jc w:val="center"/>
       </w:pPr>
@@ -80,8 +99,10 @@
       </w:hyperlink>
       <w:r>
         <w:rPr>
-          <w:rFonts w:eastAsia="Times New Roman" w:cs="Times New Roman"/>
-          <w:sz w:val="21"/>
+          <w:rFonts w:eastAsia="Times New Roman" w:cs="Times New Roman" w:ascii="Times New Roman" w:hAnsi="Times New Roman"/>
+          <w:b w:val="0"/>
+          <w:i w:val="0"/>
+          <w:sz w:val="20"/>
         </w:rPr>
         <w:t xml:space="preserve">; </w:t>
       </w:r>
@@ -96,14 +117,17 @@
       </w:hyperlink>
       <w:r>
         <w:rPr>
-          <w:rFonts w:eastAsia="Times New Roman" w:cs="Times New Roman"/>
-          <w:sz w:val="21"/>
+          <w:rFonts w:eastAsia="Times New Roman" w:cs="Times New Roman" w:ascii="Times New Roman" w:hAnsi="Times New Roman"/>
+          <w:b w:val="0"/>
+          <w:i w:val="0"/>
+          <w:sz w:val="20"/>
         </w:rPr>
         <w:t>;</w:t>
       </w:r>
     </w:p>
     <w:p>
       <w:pPr>
+        <w:spacing w:before="0" w:after="0" w:line="240" w:lineRule="auto"/>
         <w:ind w:firstLine="0"/>
         <w:jc w:val="center"/>
       </w:pPr>
@@ -119,86 +143,122 @@
     </w:p>
     <w:p>
       <w:pPr>
+        <w:spacing w:before="0" w:after="0" w:line="240" w:lineRule="auto"/>
         <w:ind w:firstLine="0"/>
         <w:jc w:val="center"/>
       </w:pPr>
       <w:r>
         <w:rPr>
-          <w:rFonts w:eastAsia="Times New Roman" w:cs="Times New Roman"/>
+          <w:rFonts w:eastAsia="Times New Roman" w:cs="Times New Roman" w:ascii="Times New Roman" w:hAnsi="Times New Roman"/>
+          <w:b w:val="0"/>
+          <w:i w:val="0"/>
+          <w:sz w:val="20"/>
         </w:rPr>
         <w:t>School of Computer Science and Engineering</w:t>
       </w:r>
     </w:p>
     <w:p>
       <w:pPr>
+        <w:spacing w:before="0" w:after="0" w:line="240" w:lineRule="auto"/>
         <w:ind w:firstLine="0"/>
         <w:jc w:val="center"/>
       </w:pPr>
       <w:r>
         <w:rPr>
-          <w:rFonts w:eastAsia="Times New Roman" w:cs="Times New Roman"/>
+          <w:rFonts w:eastAsia="Times New Roman" w:cs="Times New Roman" w:ascii="Times New Roman" w:hAnsi="Times New Roman"/>
+          <w:b w:val="0"/>
+          <w:i w:val="0"/>
+          <w:sz w:val="20"/>
         </w:rPr>
         <w:t>VIT Vellore</w:t>
       </w:r>
     </w:p>
     <w:p>
       <w:pPr>
-        <w:sectPr>
-          <w:headerReference w:type="default" r:id="rId11"/>
-          <w:footerReference w:type="default" r:id="rId12"/>
-          <w:pgSz w:w="11906" w:h="16838"/>
-          <w:pgMar w:top="1440" w:right="1440" w:bottom="1440" w:left="1440" w:header="432" w:footer="504" w:gutter="0"/>
-          <w:cols w:space="720"/>
-          <w:docGrid w:linePitch="360"/>
-        </w:sectPr>
+        <w:spacing w:line="240" w:lineRule="auto" w:after="0"/>
       </w:pPr>
     </w:p>
     <w:p>
       <w:pPr>
-        <w:spacing w:after="140"/>
+        <w:spacing w:after="0" w:before="0" w:line="240" w:lineRule="auto"/>
         <w:ind w:firstLine="0"/>
-        <w:jc w:val="center"/>
+        <w:jc w:val="both"/>
       </w:pPr>
       <w:r>
         <w:rPr>
-          <w:rFonts w:eastAsia="Times New Roman" w:cs="Times New Roman"/>
+          <w:rFonts w:ascii="Times New Roman" w:hAnsi="Times New Roman"/>
           <w:b/>
-          <w:sz w:val="24"/>
+          <w:i/>
+          <w:sz w:val="20"/>
         </w:rPr>
-        <w:t>Abstract</w:t>
+        <w:t>Abstract—</w:t>
+      </w:r>
+      <w:r>
+        <w:rPr>
+          <w:rFonts w:ascii="Times New Roman" w:hAnsi="Times New Roman"/>
+          <w:sz w:val="20"/>
+        </w:rPr>
+        <w:t>Versioning structured datasets requires durable history, efficient sparse updates, historical reconstruction, and comparison without copying every record. Revon is a Python prototype built around an immutable fixed-depth Merkle hash trie; Revon-H adds addressed changesets and adaptively selects log aggregation or hash-pruned differencing. We compare Snapshot, Log-only, forced-Merkle Revon-M, Revon-H, and Dolt 2.3.1 on deterministic workloads up to 100,000 rows, using evidence from 540 successful executions. Within the declared API and CLI workflows, median paired Dolt/Revon-H diff-latency ratios range from 7.14 to 625.10, and all seven-trial 95% bootstrap intervals favor Revon-H latency. These are workflow-level results: the comparison includes different interfaces and does not isolate index or tree performance. A separate three-seed study found the 50-commit ablation result inconclusive. Experiments used one Windows host and WSL2 on the same physical computer. The results support workload-specific trade-offs for this prototype, not general or production-level superiority.</w:t>
       </w:r>
     </w:p>
     <w:p>
       <w:pPr>
-        <w:spacing w:after="80" w:line="240" w:lineRule="exact"/>
-        <w:ind w:left="340" w:right="340" w:firstLine="0"/>
+        <w:spacing w:after="0" w:line="240" w:lineRule="auto"/>
+        <w:jc w:val="both"/>
+        <w:sectPr>
+          <w:type w:val="continuous"/>
+          <w:headerReference w:type="default" r:id="rId11"/>
+          <w:footerReference w:type="default" r:id="rId12"/>
+          <w:pgSz w:w="12240" w:h="15840"/>
+          <w:pgMar w:top="1080" w:right="900" w:bottom="1440" w:left="900" w:header="360" w:footer="360" w:gutter="0"/>
+          <w:cols w:space="0" w:num="1" w:equalWidth="1"/>
+          <w:docGrid w:linePitch="360"/>
+        </w:sectPr>
       </w:pPr>
       <w:r>
         <w:rPr>
-          <w:rFonts w:eastAsia="Times New Roman" w:cs="Times New Roman"/>
+          <w:rFonts w:ascii="Times New Roman" w:hAnsi="Times New Roman"/>
+          <w:b/>
+          <w:i/>
           <w:sz w:val="20"/>
         </w:rPr>
-        <w:t>Versioning structured datasets requires durable history, efficient sparse updates, historical reconstruction, and comparison without copying every record. Revon is a Python prototype built around an immutable fixed-depth Merkle hash trie; Revon-H adds addressed changesets and adaptively selects log aggregation or hash-pruned differencing. We evaluate Snapshot, Log-only, forced-Merkle Revon-M, Revon-H, and Dolt 2.3.1 on deterministic workloads up to 100,000 rows. The primary run contains 540 executions. Across eight workloads, median paired Dolt/Revon-H diff ratios range from 7.14 to 625.10; all seven-trial 95% bootstrap intervals favor Revon-H latency in this tested workflow. A separate three-seed study across payload sizes, history lengths, and update patterns finds the 50-commit result inconclusive. These measurements compare the declared workflows on one Windows host and WSL2 on the same physical computer. They support a workload-dependent prototype design, not general or production-level superiority.</w:t>
+        <w:t>Index Terms—</w:t>
+      </w:r>
+      <w:r>
+        <w:rPr>
+          <w:rFonts w:ascii="Times New Roman" w:hAnsi="Times New Roman"/>
+          <w:i/>
+          <w:sz w:val="20"/>
+        </w:rPr>
+        <w:t>data versioning, Merkle hash trie, hybrid differencing, content-addressed storage, benchmark methodology</w:t>
       </w:r>
     </w:p>
     <w:p>
       <w:pPr>
         <w:pStyle w:val="Heading1"/>
+        <w:keepNext/>
+        <w:spacing w:before="120" w:after="60"/>
+        <w:jc w:val="center"/>
       </w:pPr>
       <w:r>
         <w:rPr>
-          <w:rFonts w:ascii="Times New Roman" w:eastAsia="Times New Roman" w:hAnsi="Times New Roman" w:cs="Times New Roman"/>
+          <w:rFonts w:ascii="Times New Roman" w:hAnsi="Times New Roman"/>
+          <w:b/>
+          <w:i w:val="0"/>
+          <w:sz w:val="20"/>
         </w:rPr>
-        <w:t>1  Introduction</w:t>
+        <w:t>I. INTRODUCTION</w:t>
       </w:r>
     </w:p>
     <w:p>
       <w:pPr>
+        <w:spacing w:line="240" w:lineRule="auto" w:after="0"/>
         <w:ind w:firstLine="0"/>
       </w:pPr>
       <w:r>
         <w:rPr>
-          <w:rFonts w:eastAsia="Times New Roman" w:cs="Times New Roman"/>
+          <w:rFonts w:eastAsia="Times New Roman" w:cs="Times New Roman" w:ascii="Times New Roman" w:hAnsi="Times New Roman"/>
+          <w:sz w:val="20"/>
         </w:rPr>
         <w:t xml:space="preserve">Version control for structured data is more than archiving files. A useful system must retain exact versions, apply sparse mutations without rebuilding the complete state, reconstruct historical versions, and identify changes efficiently. Git provides the starting idea--immutable objects named by content and commits linked to their parents </w:t>
       </w:r>
@@ -212,23 +272,32 @@
       </w:hyperlink>
       <w:r>
         <w:rPr>
-          <w:rFonts w:eastAsia="Times New Roman" w:cs="Times New Roman"/>
+          <w:rFonts w:eastAsia="Times New Roman" w:cs="Times New Roman" w:ascii="Times New Roman" w:hAnsi="Times New Roman"/>
+          <w:sz w:val="20"/>
         </w:rPr>
         <w:t>--but organizes those objects around files and directories. A record store presents a different workload: keys remain stable, update density varies, and two versions may be separated by a handful of edits or by a long sequence of commits.</w:t>
       </w:r>
     </w:p>
     <w:p>
+      <w:pPr>
+        <w:spacing w:line="240" w:lineRule="auto" w:after="0"/>
+      </w:pPr>
       <w:r>
         <w:rPr>
-          <w:rFonts w:eastAsia="Times New Roman" w:cs="Times New Roman"/>
+          <w:rFonts w:eastAsia="Times New Roman" w:cs="Times New Roman" w:ascii="Times New Roman" w:hAnsi="Times New Roman"/>
+          <w:sz w:val="20"/>
         </w:rPr>
         <w:t>Revon evaluates whether a deliberately simple fixed-depth Merkle hash trie can unite incremental structural sharing with an operation index. Its primary variant, Revon-H, uses the log path for short or sparse intervals and switches to the Merkle path when the accumulated operations cross a calibration boundary fixed before evaluation. SQLite provides atomic durable storage, but does not determine the versioning algorithm.</w:t>
       </w:r>
     </w:p>
     <w:p>
+      <w:pPr>
+        <w:spacing w:line="240" w:lineRule="auto" w:after="0"/>
+      </w:pPr>
       <w:r>
         <w:rPr>
-          <w:rFonts w:eastAsia="Times New Roman" w:cs="Times New Roman"/>
+          <w:rFonts w:eastAsia="Times New Roman" w:cs="Times New Roman" w:ascii="Times New Roman" w:hAnsi="Times New Roman"/>
+          <w:sz w:val="20"/>
         </w:rPr>
         <w:t xml:space="preserve">Dolt is the production comparator because it combines SQL semantics, a Git-style commit graph, and content-addressed Prolly Trees </w:t>
       </w:r>
@@ -242,7 +311,8 @@
       </w:hyperlink>
       <w:r>
         <w:rPr>
-          <w:rFonts w:eastAsia="Times New Roman" w:cs="Times New Roman"/>
+          <w:rFonts w:eastAsia="Times New Roman" w:cs="Times New Roman" w:ascii="Times New Roman" w:hAnsi="Times New Roman"/>
+          <w:sz w:val="20"/>
         </w:rPr>
         <w:t xml:space="preserve">, </w:t>
       </w:r>
@@ -256,7 +326,8 @@
       </w:hyperlink>
       <w:r>
         <w:rPr>
-          <w:rFonts w:eastAsia="Times New Roman" w:cs="Times New Roman"/>
+          <w:rFonts w:eastAsia="Times New Roman" w:cs="Times New Roman" w:ascii="Times New Roman" w:hAnsi="Times New Roman"/>
+          <w:sz w:val="20"/>
         </w:rPr>
         <w:t>. Revon is not presented as a feature replacement for Dolt. The comparison measures a smaller in-process Python prototype against a Dolt CLI workflow and does not isolate their tree algorithms.</w:t>
       </w:r>
@@ -264,12 +335,18 @@
     <w:p>
       <w:pPr>
         <w:pStyle w:val="Heading2"/>
+        <w:keepNext/>
+        <w:spacing w:before="80" w:after="20"/>
+        <w:jc w:val="left"/>
       </w:pPr>
       <w:r>
         <w:rPr>
-          <w:rFonts w:ascii="Times New Roman" w:eastAsia="Times New Roman" w:hAnsi="Times New Roman" w:cs="Times New Roman"/>
+          <w:rFonts w:ascii="Times New Roman" w:hAnsi="Times New Roman"/>
+          <w:b w:val="0"/>
+          <w:i/>
+          <w:sz w:val="20"/>
         </w:rPr>
-        <w:t>1.1  Research Questions</w:t>
+        <w:t>A. Research Questions</w:t>
       </w:r>
     </w:p>
     <w:p>
@@ -308,12 +385,18 @@
     <w:p>
       <w:pPr>
         <w:pStyle w:val="Heading2"/>
+        <w:keepNext/>
+        <w:spacing w:before="80" w:after="20"/>
+        <w:jc w:val="left"/>
       </w:pPr>
       <w:r>
         <w:rPr>
-          <w:rFonts w:ascii="Times New Roman" w:eastAsia="Times New Roman" w:hAnsi="Times New Roman" w:cs="Times New Roman"/>
+          <w:rFonts w:ascii="Times New Roman" w:hAnsi="Times New Roman"/>
+          <w:b w:val="0"/>
+          <w:i/>
+          <w:sz w:val="20"/>
         </w:rPr>
-        <w:t>1.2  Contributions</w:t>
+        <w:t>B. Contributions</w:t>
       </w:r>
     </w:p>
     <w:p>
@@ -375,32 +458,46 @@
     <w:p>
       <w:pPr>
         <w:pStyle w:val="Heading1"/>
+        <w:keepNext/>
+        <w:spacing w:before="120" w:after="60"/>
+        <w:jc w:val="center"/>
       </w:pPr>
       <w:r>
         <w:rPr>
-          <w:rFonts w:ascii="Times New Roman" w:eastAsia="Times New Roman" w:hAnsi="Times New Roman" w:cs="Times New Roman"/>
+          <w:rFonts w:ascii="Times New Roman" w:hAnsi="Times New Roman"/>
+          <w:b/>
+          <w:i w:val="0"/>
+          <w:sz w:val="20"/>
         </w:rPr>
-        <w:t>2  Literature Review and Related Work</w:t>
+        <w:t>II. RELATED WORK</w:t>
       </w:r>
     </w:p>
     <w:p>
       <w:pPr>
         <w:pStyle w:val="Heading2"/>
+        <w:keepNext/>
+        <w:spacing w:before="80" w:after="20"/>
+        <w:jc w:val="left"/>
       </w:pPr>
       <w:r>
         <w:rPr>
-          <w:rFonts w:ascii="Times New Roman" w:eastAsia="Times New Roman" w:hAnsi="Times New Roman" w:cs="Times New Roman"/>
+          <w:rFonts w:ascii="Times New Roman" w:hAnsi="Times New Roman"/>
+          <w:b w:val="0"/>
+          <w:i/>
+          <w:sz w:val="20"/>
         </w:rPr>
-        <w:t>2.1  Content Addressing and Persistent Structures</w:t>
+        <w:t>A. Content Addressing and Persistent Structures</w:t>
       </w:r>
     </w:p>
     <w:p>
       <w:pPr>
+        <w:spacing w:line="240" w:lineRule="auto" w:after="0"/>
         <w:ind w:firstLine="0"/>
       </w:pPr>
       <w:r>
         <w:rPr>
-          <w:rFonts w:eastAsia="Times New Roman" w:cs="Times New Roman"/>
+          <w:rFonts w:eastAsia="Times New Roman" w:cs="Times New Roman" w:ascii="Times New Roman" w:hAnsi="Times New Roman"/>
+          <w:sz w:val="20"/>
         </w:rPr>
         <w:t xml:space="preserve">Merkle's authenticated tree construction established that a compact root digest can commit to a larger collection </w:t>
       </w:r>
@@ -414,7 +511,8 @@
       </w:hyperlink>
       <w:r>
         <w:rPr>
-          <w:rFonts w:eastAsia="Times New Roman" w:cs="Times New Roman"/>
+          <w:rFonts w:eastAsia="Times New Roman" w:cs="Times New Roman" w:ascii="Times New Roman" w:hAnsi="Times New Roman"/>
+          <w:sz w:val="20"/>
         </w:rPr>
         <w:t xml:space="preserve">, while persistent-data-structure theory formalized path copying and bounded-overhead access to historical versions </w:t>
       </w:r>
@@ -428,7 +526,8 @@
       </w:hyperlink>
       <w:r>
         <w:rPr>
-          <w:rFonts w:eastAsia="Times New Roman" w:cs="Times New Roman"/>
+          <w:rFonts w:eastAsia="Times New Roman" w:cs="Times New Roman" w:ascii="Times New Roman" w:hAnsi="Times New Roman"/>
+          <w:sz w:val="20"/>
         </w:rPr>
         <w:t xml:space="preserve">. Git applies content-addressed blobs, trees, and commits to software history </w:t>
       </w:r>
@@ -442,7 +541,8 @@
       </w:hyperlink>
       <w:r>
         <w:rPr>
-          <w:rFonts w:eastAsia="Times New Roman" w:cs="Times New Roman"/>
+          <w:rFonts w:eastAsia="Times New Roman" w:cs="Times New Roman" w:ascii="Times New Roman" w:hAnsi="Times New Roman"/>
+          <w:sz w:val="20"/>
         </w:rPr>
         <w:t xml:space="preserve">, and IPFS generalizes content-addressed links into a versionable Merkle DAG </w:t>
       </w:r>
@@ -456,15 +556,20 @@
       </w:hyperlink>
       <w:r>
         <w:rPr>
-          <w:rFonts w:eastAsia="Times New Roman" w:cs="Times New Roman"/>
+          <w:rFonts w:eastAsia="Times New Roman" w:cs="Times New Roman" w:ascii="Times New Roman" w:hAnsi="Times New Roman"/>
+          <w:sz w:val="20"/>
         </w:rPr>
         <w:t>. Revon adopts immutable object identity and parent links, but routes structured keys by hash into a persistent trie rather than mirroring a filesystem hierarchy.</w:t>
       </w:r>
     </w:p>
     <w:p>
+      <w:pPr>
+        <w:spacing w:line="240" w:lineRule="auto" w:after="0"/>
+      </w:pPr>
       <w:r>
         <w:rPr>
-          <w:rFonts w:eastAsia="Times New Roman" w:cs="Times New Roman"/>
+          <w:rFonts w:eastAsia="Times New Roman" w:cs="Times New Roman" w:ascii="Times New Roman" w:hAnsi="Times New Roman"/>
+          <w:sz w:val="20"/>
         </w:rPr>
         <w:t xml:space="preserve">Merkle Search Trees combine search-tree ordering with Merkle authentication for efficient state reconciliation </w:t>
       </w:r>
@@ -478,7 +583,8 @@
       </w:hyperlink>
       <w:r>
         <w:rPr>
-          <w:rFonts w:eastAsia="Times New Roman" w:cs="Times New Roman"/>
+          <w:rFonts w:eastAsia="Times New Roman" w:cs="Times New Roman" w:ascii="Times New Roman" w:hAnsi="Times New Roman"/>
+          <w:sz w:val="20"/>
         </w:rPr>
         <w:t xml:space="preserve">. Revon shares hash-pruned comparison but intentionally uses fixed-depth routing and a centralized commit history rather than a replicated CRDT. Content-defined chunking, established in LBFS for redundancy detection </w:t>
       </w:r>
@@ -492,7 +598,8 @@
       </w:hyperlink>
       <w:r>
         <w:rPr>
-          <w:rFonts w:eastAsia="Times New Roman" w:cs="Times New Roman"/>
+          <w:rFonts w:eastAsia="Times New Roman" w:cs="Times New Roman" w:ascii="Times New Roman" w:hAnsi="Times New Roman"/>
+          <w:sz w:val="20"/>
         </w:rPr>
         <w:t>, also explains why history-independent boundaries are a credible storage improvement beyond the current fixed buckets.</w:t>
       </w:r>
@@ -500,21 +607,29 @@
     <w:p>
       <w:pPr>
         <w:pStyle w:val="Heading2"/>
+        <w:keepNext/>
+        <w:spacing w:before="80" w:after="20"/>
+        <w:jc w:val="left"/>
       </w:pPr>
       <w:r>
         <w:rPr>
-          <w:rFonts w:ascii="Times New Roman" w:eastAsia="Times New Roman" w:hAnsi="Times New Roman" w:cs="Times New Roman"/>
+          <w:rFonts w:ascii="Times New Roman" w:hAnsi="Times New Roman"/>
+          <w:b w:val="0"/>
+          <w:i/>
+          <w:sz w:val="20"/>
         </w:rPr>
-        <w:t>2.2  Structured Dataset Versioning</w:t>
+        <w:t>B. Structured Dataset Versioning</w:t>
       </w:r>
     </w:p>
     <w:p>
       <w:pPr>
+        <w:spacing w:line="240" w:lineRule="auto" w:after="0"/>
         <w:ind w:firstLine="0"/>
       </w:pPr>
       <w:r>
         <w:rPr>
-          <w:rFonts w:eastAsia="Times New Roman" w:cs="Times New Roman"/>
+          <w:rFonts w:eastAsia="Times New Roman" w:cs="Times New Roman" w:ascii="Times New Roman" w:hAnsi="Times New Roman"/>
+          <w:sz w:val="20"/>
         </w:rPr>
         <w:t xml:space="preserve">Dataset-versioning research exposes a broader storage-retrieval design space. DataHub motivates collaborative dataset history at scale </w:t>
       </w:r>
@@ -528,7 +643,8 @@
       </w:hyperlink>
       <w:r>
         <w:rPr>
-          <w:rFonts w:eastAsia="Times New Roman" w:cs="Times New Roman"/>
+          <w:rFonts w:eastAsia="Times New Roman" w:cs="Times New Roman" w:ascii="Times New Roman" w:hAnsi="Times New Roman"/>
+          <w:sz w:val="20"/>
         </w:rPr>
         <w:t xml:space="preserve">. Decibel integrates branching into a relational storage engine and compares version-first, tuple-first, and hybrid layouts </w:t>
       </w:r>
@@ -542,7 +658,8 @@
       </w:hyperlink>
       <w:r>
         <w:rPr>
-          <w:rFonts w:eastAsia="Times New Roman" w:cs="Times New Roman"/>
+          <w:rFonts w:eastAsia="Times New Roman" w:cs="Times New Roman" w:ascii="Times New Roman" w:hAnsi="Times New Roman"/>
+          <w:sz w:val="20"/>
         </w:rPr>
         <w:t xml:space="preserve">. OrpheusDB bolts versioning onto a conventional DBMS and optimizes partitioning for version retrieval </w:t>
       </w:r>
@@ -556,7 +673,8 @@
       </w:hyperlink>
       <w:r>
         <w:rPr>
-          <w:rFonts w:eastAsia="Times New Roman" w:cs="Times New Roman"/>
+          <w:rFonts w:eastAsia="Times New Roman" w:cs="Times New Roman" w:ascii="Times New Roman" w:hAnsi="Times New Roman"/>
+          <w:sz w:val="20"/>
         </w:rPr>
         <w:t xml:space="preserve">. The dataset-versioning model in </w:t>
       </w:r>
@@ -570,7 +688,8 @@
       </w:hyperlink>
       <w:r>
         <w:rPr>
-          <w:rFonts w:eastAsia="Times New Roman" w:cs="Times New Roman"/>
+          <w:rFonts w:eastAsia="Times New Roman" w:cs="Times New Roman" w:ascii="Times New Roman" w:hAnsi="Times New Roman"/>
+          <w:sz w:val="20"/>
         </w:rPr>
         <w:t xml:space="preserve"> formalizes the conflict between storing more materialized state and paying more reconstruction cost. Delta Lake represents the complementary log-and-checkpoint design for ACID tables and time travel </w:t>
       </w:r>
@@ -584,7 +703,8 @@
       </w:hyperlink>
       <w:r>
         <w:rPr>
-          <w:rFonts w:eastAsia="Times New Roman" w:cs="Times New Roman"/>
+          <w:rFonts w:eastAsia="Times New Roman" w:cs="Times New Roman" w:ascii="Times New Roman" w:hAnsi="Times New Roman"/>
+          <w:sz w:val="20"/>
         </w:rPr>
         <w:t>. These systems motivate reporting commit, checkout, diff, and storage together rather than selecting a single metric.</w:t>
       </w:r>
@@ -592,21 +712,35 @@
     <w:p>
       <w:pPr>
         <w:pStyle w:val="Heading2"/>
+        <w:keepNext/>
+        <w:spacing w:before="80" w:after="20"/>
+        <w:jc w:val="left"/>
       </w:pPr>
       <w:r>
         <w:rPr>
-          <w:rFonts w:ascii="Times New Roman" w:eastAsia="Times New Roman" w:hAnsi="Times New Roman" w:cs="Times New Roman"/>
+          <w:rFonts w:ascii="Times New Roman" w:hAnsi="Times New Roman"/>
+          <w:b w:val="0"/>
+          <w:i/>
+          <w:sz w:val="20"/>
         </w:rPr>
-        <w:t>2.3  System Design Gap</w:t>
+        <w:t>C. System Design Gap</w:t>
       </w:r>
     </w:p>
     <w:p>
       <w:pPr>
+        <w:spacing w:line="240" w:lineRule="auto" w:after="0"/>
         <w:ind w:firstLine="0"/>
+        <w:sectPr>
+          <w:type w:val="continuous"/>
+          <w:pgSz w:w="12240" w:h="15840"/>
+          <w:pgMar w:top="1080" w:right="900" w:bottom="1440" w:left="900" w:header="360" w:footer="360" w:gutter="0"/>
+          <w:cols w:num="2" w:space="360" w:equalWidth="1"/>
+        </w:sectPr>
       </w:pPr>
       <w:r>
         <w:rPr>
-          <w:rFonts w:eastAsia="Times New Roman" w:cs="Times New Roman"/>
+          <w:rFonts w:eastAsia="Times New Roman" w:cs="Times New Roman" w:ascii="Times New Roman" w:hAnsi="Times New Roman"/>
+          <w:sz w:val="20"/>
         </w:rPr>
         <w:t xml:space="preserve">Noms represents structured data as a Merkle DAG of immutable chunks and supports efficient diff and synchronization </w:t>
       </w:r>
@@ -620,7 +754,8 @@
       </w:hyperlink>
       <w:r>
         <w:rPr>
-          <w:rFonts w:eastAsia="Times New Roman" w:cs="Times New Roman"/>
+          <w:rFonts w:eastAsia="Times New Roman" w:cs="Times New Roman" w:ascii="Times New Roman" w:hAnsi="Times New Roman"/>
+          <w:sz w:val="20"/>
         </w:rPr>
         <w:t xml:space="preserve">. ForkBase combines content addressing, fork semantics, and duplicate-content detection for forkable applications </w:t>
       </w:r>
@@ -634,7 +769,8 @@
       </w:hyperlink>
       <w:r>
         <w:rPr>
-          <w:rFonts w:eastAsia="Times New Roman" w:cs="Times New Roman"/>
+          <w:rFonts w:eastAsia="Times New Roman" w:cs="Times New Roman" w:ascii="Times New Roman" w:hAnsi="Times New Roman"/>
+          <w:sz w:val="20"/>
         </w:rPr>
         <w:t xml:space="preserve">. Dolt stores table indexes as content-addressed Prolly Trees: ordered, B-tree-like structures with history-independent chunk boundaries, structural sharing, and native diff </w:t>
       </w:r>
@@ -648,7 +784,8 @@
       </w:hyperlink>
       <w:r>
         <w:rPr>
-          <w:rFonts w:eastAsia="Times New Roman" w:cs="Times New Roman"/>
+          <w:rFonts w:eastAsia="Times New Roman" w:cs="Times New Roman" w:ascii="Times New Roman" w:hAnsi="Times New Roman"/>
+          <w:sz w:val="20"/>
         </w:rPr>
         <w:t xml:space="preserve">, </w:t>
       </w:r>
@@ -662,22 +799,39 @@
       </w:hyperlink>
       <w:r>
         <w:rPr>
-          <w:rFonts w:eastAsia="Times New Roman" w:cs="Times New Roman"/>
+          <w:rFonts w:eastAsia="Times New Roman" w:cs="Times New Roman" w:ascii="Times New Roman" w:hAnsi="Times New Roman"/>
+          <w:sz w:val="20"/>
         </w:rPr>
         <w:t>. Revon differs by using fixed-depth hash routing and by exposing an explicit alternative operation-log path. This simplifies instrumentation, but gives up Dolt's ordered range behavior, SQL surface, mature branching, merging, and production engineering.</w:t>
       </w:r>
     </w:p>
+    <w:p>
+      <w:pPr>
+        <w:pStyle w:val="Caption"/>
+        <w:keepNext/>
+        <w:spacing w:before="40" w:after="40"/>
+        <w:jc w:val="center"/>
+      </w:pPr>
+      <w:r>
+        <w:rPr>
+          <w:rFonts w:ascii="Times New Roman" w:hAnsi="Times New Roman"/>
+          <w:sz w:val="16"/>
+        </w:rPr>
+        <w:t>TABLE I. Literature-review matrix and the gap addressed by Revon.</w:t>
+      </w:r>
+    </w:p>
     <w:tbl>
       <w:tblPr>
-        <w:tblW w:w="4270" w:type="dxa"/>
+        <w:tblW w:w="9020" w:type="dxa"/>
+        <w:jc w:val="center"/>
         <w:tblInd w:w="25" w:type="dxa"/>
         <w:tblLayout w:type="fixed"/>
         <w:tblLook w:val="04A0" w:firstRow="1" w:lastRow="0" w:firstColumn="1" w:lastColumn="0" w:noHBand="0" w:noVBand="1"/>
       </w:tblPr>
       <w:tblGrid>
-        <w:gridCol w:w="1037"/>
-        <w:gridCol w:w="1464"/>
-        <w:gridCol w:w="1769"/>
+        <w:gridCol w:w="2100"/>
+        <w:gridCol w:w="2300"/>
+        <w:gridCol w:w="4620"/>
       </w:tblGrid>
       <w:tr>
         <w:trPr>
@@ -686,7 +840,7 @@
         </w:trPr>
         <w:tc>
           <w:tcPr>
-            <w:tcW w:w="1037" w:type="dxa"/>
+            <w:tcW w:w="2100" w:type="dxa"/>
             <w:tcBorders>
               <w:top w:val="single" w:sz="6" w:space="0" w:color="000000"/>
               <w:left w:val="nil"/>
@@ -721,7 +875,7 @@
         </w:tc>
         <w:tc>
           <w:tcPr>
-            <w:tcW w:w="1464" w:type="dxa"/>
+            <w:tcW w:w="2300" w:type="dxa"/>
             <w:tcBorders>
               <w:top w:val="single" w:sz="6" w:space="0" w:color="000000"/>
               <w:left w:val="nil"/>
@@ -755,7 +909,7 @@
         </w:tc>
         <w:tc>
           <w:tcPr>
-            <w:tcW w:w="1769" w:type="dxa"/>
+            <w:tcW w:w="4620" w:type="dxa"/>
             <w:tcBorders>
               <w:top w:val="single" w:sz="6" w:space="0" w:color="000000"/>
               <w:left w:val="nil"/>
@@ -794,7 +948,7 @@
         </w:trPr>
         <w:tc>
           <w:tcPr>
-            <w:tcW w:w="1037" w:type="dxa"/>
+            <w:tcW w:w="2100" w:type="dxa"/>
             <w:tcBorders>
               <w:top w:val="nil"/>
               <w:left w:val="nil"/>
@@ -827,7 +981,7 @@
         </w:tc>
         <w:tc>
           <w:tcPr>
-            <w:tcW w:w="1464" w:type="dxa"/>
+            <w:tcW w:w="2300" w:type="dxa"/>
             <w:tcBorders>
               <w:top w:val="nil"/>
               <w:left w:val="nil"/>
@@ -860,7 +1014,7 @@
         </w:tc>
         <w:tc>
           <w:tcPr>
-            <w:tcW w:w="1769" w:type="dxa"/>
+            <w:tcW w:w="4620" w:type="dxa"/>
             <w:tcBorders>
               <w:top w:val="nil"/>
               <w:left w:val="nil"/>
@@ -898,7 +1052,7 @@
         </w:trPr>
         <w:tc>
           <w:tcPr>
-            <w:tcW w:w="1037" w:type="dxa"/>
+            <w:tcW w:w="2100" w:type="dxa"/>
             <w:tcBorders>
               <w:top w:val="nil"/>
               <w:left w:val="nil"/>
@@ -931,7 +1085,7 @@
         </w:tc>
         <w:tc>
           <w:tcPr>
-            <w:tcW w:w="1464" w:type="dxa"/>
+            <w:tcW w:w="2300" w:type="dxa"/>
             <w:tcBorders>
               <w:top w:val="nil"/>
               <w:left w:val="nil"/>
@@ -964,7 +1118,7 @@
         </w:tc>
         <w:tc>
           <w:tcPr>
-            <w:tcW w:w="1769" w:type="dxa"/>
+            <w:tcW w:w="4620" w:type="dxa"/>
             <w:tcBorders>
               <w:top w:val="nil"/>
               <w:left w:val="nil"/>
@@ -1002,7 +1156,7 @@
         </w:trPr>
         <w:tc>
           <w:tcPr>
-            <w:tcW w:w="1037" w:type="dxa"/>
+            <w:tcW w:w="2100" w:type="dxa"/>
             <w:tcBorders>
               <w:top w:val="nil"/>
               <w:left w:val="nil"/>
@@ -1035,7 +1189,7 @@
         </w:tc>
         <w:tc>
           <w:tcPr>
-            <w:tcW w:w="1464" w:type="dxa"/>
+            <w:tcW w:w="2300" w:type="dxa"/>
             <w:tcBorders>
               <w:top w:val="nil"/>
               <w:left w:val="nil"/>
@@ -1068,7 +1222,7 @@
         </w:tc>
         <w:tc>
           <w:tcPr>
-            <w:tcW w:w="1769" w:type="dxa"/>
+            <w:tcW w:w="4620" w:type="dxa"/>
             <w:tcBorders>
               <w:top w:val="nil"/>
               <w:left w:val="nil"/>
@@ -1106,7 +1260,7 @@
         </w:trPr>
         <w:tc>
           <w:tcPr>
-            <w:tcW w:w="1037" w:type="dxa"/>
+            <w:tcW w:w="2100" w:type="dxa"/>
             <w:tcBorders>
               <w:top w:val="nil"/>
               <w:left w:val="nil"/>
@@ -1139,7 +1293,7 @@
         </w:tc>
         <w:tc>
           <w:tcPr>
-            <w:tcW w:w="1464" w:type="dxa"/>
+            <w:tcW w:w="2300" w:type="dxa"/>
             <w:tcBorders>
               <w:top w:val="nil"/>
               <w:left w:val="nil"/>
@@ -1172,7 +1326,7 @@
         </w:tc>
         <w:tc>
           <w:tcPr>
-            <w:tcW w:w="1769" w:type="dxa"/>
+            <w:tcW w:w="4620" w:type="dxa"/>
             <w:tcBorders>
               <w:top w:val="nil"/>
               <w:left w:val="nil"/>
@@ -1210,7 +1364,7 @@
         </w:trPr>
         <w:tc>
           <w:tcPr>
-            <w:tcW w:w="1037" w:type="dxa"/>
+            <w:tcW w:w="2100" w:type="dxa"/>
             <w:tcBorders>
               <w:top w:val="nil"/>
               <w:left w:val="nil"/>
@@ -1243,7 +1397,7 @@
         </w:tc>
         <w:tc>
           <w:tcPr>
-            <w:tcW w:w="1464" w:type="dxa"/>
+            <w:tcW w:w="2300" w:type="dxa"/>
             <w:tcBorders>
               <w:top w:val="nil"/>
               <w:left w:val="nil"/>
@@ -1276,7 +1430,7 @@
         </w:tc>
         <w:tc>
           <w:tcPr>
-            <w:tcW w:w="1769" w:type="dxa"/>
+            <w:tcW w:w="4620" w:type="dxa"/>
             <w:tcBorders>
               <w:top w:val="nil"/>
               <w:left w:val="nil"/>
@@ -1314,7 +1468,7 @@
         </w:trPr>
         <w:tc>
           <w:tcPr>
-            <w:tcW w:w="1037" w:type="dxa"/>
+            <w:tcW w:w="2100" w:type="dxa"/>
             <w:tcBorders>
               <w:top w:val="nil"/>
               <w:left w:val="nil"/>
@@ -1347,7 +1501,7 @@
         </w:tc>
         <w:tc>
           <w:tcPr>
-            <w:tcW w:w="1464" w:type="dxa"/>
+            <w:tcW w:w="2300" w:type="dxa"/>
             <w:tcBorders>
               <w:top w:val="nil"/>
               <w:left w:val="nil"/>
@@ -1380,7 +1534,7 @@
         </w:tc>
         <w:tc>
           <w:tcPr>
-            <w:tcW w:w="1769" w:type="dxa"/>
+            <w:tcW w:w="4620" w:type="dxa"/>
             <w:tcBorders>
               <w:top w:val="nil"/>
               <w:left w:val="nil"/>
@@ -1418,7 +1572,7 @@
         </w:trPr>
         <w:tc>
           <w:tcPr>
-            <w:tcW w:w="1037" w:type="dxa"/>
+            <w:tcW w:w="2100" w:type="dxa"/>
             <w:tcBorders>
               <w:top w:val="nil"/>
               <w:left w:val="nil"/>
@@ -1451,7 +1605,7 @@
         </w:tc>
         <w:tc>
           <w:tcPr>
-            <w:tcW w:w="1464" w:type="dxa"/>
+            <w:tcW w:w="2300" w:type="dxa"/>
             <w:tcBorders>
               <w:top w:val="nil"/>
               <w:left w:val="nil"/>
@@ -1484,7 +1638,7 @@
         </w:tc>
         <w:tc>
           <w:tcPr>
-            <w:tcW w:w="1769" w:type="dxa"/>
+            <w:tcW w:w="4620" w:type="dxa"/>
             <w:tcBorders>
               <w:top w:val="nil"/>
               <w:left w:val="nil"/>
@@ -1522,7 +1676,7 @@
         </w:trPr>
         <w:tc>
           <w:tcPr>
-            <w:tcW w:w="1037" w:type="dxa"/>
+            <w:tcW w:w="2100" w:type="dxa"/>
             <w:tcBorders>
               <w:top w:val="nil"/>
               <w:left w:val="nil"/>
@@ -1555,7 +1709,7 @@
         </w:tc>
         <w:tc>
           <w:tcPr>
-            <w:tcW w:w="1464" w:type="dxa"/>
+            <w:tcW w:w="2300" w:type="dxa"/>
             <w:tcBorders>
               <w:top w:val="nil"/>
               <w:left w:val="nil"/>
@@ -1588,7 +1742,7 @@
         </w:tc>
         <w:tc>
           <w:tcPr>
-            <w:tcW w:w="1769" w:type="dxa"/>
+            <w:tcW w:w="4620" w:type="dxa"/>
             <w:tcBorders>
               <w:top w:val="nil"/>
               <w:left w:val="nil"/>
@@ -1626,7 +1780,7 @@
         </w:trPr>
         <w:tc>
           <w:tcPr>
-            <w:tcW w:w="1037" w:type="dxa"/>
+            <w:tcW w:w="2100" w:type="dxa"/>
             <w:tcBorders>
               <w:top w:val="nil"/>
               <w:left w:val="nil"/>
@@ -1659,7 +1813,7 @@
         </w:tc>
         <w:tc>
           <w:tcPr>
-            <w:tcW w:w="1464" w:type="dxa"/>
+            <w:tcW w:w="2300" w:type="dxa"/>
             <w:tcBorders>
               <w:top w:val="nil"/>
               <w:left w:val="nil"/>
@@ -1692,7 +1846,7 @@
         </w:tc>
         <w:tc>
           <w:tcPr>
-            <w:tcW w:w="1769" w:type="dxa"/>
+            <w:tcW w:w="4620" w:type="dxa"/>
             <w:tcBorders>
               <w:top w:val="nil"/>
               <w:left w:val="nil"/>
@@ -1730,7 +1884,7 @@
         </w:trPr>
         <w:tc>
           <w:tcPr>
-            <w:tcW w:w="1037" w:type="dxa"/>
+            <w:tcW w:w="2100" w:type="dxa"/>
             <w:tcBorders>
               <w:top w:val="nil"/>
               <w:left w:val="nil"/>
@@ -1763,7 +1917,7 @@
         </w:tc>
         <w:tc>
           <w:tcPr>
-            <w:tcW w:w="1464" w:type="dxa"/>
+            <w:tcW w:w="2300" w:type="dxa"/>
             <w:tcBorders>
               <w:top w:val="nil"/>
               <w:left w:val="nil"/>
@@ -1796,7 +1950,7 @@
         </w:tc>
         <w:tc>
           <w:tcPr>
-            <w:tcW w:w="1769" w:type="dxa"/>
+            <w:tcW w:w="4620" w:type="dxa"/>
             <w:tcBorders>
               <w:top w:val="nil"/>
               <w:left w:val="nil"/>
@@ -1834,7 +1988,7 @@
         </w:trPr>
         <w:tc>
           <w:tcPr>
-            <w:tcW w:w="1037" w:type="dxa"/>
+            <w:tcW w:w="2100" w:type="dxa"/>
             <w:tcBorders>
               <w:top w:val="nil"/>
               <w:left w:val="nil"/>
@@ -1867,7 +2021,7 @@
         </w:tc>
         <w:tc>
           <w:tcPr>
-            <w:tcW w:w="1464" w:type="dxa"/>
+            <w:tcW w:w="2300" w:type="dxa"/>
             <w:tcBorders>
               <w:top w:val="nil"/>
               <w:left w:val="nil"/>
@@ -1900,7 +2054,7 @@
         </w:tc>
         <w:tc>
           <w:tcPr>
-            <w:tcW w:w="1769" w:type="dxa"/>
+            <w:tcW w:w="4620" w:type="dxa"/>
             <w:tcBorders>
               <w:top w:val="nil"/>
               <w:left w:val="nil"/>
@@ -1927,7 +2081,7 @@
                 <w:rFonts w:eastAsia="Times New Roman" w:cs="Times New Roman"/>
                 <w:sz w:val="18"/>
               </w:rPr>
-              <w:t>Production SOTA comparator</w:t>
+              <w:t>Mature production comparator</w:t>
             </w:r>
           </w:p>
         </w:tc>
@@ -1935,33 +2089,40 @@
     </w:tbl>
     <w:p>
       <w:pPr>
-        <w:pStyle w:val="Caption"/>
+        <w:sectPr>
+          <w:type w:val="continuous"/>
+          <w:pgSz w:w="12240" w:h="15840"/>
+          <w:pgMar w:top="1080" w:right="900" w:bottom="1440" w:left="900" w:header="360" w:footer="360" w:gutter="0"/>
+          <w:cols w:num="1" w:space="0" w:equalWidth="1"/>
+        </w:sectPr>
+      </w:pPr>
+    </w:p>
+    <w:p>
+      <w:pPr>
+        <w:pStyle w:val="Heading2"/>
+        <w:keepNext/>
+        <w:spacing w:before="80" w:after="20"/>
+        <w:jc w:val="left"/>
       </w:pPr>
       <w:r>
         <w:rPr>
-          <w:rFonts w:eastAsia="Times New Roman" w:cs="Times New Roman"/>
+          <w:rFonts w:ascii="Times New Roman" w:hAnsi="Times New Roman"/>
+          <w:b w:val="0"/>
+          <w:i/>
+          <w:sz w:val="20"/>
         </w:rPr>
-        <w:t>Table 1: Literature-review matrix and the gap addressed by Revon.</w:t>
+        <w:t>D. Design Implications and Research Positioning</w:t>
       </w:r>
     </w:p>
     <w:p>
       <w:pPr>
-        <w:pStyle w:val="Heading2"/>
+        <w:spacing w:line="240" w:lineRule="auto" w:after="0"/>
+        <w:ind w:firstLine="0"/>
       </w:pPr>
       <w:r>
         <w:rPr>
-          <w:rFonts w:ascii="Times New Roman" w:eastAsia="Times New Roman" w:hAnsi="Times New Roman" w:cs="Times New Roman"/>
-        </w:rPr>
-        <w:t>2.4  Design Implications and Research Positioning</w:t>
-      </w:r>
-    </w:p>
-    <w:p>
-      <w:pPr>
-        <w:ind w:firstLine="0"/>
-      </w:pPr>
-      <w:r>
-        <w:rPr>
-          <w:rFonts w:eastAsia="Times New Roman" w:cs="Times New Roman"/>
+          <w:rFonts w:eastAsia="Times New Roman" w:cs="Times New Roman" w:ascii="Times New Roman" w:hAnsi="Times New Roman"/>
+          <w:sz w:val="20"/>
         </w:rPr>
         <w:t xml:space="preserve">Three separate costs recur in the literature: retained history, creation of a new version, and later reconstruction or comparison. A snapshot keeps reconstruction straightforward by copying unchanged records. A log avoids that copy at commit time, but the deferred work returns during replay, compaction, or checkpointing. Path-copying persistent structures take a third route: only the paths changed by an update are new, while the remaining topology is shared </w:t>
       </w:r>
@@ -1975,7 +2136,8 @@
       </w:hyperlink>
       <w:r>
         <w:rPr>
-          <w:rFonts w:eastAsia="Times New Roman" w:cs="Times New Roman"/>
+          <w:rFonts w:eastAsia="Times New Roman" w:cs="Times New Roman" w:ascii="Times New Roman" w:hAnsi="Times New Roman"/>
+          <w:sz w:val="20"/>
         </w:rPr>
         <w:t xml:space="preserve">. The storage-versus-recreation model in </w:t>
       </w:r>
@@ -1989,7 +2151,8 @@
       </w:hyperlink>
       <w:r>
         <w:rPr>
-          <w:rFonts w:eastAsia="Times New Roman" w:cs="Times New Roman"/>
+          <w:rFonts w:eastAsia="Times New Roman" w:cs="Times New Roman" w:ascii="Times New Roman" w:hAnsi="Times New Roman"/>
+          <w:sz w:val="20"/>
         </w:rPr>
         <w:t xml:space="preserve"> makes this trade-off explicit. Decibel and OrpheusDB likewise show that one physical layout does not dominate scans, version retrieval, and storage for every branching workload </w:t>
       </w:r>
@@ -2003,7 +2166,8 @@
       </w:hyperlink>
       <w:r>
         <w:rPr>
-          <w:rFonts w:eastAsia="Times New Roman" w:cs="Times New Roman"/>
+          <w:rFonts w:eastAsia="Times New Roman" w:cs="Times New Roman" w:ascii="Times New Roman" w:hAnsi="Times New Roman"/>
+          <w:sz w:val="20"/>
         </w:rPr>
         <w:t xml:space="preserve">, </w:t>
       </w:r>
@@ -2017,15 +2181,20 @@
       </w:hyperlink>
       <w:r>
         <w:rPr>
-          <w:rFonts w:eastAsia="Times New Roman" w:cs="Times New Roman"/>
+          <w:rFonts w:eastAsia="Times New Roman" w:cs="Times New Roman" w:ascii="Times New Roman" w:hAnsi="Times New Roman"/>
+          <w:sz w:val="20"/>
         </w:rPr>
         <w:t>. For that reason, our evaluation reports import, commit, checkout, diff, and storage rather than using one measurement as a proxy for the system.</w:t>
       </w:r>
     </w:p>
     <w:p>
+      <w:pPr>
+        <w:spacing w:line="240" w:lineRule="auto" w:after="0"/>
+      </w:pPr>
       <w:r>
         <w:rPr>
-          <w:rFonts w:eastAsia="Times New Roman" w:cs="Times New Roman"/>
+          <w:rFonts w:eastAsia="Times New Roman" w:cs="Times New Roman" w:ascii="Times New Roman" w:hAnsi="Times New Roman"/>
+          <w:sz w:val="20"/>
         </w:rPr>
         <w:t xml:space="preserve">Change detection is another point of separation. Comparing two complete states does not need a detailed history, although its work grows with the states being scanned. Replaying changesets instead makes the interval length decisive and requires an unbroken ancestry path with complete changesets. With Merkle differencing, matching subtree hashes stop the search; only mismatching branches are opened. The observed cost then depends on trie shape, leaf occupancy, key distribution, and where updates land. The MST retains key order </w:t>
       </w:r>
@@ -2039,7 +2208,8 @@
       </w:hyperlink>
       <w:r>
         <w:rPr>
-          <w:rFonts w:eastAsia="Times New Roman" w:cs="Times New Roman"/>
+          <w:rFonts w:eastAsia="Times New Roman" w:cs="Times New Roman" w:ascii="Times New Roman" w:hAnsi="Times New Roman"/>
+          <w:sz w:val="20"/>
         </w:rPr>
         <w:t xml:space="preserve">. Noms and Dolt use content-defined boundaries to form history-independent Prolly Trees </w:t>
       </w:r>
@@ -2053,7 +2223,8 @@
       </w:hyperlink>
       <w:r>
         <w:rPr>
-          <w:rFonts w:eastAsia="Times New Roman" w:cs="Times New Roman"/>
+          <w:rFonts w:eastAsia="Times New Roman" w:cs="Times New Roman" w:ascii="Times New Roman" w:hAnsi="Times New Roman"/>
+          <w:sz w:val="20"/>
         </w:rPr>
         <w:t xml:space="preserve">, </w:t>
       </w:r>
@@ -2067,7 +2238,8 @@
       </w:hyperlink>
       <w:r>
         <w:rPr>
-          <w:rFonts w:eastAsia="Times New Roman" w:cs="Times New Roman"/>
+          <w:rFonts w:eastAsia="Times New Roman" w:cs="Times New Roman" w:ascii="Times New Roman" w:hAnsi="Times New Roman"/>
+          <w:sz w:val="20"/>
         </w:rPr>
         <w:t xml:space="preserve">, while ForkBase reuses addressed content across objects, branches, and versions </w:t>
       </w:r>
@@ -2081,15 +2253,20 @@
       </w:hyperlink>
       <w:r>
         <w:rPr>
-          <w:rFonts w:eastAsia="Times New Roman" w:cs="Times New Roman"/>
+          <w:rFonts w:eastAsia="Times New Roman" w:cs="Times New Roman" w:ascii="Times New Roman" w:hAnsi="Times New Roman"/>
+          <w:sz w:val="20"/>
         </w:rPr>
         <w:t>. Revon chooses fixed hash-derived routes. This choice removes ordered range access and adaptive boundaries, but gives the experiment a stable geometry whose depth and branching factor can be measured.</w:t>
       </w:r>
     </w:p>
     <w:p>
+      <w:pPr>
+        <w:spacing w:line="240" w:lineRule="auto" w:after="0"/>
+      </w:pPr>
       <w:r>
         <w:rPr>
-          <w:rFonts w:eastAsia="Times New Roman" w:cs="Times New Roman"/>
+          <w:rFonts w:eastAsia="Times New Roman" w:cs="Times New Roman" w:ascii="Times New Roman" w:hAnsi="Times New Roman"/>
+          <w:sz w:val="20"/>
         </w:rPr>
         <w:t>The gap addressed here is not a new content-addressed store, but a controlled study in which two correct diff algorithms share one durable history and are chosen from observable properties of the requested interval. Every Revon-H commit records both a Merkle root and an addressed changeset, so changing the diff path does not change the meaning of a version. We expect log aggregation to suit short, sparse intervals and hash pruning to become preferable after many operations. We also expect b and d to change latency, examined work, and storage. Snapshot and Log-only provide representation baselines; Revon-M removes the selector; Revon-H retains it; and Dolt provides a production reference point. This design tests the hybrid mechanism while keeping the system-level Dolt comparison separate from any claim about intrinsic tree superiority.</w:t>
       </w:r>
@@ -2097,30 +2274,36 @@
     <w:p>
       <w:pPr>
         <w:pStyle w:val="Heading1"/>
+        <w:keepNext/>
+        <w:spacing w:before="120" w:after="60"/>
+        <w:jc w:val="center"/>
       </w:pPr>
       <w:r>
         <w:rPr>
-          <w:rFonts w:ascii="Times New Roman" w:eastAsia="Times New Roman" w:hAnsi="Times New Roman" w:cs="Times New Roman"/>
+          <w:rFonts w:ascii="Times New Roman" w:hAnsi="Times New Roman"/>
+          <w:b/>
+          <w:i w:val="0"/>
+          <w:sz w:val="20"/>
         </w:rPr>
-        <w:lastRenderedPageBreak/>
-        <w:t>3  Revon Design</w:t>
+        <w:t>III. REVON DESIGN</w:t>
       </w:r>
     </w:p>
     <w:p>
       <w:pPr>
         <w:keepNext/>
-        <w:spacing w:before="40" w:line="240" w:lineRule="auto"/>
+        <w:spacing w:before="40" w:line="240" w:lineRule="auto" w:after="0"/>
         <w:ind w:firstLine="0"/>
         <w:jc w:val="center"/>
       </w:pPr>
       <w:r>
         <w:rPr>
-          <w:rFonts w:eastAsia="Times New Roman" w:cs="Times New Roman"/>
+          <w:rFonts w:eastAsia="Times New Roman" w:cs="Times New Roman" w:ascii="Times New Roman" w:hAnsi="Times New Roman"/>
           <w:noProof/>
+          <w:sz w:val="20"/>
         </w:rPr>
         <w:drawing>
           <wp:inline distT="0" distB="0" distL="0" distR="0" wp14:anchorId="413E2FC9" wp14:editId="09BC0E8F">
-            <wp:extent cx="5029200" cy="2950464"/>
+            <wp:extent cx="3063240" cy="2950464"/>
             <wp:effectExtent l="0" t="0" r="0" b="0"/>
             <wp:docPr id="1" name="Picture 1" descr="Revon layered architecture showing the frontend, REST API, Revon-H core, SQLite object store, and the research contribution boundary." title="Revon layered architecture showing the frontend, REST API, Revon-H core, SQLite object store, and the research contribution boundary"/>
             <wp:cNvGraphicFramePr>
@@ -2142,7 +2325,7 @@
                   <pic:spPr>
                     <a:xfrm>
                       <a:off x="0" y="0"/>
-                      <a:ext cx="5029200" cy="2950464"/>
+                      <a:ext cx="3063240" cy="2950464"/>
                     </a:xfrm>
                     <a:prstGeom prst="rect">
                       <a:avLst/>
@@ -2158,32 +2341,44 @@
     <w:p>
       <w:pPr>
         <w:pStyle w:val="Caption"/>
+        <w:keepNext/>
+        <w:spacing w:before="40" w:after="40"/>
+        <w:jc w:val="center"/>
       </w:pPr>
       <w:r>
         <w:rPr>
-          <w:rFonts w:eastAsia="Times New Roman" w:cs="Times New Roman"/>
+          <w:rFonts w:ascii="Times New Roman" w:hAnsi="Times New Roman"/>
+          <w:sz w:val="16"/>
         </w:rPr>
-        <w:t>Figure 1: Revon system architecture and the boundary of its research contribution.</w:t>
+        <w:t>Fig. 1. Revon system architecture and the boundary of its research contribution.</w:t>
       </w:r>
     </w:p>
     <w:p>
       <w:pPr>
         <w:pStyle w:val="Heading2"/>
+        <w:keepNext/>
+        <w:spacing w:before="80" w:after="20"/>
+        <w:jc w:val="left"/>
       </w:pPr>
       <w:r>
         <w:rPr>
-          <w:rFonts w:ascii="Times New Roman" w:eastAsia="Times New Roman" w:hAnsi="Times New Roman" w:cs="Times New Roman"/>
+          <w:rFonts w:ascii="Times New Roman" w:hAnsi="Times New Roman"/>
+          <w:b w:val="0"/>
+          <w:i/>
+          <w:sz w:val="20"/>
         </w:rPr>
-        <w:t>3.1  Addressed Object Model</w:t>
+        <w:t>A. Addressed Object Model</w:t>
       </w:r>
     </w:p>
     <w:p>
       <w:pPr>
+        <w:spacing w:line="240" w:lineRule="auto" w:after="0"/>
         <w:ind w:firstLine="0"/>
       </w:pPr>
       <w:r>
         <w:rPr>
-          <w:rFonts w:eastAsia="Times New Roman" w:cs="Times New Roman"/>
+          <w:rFonts w:eastAsia="Times New Roman" w:cs="Times New Roman" w:ascii="Times New Roman" w:hAnsi="Times New Roman"/>
+          <w:sz w:val="20"/>
         </w:rPr>
         <w:t>Revon serializes trie nodes and changesets as canonical JSON, then names each object with its SHA-256 digest. The commit digest includes the root, parent, changeset, message, and timestamp. Labels such as v1 and v2 are only human-readable aliases; they do not determine object identity. The durable HEAD reference stores the current commit.</w:t>
       </w:r>
@@ -2191,21 +2386,29 @@
     <w:p>
       <w:pPr>
         <w:pStyle w:val="Heading2"/>
+        <w:keepNext/>
+        <w:spacing w:before="80" w:after="20"/>
+        <w:jc w:val="left"/>
       </w:pPr>
       <w:r>
         <w:rPr>
-          <w:rFonts w:ascii="Times New Roman" w:eastAsia="Times New Roman" w:hAnsi="Times New Roman" w:cs="Times New Roman"/>
+          <w:rFonts w:ascii="Times New Roman" w:hAnsi="Times New Roman"/>
+          <w:b w:val="0"/>
+          <w:i/>
+          <w:sz w:val="20"/>
         </w:rPr>
-        <w:t>3.2  Fixed-Depth Merkle Hash Trie</w:t>
+        <w:t>B. Fixed-Depth Merkle Hash Trie</w:t>
       </w:r>
     </w:p>
     <w:p>
       <w:pPr>
+        <w:spacing w:line="240" w:lineRule="auto" w:after="0"/>
         <w:ind w:firstLine="0"/>
       </w:pPr>
       <w:r>
         <w:rPr>
-          <w:rFonts w:eastAsia="Times New Roman" w:cs="Times New Roman"/>
+          <w:rFonts w:eastAsia="Times New Roman" w:cs="Times New Roman" w:ascii="Times New Roman" w:hAnsi="Times New Roman"/>
+          <w:sz w:val="20"/>
         </w:rPr>
         <w:t>For the main experiment we set b=8 and d=4. Each level reads three bits from SHA-256(key), so twelve routing bits address 4,096 possible leaf buckets. A bucket still stores the full key, which means that two keys sharing a routing prefix remain distinguishable. Under uniform hashes the expected bucket occupancy is N/b^d. We test other b,d pairs separately instead of assuming that this default is optimal.</w:t>
       </w:r>
@@ -2213,21 +2416,29 @@
     <w:p>
       <w:pPr>
         <w:pStyle w:val="Heading2"/>
+        <w:keepNext/>
+        <w:spacing w:before="80" w:after="20"/>
+        <w:jc w:val="left"/>
       </w:pPr>
       <w:r>
         <w:rPr>
-          <w:rFonts w:ascii="Times New Roman" w:eastAsia="Times New Roman" w:hAnsi="Times New Roman" w:cs="Times New Roman"/>
+          <w:rFonts w:ascii="Times New Roman" w:hAnsi="Times New Roman"/>
+          <w:b w:val="0"/>
+          <w:i/>
+          <w:sz w:val="20"/>
         </w:rPr>
-        <w:t>3.3  Incremental Hashing and Commit</w:t>
+        <w:t>C. Incremental Hashing and Commit</w:t>
       </w:r>
     </w:p>
     <w:p>
       <w:pPr>
+        <w:spacing w:line="240" w:lineRule="auto" w:after="0"/>
         <w:ind w:firstLine="0"/>
       </w:pPr>
       <w:r>
         <w:rPr>
-          <w:rFonts w:eastAsia="Times New Roman" w:cs="Times New Roman"/>
+          <w:rFonts w:eastAsia="Times New Roman" w:cs="Times New Roman" w:ascii="Times New Roman" w:hAnsi="Times New Roman"/>
+          <w:sz w:val="20"/>
         </w:rPr>
         <w:t>A mutation batch is canonicalized, routed, and grouped by shared prefixes. Each affected leaf is rewritten once, and only the union of affected ancestor paths is rebuilt. Unchanged child hashes are copied into new internal nodes, providing structural sharing. One SQLite transaction then inserts new objects, the changeset, commit metadata, version alias, measurements, and updated HEAD. Reopen verifies payload hashes and references.</w:t>
       </w:r>
@@ -2235,19 +2446,20 @@
     <w:p>
       <w:pPr>
         <w:keepNext/>
-        <w:spacing w:before="40" w:line="240" w:lineRule="auto"/>
+        <w:spacing w:before="40" w:line="240" w:lineRule="auto" w:after="0"/>
         <w:ind w:firstLine="0"/>
         <w:jc w:val="center"/>
       </w:pPr>
       <w:r>
         <w:rPr>
-          <w:rFonts w:eastAsia="Times New Roman" w:cs="Times New Roman"/>
+          <w:rFonts w:eastAsia="Times New Roman" w:cs="Times New Roman" w:ascii="Times New Roman" w:hAnsi="Times New Roman"/>
           <w:noProof/>
+          <w:sz w:val="20"/>
         </w:rPr>
         <w:lastRenderedPageBreak/>
         <w:drawing>
           <wp:inline distT="0" distB="0" distL="0" distR="0" wp14:anchorId="0E8743F1" wp14:editId="76462CAB">
-            <wp:extent cx="5029200" cy="2615183"/>
+            <wp:extent cx="3063240" cy="2615183"/>
             <wp:effectExtent l="0" t="0" r="0" b="0"/>
             <wp:docPr id="2" name="Picture 2" descr="Incremental commit workflow followed by Revon-H selection between addressed changeset aggregation and hash-pruned Merkle comparison." title="Incremental commit workflow followed by Revon-H selection between addressed changeset aggregation and hash-pruned Merkle comparison"/>
             <wp:cNvGraphicFramePr>
@@ -2269,7 +2481,7 @@
                   <pic:spPr>
                     <a:xfrm>
                       <a:off x="0" y="0"/>
-                      <a:ext cx="5029200" cy="2615183"/>
+                      <a:ext cx="3063240" cy="2615183"/>
                     </a:xfrm>
                     <a:prstGeom prst="rect">
                       <a:avLst/>
@@ -2285,32 +2497,44 @@
     <w:p>
       <w:pPr>
         <w:pStyle w:val="Caption"/>
+        <w:keepNext/>
+        <w:spacing w:before="40" w:after="40"/>
+        <w:jc w:val="center"/>
       </w:pPr>
       <w:r>
         <w:rPr>
-          <w:rFonts w:eastAsia="Times New Roman" w:cs="Times New Roman"/>
+          <w:rFonts w:ascii="Times New Roman" w:hAnsi="Times New Roman"/>
+          <w:sz w:val="16"/>
         </w:rPr>
-        <w:t>Figure 2: Incremental commit path and adaptive diff decision.</w:t>
+        <w:t>Fig. 2. Incremental commit path and adaptive diff decision.</w:t>
       </w:r>
     </w:p>
     <w:p>
       <w:pPr>
         <w:pStyle w:val="Heading2"/>
+        <w:keepNext/>
+        <w:spacing w:before="80" w:after="20"/>
+        <w:jc w:val="left"/>
       </w:pPr>
       <w:r>
         <w:rPr>
-          <w:rFonts w:ascii="Times New Roman" w:eastAsia="Times New Roman" w:hAnsi="Times New Roman" w:cs="Times New Roman"/>
+          <w:rFonts w:ascii="Times New Roman" w:hAnsi="Times New Roman"/>
+          <w:b w:val="0"/>
+          <w:i/>
+          <w:sz w:val="20"/>
         </w:rPr>
-        <w:t>3.4  Hybrid Diff</w:t>
+        <w:t>D. Hybrid Diff</w:t>
       </w:r>
     </w:p>
     <w:p>
       <w:pPr>
+        <w:spacing w:line="240" w:lineRule="auto" w:after="0"/>
         <w:ind w:firstLine="0"/>
       </w:pPr>
       <w:r>
         <w:rPr>
-          <w:rFonts w:eastAsia="Times New Roman" w:cs="Times New Roman"/>
+          <w:rFonts w:eastAsia="Times New Roman" w:cs="Times New Roman" w:ascii="Times New Roman" w:hAnsi="Times New Roman"/>
+          <w:sz w:val="20"/>
         </w:rPr>
         <w:t>The log path walks the ancestor chain and aggregates key operations. The Merkle path recursively compares roots, prunes equal subtree hashes, and examines full leaf entries only below unequal paths. Revon-H counts accumulated ancestor operations and uses the log at or below 4,096 operations; it uses Merkle above that boundary. Revon-M forces the Merkle path and therefore serves only as an ablation.</w:t>
       </w:r>
@@ -2318,49 +2542,84 @@
     <w:p>
       <w:pPr>
         <w:pStyle w:val="Heading1"/>
+        <w:keepNext/>
+        <w:spacing w:before="120" w:after="60"/>
+        <w:jc w:val="center"/>
       </w:pPr>
       <w:r>
         <w:rPr>
-          <w:rFonts w:ascii="Times New Roman" w:eastAsia="Times New Roman" w:hAnsi="Times New Roman" w:cs="Times New Roman"/>
+          <w:rFonts w:ascii="Times New Roman" w:hAnsi="Times New Roman"/>
+          <w:b/>
+          <w:i w:val="0"/>
+          <w:sz w:val="20"/>
         </w:rPr>
-        <w:t>4  Experimental Methodology</w:t>
+        <w:t>IV. EXPERIMENTAL METHODOLOGY</w:t>
       </w:r>
     </w:p>
     <w:p>
       <w:pPr>
         <w:pStyle w:val="Heading2"/>
+        <w:keepNext/>
+        <w:spacing w:before="80" w:after="20"/>
+        <w:jc w:val="left"/>
       </w:pPr>
       <w:r>
         <w:rPr>
-          <w:rFonts w:ascii="Times New Roman" w:eastAsia="Times New Roman" w:hAnsi="Times New Roman" w:cs="Times New Roman"/>
+          <w:rFonts w:ascii="Times New Roman" w:hAnsi="Times New Roman"/>
+          <w:b w:val="0"/>
+          <w:i/>
+          <w:sz w:val="20"/>
         </w:rPr>
-        <w:t>4.1  Variants and Workloads</w:t>
+        <w:t>A. Variants and Workloads</w:t>
       </w:r>
     </w:p>
     <w:p>
       <w:pPr>
+        <w:spacing w:line="240" w:lineRule="auto" w:after="0"/>
         <w:ind w:firstLine="0"/>
+        <w:sectPr>
+          <w:type w:val="continuous"/>
+          <w:pgSz w:w="12240" w:h="15840"/>
+          <w:pgMar w:top="1080" w:right="900" w:bottom="1440" w:left="900" w:header="360" w:footer="360" w:gutter="0"/>
+          <w:cols w:num="2" w:space="360" w:equalWidth="1"/>
+        </w:sectPr>
       </w:pPr>
       <w:r>
         <w:rPr>
-          <w:rFonts w:eastAsia="Times New Roman" w:cs="Times New Roman"/>
+          <w:rFonts w:eastAsia="Times New Roman" w:cs="Times New Roman" w:ascii="Times New Roman" w:hAnsi="Times New Roman"/>
+          <w:sz w:val="20"/>
         </w:rPr>
         <w:t>Five comparison systems receive identical logical states and mutation batches: a complete Snapshot per version, an initial state plus operation-log baseline, forced-Merkle Revon-M, adaptive Revon-H, and Dolt 2.3.1 using a keyed SQL table and native JSON diff. Dolt initial import is tested two ways: batched SQL INSERT and CSV loaded with `dolt table import -r`; CSV serialization is included in the latter workflow's initial-import time. The import variants share the same Dolt engine for later operations, and their import times are kept distinct.</w:t>
       </w:r>
     </w:p>
+    <w:p>
+      <w:pPr>
+        <w:pStyle w:val="Caption"/>
+        <w:keepNext/>
+        <w:spacing w:before="40" w:after="40"/>
+        <w:jc w:val="center"/>
+      </w:pPr>
+      <w:r>
+        <w:rPr>
+          <w:rFonts w:ascii="Times New Roman" w:hAnsi="Times New Roman"/>
+          <w:sz w:val="16"/>
+        </w:rPr>
+        <w:t>TABLE II. Final evaluation workload matrix.</w:t>
+      </w:r>
+    </w:p>
     <w:tbl>
       <w:tblPr>
-        <w:tblW w:w="8500" w:type="dxa"/>
+        <w:tblW w:w="9020" w:type="dxa"/>
         <w:jc w:val="center"/>
         <w:tblLayout w:type="fixed"/>
         <w:tblLook w:val="04A0" w:firstRow="1" w:lastRow="0" w:firstColumn="1" w:lastColumn="0" w:noHBand="0" w:noVBand="1"/>
       </w:tblPr>
       <w:tblGrid>
-        <w:gridCol w:w="2500"/>
-        <w:gridCol w:w="1300"/>
-        <w:gridCol w:w="1200"/>
-        <w:gridCol w:w="1700"/>
-        <w:gridCol w:w="1800"/>
+        <w:gridCol w:w="2100"/>
+        <w:gridCol w:w="1100"/>
+        <w:gridCol w:w="800"/>
+        <w:gridCol w:w="900"/>
+        <w:gridCol w:w="4120"/>
       </w:tblGrid>
       <w:tr>
         <w:trPr>
@@ -2370,7 +2629,7 @@
         </w:trPr>
         <w:tc>
           <w:tcPr>
-            <w:tcW w:w="2500" w:type="dxa"/>
+            <w:tcW w:w="2100" w:type="dxa"/>
             <w:tcBorders>
               <w:top w:val="single" w:sz="6" w:space="0" w:color="000000"/>
               <w:left w:val="nil"/>
@@ -2404,7 +2663,7 @@
         </w:tc>
         <w:tc>
           <w:tcPr>
-            <w:tcW w:w="1300" w:type="dxa"/>
+            <w:tcW w:w="1100" w:type="dxa"/>
             <w:tcBorders>
               <w:top w:val="single" w:sz="6" w:space="0" w:color="000000"/>
               <w:left w:val="nil"/>
@@ -2438,7 +2697,7 @@
         </w:tc>
         <w:tc>
           <w:tcPr>
-            <w:tcW w:w="1200" w:type="dxa"/>
+            <w:tcW w:w="800" w:type="dxa"/>
             <w:tcBorders>
               <w:top w:val="single" w:sz="6" w:space="0" w:color="000000"/>
               <w:left w:val="nil"/>
@@ -2472,7 +2731,7 @@
         </w:tc>
         <w:tc>
           <w:tcPr>
-            <w:tcW w:w="1700" w:type="dxa"/>
+            <w:tcW w:w="900" w:type="dxa"/>
             <w:tcBorders>
               <w:top w:val="single" w:sz="6" w:space="0" w:color="000000"/>
               <w:left w:val="nil"/>
@@ -2506,7 +2765,7 @@
         </w:tc>
         <w:tc>
           <w:tcPr>
-            <w:tcW w:w="1800" w:type="dxa"/>
+            <w:tcW w:w="4120" w:type="dxa"/>
             <w:tcBorders>
               <w:top w:val="single" w:sz="6" w:space="0" w:color="000000"/>
               <w:left w:val="nil"/>
@@ -2546,7 +2805,7 @@
         </w:trPr>
         <w:tc>
           <w:tcPr>
-            <w:tcW w:w="2500" w:type="dxa"/>
+            <w:tcW w:w="2100" w:type="dxa"/>
             <w:tcBorders>
               <w:top w:val="nil"/>
               <w:left w:val="nil"/>
@@ -2579,7 +2838,7 @@
         </w:tc>
         <w:tc>
           <w:tcPr>
-            <w:tcW w:w="1300" w:type="dxa"/>
+            <w:tcW w:w="1100" w:type="dxa"/>
             <w:tcBorders>
               <w:top w:val="nil"/>
               <w:left w:val="nil"/>
@@ -2612,7 +2871,7 @@
         </w:tc>
         <w:tc>
           <w:tcPr>
-            <w:tcW w:w="1200" w:type="dxa"/>
+            <w:tcW w:w="800" w:type="dxa"/>
             <w:tcBorders>
               <w:top w:val="nil"/>
               <w:left w:val="nil"/>
@@ -2645,7 +2904,7 @@
         </w:tc>
         <w:tc>
           <w:tcPr>
-            <w:tcW w:w="1700" w:type="dxa"/>
+            <w:tcW w:w="900" w:type="dxa"/>
             <w:tcBorders>
               <w:top w:val="nil"/>
               <w:left w:val="nil"/>
@@ -2678,7 +2937,7 @@
         </w:tc>
         <w:tc>
           <w:tcPr>
-            <w:tcW w:w="1800" w:type="dxa"/>
+            <w:tcW w:w="4120" w:type="dxa"/>
             <w:tcBorders>
               <w:top w:val="nil"/>
               <w:left w:val="nil"/>
@@ -2717,7 +2976,7 @@
         </w:trPr>
         <w:tc>
           <w:tcPr>
-            <w:tcW w:w="2500" w:type="dxa"/>
+            <w:tcW w:w="2100" w:type="dxa"/>
             <w:tcBorders>
               <w:top w:val="nil"/>
               <w:left w:val="nil"/>
@@ -2750,7 +3009,7 @@
         </w:tc>
         <w:tc>
           <w:tcPr>
-            <w:tcW w:w="1300" w:type="dxa"/>
+            <w:tcW w:w="1100" w:type="dxa"/>
             <w:tcBorders>
               <w:top w:val="nil"/>
               <w:left w:val="nil"/>
@@ -2783,7 +3042,7 @@
         </w:tc>
         <w:tc>
           <w:tcPr>
-            <w:tcW w:w="1200" w:type="dxa"/>
+            <w:tcW w:w="800" w:type="dxa"/>
             <w:tcBorders>
               <w:top w:val="nil"/>
               <w:left w:val="nil"/>
@@ -2816,7 +3075,7 @@
         </w:tc>
         <w:tc>
           <w:tcPr>
-            <w:tcW w:w="1700" w:type="dxa"/>
+            <w:tcW w:w="900" w:type="dxa"/>
             <w:tcBorders>
               <w:top w:val="nil"/>
               <w:left w:val="nil"/>
@@ -2849,7 +3108,7 @@
         </w:tc>
         <w:tc>
           <w:tcPr>
-            <w:tcW w:w="1800" w:type="dxa"/>
+            <w:tcW w:w="4120" w:type="dxa"/>
             <w:tcBorders>
               <w:top w:val="nil"/>
               <w:left w:val="nil"/>
@@ -2888,7 +3147,7 @@
         </w:trPr>
         <w:tc>
           <w:tcPr>
-            <w:tcW w:w="2500" w:type="dxa"/>
+            <w:tcW w:w="2100" w:type="dxa"/>
             <w:tcBorders>
               <w:top w:val="nil"/>
               <w:left w:val="nil"/>
@@ -2921,7 +3180,7 @@
         </w:tc>
         <w:tc>
           <w:tcPr>
-            <w:tcW w:w="1300" w:type="dxa"/>
+            <w:tcW w:w="1100" w:type="dxa"/>
             <w:tcBorders>
               <w:top w:val="nil"/>
               <w:left w:val="nil"/>
@@ -2954,7 +3213,7 @@
         </w:tc>
         <w:tc>
           <w:tcPr>
-            <w:tcW w:w="1200" w:type="dxa"/>
+            <w:tcW w:w="800" w:type="dxa"/>
             <w:tcBorders>
               <w:top w:val="nil"/>
               <w:left w:val="nil"/>
@@ -2987,7 +3246,7 @@
         </w:tc>
         <w:tc>
           <w:tcPr>
-            <w:tcW w:w="1700" w:type="dxa"/>
+            <w:tcW w:w="900" w:type="dxa"/>
             <w:tcBorders>
               <w:top w:val="nil"/>
               <w:left w:val="nil"/>
@@ -3020,7 +3279,7 @@
         </w:tc>
         <w:tc>
           <w:tcPr>
-            <w:tcW w:w="1800" w:type="dxa"/>
+            <w:tcW w:w="4120" w:type="dxa"/>
             <w:tcBorders>
               <w:top w:val="nil"/>
               <w:left w:val="nil"/>
@@ -3059,7 +3318,7 @@
         </w:trPr>
         <w:tc>
           <w:tcPr>
-            <w:tcW w:w="2500" w:type="dxa"/>
+            <w:tcW w:w="2100" w:type="dxa"/>
             <w:tcBorders>
               <w:top w:val="nil"/>
               <w:left w:val="nil"/>
@@ -3092,7 +3351,7 @@
         </w:tc>
         <w:tc>
           <w:tcPr>
-            <w:tcW w:w="1300" w:type="dxa"/>
+            <w:tcW w:w="1100" w:type="dxa"/>
             <w:tcBorders>
               <w:top w:val="nil"/>
               <w:left w:val="nil"/>
@@ -3125,7 +3384,7 @@
         </w:tc>
         <w:tc>
           <w:tcPr>
-            <w:tcW w:w="1200" w:type="dxa"/>
+            <w:tcW w:w="800" w:type="dxa"/>
             <w:tcBorders>
               <w:top w:val="nil"/>
               <w:left w:val="nil"/>
@@ -3158,7 +3417,7 @@
         </w:tc>
         <w:tc>
           <w:tcPr>
-            <w:tcW w:w="1700" w:type="dxa"/>
+            <w:tcW w:w="900" w:type="dxa"/>
             <w:tcBorders>
               <w:top w:val="nil"/>
               <w:left w:val="nil"/>
@@ -3191,7 +3450,7 @@
         </w:tc>
         <w:tc>
           <w:tcPr>
-            <w:tcW w:w="1800" w:type="dxa"/>
+            <w:tcW w:w="4120" w:type="dxa"/>
             <w:tcBorders>
               <w:top w:val="nil"/>
               <w:left w:val="nil"/>
@@ -3230,11 +3489,11 @@
         </w:trPr>
         <w:tc>
           <w:tcPr>
-            <w:tcW w:w="2500" w:type="dxa"/>
+            <w:tcW w:w="2100" w:type="dxa"/>
             <w:tcBorders>
               <w:top w:val="nil"/>
               <w:left w:val="nil"/>
-              <w:bottom w:val="single" w:sz="6" w:space="0" w:color="000000"/>
+              <w:bottom w:val="nil"/>
               <w:right w:val="nil"/>
             </w:tcBorders>
             <w:tcMar>
@@ -3263,11 +3522,11 @@
         </w:tc>
         <w:tc>
           <w:tcPr>
-            <w:tcW w:w="1300" w:type="dxa"/>
+            <w:tcW w:w="1100" w:type="dxa"/>
             <w:tcBorders>
               <w:top w:val="nil"/>
               <w:left w:val="nil"/>
-              <w:bottom w:val="single" w:sz="6" w:space="0" w:color="000000"/>
+              <w:bottom w:val="nil"/>
               <w:right w:val="nil"/>
             </w:tcBorders>
             <w:tcMar>
@@ -3296,11 +3555,11 @@
         </w:tc>
         <w:tc>
           <w:tcPr>
-            <w:tcW w:w="1200" w:type="dxa"/>
+            <w:tcW w:w="800" w:type="dxa"/>
             <w:tcBorders>
               <w:top w:val="nil"/>
               <w:left w:val="nil"/>
-              <w:bottom w:val="single" w:sz="6" w:space="0" w:color="000000"/>
+              <w:bottom w:val="nil"/>
               <w:right w:val="nil"/>
             </w:tcBorders>
             <w:tcMar>
@@ -3329,11 +3588,11 @@
         </w:tc>
         <w:tc>
           <w:tcPr>
-            <w:tcW w:w="1700" w:type="dxa"/>
+            <w:tcW w:w="900" w:type="dxa"/>
             <w:tcBorders>
               <w:top w:val="nil"/>
               <w:left w:val="nil"/>
-              <w:bottom w:val="single" w:sz="6" w:space="0" w:color="000000"/>
+              <w:bottom w:val="nil"/>
               <w:right w:val="nil"/>
             </w:tcBorders>
             <w:tcMar>
@@ -3362,11 +3621,11 @@
         </w:tc>
         <w:tc>
           <w:tcPr>
-            <w:tcW w:w="1800" w:type="dxa"/>
+            <w:tcW w:w="4120" w:type="dxa"/>
             <w:tcBorders>
               <w:top w:val="nil"/>
               <w:left w:val="nil"/>
-              <w:bottom w:val="single" w:sz="6" w:space="0" w:color="000000"/>
+              <w:bottom w:val="nil"/>
               <w:right w:val="nil"/>
             </w:tcBorders>
             <w:tcMar>
@@ -3395,156 +3654,513 @@
         </w:tc>
       </w:tr>
       <w:tr>
+        <w:trPr>
+          <w:cantSplit/>
+          <w:jc w:val="center"/>
+        </w:trPr>
         <w:tc>
           <w:tcPr>
-            <w:tcW w:type="dxa" w:w="2500"/>
+            <w:tcW w:type="dxa" w:w="2100"/>
+            <w:tcBorders>
+              <w:top w:val="nil"/>
+              <w:left w:val="nil"/>
+              <w:bottom w:val="nil"/>
+              <w:right w:val="nil"/>
+            </w:tcBorders>
+            <w:tcMar>
+              <w:top w:w="16" w:type="dxa"/>
+              <w:left w:w="25" w:type="dxa"/>
+              <w:bottom w:w="16" w:type="dxa"/>
+              <w:right w:w="25" w:type="dxa"/>
+            </w:tcMar>
+            <w:vAlign w:val="center"/>
           </w:tcPr>
           <w:p>
+            <w:pPr>
+              <w:keepNext/>
+              <w:spacing w:line="200" w:lineRule="exact"/>
+              <w:ind w:firstLine="0"/>
+              <w:jc w:val="left"/>
+            </w:pPr>
             <w:r>
+              <w:rPr>
+                <w:rFonts w:eastAsia="Times New Roman" w:cs="Times New Roman"/>
+                <w:sz w:val="18"/>
+              </w:rPr>
               <w:t>Range local</w:t>
             </w:r>
           </w:p>
         </w:tc>
         <w:tc>
           <w:tcPr>
-            <w:tcW w:type="dxa" w:w="1300"/>
+            <w:tcW w:type="dxa" w:w="1100"/>
+            <w:tcBorders>
+              <w:top w:val="nil"/>
+              <w:left w:val="nil"/>
+              <w:bottom w:val="nil"/>
+              <w:right w:val="nil"/>
+            </w:tcBorders>
+            <w:tcMar>
+              <w:top w:w="16" w:type="dxa"/>
+              <w:left w:w="25" w:type="dxa"/>
+              <w:bottom w:w="16" w:type="dxa"/>
+              <w:right w:w="25" w:type="dxa"/>
+            </w:tcMar>
+            <w:vAlign w:val="center"/>
           </w:tcPr>
           <w:p>
+            <w:pPr>
+              <w:keepNext/>
+              <w:spacing w:line="200" w:lineRule="exact"/>
+              <w:ind w:firstLine="0"/>
+              <w:jc w:val="center"/>
+            </w:pPr>
             <w:r>
+              <w:rPr>
+                <w:rFonts w:eastAsia="Times New Roman" w:cs="Times New Roman"/>
+                <w:sz w:val="18"/>
+              </w:rPr>
               <w:t>100,000</w:t>
             </w:r>
           </w:p>
         </w:tc>
         <w:tc>
           <w:tcPr>
-            <w:tcW w:type="dxa" w:w="1200"/>
+            <w:tcW w:type="dxa" w:w="800"/>
+            <w:tcBorders>
+              <w:top w:val="nil"/>
+              <w:left w:val="nil"/>
+              <w:bottom w:val="nil"/>
+              <w:right w:val="nil"/>
+            </w:tcBorders>
+            <w:tcMar>
+              <w:top w:w="16" w:type="dxa"/>
+              <w:left w:w="25" w:type="dxa"/>
+              <w:bottom w:w="16" w:type="dxa"/>
+              <w:right w:w="25" w:type="dxa"/>
+            </w:tcMar>
+            <w:vAlign w:val="center"/>
           </w:tcPr>
           <w:p>
+            <w:pPr>
+              <w:keepNext/>
+              <w:spacing w:line="200" w:lineRule="exact"/>
+              <w:ind w:firstLine="0"/>
+              <w:jc w:val="center"/>
+            </w:pPr>
             <w:r>
+              <w:rPr>
+                <w:rFonts w:eastAsia="Times New Roman" w:cs="Times New Roman"/>
+                <w:sz w:val="18"/>
+              </w:rPr>
               <w:t>10</w:t>
             </w:r>
           </w:p>
         </w:tc>
         <w:tc>
           <w:tcPr>
-            <w:tcW w:type="dxa" w:w="1700"/>
+            <w:tcW w:type="dxa" w:w="900"/>
+            <w:tcBorders>
+              <w:top w:val="nil"/>
+              <w:left w:val="nil"/>
+              <w:bottom w:val="nil"/>
+              <w:right w:val="nil"/>
+            </w:tcBorders>
+            <w:tcMar>
+              <w:top w:w="16" w:type="dxa"/>
+              <w:left w:w="25" w:type="dxa"/>
+              <w:bottom w:w="16" w:type="dxa"/>
+              <w:right w:w="25" w:type="dxa"/>
+            </w:tcMar>
+            <w:vAlign w:val="center"/>
           </w:tcPr>
           <w:p>
+            <w:pPr>
+              <w:keepNext/>
+              <w:spacing w:line="200" w:lineRule="exact"/>
+              <w:ind w:firstLine="0"/>
+              <w:jc w:val="center"/>
+            </w:pPr>
             <w:r>
+              <w:rPr>
+                <w:rFonts w:eastAsia="Times New Roman" w:cs="Times New Roman"/>
+                <w:sz w:val="18"/>
+              </w:rPr>
               <w:t>100</w:t>
             </w:r>
           </w:p>
         </w:tc>
         <w:tc>
           <w:tcPr>
-            <w:tcW w:type="dxa" w:w="1800"/>
+            <w:tcW w:type="dxa" w:w="4120"/>
+            <w:tcBorders>
+              <w:top w:val="nil"/>
+              <w:left w:val="nil"/>
+              <w:bottom w:val="nil"/>
+              <w:right w:val="nil"/>
+            </w:tcBorders>
+            <w:tcMar>
+              <w:top w:w="16" w:type="dxa"/>
+              <w:left w:w="25" w:type="dxa"/>
+              <w:bottom w:w="16" w:type="dxa"/>
+              <w:right w:w="25" w:type="dxa"/>
+            </w:tcMar>
+            <w:vAlign w:val="center"/>
           </w:tcPr>
           <w:p>
+            <w:pPr>
+              <w:keepNext/>
+              <w:spacing w:line="200" w:lineRule="exact"/>
+              <w:ind w:firstLine="0"/>
+              <w:jc w:val="center"/>
+            </w:pPr>
             <w:r>
+              <w:rPr>
+                <w:rFonts w:eastAsia="Times New Roman" w:cs="Times New Roman"/>
+                <w:sz w:val="18"/>
+              </w:rPr>
               <w:t>contiguous sorted-key intervals</w:t>
             </w:r>
           </w:p>
         </w:tc>
       </w:tr>
       <w:tr>
+        <w:trPr>
+          <w:cantSplit/>
+          <w:jc w:val="center"/>
+        </w:trPr>
         <w:tc>
           <w:tcPr>
-            <w:tcW w:type="dxa" w:w="2500"/>
+            <w:tcW w:type="dxa" w:w="2100"/>
+            <w:tcBorders>
+              <w:top w:val="nil"/>
+              <w:left w:val="nil"/>
+              <w:bottom w:val="nil"/>
+              <w:right w:val="nil"/>
+            </w:tcBorders>
+            <w:tcMar>
+              <w:top w:w="16" w:type="dxa"/>
+              <w:left w:w="25" w:type="dxa"/>
+              <w:bottom w:w="16" w:type="dxa"/>
+              <w:right w:w="25" w:type="dxa"/>
+            </w:tcMar>
+            <w:vAlign w:val="center"/>
           </w:tcPr>
           <w:p>
+            <w:pPr>
+              <w:keepNext/>
+              <w:spacing w:line="200" w:lineRule="exact"/>
+              <w:ind w:firstLine="0"/>
+              <w:jc w:val="left"/>
+            </w:pPr>
             <w:r>
+              <w:rPr>
+                <w:rFonts w:eastAsia="Times New Roman" w:cs="Times New Roman"/>
+                <w:sz w:val="18"/>
+              </w:rPr>
               <w:t>Repeated key</w:t>
             </w:r>
           </w:p>
         </w:tc>
         <w:tc>
           <w:tcPr>
-            <w:tcW w:type="dxa" w:w="1300"/>
+            <w:tcW w:type="dxa" w:w="1100"/>
+            <w:tcBorders>
+              <w:top w:val="nil"/>
+              <w:left w:val="nil"/>
+              <w:bottom w:val="nil"/>
+              <w:right w:val="nil"/>
+            </w:tcBorders>
+            <w:tcMar>
+              <w:top w:w="16" w:type="dxa"/>
+              <w:left w:w="25" w:type="dxa"/>
+              <w:bottom w:w="16" w:type="dxa"/>
+              <w:right w:w="25" w:type="dxa"/>
+            </w:tcMar>
+            <w:vAlign w:val="center"/>
           </w:tcPr>
           <w:p>
+            <w:pPr>
+              <w:keepNext/>
+              <w:spacing w:line="200" w:lineRule="exact"/>
+              <w:ind w:firstLine="0"/>
+              <w:jc w:val="center"/>
+            </w:pPr>
             <w:r>
+              <w:rPr>
+                <w:rFonts w:eastAsia="Times New Roman" w:cs="Times New Roman"/>
+                <w:sz w:val="18"/>
+              </w:rPr>
               <w:t>100,000</w:t>
             </w:r>
           </w:p>
         </w:tc>
         <w:tc>
           <w:tcPr>
-            <w:tcW w:type="dxa" w:w="1200"/>
+            <w:tcW w:type="dxa" w:w="800"/>
+            <w:tcBorders>
+              <w:top w:val="nil"/>
+              <w:left w:val="nil"/>
+              <w:bottom w:val="nil"/>
+              <w:right w:val="nil"/>
+            </w:tcBorders>
+            <w:tcMar>
+              <w:top w:w="16" w:type="dxa"/>
+              <w:left w:w="25" w:type="dxa"/>
+              <w:bottom w:w="16" w:type="dxa"/>
+              <w:right w:w="25" w:type="dxa"/>
+            </w:tcMar>
+            <w:vAlign w:val="center"/>
           </w:tcPr>
           <w:p>
+            <w:pPr>
+              <w:keepNext/>
+              <w:spacing w:line="200" w:lineRule="exact"/>
+              <w:ind w:firstLine="0"/>
+              <w:jc w:val="center"/>
+            </w:pPr>
             <w:r>
+              <w:rPr>
+                <w:rFonts w:eastAsia="Times New Roman" w:cs="Times New Roman"/>
+                <w:sz w:val="18"/>
+              </w:rPr>
               <w:t>10</w:t>
             </w:r>
           </w:p>
         </w:tc>
         <w:tc>
           <w:tcPr>
-            <w:tcW w:type="dxa" w:w="1700"/>
+            <w:tcW w:type="dxa" w:w="900"/>
+            <w:tcBorders>
+              <w:top w:val="nil"/>
+              <w:left w:val="nil"/>
+              <w:bottom w:val="nil"/>
+              <w:right w:val="nil"/>
+            </w:tcBorders>
+            <w:tcMar>
+              <w:top w:w="16" w:type="dxa"/>
+              <w:left w:w="25" w:type="dxa"/>
+              <w:bottom w:w="16" w:type="dxa"/>
+              <w:right w:w="25" w:type="dxa"/>
+            </w:tcMar>
+            <w:vAlign w:val="center"/>
           </w:tcPr>
           <w:p>
+            <w:pPr>
+              <w:keepNext/>
+              <w:spacing w:line="200" w:lineRule="exact"/>
+              <w:ind w:firstLine="0"/>
+              <w:jc w:val="center"/>
+            </w:pPr>
             <w:r>
+              <w:rPr>
+                <w:rFonts w:eastAsia="Times New Roman" w:cs="Times New Roman"/>
+                <w:sz w:val="18"/>
+              </w:rPr>
               <w:t>100</w:t>
             </w:r>
           </w:p>
         </w:tc>
         <w:tc>
           <w:tcPr>
-            <w:tcW w:type="dxa" w:w="1800"/>
+            <w:tcW w:type="dxa" w:w="4120"/>
+            <w:tcBorders>
+              <w:top w:val="nil"/>
+              <w:left w:val="nil"/>
+              <w:bottom w:val="nil"/>
+              <w:right w:val="nil"/>
+            </w:tcBorders>
+            <w:tcMar>
+              <w:top w:w="16" w:type="dxa"/>
+              <w:left w:w="25" w:type="dxa"/>
+              <w:bottom w:w="16" w:type="dxa"/>
+              <w:right w:w="25" w:type="dxa"/>
+            </w:tcMar>
+            <w:vAlign w:val="center"/>
           </w:tcPr>
           <w:p>
+            <w:pPr>
+              <w:keepNext/>
+              <w:spacing w:line="200" w:lineRule="exact"/>
+              <w:ind w:firstLine="0"/>
+              <w:jc w:val="center"/>
+            </w:pPr>
             <w:r>
+              <w:rPr>
+                <w:rFonts w:eastAsia="Times New Roman" w:cs="Times New Roman"/>
+                <w:sz w:val="18"/>
+              </w:rPr>
               <w:t>repeated small key set</w:t>
             </w:r>
           </w:p>
         </w:tc>
       </w:tr>
       <w:tr>
+        <w:trPr>
+          <w:cantSplit/>
+          <w:jc w:val="center"/>
+        </w:trPr>
         <w:tc>
           <w:tcPr>
-            <w:tcW w:type="dxa" w:w="2500"/>
+            <w:tcW w:type="dxa" w:w="2100"/>
+            <w:tcBorders>
+              <w:top w:val="nil"/>
+              <w:left w:val="nil"/>
+              <w:right w:val="nil"/>
+              <w:bottom w:val="single" w:sz="6" w:space="0" w:color="000000"/>
+            </w:tcBorders>
+            <w:tcMar>
+              <w:top w:w="16" w:type="dxa"/>
+              <w:left w:w="25" w:type="dxa"/>
+              <w:bottom w:w="16" w:type="dxa"/>
+              <w:right w:w="25" w:type="dxa"/>
+            </w:tcMar>
+            <w:vAlign w:val="center"/>
           </w:tcPr>
           <w:p>
+            <w:pPr>
+              <w:keepNext/>
+              <w:spacing w:line="200" w:lineRule="exact"/>
+              <w:ind w:firstLine="0"/>
+              <w:jc w:val="left"/>
+            </w:pPr>
             <w:r>
+              <w:rPr>
+                <w:rFonts w:eastAsia="Times New Roman" w:cs="Times New Roman"/>
+                <w:sz w:val="18"/>
+              </w:rPr>
               <w:t>Hash-route local</w:t>
             </w:r>
           </w:p>
         </w:tc>
         <w:tc>
           <w:tcPr>
-            <w:tcW w:type="dxa" w:w="1300"/>
+            <w:tcW w:type="dxa" w:w="1100"/>
+            <w:tcBorders>
+              <w:top w:val="nil"/>
+              <w:left w:val="nil"/>
+              <w:right w:val="nil"/>
+              <w:bottom w:val="single" w:sz="6" w:space="0" w:color="000000"/>
+            </w:tcBorders>
+            <w:tcMar>
+              <w:top w:w="16" w:type="dxa"/>
+              <w:left w:w="25" w:type="dxa"/>
+              <w:bottom w:w="16" w:type="dxa"/>
+              <w:right w:w="25" w:type="dxa"/>
+            </w:tcMar>
+            <w:vAlign w:val="center"/>
           </w:tcPr>
           <w:p>
+            <w:pPr>
+              <w:keepNext/>
+              <w:spacing w:line="200" w:lineRule="exact"/>
+              <w:ind w:firstLine="0"/>
+              <w:jc w:val="center"/>
+            </w:pPr>
             <w:r>
+              <w:rPr>
+                <w:rFonts w:eastAsia="Times New Roman" w:cs="Times New Roman"/>
+                <w:sz w:val="18"/>
+              </w:rPr>
               <w:t>100,000</w:t>
             </w:r>
           </w:p>
         </w:tc>
         <w:tc>
           <w:tcPr>
-            <w:tcW w:type="dxa" w:w="1200"/>
+            <w:tcW w:type="dxa" w:w="800"/>
+            <w:tcBorders>
+              <w:top w:val="nil"/>
+              <w:left w:val="nil"/>
+              <w:right w:val="nil"/>
+              <w:bottom w:val="single" w:sz="6" w:space="0" w:color="000000"/>
+            </w:tcBorders>
+            <w:tcMar>
+              <w:top w:w="16" w:type="dxa"/>
+              <w:left w:w="25" w:type="dxa"/>
+              <w:bottom w:w="16" w:type="dxa"/>
+              <w:right w:w="25" w:type="dxa"/>
+            </w:tcMar>
+            <w:vAlign w:val="center"/>
           </w:tcPr>
           <w:p>
+            <w:pPr>
+              <w:keepNext/>
+              <w:spacing w:line="200" w:lineRule="exact"/>
+              <w:ind w:firstLine="0"/>
+              <w:jc w:val="center"/>
+            </w:pPr>
             <w:r>
+              <w:rPr>
+                <w:rFonts w:eastAsia="Times New Roman" w:cs="Times New Roman"/>
+                <w:sz w:val="18"/>
+              </w:rPr>
               <w:t>10</w:t>
             </w:r>
           </w:p>
         </w:tc>
         <w:tc>
           <w:tcPr>
-            <w:tcW w:type="dxa" w:w="1700"/>
+            <w:tcW w:type="dxa" w:w="900"/>
+            <w:tcBorders>
+              <w:top w:val="nil"/>
+              <w:left w:val="nil"/>
+              <w:right w:val="nil"/>
+              <w:bottom w:val="single" w:sz="6" w:space="0" w:color="000000"/>
+            </w:tcBorders>
+            <w:tcMar>
+              <w:top w:w="16" w:type="dxa"/>
+              <w:left w:w="25" w:type="dxa"/>
+              <w:bottom w:w="16" w:type="dxa"/>
+              <w:right w:w="25" w:type="dxa"/>
+            </w:tcMar>
+            <w:vAlign w:val="center"/>
           </w:tcPr>
           <w:p>
+            <w:pPr>
+              <w:keepNext/>
+              <w:spacing w:line="200" w:lineRule="exact"/>
+              <w:ind w:firstLine="0"/>
+              <w:jc w:val="center"/>
+            </w:pPr>
             <w:r>
+              <w:rPr>
+                <w:rFonts w:eastAsia="Times New Roman" w:cs="Times New Roman"/>
+                <w:sz w:val="18"/>
+              </w:rPr>
               <w:t>100</w:t>
             </w:r>
           </w:p>
         </w:tc>
         <w:tc>
           <w:tcPr>
-            <w:tcW w:type="dxa" w:w="1800"/>
+            <w:tcW w:type="dxa" w:w="4120"/>
+            <w:tcBorders>
+              <w:top w:val="nil"/>
+              <w:left w:val="nil"/>
+              <w:right w:val="nil"/>
+              <w:bottom w:val="single" w:sz="6" w:space="0" w:color="000000"/>
+            </w:tcBorders>
+            <w:tcMar>
+              <w:top w:w="16" w:type="dxa"/>
+              <w:left w:w="25" w:type="dxa"/>
+              <w:bottom w:w="16" w:type="dxa"/>
+              <w:right w:w="25" w:type="dxa"/>
+            </w:tcMar>
+            <w:vAlign w:val="center"/>
           </w:tcPr>
           <w:p>
+            <w:pPr>
+              <w:keepNext/>
+              <w:spacing w:line="200" w:lineRule="exact"/>
+              <w:ind w:firstLine="0"/>
+              <w:jc w:val="center"/>
+            </w:pPr>
             <w:r>
+              <w:rPr>
+                <w:rFonts w:eastAsia="Times New Roman" w:cs="Times New Roman"/>
+                <w:sz w:val="18"/>
+              </w:rPr>
               <w:t>shared 9-bit SHA-256 prefix</w:t>
             </w:r>
           </w:p>
@@ -3553,33 +4169,40 @@
     </w:tbl>
     <w:p>
       <w:pPr>
-        <w:pStyle w:val="Caption"/>
+        <w:sectPr>
+          <w:type w:val="continuous"/>
+          <w:pgSz w:w="12240" w:h="15840"/>
+          <w:pgMar w:top="1080" w:right="900" w:bottom="1440" w:left="900" w:header="360" w:footer="360" w:gutter="0"/>
+          <w:cols w:num="1" w:space="0" w:equalWidth="1"/>
+        </w:sectPr>
+      </w:pPr>
+    </w:p>
+    <w:p>
+      <w:pPr>
+        <w:pStyle w:val="Heading2"/>
+        <w:keepNext/>
+        <w:spacing w:before="80" w:after="20"/>
+        <w:jc w:val="left"/>
       </w:pPr>
       <w:r>
         <w:rPr>
-          <w:rFonts w:eastAsia="Times New Roman" w:cs="Times New Roman"/>
+          <w:rFonts w:ascii="Times New Roman" w:hAnsi="Times New Roman"/>
+          <w:b w:val="0"/>
+          <w:i/>
+          <w:sz w:val="20"/>
         </w:rPr>
-        <w:t>Table 2: Final evaluation workload matrix.</w:t>
+        <w:t>B. Measurement Contract</w:t>
       </w:r>
     </w:p>
     <w:p>
       <w:pPr>
-        <w:pStyle w:val="Heading2"/>
+        <w:spacing w:line="240" w:lineRule="auto" w:after="0"/>
+        <w:ind w:firstLine="0"/>
       </w:pPr>
       <w:r>
         <w:rPr>
-          <w:rFonts w:ascii="Times New Roman" w:eastAsia="Times New Roman" w:hAnsi="Times New Roman" w:cs="Times New Roman"/>
-        </w:rPr>
-        <w:t>4.2  Measurement Contract</w:t>
-      </w:r>
-    </w:p>
-    <w:p>
-      <w:pPr>
-        <w:ind w:firstLine="0"/>
-      </w:pPr>
-      <w:r>
-        <w:rPr>
-          <w:rFonts w:eastAsia="Times New Roman" w:cs="Times New Roman"/>
+          <w:rFonts w:eastAsia="Times New Roman" w:cs="Times New Roman" w:ascii="Times New Roman" w:hAnsi="Times New Roman"/>
+          <w:sz w:val="20"/>
         </w:rPr>
         <w:t>Initial import measures the first durable state; incremental commit is the within-trial median across ten commits; diff and checkout both materialize common outputs inside their timed regions. Diff is sorted changed keys with old/new SHA-256 value hashes encoded as canonical JSON. Checkout is the complete sorted key/value state encoded as canonical UTF-8 JSON. Dolt JSON parsing and normalization are included. Correctness compares the full state and hash contract with the workload oracle. Dolt SQL-path commit timing includes SQL mutation, add, and commit; commit hashes are retained for historical checkout and no version tags are created. Timed operations run without tracemalloc. An external parent process samples process-tree RSS every 10 ms for each isolated primary trial, including Dolt children; sampling is outside timed operations. A separate Windows sensitivity telemetry run has 405 rows (315 measured) with RSS, CPU, read/write bytes, and serial commit throughput in every row; all rows passed correctness checks and the schema-2 audit. These counters include setup and correctness work, not only timed operations. The WSL2 replication has incomplete I/O coverage and used the same physical host. Work-examined units differ by system and are not normalized.</w:t>
       </w:r>
@@ -3587,45 +4210,55 @@
     <w:p>
       <w:pPr>
         <w:pStyle w:val="Heading2"/>
+        <w:keepNext/>
+        <w:spacing w:before="80" w:after="20"/>
+        <w:jc w:val="left"/>
       </w:pPr>
       <w:r>
         <w:rPr>
-          <w:rFonts w:ascii="Times New Roman" w:eastAsia="Times New Roman" w:hAnsi="Times New Roman" w:cs="Times New Roman"/>
+          <w:rFonts w:ascii="Times New Roman" w:hAnsi="Times New Roman"/>
+          <w:b w:val="0"/>
+          <w:i/>
+          <w:sz w:val="20"/>
         </w:rPr>
-        <w:t>4.3  Repetition, Calibration, and Integrity</w:t>
+        <w:t>C. Repetition, Calibration, and Integrity</w:t>
       </w:r>
     </w:p>
     <w:p>
       <w:pPr>
+        <w:spacing w:line="240" w:lineRule="auto" w:after="0"/>
         <w:ind w:firstLine="0"/>
       </w:pPr>
       <w:r>
         <w:rPr>
-          <w:rFonts w:eastAsia="Times New Roman" w:cs="Times New Roman"/>
+          <w:rFonts w:eastAsia="Times New Roman" w:cs="Times New Roman" w:ascii="Times New Roman" w:hAnsi="Times New Roman"/>
+          <w:sz w:val="20"/>
         </w:rPr>
         <w:t>The primary matrix has two warm-ups and seven measured trials per configuration: 120 warm-ups and 420 measured runs across calibration and evaluation. The primary five-system evaluation contains 280 measured runs, including 56 SQL-path Dolt runs; 56 additional measured runs use Dolt bulk import. Model order is counterbalanced and recorded. Each system/trial runs in a clean worker. The primary run reuses one deterministic workload per scenario, regenerated and digest-checked by the internal audit. Run b7a4ec7b610742d9b827f43fd5092fe2 used Windows-11-10.0.26200-SP0 and Python 3.14.3. For each scenario and comparison, latency ratios are formed from matching trial numbers; a 20,000-resample percentile bootstrap of the seven paired ratios supplies a 95% interval. These intervals describe run-to-run variation conditional on the fixed workload and host, not variation across datasets or machines. Intervals that include parity are classified as inconclusive; a 5% practical margin is used as an analyst-selected label, not as an external standard.</w:t>
       </w:r>
       <w:r>
         <w:rPr>
-          <w:rFonts w:eastAsia="Times New Roman" w:cs="Times New Roman"/>
+          <w:rFonts w:eastAsia="Times New Roman" w:cs="Times New Roman" w:ascii="Times New Roman" w:hAnsi="Times New Roman"/>
+          <w:sz w:val="20"/>
         </w:rPr>
       </w:r>
     </w:p>
     <w:p>
       <w:pPr>
         <w:keepNext/>
-        <w:spacing w:before="40" w:line="240" w:lineRule="auto"/>
+        <w:spacing w:before="40" w:line="240" w:lineRule="auto" w:after="0"/>
         <w:ind w:firstLine="0"/>
         <w:jc w:val="center"/>
       </w:pPr>
       <w:r>
         <w:rPr>
-          <w:rFonts w:eastAsia="Times New Roman" w:cs="Times New Roman"/>
+          <w:rFonts w:eastAsia="Times New Roman" w:cs="Times New Roman" w:ascii="Times New Roman" w:hAnsi="Times New Roman"/>
           <w:noProof/>
+          <w:sz w:val="20"/>
         </w:rPr>
         <w:drawing>
           <wp:inline distT="0" distB="0" distL="0" distR="0" wp14:anchorId="7D2C9E31" wp14:editId="33BDCA98">
-            <wp:extent cx="4800600" cy="2700338"/>
+            <wp:extent cx="3063240" cy="2700338"/>
             <wp:effectExtent l="0" t="0" r="0" b="0"/>
             <wp:docPr id="3" name="Picture 3" descr="Calibration plot comparing log aggregation and forced-Merkle diff latency across accumulated operation counts, with the frozen 4,096-operation boundary." title="Calibration plot comparing log aggregation and forced-Merkle diff latency across accumulated operation counts, with the frozen 4,096-operation boundary"/>
             <wp:cNvGraphicFramePr>
@@ -3647,7 +4280,7 @@
                   <pic:spPr>
                     <a:xfrm>
                       <a:off x="0" y="0"/>
-                      <a:ext cx="4800600" cy="2700338"/>
+                      <a:ext cx="3063240" cy="2700338"/>
                     </a:xfrm>
                     <a:prstGeom prst="rect">
                       <a:avLst/>
@@ -3663,18 +4296,26 @@
     <w:p>
       <w:pPr>
         <w:pStyle w:val="Caption"/>
+        <w:keepNext/>
+        <w:spacing w:before="40" w:after="40"/>
+        <w:jc w:val="center"/>
       </w:pPr>
       <w:r>
         <w:rPr>
-          <w:rFonts w:eastAsia="Times New Roman" w:cs="Times New Roman"/>
+          <w:rFonts w:ascii="Times New Roman" w:hAnsi="Times New Roman"/>
+          <w:sz w:val="16"/>
         </w:rPr>
-        <w:t>Figure 3: Independent threshold calibration; 4,096 is the largest sampled log-favorable point.</w:t>
+        <w:t>Fig. 3. Independent threshold calibration; 4,096 is the largest sampled log-favorable point.</w:t>
       </w:r>
     </w:p>
     <w:p>
+      <w:pPr>
+        <w:spacing w:line="240" w:lineRule="auto" w:after="0"/>
+      </w:pPr>
       <w:r>
         <w:rPr>
-          <w:rFonts w:eastAsia="Times New Roman" w:cs="Times New Roman"/>
+          <w:rFonts w:eastAsia="Times New Roman" w:cs="Times New Roman" w:ascii="Times New Roman" w:hAnsi="Times New Roman"/>
+          <w:sz w:val="20"/>
         </w:rPr>
         <w:t>The 4,096-operation boundary is a frozen policy for this machine, not a universal crossover. All 540 primary executions completed successfully and passed state and diff checks. The audit retained all 127 Tukey outlier candidates; no observation was deleted. A separate sensitivity run varies seed, payload size, history length, and update pattern; it is kept separate from the primary tables.</w:t>
       </w:r>
@@ -3682,54 +4323,61 @@
     <w:p>
       <w:pPr>
         <w:pStyle w:val="Heading1"/>
-      </w:pPr>
-      <w:proofErr w:type="gramStart"/>
+        <w:keepNext/>
+        <w:spacing w:before="120" w:after="60"/>
+        <w:jc w:val="center"/>
+      </w:pPr>
       <w:r>
+        <w:rPr>
+          <w:rFonts w:ascii="Times New Roman" w:hAnsi="Times New Roman"/>
+          <w:b/>
+          <w:i w:val="0"/>
+          <w:sz w:val="20"/>
+        </w:rPr>
+        <w:t>V. RESULTS</w:t>
+      </w:r>
+    </w:p>
+    <w:p>
+      <w:pPr>
+        <w:pStyle w:val="Heading2"/>
+        <w:keepNext/>
+        <w:spacing w:before="80" w:after="20"/>
+        <w:jc w:val="left"/>
         <w:rPr>
           <w:rFonts w:ascii="Times New Roman" w:eastAsia="Times New Roman" w:hAnsi="Times New Roman" w:cs="Times New Roman"/>
         </w:rPr>
-        <w:t>5  Results</w:t>
+      </w:pPr>
+      <w:r>
+        <w:rPr>
+          <w:rFonts w:ascii="Times New Roman" w:hAnsi="Times New Roman"/>
+          <w:b w:val="0"/>
+          <w:i/>
+          <w:sz w:val="20"/>
+        </w:rPr>
+        <w:t>A. Final Diff Performance</w:t>
       </w:r>
-      <w:proofErr w:type="gramEnd"/>
     </w:p>
     <w:p>
       <w:pPr>
-        <w:pStyle w:val="Heading2"/>
-        <w:rPr>
-          <w:rFonts w:ascii="Times New Roman" w:eastAsia="Times New Roman" w:hAnsi="Times New Roman" w:cs="Times New Roman"/>
-        </w:rPr>
-      </w:pPr>
-      <w:proofErr w:type="gramStart"/>
+        <w:spacing w:line="240" w:lineRule="auto" w:after="0"/>
+      </w:pPr>
+    </w:p>
+    <w:p>
+      <w:pPr>
+        <w:keepNext/>
+        <w:spacing w:before="40" w:line="240" w:lineRule="auto" w:after="0"/>
+        <w:ind w:firstLine="0"/>
+        <w:jc w:val="center"/>
+      </w:pPr>
       <w:r>
         <w:rPr>
-          <w:rFonts w:ascii="Times New Roman" w:eastAsia="Times New Roman" w:hAnsi="Times New Roman" w:cs="Times New Roman"/>
-        </w:rPr>
-        <w:t>5.1  Final</w:t>
-      </w:r>
-      <w:proofErr w:type="gramEnd"/>
-      <w:r>
-        <w:rPr>
-          <w:rFonts w:ascii="Times New Roman" w:eastAsia="Times New Roman" w:hAnsi="Times New Roman" w:cs="Times New Roman"/>
-        </w:rPr>
-        <w:t xml:space="preserve"> Diff Performance</w:t>
-      </w:r>
-    </w:p>
-    <w:p/>
-    <w:p>
-      <w:pPr>
-        <w:keepNext/>
-        <w:spacing w:before="40" w:line="240" w:lineRule="auto"/>
-        <w:ind w:firstLine="0"/>
-        <w:jc w:val="center"/>
-      </w:pPr>
-      <w:r>
-        <w:rPr>
-          <w:rFonts w:eastAsia="Times New Roman" w:cs="Times New Roman"/>
+          <w:rFonts w:eastAsia="Times New Roman" w:cs="Times New Roman" w:ascii="Times New Roman" w:hAnsi="Times New Roman"/>
           <w:noProof/>
+          <w:sz w:val="20"/>
         </w:rPr>
         <w:drawing>
           <wp:inline distT="0" distB="0" distL="0" distR="0" wp14:anchorId="1311E863" wp14:editId="48B78019">
-            <wp:extent cx="4800600" cy="2728762"/>
+            <wp:extent cx="3063240" cy="2728762"/>
             <wp:effectExtent l="0" t="0" r="0" b="0"/>
             <wp:docPr id="4" name="Picture 4" descr="Log-scale grouped bar chart of final median diff latency with interquartile whiskers for Snapshot, Log-only, Revon-M, Revon-H, and Dolt across five workloads." title="Log-scale grouped bar chart of final median diff latency with interquartile whiskers for Snapshot, Log-only, Revon-M, Revon-H, and Dolt across five workloads"/>
             <wp:cNvGraphicFramePr>
@@ -3751,7 +4399,7 @@
                   <pic:spPr>
                     <a:xfrm>
                       <a:off x="0" y="0"/>
-                      <a:ext cx="4800600" cy="2728762"/>
+                      <a:ext cx="3063240" cy="2728762"/>
                     </a:xfrm>
                     <a:prstGeom prst="rect">
                       <a:avLst/>
@@ -3767,7 +4415,9 @@
     <w:p>
       <w:pPr>
         <w:pStyle w:val="Caption"/>
-        <w:spacing w:before="80"/>
+        <w:keepNext/>
+        <w:spacing w:before="40" w:after="40"/>
+        <w:jc w:val="center"/>
         <w:rPr>
           <w:rFonts w:eastAsia="Times New Roman" w:cs="Times New Roman"/>
         </w:rPr>
@@ -3776,31 +4426,63 @@
     <w:p>
       <w:pPr>
         <w:pStyle w:val="Caption"/>
-        <w:spacing w:before="80"/>
+        <w:keepNext/>
+        <w:spacing w:before="40" w:after="40"/>
+        <w:jc w:val="center"/>
       </w:pPr>
       <w:r>
         <w:rPr>
-          <w:rFonts w:eastAsia="Times New Roman" w:cs="Times New Roman"/>
+          <w:rFonts w:ascii="Times New Roman" w:hAnsi="Times New Roman"/>
+          <w:sz w:val="16"/>
         </w:rPr>
-        <w:t>Figure 4: Diff latency across eight scenarios, including separate application-key, range, repeated-key, and hash-route update locality; lower is better.</w:t>
+        <w:t>Fig. 4. Diff latency across eight scenarios, including separate application-key, range, repeated-key, and hash-route update locality; lower is better.</w:t>
       </w:r>
     </w:p>
     <w:p>
-      <w:r/>
+      <w:pPr>
+        <w:spacing w:line="240" w:lineRule="auto" w:after="0"/>
+        <w:sectPr>
+          <w:type w:val="continuous"/>
+          <w:pgSz w:w="12240" w:h="15840"/>
+          <w:pgMar w:top="1080" w:right="900" w:bottom="1440" w:left="900" w:header="360" w:footer="360" w:gutter="0"/>
+          <w:cols w:num="2" w:space="360" w:equalWidth="1"/>
+        </w:sectPr>
+      </w:pPr>
+      <w:r>
+        <w:rPr>
+          <w:rFonts w:ascii="Times New Roman" w:hAnsi="Times New Roman"/>
+          <w:sz w:val="20"/>
+        </w:rPr>
+      </w:r>
+    </w:p>
+    <w:p>
+      <w:pPr>
+        <w:pStyle w:val="Caption"/>
+        <w:keepNext/>
+        <w:spacing w:before="40" w:after="40"/>
+        <w:jc w:val="center"/>
+      </w:pPr>
+      <w:r>
+        <w:rPr>
+          <w:rFonts w:ascii="Times New Roman" w:hAnsi="Times New Roman"/>
+          <w:sz w:val="16"/>
+        </w:rPr>
+        <w:t>TABLE III. Revon-H versus SQL-path Dolt diff latency; the final column reports the median paired trial ratio and percentile-bootstrap 95% interval.</w:t>
+      </w:r>
     </w:p>
     <w:tbl>
       <w:tblPr>
-        <w:tblW w:w="8500" w:type="dxa"/>
+        <w:tblW w:w="9020" w:type="dxa"/>
         <w:jc w:val="center"/>
         <w:tblLayout w:type="fixed"/>
         <w:tblLook w:val="04A0" w:firstRow="1" w:lastRow="0" w:firstColumn="1" w:lastColumn="0" w:noHBand="0" w:noVBand="1"/>
       </w:tblPr>
       <w:tblGrid>
-        <w:gridCol w:w="2246"/>
-        <w:gridCol w:w="936"/>
-        <w:gridCol w:w="1368"/>
-        <w:gridCol w:w="1584"/>
-        <w:gridCol w:w="2088"/>
+        <w:gridCol w:w="2050"/>
+        <w:gridCol w:w="750"/>
+        <w:gridCol w:w="900"/>
+        <w:gridCol w:w="1250"/>
+        <w:gridCol w:w="4070"/>
       </w:tblGrid>
       <w:tr>
         <w:trPr>
@@ -3810,7 +4492,7 @@
         </w:trPr>
         <w:tc>
           <w:tcPr>
-            <w:tcW w:w="2246" w:type="dxa"/>
+            <w:tcW w:w="2050" w:type="dxa"/>
             <w:tcBorders>
               <w:top w:val="single" w:sz="6" w:space="0" w:color="000000"/>
               <w:left w:val="nil"/>
@@ -3845,7 +4527,7 @@
         </w:tc>
         <w:tc>
           <w:tcPr>
-            <w:tcW w:w="936" w:type="dxa"/>
+            <w:tcW w:w="750" w:type="dxa"/>
             <w:tcBorders>
               <w:top w:val="single" w:sz="6" w:space="0" w:color="000000"/>
               <w:left w:val="nil"/>
@@ -3879,7 +4561,7 @@
         </w:tc>
         <w:tc>
           <w:tcPr>
-            <w:tcW w:w="1368" w:type="dxa"/>
+            <w:tcW w:w="900" w:type="dxa"/>
             <w:tcBorders>
               <w:top w:val="single" w:sz="6" w:space="0" w:color="000000"/>
               <w:left w:val="nil"/>
@@ -3913,7 +4595,7 @@
         </w:tc>
         <w:tc>
           <w:tcPr>
-            <w:tcW w:w="1584" w:type="dxa"/>
+            <w:tcW w:w="1250" w:type="dxa"/>
             <w:tcBorders>
               <w:top w:val="single" w:sz="6" w:space="0" w:color="000000"/>
               <w:left w:val="nil"/>
@@ -3947,7 +4629,7 @@
         </w:tc>
         <w:tc>
           <w:tcPr>
-            <w:tcW w:w="2088" w:type="dxa"/>
+            <w:tcW w:w="4070" w:type="dxa"/>
             <w:tcBorders>
               <w:top w:val="single" w:sz="6" w:space="0" w:color="000000"/>
               <w:left w:val="nil"/>
@@ -3987,7 +4669,7 @@
         </w:trPr>
         <w:tc>
           <w:tcPr>
-            <w:tcW w:w="2246" w:type="dxa"/>
+            <w:tcW w:w="2050" w:type="dxa"/>
             <w:tcBorders>
               <w:top w:val="nil"/>
               <w:left w:val="nil"/>
@@ -4020,7 +4702,7 @@
         </w:tc>
         <w:tc>
           <w:tcPr>
-            <w:tcW w:w="936" w:type="dxa"/>
+            <w:tcW w:w="750" w:type="dxa"/>
             <w:tcBorders>
               <w:top w:val="nil"/>
               <w:left w:val="nil"/>
@@ -4053,7 +4735,7 @@
         </w:tc>
         <w:tc>
           <w:tcPr>
-            <w:tcW w:w="1368" w:type="dxa"/>
+            <w:tcW w:w="900" w:type="dxa"/>
             <w:tcBorders>
               <w:top w:val="nil"/>
               <w:left w:val="nil"/>
@@ -4086,7 +4768,7 @@
         </w:tc>
         <w:tc>
           <w:tcPr>
-            <w:tcW w:w="1584" w:type="dxa"/>
+            <w:tcW w:w="1250" w:type="dxa"/>
             <w:tcBorders>
               <w:top w:val="nil"/>
               <w:left w:val="nil"/>
@@ -4119,7 +4801,7 @@
         </w:tc>
         <w:tc>
           <w:tcPr>
-            <w:tcW w:w="2088" w:type="dxa"/>
+            <w:tcW w:w="4070" w:type="dxa"/>
             <w:tcBorders>
               <w:top w:val="nil"/>
               <w:left w:val="nil"/>
@@ -4158,7 +4840,7 @@
         </w:trPr>
         <w:tc>
           <w:tcPr>
-            <w:tcW w:w="2246" w:type="dxa"/>
+            <w:tcW w:w="2050" w:type="dxa"/>
             <w:tcBorders>
               <w:top w:val="nil"/>
               <w:left w:val="nil"/>
@@ -4191,7 +4873,7 @@
         </w:tc>
         <w:tc>
           <w:tcPr>
-            <w:tcW w:w="936" w:type="dxa"/>
+            <w:tcW w:w="750" w:type="dxa"/>
             <w:tcBorders>
               <w:top w:val="nil"/>
               <w:left w:val="nil"/>
@@ -4224,7 +4906,7 @@
         </w:tc>
         <w:tc>
           <w:tcPr>
-            <w:tcW w:w="1368" w:type="dxa"/>
+            <w:tcW w:w="900" w:type="dxa"/>
             <w:tcBorders>
               <w:top w:val="nil"/>
               <w:left w:val="nil"/>
@@ -4257,7 +4939,7 @@
         </w:tc>
         <w:tc>
           <w:tcPr>
-            <w:tcW w:w="1584" w:type="dxa"/>
+            <w:tcW w:w="1250" w:type="dxa"/>
             <w:tcBorders>
               <w:top w:val="nil"/>
               <w:left w:val="nil"/>
@@ -4290,7 +4972,7 @@
         </w:tc>
         <w:tc>
           <w:tcPr>
-            <w:tcW w:w="2088" w:type="dxa"/>
+            <w:tcW w:w="4070" w:type="dxa"/>
             <w:tcBorders>
               <w:top w:val="nil"/>
               <w:left w:val="nil"/>
@@ -4329,7 +5011,7 @@
         </w:trPr>
         <w:tc>
           <w:tcPr>
-            <w:tcW w:w="2246" w:type="dxa"/>
+            <w:tcW w:w="2050" w:type="dxa"/>
             <w:tcBorders>
               <w:top w:val="nil"/>
               <w:left w:val="nil"/>
@@ -4362,7 +5044,7 @@
         </w:tc>
         <w:tc>
           <w:tcPr>
-            <w:tcW w:w="936" w:type="dxa"/>
+            <w:tcW w:w="750" w:type="dxa"/>
             <w:tcBorders>
               <w:top w:val="nil"/>
               <w:left w:val="nil"/>
@@ -4395,7 +5077,7 @@
         </w:tc>
         <w:tc>
           <w:tcPr>
-            <w:tcW w:w="1368" w:type="dxa"/>
+            <w:tcW w:w="900" w:type="dxa"/>
             <w:tcBorders>
               <w:top w:val="nil"/>
               <w:left w:val="nil"/>
@@ -4428,7 +5110,7 @@
         </w:tc>
         <w:tc>
           <w:tcPr>
-            <w:tcW w:w="1584" w:type="dxa"/>
+            <w:tcW w:w="1250" w:type="dxa"/>
             <w:tcBorders>
               <w:top w:val="nil"/>
               <w:left w:val="nil"/>
@@ -4461,7 +5143,7 @@
         </w:tc>
         <w:tc>
           <w:tcPr>
-            <w:tcW w:w="2088" w:type="dxa"/>
+            <w:tcW w:w="4070" w:type="dxa"/>
             <w:tcBorders>
               <w:top w:val="nil"/>
               <w:left w:val="nil"/>
@@ -4500,7 +5182,7 @@
         </w:trPr>
         <w:tc>
           <w:tcPr>
-            <w:tcW w:w="2246" w:type="dxa"/>
+            <w:tcW w:w="2050" w:type="dxa"/>
             <w:tcBorders>
               <w:top w:val="nil"/>
               <w:left w:val="nil"/>
@@ -4533,7 +5215,7 @@
         </w:tc>
         <w:tc>
           <w:tcPr>
-            <w:tcW w:w="936" w:type="dxa"/>
+            <w:tcW w:w="750" w:type="dxa"/>
             <w:tcBorders>
               <w:top w:val="nil"/>
               <w:left w:val="nil"/>
@@ -4566,7 +5248,7 @@
         </w:tc>
         <w:tc>
           <w:tcPr>
-            <w:tcW w:w="1368" w:type="dxa"/>
+            <w:tcW w:w="900" w:type="dxa"/>
             <w:tcBorders>
               <w:top w:val="nil"/>
               <w:left w:val="nil"/>
@@ -4599,7 +5281,7 @@
         </w:tc>
         <w:tc>
           <w:tcPr>
-            <w:tcW w:w="1584" w:type="dxa"/>
+            <w:tcW w:w="1250" w:type="dxa"/>
             <w:tcBorders>
               <w:top w:val="nil"/>
               <w:left w:val="nil"/>
@@ -4632,7 +5314,7 @@
         </w:tc>
         <w:tc>
           <w:tcPr>
-            <w:tcW w:w="2088" w:type="dxa"/>
+            <w:tcW w:w="4070" w:type="dxa"/>
             <w:tcBorders>
               <w:top w:val="nil"/>
               <w:left w:val="nil"/>
@@ -4671,11 +5353,11 @@
         </w:trPr>
         <w:tc>
           <w:tcPr>
-            <w:tcW w:w="2246" w:type="dxa"/>
+            <w:tcW w:w="2050" w:type="dxa"/>
             <w:tcBorders>
               <w:top w:val="nil"/>
               <w:left w:val="nil"/>
-              <w:bottom w:val="single" w:sz="6" w:space="0" w:color="000000"/>
+              <w:bottom w:val="nil"/>
               <w:right w:val="nil"/>
             </w:tcBorders>
             <w:tcMar>
@@ -4704,11 +5386,11 @@
         </w:tc>
         <w:tc>
           <w:tcPr>
-            <w:tcW w:w="936" w:type="dxa"/>
+            <w:tcW w:w="750" w:type="dxa"/>
             <w:tcBorders>
               <w:top w:val="nil"/>
               <w:left w:val="nil"/>
-              <w:bottom w:val="single" w:sz="6" w:space="0" w:color="000000"/>
+              <w:bottom w:val="nil"/>
               <w:right w:val="nil"/>
             </w:tcBorders>
             <w:tcMar>
@@ -4737,11 +5419,11 @@
         </w:tc>
         <w:tc>
           <w:tcPr>
-            <w:tcW w:w="1368" w:type="dxa"/>
+            <w:tcW w:w="900" w:type="dxa"/>
             <w:tcBorders>
               <w:top w:val="nil"/>
               <w:left w:val="nil"/>
-              <w:bottom w:val="single" w:sz="6" w:space="0" w:color="000000"/>
+              <w:bottom w:val="nil"/>
               <w:right w:val="nil"/>
             </w:tcBorders>
             <w:tcMar>
@@ -4770,11 +5452,11 @@
         </w:tc>
         <w:tc>
           <w:tcPr>
-            <w:tcW w:w="1584" w:type="dxa"/>
+            <w:tcW w:w="1250" w:type="dxa"/>
             <w:tcBorders>
               <w:top w:val="nil"/>
               <w:left w:val="nil"/>
-              <w:bottom w:val="single" w:sz="6" w:space="0" w:color="000000"/>
+              <w:bottom w:val="nil"/>
               <w:right w:val="nil"/>
             </w:tcBorders>
             <w:tcMar>
@@ -4803,11 +5485,11 @@
         </w:tc>
         <w:tc>
           <w:tcPr>
-            <w:tcW w:w="2088" w:type="dxa"/>
+            <w:tcW w:w="4070" w:type="dxa"/>
             <w:tcBorders>
               <w:top w:val="nil"/>
               <w:left w:val="nil"/>
-              <w:bottom w:val="single" w:sz="6" w:space="0" w:color="000000"/>
+              <w:bottom w:val="nil"/>
               <w:right w:val="nil"/>
             </w:tcBorders>
             <w:tcMar>
@@ -4836,53 +5518,169 @@
         </w:tc>
       </w:tr>
       <w:tr>
+        <w:trPr>
+          <w:cantSplit/>
+          <w:jc w:val="center"/>
+        </w:trPr>
         <w:tc>
           <w:tcPr>
-            <w:tcW w:type="dxa" w:w="2246"/>
+            <w:tcW w:type="dxa" w:w="2050"/>
+            <w:tcBorders>
+              <w:top w:val="nil"/>
+              <w:left w:val="nil"/>
+              <w:bottom w:val="nil"/>
+              <w:right w:val="nil"/>
+            </w:tcBorders>
+            <w:tcMar>
+              <w:top w:w="16" w:type="dxa"/>
+              <w:left w:w="25" w:type="dxa"/>
+              <w:bottom w:w="16" w:type="dxa"/>
+              <w:right w:w="25" w:type="dxa"/>
+            </w:tcMar>
+            <w:vAlign w:val="center"/>
           </w:tcPr>
           <w:p>
+            <w:pPr>
+              <w:keepNext/>
+              <w:spacing w:line="200" w:lineRule="exact"/>
+              <w:ind w:firstLine="0"/>
+              <w:jc w:val="left"/>
+            </w:pPr>
             <w:r>
+              <w:rPr>
+                <w:rFonts w:eastAsia="Times New Roman" w:cs="Times New Roman"/>
+                <w:sz w:val="18"/>
+              </w:rPr>
               <w:t>Range local</w:t>
             </w:r>
           </w:p>
         </w:tc>
         <w:tc>
           <w:tcPr>
-            <w:tcW w:type="dxa" w:w="936"/>
+            <w:tcW w:type="dxa" w:w="750"/>
+            <w:tcBorders>
+              <w:top w:val="nil"/>
+              <w:left w:val="nil"/>
+              <w:bottom w:val="nil"/>
+              <w:right w:val="nil"/>
+            </w:tcBorders>
+            <w:tcMar>
+              <w:top w:w="16" w:type="dxa"/>
+              <w:left w:w="25" w:type="dxa"/>
+              <w:bottom w:w="16" w:type="dxa"/>
+              <w:right w:w="25" w:type="dxa"/>
+            </w:tcMar>
+            <w:vAlign w:val="center"/>
           </w:tcPr>
           <w:p>
+            <w:pPr>
+              <w:keepNext/>
+              <w:spacing w:line="200" w:lineRule="exact"/>
+              <w:ind w:firstLine="0"/>
+              <w:jc w:val="center"/>
+            </w:pPr>
             <w:r>
+              <w:rPr>
+                <w:rFonts w:eastAsia="Times New Roman" w:cs="Times New Roman"/>
+                <w:sz w:val="18"/>
+              </w:rPr>
               <w:t>log</w:t>
             </w:r>
           </w:p>
         </w:tc>
         <w:tc>
           <w:tcPr>
-            <w:tcW w:type="dxa" w:w="1368"/>
+            <w:tcW w:type="dxa" w:w="900"/>
+            <w:tcBorders>
+              <w:top w:val="nil"/>
+              <w:left w:val="nil"/>
+              <w:bottom w:val="nil"/>
+              <w:right w:val="nil"/>
+            </w:tcBorders>
+            <w:tcMar>
+              <w:top w:w="16" w:type="dxa"/>
+              <w:left w:w="25" w:type="dxa"/>
+              <w:bottom w:w="16" w:type="dxa"/>
+              <w:right w:w="25" w:type="dxa"/>
+            </w:tcMar>
+            <w:vAlign w:val="center"/>
           </w:tcPr>
           <w:p>
+            <w:pPr>
+              <w:keepNext/>
+              <w:spacing w:line="200" w:lineRule="exact"/>
+              <w:ind w:firstLine="0"/>
+              <w:jc w:val="center"/>
+            </w:pPr>
             <w:r>
+              <w:rPr>
+                <w:rFonts w:eastAsia="Times New Roman" w:cs="Times New Roman"/>
+                <w:sz w:val="18"/>
+              </w:rPr>
               <w:t>41.359</w:t>
             </w:r>
           </w:p>
         </w:tc>
         <w:tc>
           <w:tcPr>
-            <w:tcW w:type="dxa" w:w="1584"/>
+            <w:tcW w:type="dxa" w:w="1250"/>
+            <w:tcBorders>
+              <w:top w:val="nil"/>
+              <w:left w:val="nil"/>
+              <w:bottom w:val="nil"/>
+              <w:right w:val="nil"/>
+            </w:tcBorders>
+            <w:tcMar>
+              <w:top w:w="16" w:type="dxa"/>
+              <w:left w:w="25" w:type="dxa"/>
+              <w:bottom w:w="16" w:type="dxa"/>
+              <w:right w:w="25" w:type="dxa"/>
+            </w:tcMar>
+            <w:vAlign w:val="center"/>
           </w:tcPr>
           <w:p>
+            <w:pPr>
+              <w:keepNext/>
+              <w:spacing w:line="200" w:lineRule="exact"/>
+              <w:ind w:firstLine="0"/>
+              <w:jc w:val="center"/>
+            </w:pPr>
             <w:r>
+              <w:rPr>
+                <w:rFonts w:eastAsia="Times New Roman" w:cs="Times New Roman"/>
+                <w:sz w:val="18"/>
+              </w:rPr>
               <w:t>325.04</w:t>
             </w:r>
           </w:p>
         </w:tc>
         <w:tc>
           <w:tcPr>
-            <w:tcW w:type="dxa" w:w="2088"/>
+            <w:tcW w:type="dxa" w:w="4070"/>
+            <w:tcBorders>
+              <w:top w:val="nil"/>
+              <w:left w:val="nil"/>
+              <w:bottom w:val="nil"/>
+              <w:right w:val="nil"/>
+            </w:tcBorders>
+            <w:tcMar>
+              <w:top w:w="16" w:type="dxa"/>
+              <w:left w:w="25" w:type="dxa"/>
+              <w:bottom w:w="16" w:type="dxa"/>
+              <w:right w:w="25" w:type="dxa"/>
+            </w:tcMar>
+            <w:vAlign w:val="center"/>
           </w:tcPr>
           <w:p>
+            <w:pPr>
+              <w:keepNext/>
+              <w:spacing w:line="200" w:lineRule="exact"/>
+              <w:ind w:firstLine="0"/>
+              <w:jc w:val="center"/>
+            </w:pPr>
             <w:r>
               <w:rPr>
+                <w:rFonts w:eastAsia="Times New Roman" w:cs="Times New Roman"/>
                 <w:sz w:val="16"/>
               </w:rPr>
               <w:t>7.8 (6.8-11.2)</w:t>
@@ -4891,53 +5689,169 @@
         </w:tc>
       </w:tr>
       <w:tr>
+        <w:trPr>
+          <w:cantSplit/>
+          <w:jc w:val="center"/>
+        </w:trPr>
         <w:tc>
           <w:tcPr>
-            <w:tcW w:type="dxa" w:w="2246"/>
+            <w:tcW w:type="dxa" w:w="2050"/>
+            <w:tcBorders>
+              <w:top w:val="nil"/>
+              <w:left w:val="nil"/>
+              <w:bottom w:val="nil"/>
+              <w:right w:val="nil"/>
+            </w:tcBorders>
+            <w:tcMar>
+              <w:top w:w="16" w:type="dxa"/>
+              <w:left w:w="25" w:type="dxa"/>
+              <w:bottom w:w="16" w:type="dxa"/>
+              <w:right w:w="25" w:type="dxa"/>
+            </w:tcMar>
+            <w:vAlign w:val="center"/>
           </w:tcPr>
           <w:p>
+            <w:pPr>
+              <w:keepNext/>
+              <w:spacing w:line="200" w:lineRule="exact"/>
+              <w:ind w:firstLine="0"/>
+              <w:jc w:val="left"/>
+            </w:pPr>
             <w:r>
+              <w:rPr>
+                <w:rFonts w:eastAsia="Times New Roman" w:cs="Times New Roman"/>
+                <w:sz w:val="18"/>
+              </w:rPr>
               <w:t>Repeated key</w:t>
             </w:r>
           </w:p>
         </w:tc>
         <w:tc>
           <w:tcPr>
-            <w:tcW w:type="dxa" w:w="936"/>
+            <w:tcW w:type="dxa" w:w="750"/>
+            <w:tcBorders>
+              <w:top w:val="nil"/>
+              <w:left w:val="nil"/>
+              <w:bottom w:val="nil"/>
+              <w:right w:val="nil"/>
+            </w:tcBorders>
+            <w:tcMar>
+              <w:top w:w="16" w:type="dxa"/>
+              <w:left w:w="25" w:type="dxa"/>
+              <w:bottom w:w="16" w:type="dxa"/>
+              <w:right w:w="25" w:type="dxa"/>
+            </w:tcMar>
+            <w:vAlign w:val="center"/>
           </w:tcPr>
           <w:p>
+            <w:pPr>
+              <w:keepNext/>
+              <w:spacing w:line="200" w:lineRule="exact"/>
+              <w:ind w:firstLine="0"/>
+              <w:jc w:val="center"/>
+            </w:pPr>
             <w:r>
+              <w:rPr>
+                <w:rFonts w:eastAsia="Times New Roman" w:cs="Times New Roman"/>
+                <w:sz w:val="18"/>
+              </w:rPr>
               <w:t>log</w:t>
             </w:r>
           </w:p>
         </w:tc>
         <w:tc>
           <w:tcPr>
-            <w:tcW w:type="dxa" w:w="1368"/>
+            <w:tcW w:type="dxa" w:w="900"/>
+            <w:tcBorders>
+              <w:top w:val="nil"/>
+              <w:left w:val="nil"/>
+              <w:bottom w:val="nil"/>
+              <w:right w:val="nil"/>
+            </w:tcBorders>
+            <w:tcMar>
+              <w:top w:w="16" w:type="dxa"/>
+              <w:left w:w="25" w:type="dxa"/>
+              <w:bottom w:w="16" w:type="dxa"/>
+              <w:right w:w="25" w:type="dxa"/>
+            </w:tcMar>
+            <w:vAlign w:val="center"/>
           </w:tcPr>
           <w:p>
+            <w:pPr>
+              <w:keepNext/>
+              <w:spacing w:line="200" w:lineRule="exact"/>
+              <w:ind w:firstLine="0"/>
+              <w:jc w:val="center"/>
+            </w:pPr>
             <w:r>
+              <w:rPr>
+                <w:rFonts w:eastAsia="Times New Roman" w:cs="Times New Roman"/>
+                <w:sz w:val="18"/>
+              </w:rPr>
               <w:t>1.992</w:t>
             </w:r>
           </w:p>
         </w:tc>
         <w:tc>
           <w:tcPr>
-            <w:tcW w:type="dxa" w:w="1584"/>
+            <w:tcW w:type="dxa" w:w="1250"/>
+            <w:tcBorders>
+              <w:top w:val="nil"/>
+              <w:left w:val="nil"/>
+              <w:bottom w:val="nil"/>
+              <w:right w:val="nil"/>
+            </w:tcBorders>
+            <w:tcMar>
+              <w:top w:w="16" w:type="dxa"/>
+              <w:left w:w="25" w:type="dxa"/>
+              <w:bottom w:w="16" w:type="dxa"/>
+              <w:right w:w="25" w:type="dxa"/>
+            </w:tcMar>
+            <w:vAlign w:val="center"/>
           </w:tcPr>
           <w:p>
+            <w:pPr>
+              <w:keepNext/>
+              <w:spacing w:line="200" w:lineRule="exact"/>
+              <w:ind w:firstLine="0"/>
+              <w:jc w:val="center"/>
+            </w:pPr>
             <w:r>
+              <w:rPr>
+                <w:rFonts w:eastAsia="Times New Roman" w:cs="Times New Roman"/>
+                <w:sz w:val="18"/>
+              </w:rPr>
               <w:t>293.72</w:t>
             </w:r>
           </w:p>
         </w:tc>
         <w:tc>
           <w:tcPr>
-            <w:tcW w:type="dxa" w:w="2088"/>
+            <w:tcW w:type="dxa" w:w="4070"/>
+            <w:tcBorders>
+              <w:top w:val="nil"/>
+              <w:left w:val="nil"/>
+              <w:bottom w:val="nil"/>
+              <w:right w:val="nil"/>
+            </w:tcBorders>
+            <w:tcMar>
+              <w:top w:w="16" w:type="dxa"/>
+              <w:left w:w="25" w:type="dxa"/>
+              <w:bottom w:w="16" w:type="dxa"/>
+              <w:right w:w="25" w:type="dxa"/>
+            </w:tcMar>
+            <w:vAlign w:val="center"/>
           </w:tcPr>
           <w:p>
+            <w:pPr>
+              <w:keepNext/>
+              <w:spacing w:line="200" w:lineRule="exact"/>
+              <w:ind w:firstLine="0"/>
+              <w:jc w:val="center"/>
+            </w:pPr>
             <w:r>
               <w:rPr>
+                <w:rFonts w:eastAsia="Times New Roman" w:cs="Times New Roman"/>
                 <w:sz w:val="16"/>
               </w:rPr>
               <w:t>141.6 (109.5-173.2)</w:t>
@@ -4946,53 +5860,169 @@
         </w:tc>
       </w:tr>
       <w:tr>
+        <w:trPr>
+          <w:cantSplit/>
+          <w:jc w:val="center"/>
+        </w:trPr>
         <w:tc>
           <w:tcPr>
-            <w:tcW w:type="dxa" w:w="2246"/>
+            <w:tcW w:type="dxa" w:w="2050"/>
+            <w:tcBorders>
+              <w:top w:val="nil"/>
+              <w:left w:val="nil"/>
+              <w:right w:val="nil"/>
+              <w:bottom w:val="single" w:sz="6" w:space="0" w:color="000000"/>
+            </w:tcBorders>
+            <w:tcMar>
+              <w:top w:w="16" w:type="dxa"/>
+              <w:left w:w="25" w:type="dxa"/>
+              <w:bottom w:w="16" w:type="dxa"/>
+              <w:right w:w="25" w:type="dxa"/>
+            </w:tcMar>
+            <w:vAlign w:val="center"/>
           </w:tcPr>
           <w:p>
+            <w:pPr>
+              <w:keepNext/>
+              <w:spacing w:line="200" w:lineRule="exact"/>
+              <w:ind w:firstLine="0"/>
+              <w:jc w:val="left"/>
+            </w:pPr>
             <w:r>
+              <w:rPr>
+                <w:rFonts w:eastAsia="Times New Roman" w:cs="Times New Roman"/>
+                <w:sz w:val="18"/>
+              </w:rPr>
               <w:t>Hash-route local</w:t>
             </w:r>
           </w:p>
         </w:tc>
         <w:tc>
           <w:tcPr>
-            <w:tcW w:type="dxa" w:w="936"/>
+            <w:tcW w:type="dxa" w:w="750"/>
+            <w:tcBorders>
+              <w:top w:val="nil"/>
+              <w:left w:val="nil"/>
+              <w:right w:val="nil"/>
+              <w:bottom w:val="single" w:sz="6" w:space="0" w:color="000000"/>
+            </w:tcBorders>
+            <w:tcMar>
+              <w:top w:w="16" w:type="dxa"/>
+              <w:left w:w="25" w:type="dxa"/>
+              <w:bottom w:w="16" w:type="dxa"/>
+              <w:right w:w="25" w:type="dxa"/>
+            </w:tcMar>
+            <w:vAlign w:val="center"/>
           </w:tcPr>
           <w:p>
+            <w:pPr>
+              <w:keepNext/>
+              <w:spacing w:line="200" w:lineRule="exact"/>
+              <w:ind w:firstLine="0"/>
+              <w:jc w:val="center"/>
+            </w:pPr>
             <w:r>
+              <w:rPr>
+                <w:rFonts w:eastAsia="Times New Roman" w:cs="Times New Roman"/>
+                <w:sz w:val="18"/>
+              </w:rPr>
               <w:t>log</w:t>
             </w:r>
           </w:p>
         </w:tc>
         <w:tc>
           <w:tcPr>
-            <w:tcW w:type="dxa" w:w="1368"/>
+            <w:tcW w:type="dxa" w:w="900"/>
+            <w:tcBorders>
+              <w:top w:val="nil"/>
+              <w:left w:val="nil"/>
+              <w:right w:val="nil"/>
+              <w:bottom w:val="single" w:sz="6" w:space="0" w:color="000000"/>
+            </w:tcBorders>
+            <w:tcMar>
+              <w:top w:w="16" w:type="dxa"/>
+              <w:left w:w="25" w:type="dxa"/>
+              <w:bottom w:w="16" w:type="dxa"/>
+              <w:right w:w="25" w:type="dxa"/>
+            </w:tcMar>
+            <w:vAlign w:val="center"/>
           </w:tcPr>
           <w:p>
+            <w:pPr>
+              <w:keepNext/>
+              <w:spacing w:line="200" w:lineRule="exact"/>
+              <w:ind w:firstLine="0"/>
+              <w:jc w:val="center"/>
+            </w:pPr>
             <w:r>
+              <w:rPr>
+                <w:rFonts w:eastAsia="Times New Roman" w:cs="Times New Roman"/>
+                <w:sz w:val="18"/>
+              </w:rPr>
               <w:t>2.620</w:t>
             </w:r>
           </w:p>
         </w:tc>
         <w:tc>
           <w:tcPr>
-            <w:tcW w:type="dxa" w:w="1584"/>
+            <w:tcW w:type="dxa" w:w="1250"/>
+            <w:tcBorders>
+              <w:top w:val="nil"/>
+              <w:left w:val="nil"/>
+              <w:right w:val="nil"/>
+              <w:bottom w:val="single" w:sz="6" w:space="0" w:color="000000"/>
+            </w:tcBorders>
+            <w:tcMar>
+              <w:top w:w="16" w:type="dxa"/>
+              <w:left w:w="25" w:type="dxa"/>
+              <w:bottom w:w="16" w:type="dxa"/>
+              <w:right w:w="25" w:type="dxa"/>
+            </w:tcMar>
+            <w:vAlign w:val="center"/>
           </w:tcPr>
           <w:p>
+            <w:pPr>
+              <w:keepNext/>
+              <w:spacing w:line="200" w:lineRule="exact"/>
+              <w:ind w:firstLine="0"/>
+              <w:jc w:val="center"/>
+            </w:pPr>
             <w:r>
+              <w:rPr>
+                <w:rFonts w:eastAsia="Times New Roman" w:cs="Times New Roman"/>
+                <w:sz w:val="18"/>
+              </w:rPr>
               <w:t>278.22</w:t>
             </w:r>
           </w:p>
         </w:tc>
         <w:tc>
           <w:tcPr>
-            <w:tcW w:type="dxa" w:w="2088"/>
+            <w:tcW w:type="dxa" w:w="4070"/>
+            <w:tcBorders>
+              <w:top w:val="nil"/>
+              <w:left w:val="nil"/>
+              <w:right w:val="nil"/>
+              <w:bottom w:val="single" w:sz="6" w:space="0" w:color="000000"/>
+            </w:tcBorders>
+            <w:tcMar>
+              <w:top w:w="16" w:type="dxa"/>
+              <w:left w:w="25" w:type="dxa"/>
+              <w:bottom w:w="16" w:type="dxa"/>
+              <w:right w:w="25" w:type="dxa"/>
+            </w:tcMar>
+            <w:vAlign w:val="center"/>
           </w:tcPr>
           <w:p>
+            <w:pPr>
+              <w:keepNext/>
+              <w:spacing w:line="200" w:lineRule="exact"/>
+              <w:ind w:firstLine="0"/>
+              <w:jc w:val="center"/>
+            </w:pPr>
             <w:r>
               <w:rPr>
+                <w:rFonts w:eastAsia="Times New Roman" w:cs="Times New Roman"/>
                 <w:sz w:val="16"/>
               </w:rPr>
               <w:t>102.4 (97.5-104.0)</w:t>
@@ -5003,19 +6033,22 @@
     </w:tbl>
     <w:p>
       <w:pPr>
-        <w:pStyle w:val="Caption"/>
+        <w:sectPr>
+          <w:type w:val="continuous"/>
+          <w:pgSz w:w="12240" w:h="15840"/>
+          <w:pgMar w:top="1080" w:right="900" w:bottom="1440" w:left="900" w:header="360" w:footer="360" w:gutter="0"/>
+          <w:cols w:num="1" w:space="0" w:equalWidth="1"/>
+        </w:sectPr>
+      </w:pPr>
+    </w:p>
+    <w:p>
+      <w:pPr>
+        <w:spacing w:line="240" w:lineRule="auto" w:after="0"/>
       </w:pPr>
       <w:r>
         <w:rPr>
-          <w:rFonts w:eastAsia="Times New Roman" w:cs="Times New Roman"/>
-        </w:rPr>
-        <w:t>Table 3: Revon-H versus SQL-path Dolt diff latency; the final column reports the median paired trial ratio and percentile-bootstrap 95% interval.</w:t>
-      </w:r>
-    </w:p>
-    <w:p>
-      <w:r>
-        <w:rPr>
-          <w:rFonts w:eastAsia="Times New Roman" w:cs="Times New Roman"/>
+          <w:rFonts w:eastAsia="Times New Roman" w:cs="Times New Roman" w:ascii="Times New Roman" w:hAnsi="Times New Roman"/>
+          <w:sz w:val="20"/>
         </w:rPr>
         <w:t>Across the eight scenarios, every paired Dolt/Revon-H diff ratio is above one and its 95% interval excludes parity, indicating lower Revon-H latency for this tested workflow. Table 3 reports the median of the seven same-trial ratios and its bootstrap interval. This remains an in-process Revon API versus Dolt CLI workflow comparison: Dolt's CLI and SQL costs are included, so the ratios are not engine-only speedups. The lexical-key case is application-key local; range-local, repeated-key, and hash-route-local updates remain distinct workloads.</w:t>
       </w:r>
@@ -5023,21 +6056,29 @@
     <w:p>
       <w:pPr>
         <w:pStyle w:val="Heading2"/>
+        <w:keepNext/>
+        <w:spacing w:before="80" w:after="20"/>
+        <w:jc w:val="left"/>
       </w:pPr>
       <w:r>
         <w:rPr>
-          <w:rFonts w:ascii="Times New Roman" w:eastAsia="Times New Roman" w:hAnsi="Times New Roman" w:cs="Times New Roman"/>
+          <w:rFonts w:ascii="Times New Roman" w:hAnsi="Times New Roman"/>
+          <w:b w:val="0"/>
+          <w:i/>
+          <w:sz w:val="20"/>
         </w:rPr>
-        <w:t>5.2  Hybrid Ablation</w:t>
+        <w:t>B. Hybrid Ablation</w:t>
       </w:r>
     </w:p>
     <w:p>
       <w:pPr>
+        <w:spacing w:line="240" w:lineRule="auto" w:after="0"/>
         <w:ind w:firstLine="0"/>
       </w:pPr>
       <w:r>
         <w:rPr>
-          <w:rFonts w:eastAsia="Times New Roman" w:cs="Times New Roman"/>
+          <w:rFonts w:eastAsia="Times New Roman" w:cs="Times New Roman" w:ascii="Times New Roman" w:hAnsi="Times New Roman"/>
+          <w:sz w:val="20"/>
         </w:rPr>
         <w:t>In the primary run, 3 of eight paired Revon-M/Revon-H diff intervals include parity and are inconclusive. A separate robustness matrix covers 10,000 rows, three seeds, 32- and 128-byte values, 10- and 50-commit histories, and spread, range-local, and repeated-key updates. Revon-M/Revon-H diff ratios above one mean Revon-M was slower. On Windows, baseline, 128-byte payload, range-local, and repeated-key ratios were 1.58 [1.23, 1.87], 1.62 [1.38, 1.72], 1.64 [1.38, 1.77], and 2.24 [2.02, 2.38]. The 50-commit interval crossed parity. WSL2 showed the same direction for those four factors and parity overlap for the 50-commit history. The paired ablation is more direct evidence about adaptive selection than cross-system ratios, but this three-seed, one-host sensitivity study does not establish general superiority.</w:t>
       </w:r>
@@ -5045,29 +6086,36 @@
     <w:p>
       <w:pPr>
         <w:pStyle w:val="Heading2"/>
+        <w:keepNext/>
+        <w:spacing w:before="80" w:after="20"/>
+        <w:jc w:val="left"/>
       </w:pPr>
       <w:r>
         <w:rPr>
-          <w:rFonts w:ascii="Times New Roman" w:eastAsia="Times New Roman" w:hAnsi="Times New Roman" w:cs="Times New Roman"/>
+          <w:rFonts w:ascii="Times New Roman" w:hAnsi="Times New Roman"/>
+          <w:b w:val="0"/>
+          <w:i/>
+          <w:sz w:val="20"/>
         </w:rPr>
-        <w:t>5.3  Commit, Checkout, and Storage</w:t>
+        <w:t>C. Commit, Checkout, and Storage</w:t>
       </w:r>
     </w:p>
     <w:p>
       <w:pPr>
         <w:keepNext/>
-        <w:spacing w:before="40" w:line="240" w:lineRule="auto"/>
+        <w:spacing w:before="40" w:line="240" w:lineRule="auto" w:after="0"/>
         <w:ind w:firstLine="0"/>
         <w:jc w:val="center"/>
       </w:pPr>
       <w:r>
         <w:rPr>
-          <w:rFonts w:eastAsia="Times New Roman" w:cs="Times New Roman"/>
+          <w:rFonts w:eastAsia="Times New Roman" w:cs="Times New Roman" w:ascii="Times New Roman" w:hAnsi="Times New Roman"/>
           <w:noProof/>
+          <w:sz w:val="20"/>
         </w:rPr>
         <w:drawing>
           <wp:inline distT="0" distB="0" distL="0" distR="0" wp14:anchorId="5480C593" wp14:editId="6B287AB5">
-            <wp:extent cx="5120640" cy="2641172"/>
+            <wp:extent cx="3063240" cy="2641172"/>
             <wp:effectExtent l="0" t="0" r="0" b="0"/>
             <wp:docPr id="5" name="Picture 5" descr="Two-panel log-scale chart comparing Revon-H and Dolt median incremental commit and historical checkout latency with interquartile whiskers." title="Two-panel log-scale chart comparing Revon-H and Dolt median incremental commit and historical checkout latency with interquartile whiskers"/>
             <wp:cNvGraphicFramePr>
@@ -5089,7 +6137,7 @@
                   <pic:spPr>
                     <a:xfrm>
                       <a:off x="0" y="0"/>
-                      <a:ext cx="5120640" cy="2641172"/>
+                      <a:ext cx="3063240" cy="2641172"/>
                     </a:xfrm>
                     <a:prstGeom prst="rect">
                       <a:avLst/>
@@ -5105,26 +6153,38 @@
     <w:p>
       <w:pPr>
         <w:pStyle w:val="Caption"/>
+        <w:keepNext/>
+        <w:spacing w:before="40" w:after="40"/>
+        <w:jc w:val="center"/>
       </w:pPr>
       <w:r>
         <w:rPr>
-          <w:rFonts w:eastAsia="Times New Roman" w:cs="Times New Roman"/>
+          <w:rFonts w:ascii="Times New Roman" w:hAnsi="Times New Roman"/>
+          <w:sz w:val="16"/>
         </w:rPr>
-        <w:t>Figure 5: Revon-H and Dolt operational latency; lower is better.</w:t>
+        <w:t>Fig. 5. Revon-H and Dolt operational latency; lower is better.</w:t>
       </w:r>
     </w:p>
     <w:p>
+      <w:pPr>
+        <w:spacing w:line="240" w:lineRule="auto" w:after="0"/>
+      </w:pPr>
       <w:r>
         <w:rPr>
-          <w:rFonts w:eastAsia="Times New Roman" w:cs="Times New Roman"/>
+          <w:rFonts w:eastAsia="Times New Roman" w:cs="Times New Roman" w:ascii="Times New Roman" w:hAnsi="Times New Roman"/>
+          <w:sz w:val="20"/>
         </w:rPr>
         <w:t>Across all eight scenarios, paired Dolt/Revon-H intervals exclude parity for initial import, incremental commit, diff, and historical checkout. The full paired ratios and intervals are in paired_ratio_uncertainty.csv. Initial-import workflow medians across scenario medians were 1,814.83 ms for batched SQL INSERT, 1,701.25 ms for Dolt bulk import, and 1,131.24 ms for Revon-H. In the paired SQL/bulk-import analysis, four scenario intervals favor bulk import and four include parity; there is no general bulk-import advantage. These are workflow measurements; they do not establish engine-level or production-system superiority.</w:t>
       </w:r>
     </w:p>
     <w:p>
+      <w:pPr>
+        <w:spacing w:line="240" w:lineRule="auto" w:after="0"/>
+      </w:pPr>
       <w:r>
         <w:rPr>
-          <w:rFonts w:eastAsia="Times New Roman" w:cs="Times New Roman"/>
+          <w:rFonts w:eastAsia="Times New Roman" w:cs="Times New Roman" w:ascii="Times New Roman" w:hAnsi="Times New Roman"/>
+          <w:sz w:val="20"/>
         </w:rPr>
         <w:t>Repository directory size is a whole-workflow footprint, not normalized algorithm storage. Across the eight scenarios, Revon-H/Dolt repository-footprint ratios ranged from 1.99 to 6.90. Median Revon-H/Dolt ratios after dividing each directory by final UTF-8 logical key/value payload bytes were 3.82; the corresponding residual ratio was 6.82. The residual is not pure metadata: it includes serialization, indexes, metadata, and compression effects. Post-compaction mean footprints for one measured sample per scenario were Revon-M 22.08 MiB, Revon-H 22.08 MiB, Dolt SQL 2.17 MiB, and Dolt bulk import 2.19 MiB. Dolt was compacted offline with `dolt gc` and Revon SQLite repositories with `VACUUM`; compaction time is outside latency and RSS. These are sampled outcomes, not a pure metadata comparison or universal steady-state result.</w:t>
       </w:r>
@@ -5132,30 +6192,36 @@
     <w:p>
       <w:pPr>
         <w:pStyle w:val="Heading2"/>
+        <w:keepNext/>
+        <w:spacing w:before="80" w:after="20"/>
+        <w:jc w:val="left"/>
       </w:pPr>
       <w:r>
         <w:rPr>
-          <w:rFonts w:ascii="Times New Roman" w:eastAsia="Times New Roman" w:hAnsi="Times New Roman" w:cs="Times New Roman"/>
+          <w:rFonts w:ascii="Times New Roman" w:hAnsi="Times New Roman"/>
+          <w:b w:val="0"/>
+          <w:i/>
+          <w:sz w:val="20"/>
         </w:rPr>
-        <w:lastRenderedPageBreak/>
-        <w:t>5.4  Trie-Parameter Sensitivity</w:t>
+        <w:t>D. Trie-Parameter Sensitivity</w:t>
       </w:r>
     </w:p>
     <w:p>
       <w:pPr>
         <w:keepNext/>
-        <w:spacing w:before="40" w:line="240" w:lineRule="auto"/>
+        <w:spacing w:before="40" w:line="240" w:lineRule="auto" w:after="0"/>
         <w:ind w:firstLine="0"/>
         <w:jc w:val="center"/>
       </w:pPr>
       <w:r>
         <w:rPr>
-          <w:rFonts w:eastAsia="Times New Roman" w:cs="Times New Roman"/>
+          <w:rFonts w:eastAsia="Times New Roman" w:cs="Times New Roman" w:ascii="Times New Roman" w:hAnsi="Times New Roman"/>
           <w:noProof/>
+          <w:sz w:val="20"/>
         </w:rPr>
         <w:drawing>
           <wp:inline distT="0" distB="0" distL="0" distR="0" wp14:anchorId="0AF85796" wp14:editId="7444C345">
-            <wp:extent cx="4800600" cy="2700338"/>
+            <wp:extent cx="3063240" cy="2700338"/>
             <wp:effectExtent l="0" t="0" r="0" b="0"/>
             <wp:docPr id="6" name="Picture 6" descr="Scatter plot of forced-Merkle median diff latency against repository storage for five branching-factor and depth configurations, highlighting b8-d4." title="Scatter plot of forced-Merkle median diff latency against repository storage for five branching-factor and depth configurations, highlighting b8-d4"/>
             <wp:cNvGraphicFramePr>
@@ -5177,7 +6243,7 @@
                   <pic:spPr>
                     <a:xfrm>
                       <a:off x="0" y="0"/>
-                      <a:ext cx="4800600" cy="2700338"/>
+                      <a:ext cx="3063240" cy="2700338"/>
                     </a:xfrm>
                     <a:prstGeom prst="rect">
                       <a:avLst/>
@@ -5193,19 +6259,26 @@
     <w:p>
       <w:pPr>
         <w:pStyle w:val="Caption"/>
-        <w:spacing w:before="80"/>
+        <w:keepNext/>
+        <w:spacing w:before="40" w:after="40"/>
+        <w:jc w:val="center"/>
       </w:pPr>
       <w:r>
         <w:rPr>
-          <w:rFonts w:eastAsia="Times New Roman" w:cs="Times New Roman"/>
+          <w:rFonts w:ascii="Times New Roman" w:hAnsi="Times New Roman"/>
+          <w:sz w:val="16"/>
         </w:rPr>
-        <w:t>Figure 6: Fixed-trie sensitivity; dots show median diff latency, and the axis extends above the largest measured p75.</w:t>
+        <w:t>Fig. 6. Fixed-trie sensitivity; dots show median diff latency, and the axis extends above the largest measured p75.</w:t>
       </w:r>
     </w:p>
     <w:p>
+      <w:pPr>
+        <w:spacing w:line="240" w:lineRule="auto" w:after="0"/>
+      </w:pPr>
       <w:r>
         <w:rPr>
-          <w:rFonts w:eastAsia="Times New Roman" w:cs="Times New Roman"/>
+          <w:rFonts w:eastAsia="Times New Roman" w:cs="Times New Roman" w:ascii="Times New Roman" w:hAnsi="Times New Roman"/>
+          <w:sz w:val="20"/>
         </w:rPr>
         <w:t>The corrected fixed-trie sensitivity run contains 45 successful executions: 10 warm-ups and 35 measured runs. b16-d3 had the lowest median diff (21.46 ms) but used 8.12 MiB; b8-d4 measured 26.74 ms and used the least storage (4.26 MiB). The over-deep b8-d5 design measured 33.68 ms for diff and used 44.5% more storage than b8-d4. Thus b8-d4 is a storage-conscious balanced default, not a universal optimum.</w:t>
       </w:r>
@@ -5213,45 +6286,65 @@
     <w:p>
       <w:pPr>
         <w:pStyle w:val="Heading1"/>
+        <w:keepNext/>
+        <w:spacing w:before="120" w:after="60"/>
+        <w:jc w:val="center"/>
       </w:pPr>
       <w:r>
         <w:rPr>
-          <w:rFonts w:ascii="Times New Roman" w:eastAsia="Times New Roman" w:hAnsi="Times New Roman" w:cs="Times New Roman"/>
+          <w:rFonts w:ascii="Times New Roman" w:hAnsi="Times New Roman"/>
+          <w:b/>
+          <w:i w:val="0"/>
+          <w:sz w:val="20"/>
         </w:rPr>
-        <w:t>6  Discussion</w:t>
+        <w:t>VI. DISCUSSION</w:t>
       </w:r>
     </w:p>
     <w:p>
       <w:pPr>
+        <w:spacing w:line="240" w:lineRule="auto" w:after="0"/>
         <w:ind w:firstLine="0"/>
       </w:pPr>
       <w:r>
         <w:rPr>
-          <w:rFonts w:eastAsia="Times New Roman" w:cs="Times New Roman"/>
+          <w:rFonts w:eastAsia="Times New Roman" w:cs="Times New Roman" w:ascii="Times New Roman" w:hAnsi="Times New Roman"/>
+          <w:sz w:val="20"/>
         </w:rPr>
         <w:t>RQ1 shows scenario-dependent workflow latency and storage trade-offs across the declared synthetic update patterns. A separate three-seed sensitivity study found consistent Revon-H diff advantages over the forced-Merkle ablation for four tested factors on Windows and WSL2. The 50-commit case remained inconclusive on both. Lexically adjacent application keys, sorted-range updates, repeated-key updates, and hash-route locality are different update patterns. None of these experiments measures ordered range queries, concurrent reads or writes, or production throughput.</w:t>
       </w:r>
     </w:p>
     <w:p>
+      <w:pPr>
+        <w:spacing w:line="240" w:lineRule="auto" w:after="0"/>
+      </w:pPr>
       <w:r>
         <w:rPr>
-          <w:rFonts w:eastAsia="Times New Roman" w:cs="Times New Roman"/>
+          <w:rFonts w:eastAsia="Times New Roman" w:cs="Times New Roman" w:ascii="Times New Roman" w:hAnsi="Times New Roman"/>
+          <w:sz w:val="20"/>
         </w:rPr>
         <w:t>RQ2 is supported more directly for the tested short and sparse histories: the paired Revon-M/Revon-H ablation shares the durable trie, while the added 50-commit case that crossed the frozen operation boundary showed no resolved difference. This does not establish a universal selector advantage.</w:t>
       </w:r>
     </w:p>
     <w:p>
+      <w:pPr>
+        <w:spacing w:line="240" w:lineRule="auto" w:after="0"/>
+      </w:pPr>
       <w:r>
         <w:rPr>
-          <w:rFonts w:eastAsia="Times New Roman" w:cs="Times New Roman"/>
+          <w:rFonts w:eastAsia="Times New Roman" w:cs="Times New Roman" w:ascii="Times New Roman" w:hAnsi="Times New Roman"/>
+          <w:sz w:val="20"/>
         </w:rPr>
         <w:t>RQ3 rejects a universal geometry. Shallow routing lowers internal traversal but creates larger leaf buckets and higher storage; deeper routing lowers occupancy but increases internal-node work. The suitable configuration therefore depends on which requirement dominates the workload: latency, storage, or worst-case leaf-bucket scanning.</w:t>
       </w:r>
     </w:p>
     <w:p>
+      <w:pPr>
+        <w:spacing w:line="240" w:lineRule="auto" w:after="0"/>
+      </w:pPr>
       <w:r>
         <w:rPr>
-          <w:rFonts w:eastAsia="Times New Roman" w:cs="Times New Roman"/>
+          <w:rFonts w:eastAsia="Times New Roman" w:cs="Times New Roman" w:ascii="Times New Roman" w:hAnsi="Times New Roman"/>
+          <w:sz w:val="20"/>
         </w:rPr>
         <w:t>The Dolt ratios need a system-level interpretation. Dolt performs SQL parsing, schema management, version-control operations, and production durability work that the Revon prototype does not. Dolt's Prolly Trees also serve ordered queries, branches, merges, and remote workflows. Our timings compare the declared interfaces used in the experiment. They do not isolate the tree algorithms and therefore cannot show that a fixed trie is inherently faster than a Prolly Tree.</w:t>
       </w:r>
@@ -5259,12 +6352,18 @@
     <w:p>
       <w:pPr>
         <w:pStyle w:val="Heading1"/>
+        <w:keepNext/>
+        <w:spacing w:before="120" w:after="60"/>
+        <w:jc w:val="center"/>
       </w:pPr>
       <w:r>
         <w:rPr>
-          <w:rFonts w:ascii="Times New Roman" w:eastAsia="Times New Roman" w:hAnsi="Times New Roman" w:cs="Times New Roman"/>
+          <w:rFonts w:ascii="Times New Roman" w:hAnsi="Times New Roman"/>
+          <w:b/>
+          <w:i w:val="0"/>
+          <w:sz w:val="20"/>
         </w:rPr>
-        <w:t>7  Limitations and Threats to Validity</w:t>
+        <w:t>VII. LIMITATIONS AND THREATS TO VALIDITY</w:t>
       </w:r>
     </w:p>
     <w:p>
@@ -5358,56 +6457,83 @@
     <w:p>
       <w:pPr>
         <w:pStyle w:val="Heading1"/>
+        <w:keepNext/>
+        <w:spacing w:before="120" w:after="60"/>
+        <w:jc w:val="center"/>
       </w:pPr>
       <w:r>
         <w:rPr>
-          <w:rFonts w:ascii="Times New Roman" w:eastAsia="Times New Roman" w:hAnsi="Times New Roman" w:cs="Times New Roman"/>
+          <w:rFonts w:ascii="Times New Roman" w:hAnsi="Times New Roman"/>
+          <w:b/>
+          <w:i w:val="0"/>
+          <w:sz w:val="20"/>
         </w:rPr>
-        <w:t>8  Future Work</w:t>
+        <w:t>VIII. FUTURE WORK</w:t>
       </w:r>
     </w:p>
     <w:p>
       <w:pPr>
+        <w:spacing w:line="240" w:lineRule="auto" w:after="0"/>
         <w:ind w:firstLine="0"/>
       </w:pPr>
       <w:r>
         <w:rPr>
-          <w:rFonts w:eastAsia="Times New Roman" w:cs="Times New Roman"/>
+          <w:rFonts w:eastAsia="Times New Roman" w:cs="Times New Roman" w:ascii="Times New Roman" w:hAnsi="Times New Roman"/>
+          <w:sz w:val="20"/>
         </w:rPr>
         <w:t>A next version should choose its structure from observed workload statistics. Key count, prefix skew, mutation density, and leaf occupancy could guide the choice among measured trie geometries instead of fixing b and d for every repository. The diff selector could recalibrate periodically and consider history distance, changed-prefix density, and observed I/O cost alongside its present operation-count rule.</w:t>
       </w:r>
     </w:p>
     <w:p>
+      <w:pPr>
+        <w:spacing w:line="240" w:lineRule="auto" w:after="0"/>
+      </w:pPr>
       <w:r>
         <w:rPr>
-          <w:rFonts w:eastAsia="Times New Roman" w:cs="Times New Roman"/>
+          <w:rFonts w:eastAsia="Times New Roman" w:cs="Times New Roman" w:ascii="Times New Roman" w:hAnsi="Times New Roman"/>
+          <w:sz w:val="20"/>
         </w:rPr>
         <w:t>Storage efficiency could be improved with binary node records, separate value chunks, packed objects, compression, reachability checks, and garbage collection. An ordered Merkle index or content-defined chunk boundaries could add range scans and a history-independent layout while leaving the fixed trie as the controlled baseline.</w:t>
       </w:r>
     </w:p>
     <w:p>
+      <w:pPr>
+        <w:spacing w:line="240" w:lineRule="auto" w:after="0"/>
+      </w:pPr>
       <w:r>
+        <w:rPr>
+          <w:rFonts w:ascii="Times New Roman" w:hAnsi="Times New Roman"/>
+          <w:sz w:val="20"/>
+        </w:rPr>
         <w:t>To move beyond a linear prototype, Revon still needs named branches, merge commits, conflict reporting, schema-aware records, concurrent readers and writers, ordered range scans, and remote synchronization. Evaluation still needs public structured datasets, one-million-row workloads, and independent researcher and hardware replications. WSL2 I/O counters remain incomplete; Windows sensitivity counters are workflow-level and do not isolate operation costs.</w:t>
       </w:r>
     </w:p>
     <w:p>
       <w:pPr>
         <w:pStyle w:val="Heading1"/>
+        <w:keepNext/>
+        <w:spacing w:before="120" w:after="60"/>
+        <w:jc w:val="center"/>
       </w:pPr>
       <w:r>
         <w:rPr>
-          <w:rFonts w:ascii="Times New Roman" w:eastAsia="Times New Roman" w:hAnsi="Times New Roman" w:cs="Times New Roman"/>
+          <w:rFonts w:ascii="Times New Roman" w:hAnsi="Times New Roman"/>
+          <w:b/>
+          <w:i w:val="0"/>
+          <w:sz w:val="20"/>
         </w:rPr>
-        <w:t>9  Conclusion</w:t>
+        <w:t>IX. CONCLUSION</w:t>
       </w:r>
     </w:p>
     <w:p>
       <w:pPr>
+        <w:spacing w:line="240" w:lineRule="auto" w:after="0"/>
         <w:ind w:firstLine="0"/>
       </w:pPr>
       <w:r>
         <w:rPr>
-          <w:rFonts w:eastAsia="Times New Roman" w:cs="Times New Roman"/>
+          <w:rFonts w:eastAsia="Times New Roman" w:cs="Times New Roman" w:ascii="Times New Roman" w:hAnsi="Times New Roman"/>
+          <w:sz w:val="20"/>
         </w:rPr>
         <w:t>Revon demonstrates a content-addressed versioning path for structured key/value data through immutable objects, incremental Merkle updates, SQLite persistence, historical checkout, and adaptive differencing. Paired intervals and a three-seed sensitivity study support workload-specific differences between Revon-H and the forced-Merkle ablation; the long-history result remains inconclusive. The primary benchmark and follow-up runs do not establish performance across real schemas, public datasets, independent hardware, concurrent workloads, or ordered range queries. These measurements describe a reproducible prototype, not a production-system replacement.</w:t>
       </w:r>
@@ -5415,21 +6541,29 @@
     <w:p>
       <w:pPr>
         <w:pStyle w:val="Heading1"/>
+        <w:keepNext/>
+        <w:spacing w:before="120" w:after="60"/>
+        <w:jc w:val="center"/>
       </w:pPr>
       <w:r>
         <w:rPr>
-          <w:rFonts w:ascii="Times New Roman" w:eastAsia="Times New Roman" w:hAnsi="Times New Roman" w:cs="Times New Roman"/>
+          <w:rFonts w:ascii="Times New Roman" w:hAnsi="Times New Roman"/>
+          <w:b/>
+          <w:i w:val="0"/>
+          <w:sz w:val="20"/>
         </w:rPr>
-        <w:t>Acknowledgment</w:t>
+        <w:t>ACKNOWLEDGMENT</w:t>
       </w:r>
     </w:p>
     <w:p>
       <w:pPr>
+        <w:spacing w:line="240" w:lineRule="auto" w:after="0"/>
         <w:ind w:firstLine="0"/>
       </w:pPr>
       <w:r>
         <w:rPr>
-          <w:rFonts w:eastAsia="Times New Roman" w:cs="Times New Roman"/>
+          <w:rFonts w:eastAsia="Times New Roman" w:cs="Times New Roman" w:ascii="Times New Roman" w:hAnsi="Times New Roman"/>
+          <w:sz w:val="20"/>
         </w:rPr>
         <w:t>The authors acknowledge the open-source Dolt project and the researchers whose dataset-versioning systems informed the experimental design.</w:t>
       </w:r>
@@ -5437,262 +6571,313 @@
     <w:p>
       <w:pPr>
         <w:pStyle w:val="Heading1"/>
-        <w:pageBreakBefore/>
+        <w:keepNext/>
+        <w:spacing w:before="120" w:after="60"/>
+        <w:jc w:val="center"/>
       </w:pPr>
       <w:r>
         <w:rPr>
-          <w:rFonts w:ascii="Times New Roman" w:eastAsia="Times New Roman" w:hAnsi="Times New Roman" w:cs="Times New Roman"/>
+          <w:rFonts w:ascii="Times New Roman" w:hAnsi="Times New Roman"/>
+          <w:b/>
+          <w:i w:val="0"/>
+          <w:sz w:val="20"/>
         </w:rPr>
-        <w:t>References</w:t>
+        <w:t>REFERENCES</w:t>
       </w:r>
     </w:p>
     <w:p>
       <w:pPr>
         <w:pStyle w:val="IEEEReference"/>
-      </w:pPr>
-      <w:bookmarkStart w:id="0" w:name="ref_git"/>
+        <w:spacing w:after="40" w:line="240" w:lineRule="auto"/>
+        <w:ind w:left="288" w:hanging="288"/>
+      </w:pPr>
+      <w:bookmarkStart w:id="100" w:name="ref_git"/>
       <w:r>
         <w:rPr>
-          <w:rFonts w:eastAsia="Times New Roman" w:cs="Times New Roman"/>
-          <w:color w:val="000000"/>
+          <w:rFonts w:ascii="Times New Roman" w:hAnsi="Times New Roman"/>
+          <w:sz w:val="16"/>
         </w:rPr>
-        <w:t>[1] Scott Chacon and Ben Straub. 2014. Git Internals - Git Objects. In Pro Git, 2nd edition. https://git-scm.com/book/en/v2/Git-Internals-Git-Objects.</w:t>
+        <w:t>[1] S. Chacon and B. Straub, “Git Internals—Git Objects,” in Pro Git, 2nd ed., 2014. [Online]. Available: https://git-scm.com/book/en/v2/Git-Internals-Git-Objects.</w:t>
       </w:r>
-      <w:bookmarkEnd w:id="0"/>
+      <w:bookmarkEnd w:id="100"/>
     </w:p>
     <w:p>
       <w:pPr>
         <w:pStyle w:val="IEEEReference"/>
-      </w:pPr>
-      <w:bookmarkStart w:id="1" w:name="ref_dolt_block"/>
+        <w:spacing w:after="40" w:line="240" w:lineRule="auto"/>
+        <w:ind w:left="288" w:hanging="288"/>
+      </w:pPr>
+      <w:bookmarkStart w:id="101" w:name="ref_dolt_block"/>
       <w:r>
         <w:rPr>
-          <w:rFonts w:eastAsia="Times New Roman" w:cs="Times New Roman"/>
-          <w:color w:val="000000"/>
+          <w:rFonts w:ascii="Times New Roman" w:hAnsi="Times New Roman"/>
+          <w:sz w:val="16"/>
         </w:rPr>
-        <w:t>[2] DoltHub. 2024. Dolt Storage Engine: Block Store. Dolt Documentation. https://www.dolthub.com/docs/architecture/storage-engine/block-store/.</w:t>
+        <w:t>[2] DoltHub, “Dolt Storage Engine: Block Store,” Dolt Documentation, 2024. [Online]. Available: https://www.dolthub.com/docs/architecture/storage-engine/block-store/.</w:t>
       </w:r>
-      <w:bookmarkEnd w:id="1"/>
+      <w:bookmarkEnd w:id="101"/>
     </w:p>
     <w:p>
       <w:pPr>
         <w:pStyle w:val="IEEEReference"/>
-      </w:pPr>
-      <w:bookmarkStart w:id="2" w:name="ref_dolt_prolly"/>
+        <w:spacing w:after="40" w:line="240" w:lineRule="auto"/>
+        <w:ind w:left="288" w:hanging="288"/>
+      </w:pPr>
+      <w:bookmarkStart w:id="102" w:name="ref_dolt_prolly"/>
       <w:r>
         <w:rPr>
-          <w:rFonts w:eastAsia="Times New Roman" w:cs="Times New Roman"/>
-          <w:color w:val="000000"/>
+          <w:rFonts w:ascii="Times New Roman" w:hAnsi="Times New Roman"/>
+          <w:sz w:val="16"/>
         </w:rPr>
-        <w:t>[3] Tim Sehn. 2024. Dolt's Storage Engine. DoltHub Blog, February 29, 2024. https://www.dolthub.com/blog/2024-02-29-storage-engine/.</w:t>
+        <w:t>[3] T. Sehn, “Dolt’s Storage Engine,” DoltHub Blog, Feb. 29, 2024. [Online]. Available: https://www.dolthub.com/blog/2024-02-29-storage-engine/.</w:t>
       </w:r>
-      <w:bookmarkEnd w:id="2"/>
+      <w:bookmarkEnd w:id="102"/>
     </w:p>
     <w:p>
       <w:pPr>
         <w:pStyle w:val="IEEEReference"/>
-      </w:pPr>
-      <w:bookmarkStart w:id="3" w:name="ref_merkle"/>
+        <w:spacing w:after="40" w:line="240" w:lineRule="auto"/>
+        <w:ind w:left="288" w:hanging="288"/>
+      </w:pPr>
+      <w:bookmarkStart w:id="103" w:name="ref_merkle"/>
       <w:r>
         <w:rPr>
-          <w:rFonts w:eastAsia="Times New Roman" w:cs="Times New Roman"/>
-          <w:color w:val="000000"/>
+          <w:rFonts w:ascii="Times New Roman" w:hAnsi="Times New Roman"/>
+          <w:sz w:val="16"/>
         </w:rPr>
-        <w:t>[4] Ralph C. Merkle. 1988. A Digital Signature Based on a Conventional Encryption Function. In Advances in Cryptology - CRYPTO '87, LNCS 293, pages 369-378. doi:10.1007/3-540-48184-2_32.</w:t>
+        <w:t>[4] R. C. Merkle, “A digital signature based on a conventional encryption function,” in Advances in Cryptology—CRYPTO ’87, Lecture Notes in Computer Science, vol. 293, 1988, pp. 369–378, doi: 10.1007/3-540-48184-2_32.</w:t>
       </w:r>
-      <w:bookmarkEnd w:id="3"/>
+      <w:bookmarkEnd w:id="103"/>
     </w:p>
     <w:p>
       <w:pPr>
         <w:pStyle w:val="IEEEReference"/>
-      </w:pPr>
-      <w:bookmarkStart w:id="4" w:name="ref_persistent"/>
+        <w:spacing w:after="40" w:line="240" w:lineRule="auto"/>
+        <w:ind w:left="288" w:hanging="288"/>
+      </w:pPr>
+      <w:bookmarkStart w:id="104" w:name="ref_persistent"/>
       <w:r>
         <w:rPr>
-          <w:rFonts w:eastAsia="Times New Roman" w:cs="Times New Roman"/>
-          <w:color w:val="000000"/>
+          <w:rFonts w:ascii="Times New Roman" w:hAnsi="Times New Roman"/>
+          <w:sz w:val="16"/>
         </w:rPr>
-        <w:t>[5] James R. Driscoll, Neil Sarnak, Daniel D. Sleator, and Robert E. Tarjan. 1989. Making Data Structures Persistent. Journal of Computer and System Sciences, 38(1):86-124. doi:10.1016/0022-0000(89)90034-2.</w:t>
+        <w:t>[5] J. R. Driscoll, N. Sarnak, D. D. Sleator, and R. E. Tarjan, “Making data structures persistent,” J. Comput. Syst. Sci., vol. 38, no. 1, pp. 86–124, 1989, doi: 10.1016/0022-0000(89)90034-2.</w:t>
       </w:r>
-      <w:bookmarkEnd w:id="4"/>
+      <w:bookmarkEnd w:id="104"/>
     </w:p>
     <w:p>
       <w:pPr>
         <w:pStyle w:val="IEEEReference"/>
-      </w:pPr>
-      <w:bookmarkStart w:id="5" w:name="ref_ipfs"/>
+        <w:spacing w:after="40" w:line="240" w:lineRule="auto"/>
+        <w:ind w:left="288" w:hanging="288"/>
+      </w:pPr>
+      <w:bookmarkStart w:id="105" w:name="ref_ipfs"/>
       <w:r>
         <w:rPr>
-          <w:rFonts w:eastAsia="Times New Roman" w:cs="Times New Roman"/>
-          <w:color w:val="000000"/>
+          <w:rFonts w:ascii="Times New Roman" w:hAnsi="Times New Roman"/>
+          <w:sz w:val="16"/>
         </w:rPr>
-        <w:t>[6] Juan Benet. 2014. IPFS - Content Addressed, Versioned, P2P File System. arXiv:1407.3561.</w:t>
+        <w:t>[6] J. Benet, “IPFS—Content Addressed, Versioned, P2P File System,” arXiv:1407.3561, 2014.</w:t>
       </w:r>
-      <w:bookmarkEnd w:id="5"/>
+      <w:bookmarkEnd w:id="105"/>
     </w:p>
     <w:p>
       <w:pPr>
         <w:pStyle w:val="IEEEReference"/>
-      </w:pPr>
-      <w:bookmarkStart w:id="6" w:name="ref_mst"/>
+        <w:spacing w:after="40" w:line="240" w:lineRule="auto"/>
+        <w:ind w:left="288" w:hanging="288"/>
+      </w:pPr>
+      <w:bookmarkStart w:id="106" w:name="ref_mst"/>
       <w:r>
         <w:rPr>
-          <w:rFonts w:eastAsia="Times New Roman" w:cs="Times New Roman"/>
-          <w:color w:val="000000"/>
+          <w:rFonts w:ascii="Times New Roman" w:hAnsi="Times New Roman"/>
+          <w:sz w:val="16"/>
         </w:rPr>
-        <w:t>[7] Alex Auvolat and François Taïani. 2019. Merkle Search Trees: Efficient State-Based CRDTs in Open Networks. 38th IEEE International Symposium on Reliable Distributed Systems, pages 221-230. doi:10.1109/SRDS47363.2019.00032.</w:t>
+        <w:t>[7] A. Auvolat and F. Taïani, “Merkle Search Trees: Efficient State-Based CRDTs in Open Networks,” in Proc. 38th IEEE Int. Symp. Reliable Distributed Syst. (SRDS), 2019, pp. 221–230, doi: 10.1109/SRDS47363.2019.00032.</w:t>
       </w:r>
-      <w:bookmarkEnd w:id="6"/>
+      <w:bookmarkEnd w:id="106"/>
     </w:p>
     <w:p>
       <w:pPr>
         <w:pStyle w:val="IEEEReference"/>
-      </w:pPr>
-      <w:bookmarkStart w:id="7" w:name="ref_lbfs"/>
+        <w:spacing w:after="40" w:line="240" w:lineRule="auto"/>
+        <w:ind w:left="288" w:hanging="288"/>
+      </w:pPr>
+      <w:bookmarkStart w:id="107" w:name="ref_lbfs"/>
       <w:r>
         <w:rPr>
-          <w:rFonts w:eastAsia="Times New Roman" w:cs="Times New Roman"/>
-          <w:color w:val="000000"/>
+          <w:rFonts w:ascii="Times New Roman" w:hAnsi="Times New Roman"/>
+          <w:sz w:val="16"/>
         </w:rPr>
-        <w:t>[8] Athicha Muthitacharoen, Benjie Chen, and David Mazières. 2001. A Low-Bandwidth Network File System. Proceedings of the 18th ACM Symposium on Operating Systems Principles, pages 174-187. doi:10.1145/502034.502052.</w:t>
+        <w:t>[8] A. Muthitacharoen, B. Chen, and D. Mazières, “A low-bandwidth network file system,” in Proc. 18th ACM Symp. Operating Syst. Principles (SOSP), 2001, pp. 174–187, doi: 10.1145/502034.502052.</w:t>
       </w:r>
-      <w:bookmarkEnd w:id="7"/>
+      <w:bookmarkEnd w:id="107"/>
     </w:p>
     <w:p>
       <w:pPr>
         <w:pStyle w:val="IEEEReference"/>
-      </w:pPr>
-      <w:bookmarkStart w:id="8" w:name="ref_datahub"/>
+        <w:spacing w:after="40" w:line="240" w:lineRule="auto"/>
+        <w:ind w:left="288" w:hanging="288"/>
+      </w:pPr>
+      <w:bookmarkStart w:id="108" w:name="ref_datahub"/>
       <w:r>
         <w:rPr>
-          <w:rFonts w:eastAsia="Times New Roman" w:cs="Times New Roman"/>
-          <w:color w:val="000000"/>
+          <w:rFonts w:ascii="Times New Roman" w:hAnsi="Times New Roman"/>
+          <w:sz w:val="16"/>
         </w:rPr>
-        <w:t>[9] Anant Bhardwaj, Souvik Bhattacherjee, Amit Chavan, Amol Deshpande, Aaron J. Elmore, Samuel Madden, and Aditya G. Parameswaran. 2015. DataHub: Collaborative Data Science and Dataset Version Management at Scale. 7th Biennial Conference on Innovative Data Systems Research.</w:t>
+        <w:t>[9] A. Bhardwaj et al., “DataHub: Collaborative Data Science and Dataset Version Management at Scale,” in Proc. 7th Biennial Conf. Innovative Data Syst. Research (CIDR), 2015.</w:t>
       </w:r>
-      <w:bookmarkEnd w:id="8"/>
+      <w:bookmarkEnd w:id="108"/>
     </w:p>
     <w:p>
       <w:pPr>
         <w:pStyle w:val="IEEEReference"/>
-      </w:pPr>
-      <w:bookmarkStart w:id="9" w:name="ref_decibel"/>
+        <w:spacing w:after="40" w:line="240" w:lineRule="auto"/>
+        <w:ind w:left="288" w:hanging="288"/>
+      </w:pPr>
+      <w:bookmarkStart w:id="109" w:name="ref_decibel"/>
       <w:r>
         <w:rPr>
-          <w:rFonts w:eastAsia="Times New Roman" w:cs="Times New Roman"/>
-          <w:color w:val="000000"/>
+          <w:rFonts w:ascii="Times New Roman" w:hAnsi="Times New Roman"/>
+          <w:sz w:val="16"/>
         </w:rPr>
-        <w:t>[10] Michael Maddox, David Goehring, Aaron J. Elmore, Samuel Madden, Aditya G. Parameswaran, and Amol Deshpande. 2016. Decibel: The Relational Dataset Branching System. Proceedings of the VLDB Endowment, 9(9):624-635. doi:10.14778/2947618.2947619.</w:t>
+        <w:t>[10] M. Maddox et al., “Decibel: The Relational Dataset Branching System,” Proc. VLDB Endowment, vol. 9, no. 9, pp. 624–635, 2016, doi: 10.14778/2947618.2947619.</w:t>
       </w:r>
-      <w:bookmarkEnd w:id="9"/>
+      <w:bookmarkEnd w:id="109"/>
     </w:p>
     <w:p>
       <w:pPr>
         <w:pStyle w:val="IEEEReference"/>
-      </w:pPr>
-      <w:bookmarkStart w:id="10" w:name="ref_orpheus"/>
+        <w:spacing w:after="40" w:line="240" w:lineRule="auto"/>
+        <w:ind w:left="288" w:hanging="288"/>
+      </w:pPr>
+      <w:bookmarkStart w:id="110" w:name="ref_orpheus"/>
       <w:r>
         <w:rPr>
-          <w:rFonts w:eastAsia="Times New Roman" w:cs="Times New Roman"/>
-          <w:color w:val="000000"/>
+          <w:rFonts w:ascii="Times New Roman" w:hAnsi="Times New Roman"/>
+          <w:sz w:val="16"/>
         </w:rPr>
-        <w:t>[11] Silu Huang, Liqi Xu, Jialin Liu, Aaron J. Elmore, and Aditya G. Parameswaran. 2017. OrpheusDB: Bolt-on Versioning for Relational Databases. Proceedings of the VLDB Endowment, 10(10):1130-1141. doi:10.14778/3115404.3115417.</w:t>
+        <w:t>[11] S. Huang, L. Xu, J. Liu, A. J. Elmore, and A. G. Parameswaran, “OrpheusDB: Bolt-on Versioning for Relational Databases,” Proc. VLDB Endowment, vol. 10, no. 10, pp. 1130–1141, 2017, doi: 10.14778/3115404.3115417.</w:t>
       </w:r>
-      <w:bookmarkEnd w:id="10"/>
+      <w:bookmarkEnd w:id="110"/>
     </w:p>
     <w:p>
       <w:pPr>
         <w:pStyle w:val="IEEEReference"/>
-      </w:pPr>
-      <w:bookmarkStart w:id="11" w:name="ref_versioning"/>
+        <w:spacing w:after="40" w:line="240" w:lineRule="auto"/>
+        <w:ind w:left="288" w:hanging="288"/>
+      </w:pPr>
+      <w:bookmarkStart w:id="111" w:name="ref_versioning"/>
       <w:r>
         <w:rPr>
-          <w:rFonts w:eastAsia="Times New Roman" w:cs="Times New Roman"/>
-          <w:color w:val="000000"/>
+          <w:rFonts w:ascii="Times New Roman" w:hAnsi="Times New Roman"/>
+          <w:sz w:val="16"/>
         </w:rPr>
-        <w:t>[12] Souvik Bhattacherjee, Amit Chavan, Silu Huang, Amol Deshpande, and Aditya Parameswaran. 2015. Principles of Dataset Versioning: Exploring the Recreation/Storage Tradeoff. Proceedings of the VLDB Endowment, 8(12):1346-1357. doi:10.14778/2824032.2824035.</w:t>
+        <w:t>[12] S. Bhattacherjee, A. Chavan, S. Huang, A. Deshpande, and A. Parameswaran, “Principles of Dataset Versioning: Exploring the Recreation/Storage Tradeoff,” Proc. VLDB Endowment, vol. 8, no. 12, pp. 1346–1357, 2015, doi: 10.14778/2824032.2824035.</w:t>
       </w:r>
-      <w:bookmarkEnd w:id="11"/>
+      <w:bookmarkEnd w:id="111"/>
     </w:p>
     <w:p>
       <w:pPr>
         <w:pStyle w:val="IEEEReference"/>
-      </w:pPr>
-      <w:bookmarkStart w:id="12" w:name="ref_delta"/>
+        <w:spacing w:after="40" w:line="240" w:lineRule="auto"/>
+        <w:ind w:left="288" w:hanging="288"/>
+      </w:pPr>
+      <w:bookmarkStart w:id="112" w:name="ref_delta"/>
       <w:r>
         <w:rPr>
-          <w:rFonts w:eastAsia="Times New Roman" w:cs="Times New Roman"/>
-          <w:color w:val="000000"/>
+          <w:rFonts w:ascii="Times New Roman" w:hAnsi="Times New Roman"/>
+          <w:sz w:val="16"/>
         </w:rPr>
-        <w:t>[13] Michael Armbrust et al. 2020. Delta Lake: High-Performance ACID Table Storage over Cloud Object Stores. Proceedings of the VLDB Endowment, 13(12):3411-3424. doi:10.14778/3415478.3415560.</w:t>
+        <w:t>[13] M. Armbrust et al., “Delta Lake: High-Performance ACID Table Storage over Cloud Object Stores,” Proc. VLDB Endowment, vol. 13, no. 12, pp. 3411–3424, 2020, doi: 10.14778/3415478.3415560.</w:t>
       </w:r>
-      <w:bookmarkEnd w:id="12"/>
+      <w:bookmarkEnd w:id="112"/>
     </w:p>
     <w:p>
       <w:pPr>
         <w:pStyle w:val="IEEEReference"/>
-      </w:pPr>
-      <w:bookmarkStart w:id="13" w:name="ref_noms"/>
+        <w:spacing w:after="40" w:line="240" w:lineRule="auto"/>
+        <w:ind w:left="288" w:hanging="288"/>
+      </w:pPr>
+      <w:bookmarkStart w:id="113" w:name="ref_noms"/>
       <w:r>
         <w:rPr>
-          <w:rFonts w:eastAsia="Times New Roman" w:cs="Times New Roman"/>
-          <w:color w:val="000000"/>
+          <w:rFonts w:ascii="Times New Roman" w:hAnsi="Times New Roman"/>
+          <w:sz w:val="16"/>
         </w:rPr>
-        <w:t>[14] Attic Labs. n.d. Noms technical overview. GitHub. https://github.com/attic-labs/noms/blob/master/doc/intro.md.</w:t>
+        <w:t>[14] Attic Labs, “Noms Technical Overview.” GitHub. [Online]. Available: https://github.com/attic-labs/noms/blob/master/doc/intro.md.</w:t>
       </w:r>
-      <w:bookmarkEnd w:id="13"/>
+      <w:bookmarkEnd w:id="113"/>
     </w:p>
     <w:p>
       <w:pPr>
         <w:pStyle w:val="IEEEReference"/>
-      </w:pPr>
-      <w:bookmarkStart w:id="14" w:name="ref_forkbase"/>
+        <w:spacing w:after="40" w:line="240" w:lineRule="auto"/>
+        <w:ind w:left="288" w:hanging="288"/>
+      </w:pPr>
+      <w:bookmarkStart w:id="114" w:name="ref_forkbase"/>
       <w:r>
         <w:rPr>
-          <w:rFonts w:eastAsia="Times New Roman" w:cs="Times New Roman"/>
-          <w:color w:val="000000"/>
+          <w:rFonts w:ascii="Times New Roman" w:hAnsi="Times New Roman"/>
+          <w:sz w:val="16"/>
         </w:rPr>
-        <w:t>[15] Sheng Wang et al. 2018. ForkBase: An Efficient Storage Engine for Blockchain and Forkable Applications. Proceedings of the VLDB Endowment, 11(10):1137-1150. doi:10.14778/3231751.3231762.</w:t>
+        <w:t>[15] S. Wang et al., “ForkBase: An Efficient Storage Engine for Blockchain and Forkable Applications,” Proc. VLDB Endowment, vol. 11, no. 10, pp. 1137–1150, 2018, doi: 10.14778/3231751.3231762.</w:t>
       </w:r>
-      <w:bookmarkEnd w:id="14"/>
+      <w:bookmarkEnd w:id="114"/>
     </w:p>
     <w:p>
       <w:pPr>
         <w:pStyle w:val="Heading1"/>
+        <w:keepNext/>
+        <w:spacing w:before="120" w:after="60"/>
+        <w:jc w:val="center"/>
       </w:pPr>
       <w:r>
         <w:rPr>
-          <w:rFonts w:ascii="Times New Roman" w:eastAsia="Times New Roman" w:hAnsi="Times New Roman" w:cs="Times New Roman"/>
+          <w:rFonts w:ascii="Times New Roman" w:hAnsi="Times New Roman"/>
+          <w:b/>
+          <w:i w:val="0"/>
+          <w:sz w:val="20"/>
         </w:rPr>
-        <w:t>Appendix A  Reproducibility and Data Availability</w:t>
+        <w:t>APPENDIX A. REPRODUCIBILITY AND DATA AVAILABILITY</w:t>
       </w:r>
     </w:p>
     <w:p>
       <w:pPr>
+        <w:spacing w:line="240" w:lineRule="auto" w:after="0"/>
         <w:ind w:firstLine="0"/>
         <w:jc w:val="left"/>
       </w:pPr>
       <w:r>
+        <w:rPr>
+          <w:rFonts w:ascii="Times New Roman" w:hAnsi="Times New Roman"/>
+          <w:sz w:val="20"/>
+        </w:rPr>
         <w:t>The repository contains the benchmark harness, evidence audit, paired-ratio analysis, multi-seed robustness study, and manuscript validation tools. The primary corrected paper-profile bundle is evidence/paper-corrected-issues13-17-counterbalanced-final-20260923. The primary paired ratio intervals are in evidence/paper-corrected-issues13-17-counterbalanced-final-20260923/paired_ratio_uncertainty.csv. The Windows and WSL2 sensitivity bundles are evidence/paper-issues18-20-robustness-20260923 and evidence/paper-issues18-20-linux-wsl-20260923; the supplemental Windows telemetry bundle is evidence/paper-issues14-windows-telemetry-20260924. Their raw rows, manifests, audits, summaries, and seed-cluster intervals are retained. The trie-sensitivity bundle is evidence/trie-sensitivity-issues8-20260923. These artifacts validate evidence consistency; they do not independently reproduce timings. Project repository: https://github.com/atharvasheersh/Revon</w:t>
       </w:r>
     </w:p>
     <w:p>
       <w:pPr>
+        <w:spacing w:line="240" w:lineRule="auto" w:after="0"/>
         <w:sectPr>
           <w:type w:val="continuous"/>
-          <w:pgSz w:w="11906" w:h="16838"/>
-          <w:pgMar w:top="1440" w:right="1440" w:bottom="1440" w:left="1440" w:header="432" w:footer="504" w:gutter="0"/>
-          <w:cols w:space="346"/>
+          <w:pgSz w:w="12240" w:h="15840"/>
+          <w:pgMar w:top="1080" w:right="900" w:bottom="1440" w:left="900" w:header="360" w:footer="360" w:gutter="0"/>
+          <w:cols w:space="360" w:num="2" w:equalWidth="1"/>
           <w:docGrid w:linePitch="360"/>
         </w:sectPr>
       </w:pPr>
     </w:p>
-    <w:p/>
+    <w:p>
+      <w:pPr>
+        <w:spacing w:line="240" w:lineRule="auto" w:after="0"/>
+      </w:pPr>
+    </w:p>
     <w:sectPr>
       <w:type w:val="continuous"/>
-      <w:pgSz w:w="11906" w:h="16838"/>
-      <w:pgMar w:top="1440" w:right="1440" w:bottom="1440" w:left="1440" w:header="432" w:footer="504" w:gutter="0"/>
-      <w:cols w:space="720"/>
+      <w:pgSz w:w="12240" w:h="15840"/>
+      <w:pgMar w:top="1080" w:right="900" w:bottom="1440" w:left="900" w:header="360" w:footer="360" w:gutter="0"/>
+      <w:cols w:space="360" w:num="2" w:equalWidth="1"/>
       <w:docGrid w:linePitch="360"/>
     </w:sectPr>
   </w:body>
@@ -6363,13 +7548,14 @@
     <w:qFormat/>
     <w:rsid w:val="00FC693F"/>
     <w:pPr>
-      <w:spacing w:after="0" w:line="272" w:lineRule="exact"/>
+      <w:spacing w:after="0" w:line="240" w:lineRule="auto"/>
       <w:ind w:firstLine="216"/>
       <w:jc w:val="both"/>
     </w:pPr>
     <w:rPr>
       <w:rFonts w:ascii="Times New Roman" w:hAnsi="Times New Roman"/>
       <w:color w:val="000000"/>
+      <w:sz w:val="20"/>
     </w:rPr>
   </w:style>
   <w:style w:type="paragraph" w:styleId="Heading1">

</xml_diff>

<commit_message>
paper: refresh final manuscript pagination
Update the final research paper DOCX and PDF after table and figure pagination repair. Keep tables, captions, and figures together in the rendered manuscript.
</commit_message>
<xml_diff>
--- a/paper/Revon_Final_Research_Paper.docx
+++ b/paper/Revon_Final_Research_Paper.docx
@@ -5,7 +5,8 @@
     <w:p>
       <w:pPr>
         <w:pStyle w:val="Title"/>
-        <w:spacing w:before="0" w:after="160"/>
+        <w:keepNext/>
+        <w:spacing w:before="0" w:after="160" w:line="240" w:lineRule="auto"/>
         <w:jc w:val="center"/>
       </w:pPr>
       <w:r>
@@ -15,7 +16,25 @@
           <w:i w:val="0"/>
           <w:sz w:val="48"/>
         </w:rPr>
-        <w:t>Revon: Evaluating Hybrid Diffing in a Versioned Key-Value Prototype</w:t>
+        <w:t>Revon: Git-Inspired Merkle Hash Trie</w:t>
+        <w:br/>
+      </w:r>
+      <w:r>
+        <w:rPr>
+          <w:rFonts w:ascii="Times New Roman" w:hAnsi="Times New Roman"/>
+          <w:b w:val="0"/>
+          <w:i w:val="0"/>
+          <w:sz w:val="48"/>
+        </w:rPr>
+        <w:t>Versioning for Structured Data</w:t>
+      </w:r>
+      <w:r>
+        <w:rPr>
+          <w:rFonts w:ascii="Times New Roman" w:hAnsi="Times New Roman"/>
+          <w:b w:val="0"/>
+          <w:i w:val="0"/>
+          <w:sz w:val="48"/>
+        </w:rPr>
       </w:r>
     </w:p>
     <w:p>
@@ -186,19 +205,12 @@
       </w:pPr>
       <w:r>
         <w:rPr>
-          <w:rFonts w:ascii="Times New Roman" w:hAnsi="Times New Roman"/>
           <w:b/>
-          <w:i/>
-          <w:sz w:val="20"/>
         </w:rPr>
-        <w:t>Abstract—</w:t>
-      </w:r>
-      <w:r>
-        <w:rPr>
-          <w:rFonts w:ascii="Times New Roman" w:hAnsi="Times New Roman"/>
-          <w:sz w:val="20"/>
-        </w:rPr>
-        <w:t>Versioning structured datasets requires durable history, efficient sparse updates, historical reconstruction, and comparison without copying every record. Revon is a Python prototype built around an immutable fixed-depth Merkle hash trie; Revon-H adds addressed changesets and adaptively selects log aggregation or hash-pruned differencing. We compare Snapshot, Log-only, forced-Merkle Revon-M, Revon-H, and Dolt 2.3.1 on deterministic workloads up to 100,000 rows, using evidence from 540 successful executions. Within the declared API and CLI workflows, median paired Dolt/Revon-H diff-latency ratios range from 7.14 to 625.10, and all seven-trial 95% bootstrap intervals favor Revon-H latency. These are workflow-level results: the comparison includes different interfaces and does not isolate index or tree performance. A separate three-seed study found the 50-commit ablation result inconclusive. Experiments used one Windows host and WSL2 on the same physical computer. The results support workload-specific trade-offs for this prototype, not general or production-level superiority.</w:t>
+        <w:t>Abstract:</w:t>
+      </w:r>
+      <w:r>
+        <w:t xml:space="preserve"> Versioning structured data means keeping exact historical states, handling sparse updates, and comparing versions without copying the full dataset each time. Revon is a Python prototype built on an immutable, fixed-depth Merkle hash trie. Its hybrid variant, Revon-H, stores addressed changesets and chooses between log aggregation and hash-pruned differencing. We tested Snapshot, Log-only, forced-Merkle Revon-M, Revon-H, and Dolt 2.3.1 on deterministic workloads of up to 100,000 rows, across 540 successful executions. For the tested workflows, median paired Dolt/Revon-H diff-latency ratios ranged from 7.14 to 625.10, and all seven-trial 95% bootstrap intervals favored Revon-H latency. Those are interface-level results: the comparison includes different APIs and does not isolate tree or index performance. A separate three-seed study could not resolve the 50-commit ablation result. We ran the experiments on one Windows host and under WSL2 on that same computer. The results show workload-dependent trade-offs for this prototype; they do not establish general or production-level superiority.</w:t>
       </w:r>
     </w:p>
     <w:p>
@@ -222,7 +234,7 @@
           <w:i/>
           <w:sz w:val="20"/>
         </w:rPr>
-        <w:t>Index Terms—</w:t>
+        <w:t xml:space="preserve">Index Terms: </w:t>
       </w:r>
       <w:r>
         <w:rPr>
@@ -256,26 +268,18 @@
         <w:ind w:firstLine="0"/>
       </w:pPr>
       <w:r>
-        <w:rPr>
-          <w:rFonts w:eastAsia="Times New Roman" w:cs="Times New Roman" w:ascii="Times New Roman" w:hAnsi="Times New Roman"/>
-          <w:sz w:val="20"/>
-        </w:rPr>
-        <w:t xml:space="preserve">Version control for structured data is more than archiving files. A useful system must retain exact versions, apply sparse mutations without rebuilding the complete state, reconstruct historical versions, and identify changes efficiently. Git provides the starting idea--immutable objects named by content and commits linked to their parents </w:t>
+        <w:t xml:space="preserve">Structured-data version control has to do more than archive files. It must preserve exact versions, apply sparse updates without rebuilding the whole state, restore earlier versions, and compare states efficiently. Git offers a useful starting point: immutable objects named by their content, linked through parent commits </w:t>
       </w:r>
       <w:hyperlink w:anchor="ref_git" w:history="1">
         <w:r>
           <w:rPr>
-            <w:color w:val="0000FF"/>
+            <w:rStyle w:val="Hyperlink"/>
           </w:rPr>
           <w:t>[1]</w:t>
         </w:r>
       </w:hyperlink>
       <w:r>
-        <w:rPr>
-          <w:rFonts w:eastAsia="Times New Roman" w:cs="Times New Roman" w:ascii="Times New Roman" w:hAnsi="Times New Roman"/>
-          <w:sz w:val="20"/>
-        </w:rPr>
-        <w:t>--but organizes those objects around files and directories. A record store presents a different workload: keys remain stable, update density varies, and two versions may be separated by a handful of edits or by a long sequence of commits.</w:t>
+        <w:t>. Its objects are organized around files and directories, however. Record stores have a different shape: keys may remain stable while update density changes, and two versions may differ by a few edits or by a long commit history.</w:t>
       </w:r>
     </w:p>
     <w:p>
@@ -283,11 +287,7 @@
         <w:spacing w:line="240" w:lineRule="auto" w:after="0"/>
       </w:pPr>
       <w:r>
-        <w:rPr>
-          <w:rFonts w:eastAsia="Times New Roman" w:cs="Times New Roman" w:ascii="Times New Roman" w:hAnsi="Times New Roman"/>
-          <w:sz w:val="20"/>
-        </w:rPr>
-        <w:t>Revon evaluates whether a deliberately simple fixed-depth Merkle hash trie can unite incremental structural sharing with an operation index. Its primary variant, Revon-H, uses the log path for short or sparse intervals and switches to the Merkle path when the accumulated operations cross a calibration boundary fixed before evaluation. SQLite provides atomic durable storage, but does not determine the versioning algorithm.</w:t>
+        <w:t>Revon asks whether a fixed-depth Merkle hash trie can combine incremental structural sharing with an operation index. The main variant, Revon-H, uses the log path for short or sparse intervals and switches to Merkle comparison after a calibration threshold fixed before evaluation. SQLite supplies atomic, durable storage; it does not define Revon’s versioning algorithm.</w:t>
       </w:r>
     </w:p>
     <w:p>
@@ -295,41 +295,29 @@
         <w:spacing w:line="240" w:lineRule="auto" w:after="0"/>
       </w:pPr>
       <w:r>
-        <w:rPr>
-          <w:rFonts w:eastAsia="Times New Roman" w:cs="Times New Roman" w:ascii="Times New Roman" w:hAnsi="Times New Roman"/>
-          <w:sz w:val="20"/>
-        </w:rPr>
-        <w:t xml:space="preserve">Dolt is the production comparator because it combines SQL semantics, a Git-style commit graph, and content-addressed Prolly Trees </w:t>
+        <w:t xml:space="preserve">We use Dolt as the production comparator because it combines SQL, a Git-style commit graph, and content-addressed Prolly Trees </w:t>
       </w:r>
       <w:hyperlink w:anchor="ref_dolt_block" w:history="1">
         <w:r>
           <w:rPr>
-            <w:color w:val="0000FF"/>
+            <w:rStyle w:val="Hyperlink"/>
           </w:rPr>
           <w:t>[2]</w:t>
         </w:r>
       </w:hyperlink>
       <w:r>
-        <w:rPr>
-          <w:rFonts w:eastAsia="Times New Roman" w:cs="Times New Roman" w:ascii="Times New Roman" w:hAnsi="Times New Roman"/>
-          <w:sz w:val="20"/>
-        </w:rPr>
         <w:t xml:space="preserve">, </w:t>
       </w:r>
       <w:hyperlink w:anchor="ref_dolt_prolly" w:history="1">
         <w:r>
           <w:rPr>
-            <w:color w:val="0000FF"/>
+            <w:rStyle w:val="Hyperlink"/>
           </w:rPr>
           <w:t>[3]</w:t>
         </w:r>
       </w:hyperlink>
       <w:r>
-        <w:rPr>
-          <w:rFonts w:eastAsia="Times New Roman" w:cs="Times New Roman" w:ascii="Times New Roman" w:hAnsi="Times New Roman"/>
-          <w:sz w:val="20"/>
-        </w:rPr>
-        <w:t>. Revon is not presented as a feature replacement for Dolt. The comparison measures a smaller in-process Python prototype against a Dolt CLI workflow and does not isolate their tree algorithms.</w:t>
+        <w:t>. Revon is a smaller research prototype, not a feature-for-feature replacement for Dolt. Our results compare Revon’s in-process Python API with a Dolt CLI workflow; they do not isolate the performance of either tree structure.</w:t>
       </w:r>
     </w:p>
     <w:p>
@@ -354,10 +342,7 @@
         <w:pStyle w:val="ListBullet"/>
       </w:pPr>
       <w:r>
-        <w:rPr>
-          <w:rFonts w:eastAsia="Times New Roman" w:cs="Times New Roman"/>
-        </w:rPr>
-        <w:t>RQ1: What latency and storage trade-offs does Revon-H exhibit against Snapshot, Log-only, and Dolt across dataset size, mutation density, and locality?</w:t>
+        <w:t>RQ1: How do Revon-H’s latency and storage compare with Snapshot, Log-only, and Dolt across dataset sizes, mutation densities, and update localities?</w:t>
       </w:r>
     </w:p>
     <w:p>
@@ -365,10 +350,7 @@
         <w:pStyle w:val="ListBullet"/>
       </w:pPr>
       <w:r>
-        <w:rPr>
-          <w:rFonts w:eastAsia="Times New Roman" w:cs="Times New Roman"/>
-        </w:rPr>
-        <w:t>RQ2: Does adaptive log/Merkle selection improve diff latency relative to a forced-Merkle ablation without changing correctness?</w:t>
+        <w:t>RQ2: Does choosing between log and Merkle diff improve latency over forced-Merkle Revon-M while preserving correctness?</w:t>
       </w:r>
     </w:p>
     <w:p>
@@ -376,10 +358,7 @@
         <w:pStyle w:val="ListBullet"/>
       </w:pPr>
       <w:r>
-        <w:rPr>
-          <w:rFonts w:eastAsia="Times New Roman" w:cs="Times New Roman"/>
-        </w:rPr>
-        <w:t>RQ3: How sensitive are fixed-trie latency, storage, and examined work to branching factor and depth?</w:t>
+        <w:t>RQ3: How do branching factor and trie depth affect latency, storage, and the amount of work examined?</w:t>
       </w:r>
     </w:p>
     <w:p>
@@ -404,10 +383,7 @@
         <w:pStyle w:val="ListBullet"/>
       </w:pPr>
       <w:r>
-        <w:rPr>
-          <w:rFonts w:eastAsia="Times New Roman" w:cs="Times New Roman"/>
-        </w:rPr>
-        <w:t>A canonical SHA-256-addressed fixed-depth trie with incremental multi-key path rewriting.</w:t>
+        <w:t>We implement a canonical SHA-256-addressed, fixed-depth trie with incremental rewriting of paths affected by multi-key updates.</w:t>
       </w:r>
     </w:p>
     <w:p>
@@ -415,10 +391,7 @@
         <w:pStyle w:val="ListBullet"/>
       </w:pPr>
       <w:r>
-        <w:rPr>
-          <w:rFonts w:eastAsia="Times New Roman" w:cs="Times New Roman"/>
-        </w:rPr>
-        <w:t>A hybrid diff policy combining addressed changesets with hash-pruned tree comparison.</w:t>
+        <w:t>We design a hybrid diff policy that combines addressed changesets with hash-pruned tree comparison.</w:t>
       </w:r>
     </w:p>
     <w:p>
@@ -426,11 +399,7 @@
         <w:pStyle w:val="ListBullet"/>
       </w:pPr>
       <w:r>
-        <w:rPr>
-          <w:rFonts w:eastAsia="Times New Roman" w:cs="Times New Roman"/>
-        </w:rPr>
-        <w:lastRenderedPageBreak/>
-        <w:t>An atomic SQLite repository that persists objects, commits, aliases, metrics, and HEAD and verifies hashes after reopen.</w:t>
+        <w:t>We build an atomic SQLite repository for objects, commits, aliases, measurements, and HEAD, and verify object hashes after reopening it.</w:t>
       </w:r>
     </w:p>
     <w:p>
@@ -438,10 +407,7 @@
         <w:pStyle w:val="ListBullet"/>
       </w:pPr>
       <w:r>
-        <w:rPr>
-          <w:rFonts w:eastAsia="Times New Roman" w:cs="Times New Roman"/>
-        </w:rPr>
-        <w:t>A five-system benchmark with shared deterministic workloads, common canonical diff and checkout outputs, two separately reported Dolt initial-import workflows, balanced randomized execution order, external process-tree RSS sampling, raw evidence, and an internal evidence-integrity audit.</w:t>
+        <w:t>We compare five systems on shared deterministic workloads, using common diff and checkout outputs. We report Dolt’s two initial-import workflows separately, randomize and balance execution order, sample process-tree RSS externally, retain raw evidence, and audit its integrity.</w:t>
       </w:r>
     </w:p>
     <w:p>
@@ -449,10 +415,7 @@
         <w:pStyle w:val="ListBullet"/>
       </w:pPr>
       <w:r>
-        <w:rPr>
-          <w:rFonts w:eastAsia="Times New Roman" w:cs="Times New Roman"/>
-        </w:rPr>
-        <w:t>A controlled branching-factor/depth sensitivity study that prevents treating b=8, d=4 as universally optimal.</w:t>
+        <w:t>We measure how branching factor and depth affect the fixed trie, rather than assuming that b=8 and d=4 are universally best.</w:t>
       </w:r>
     </w:p>
     <w:p>
@@ -495,71 +458,117 @@
         <w:ind w:firstLine="0"/>
       </w:pPr>
       <w:r>
-        <w:rPr>
-          <w:rFonts w:eastAsia="Times New Roman" w:cs="Times New Roman" w:ascii="Times New Roman" w:hAnsi="Times New Roman"/>
-          <w:sz w:val="20"/>
-        </w:rPr>
-        <w:t xml:space="preserve">Merkle's authenticated tree construction established that a compact root digest can commit to a larger collection </w:t>
+        <w:t xml:space="preserve">Merkle’s authenticated-tree construction showed that a compact root digest can commit to a larger collection </w:t>
       </w:r>
       <w:hyperlink w:anchor="ref_merkle" w:history="1">
         <w:r>
           <w:rPr>
-            <w:color w:val="0000FF"/>
+            <w:rStyle w:val="Hyperlink"/>
           </w:rPr>
           <w:t>[4]</w:t>
         </w:r>
       </w:hyperlink>
       <w:r>
-        <w:rPr>
-          <w:rFonts w:eastAsia="Times New Roman" w:cs="Times New Roman" w:ascii="Times New Roman" w:hAnsi="Times New Roman"/>
-          <w:sz w:val="20"/>
-        </w:rPr>
-        <w:t xml:space="preserve">, while persistent-data-structure theory formalized path copying and bounded-overhead access to historical versions </w:t>
+        <w:t xml:space="preserve">. Git and IPFS apply content addressing to software history and networked content </w:t>
+      </w:r>
+      <w:hyperlink w:anchor="ref_git" w:history="1">
+        <w:r>
+          <w:rPr>
+            <w:rStyle w:val="Hyperlink"/>
+          </w:rPr>
+          <w:t>[1]</w:t>
+        </w:r>
+      </w:hyperlink>
+      <w:r>
+        <w:t xml:space="preserve">, </w:t>
+      </w:r>
+      <w:hyperlink w:anchor="ref_ipfs" w:history="1">
+        <w:r>
+          <w:rPr>
+            <w:rStyle w:val="Hyperlink"/>
+          </w:rPr>
+          <w:t>[6]</w:t>
+        </w:r>
+      </w:hyperlink>
+      <w:r>
+        <w:t xml:space="preserve">. Persistent-data-structure theory formalized path copying and access to earlier states </w:t>
       </w:r>
       <w:hyperlink w:anchor="ref_persistent" w:history="1">
         <w:r>
           <w:rPr>
-            <w:color w:val="0000FF"/>
+            <w:rStyle w:val="Hyperlink"/>
           </w:rPr>
           <w:t>[5]</w:t>
         </w:r>
       </w:hyperlink>
       <w:r>
-        <w:rPr>
-          <w:rFonts w:eastAsia="Times New Roman" w:cs="Times New Roman" w:ascii="Times New Roman" w:hAnsi="Times New Roman"/>
-          <w:sz w:val="20"/>
-        </w:rPr>
-        <w:t xml:space="preserve">. Git applies content-addressed blobs, trees, and commits to software history </w:t>
-      </w:r>
-      <w:hyperlink w:anchor="ref_git" w:history="1">
+        <w:t xml:space="preserve">. Later persistent dictionaries explore ordered, disk-oriented alternatives: stratified B-trees </w:t>
+      </w:r>
+      <w:hyperlink w:anchor="ref_stratified" w:history="1">
         <w:r>
           <w:rPr>
-            <w:color w:val="0000FF"/>
+            <w:rStyle w:val="Hyperlink"/>
           </w:rPr>
-          <w:t>[1]</w:t>
+          <w:t>[16]</w:t>
         </w:r>
       </w:hyperlink>
       <w:r>
-        <w:rPr>
-          <w:rFonts w:eastAsia="Times New Roman" w:cs="Times New Roman" w:ascii="Times New Roman" w:hAnsi="Times New Roman"/>
-          <w:sz w:val="20"/>
-        </w:rPr>
-        <w:t xml:space="preserve">, and IPFS generalizes content-addressed links into a versionable Merkle DAG </w:t>
-      </w:r>
-      <w:hyperlink w:anchor="ref_ipfs" w:history="1">
+        <w:t xml:space="preserve"> and fully persistent B-trees </w:t>
+      </w:r>
+      <w:hyperlink w:anchor="ref_fully_persistent_btree" w:history="1">
         <w:r>
           <w:rPr>
-            <w:color w:val="0000FF"/>
+            <w:rStyle w:val="Hyperlink"/>
           </w:rPr>
-          <w:t>[6]</w:t>
+          <w:t>[19]</w:t>
         </w:r>
       </w:hyperlink>
       <w:r>
-        <w:rPr>
-          <w:rFonts w:eastAsia="Times New Roman" w:cs="Times New Roman" w:ascii="Times New Roman" w:hAnsi="Times New Roman"/>
-          <w:sz w:val="20"/>
-        </w:rPr>
-        <w:t>. Revon adopts immutable object identity and parent links, but routes structured keys by hash into a persistent trie rather than mirroring a filesystem hierarchy.</w:t>
+        <w:t xml:space="preserve">. Revon instead routes hashed keys through a fixed-depth trie, trading ordered range access for hash-pruned comparison. Scientific array systems such as SciDB and TimeArr preserve versions using array-specific storage layouts and deltas </w:t>
+      </w:r>
+      <w:hyperlink w:anchor="ref_scidb_version" w:history="1">
+        <w:r>
+          <w:rPr>
+            <w:rStyle w:val="Hyperlink"/>
+          </w:rPr>
+          <w:t>[17]</w:t>
+        </w:r>
+      </w:hyperlink>
+      <w:r>
+        <w:t xml:space="preserve">, </w:t>
+      </w:r>
+      <w:hyperlink w:anchor="ref_timearr" w:history="1">
+        <w:r>
+          <w:rPr>
+            <w:rStyle w:val="Hyperlink"/>
+          </w:rPr>
+          <w:t>[18]</w:t>
+        </w:r>
+      </w:hyperlink>
+      <w:r>
+        <w:t xml:space="preserve">. TardisDB integrates version access with a main-memory database, while Saquib et al. study replicated versioned structures across wide-area systems </w:t>
+      </w:r>
+      <w:hyperlink w:anchor="ref_replicated_versioned" w:history="1">
+        <w:r>
+          <w:rPr>
+            <w:rStyle w:val="Hyperlink"/>
+          </w:rPr>
+          <w:t>[20]</w:t>
+        </w:r>
+      </w:hyperlink>
+      <w:r>
+        <w:t xml:space="preserve">, </w:t>
+      </w:r>
+      <w:hyperlink w:anchor="ref_tardisdb" w:history="1">
+        <w:r>
+          <w:rPr>
+            <w:rStyle w:val="Hyperlink"/>
+          </w:rPr>
+          <w:t>[21]</w:t>
+        </w:r>
+      </w:hyperlink>
+      <w:r>
+        <w:t>. These systems illuminate adjacent design choices, but they do not compare Revon’s log and Merkle diff paths over the same history.</w:t>
       </w:r>
     </w:p>
     <w:p>
@@ -567,41 +576,29 @@
         <w:spacing w:line="240" w:lineRule="auto" w:after="0"/>
       </w:pPr>
       <w:r>
-        <w:rPr>
-          <w:rFonts w:eastAsia="Times New Roman" w:cs="Times New Roman" w:ascii="Times New Roman" w:hAnsi="Times New Roman"/>
-          <w:sz w:val="20"/>
-        </w:rPr>
-        <w:t xml:space="preserve">Merkle Search Trees combine search-tree ordering with Merkle authentication for efficient state reconciliation </w:t>
+        <w:t xml:space="preserve">Merkle Search Trees combine search-tree ordering with Merkle authentication to reconcile state </w:t>
       </w:r>
       <w:hyperlink w:anchor="ref_mst" w:history="1">
         <w:r>
           <w:rPr>
-            <w:color w:val="0000FF"/>
+            <w:rStyle w:val="Hyperlink"/>
           </w:rPr>
           <w:t>[7]</w:t>
         </w:r>
       </w:hyperlink>
       <w:r>
-        <w:rPr>
-          <w:rFonts w:eastAsia="Times New Roman" w:cs="Times New Roman" w:ascii="Times New Roman" w:hAnsi="Times New Roman"/>
-          <w:sz w:val="20"/>
-        </w:rPr>
-        <w:t xml:space="preserve">. Revon shares hash-pruned comparison but intentionally uses fixed-depth routing and a centralized commit history rather than a replicated CRDT. Content-defined chunking, established in LBFS for redundancy detection </w:t>
+        <w:t xml:space="preserve">. Revon also prunes comparisons by hash, but uses fixed-depth routing and a centralized linear history rather than a replicated CRDT. LBFS introduced content-defined chunking for redundancy detection </w:t>
       </w:r>
       <w:hyperlink w:anchor="ref_lbfs" w:history="1">
         <w:r>
           <w:rPr>
-            <w:color w:val="0000FF"/>
+            <w:rStyle w:val="Hyperlink"/>
           </w:rPr>
           <w:t>[8]</w:t>
         </w:r>
       </w:hyperlink>
       <w:r>
-        <w:rPr>
-          <w:rFonts w:eastAsia="Times New Roman" w:cs="Times New Roman" w:ascii="Times New Roman" w:hAnsi="Times New Roman"/>
-          <w:sz w:val="20"/>
-        </w:rPr>
-        <w:t>, also explains why history-independent boundaries are a credible storage improvement beyond the current fixed buckets.</w:t>
+        <w:t>; Dolt and Noms use related boundary strategies. Ordered indexes preserve range operations, while content-defined boundaries can improve deduplication when data shifts. Revon’s current benchmark measures neither capability.</w:t>
       </w:r>
     </w:p>
     <w:p>
@@ -627,86 +624,84 @@
         <w:ind w:firstLine="0"/>
       </w:pPr>
       <w:r>
-        <w:rPr>
-          <w:rFonts w:eastAsia="Times New Roman" w:cs="Times New Roman" w:ascii="Times New Roman" w:hAnsi="Times New Roman"/>
-          <w:sz w:val="20"/>
-        </w:rPr>
-        <w:t xml:space="preserve">Dataset-versioning research exposes a broader storage-retrieval design space. DataHub motivates collaborative dataset history at scale </w:t>
+        <w:t xml:space="preserve">Dataset-versioning research covers collaboration, storage layout, and retrieval. DataHub studies collaborative dataset history at scale </w:t>
       </w:r>
       <w:hyperlink w:anchor="ref_datahub" w:history="1">
         <w:r>
           <w:rPr>
-            <w:color w:val="0000FF"/>
+            <w:rStyle w:val="Hyperlink"/>
           </w:rPr>
           <w:t>[9]</w:t>
         </w:r>
       </w:hyperlink>
       <w:r>
-        <w:rPr>
-          <w:rFonts w:eastAsia="Times New Roman" w:cs="Times New Roman" w:ascii="Times New Roman" w:hAnsi="Times New Roman"/>
-          <w:sz w:val="20"/>
-        </w:rPr>
-        <w:t xml:space="preserve">. Decibel integrates branching into a relational storage engine and compares version-first, tuple-first, and hybrid layouts </w:t>
+        <w:t xml:space="preserve">. Decibel brings branching into a relational engine and compares version-first, tuple-first, and hybrid layouts </w:t>
       </w:r>
       <w:hyperlink w:anchor="ref_decibel" w:history="1">
         <w:r>
           <w:rPr>
-            <w:color w:val="0000FF"/>
+            <w:rStyle w:val="Hyperlink"/>
           </w:rPr>
           <w:t>[10]</w:t>
         </w:r>
       </w:hyperlink>
       <w:r>
-        <w:rPr>
-          <w:rFonts w:eastAsia="Times New Roman" w:cs="Times New Roman" w:ascii="Times New Roman" w:hAnsi="Times New Roman"/>
-          <w:sz w:val="20"/>
-        </w:rPr>
-        <w:t xml:space="preserve">. OrpheusDB bolts versioning onto a conventional DBMS and optimizes partitioning for version retrieval </w:t>
+        <w:t xml:space="preserve">. OrpheusDB adds versioning to a conventional DBMS and optimizes version retrieval through partitioning </w:t>
       </w:r>
       <w:hyperlink w:anchor="ref_orpheus" w:history="1">
         <w:r>
           <w:rPr>
-            <w:color w:val="0000FF"/>
+            <w:rStyle w:val="Hyperlink"/>
           </w:rPr>
           <w:t>[11]</w:t>
         </w:r>
       </w:hyperlink>
       <w:r>
-        <w:rPr>
-          <w:rFonts w:eastAsia="Times New Roman" w:cs="Times New Roman" w:ascii="Times New Roman" w:hAnsi="Times New Roman"/>
-          <w:sz w:val="20"/>
-        </w:rPr>
-        <w:t xml:space="preserve">. The dataset-versioning model in </w:t>
+        <w:t xml:space="preserve">. Bhattacherjee et al. formalize the storage-versus-reconstruction trade-off </w:t>
       </w:r>
       <w:hyperlink w:anchor="ref_versioning" w:history="1">
         <w:r>
           <w:rPr>
-            <w:color w:val="0000FF"/>
+            <w:rStyle w:val="Hyperlink"/>
           </w:rPr>
           <w:t>[12]</w:t>
         </w:r>
       </w:hyperlink>
       <w:r>
-        <w:rPr>
-          <w:rFonts w:eastAsia="Times New Roman" w:cs="Times New Roman" w:ascii="Times New Roman" w:hAnsi="Times New Roman"/>
-          <w:sz w:val="20"/>
-        </w:rPr>
-        <w:t xml:space="preserve"> formalizes the conflict between storing more materialized state and paying more reconstruction cost. Delta Lake represents the complementary log-and-checkpoint design for ACID tables and time travel </w:t>
+        <w:t xml:space="preserve">, while Delta Lake uses transaction logs and checkpoints for ACID tables </w:t>
       </w:r>
       <w:hyperlink w:anchor="ref_delta" w:history="1">
         <w:r>
           <w:rPr>
-            <w:color w:val="0000FF"/>
+            <w:rStyle w:val="Hyperlink"/>
           </w:rPr>
           <w:t>[13]</w:t>
         </w:r>
       </w:hyperlink>
       <w:r>
-        <w:rPr>
-          <w:rFonts w:eastAsia="Times New Roman" w:cs="Times New Roman" w:ascii="Times New Roman" w:hAnsi="Times New Roman"/>
-          <w:sz w:val="20"/>
-        </w:rPr>
-        <w:t>. These systems motivate reporting commit, checkout, diff, and storage together rather than selecting a single metric.</w:t>
+        <w:t xml:space="preserve">. More recent work studies how to choose materialized versions and deltas over a version graph, subject to storage and retrieval costs </w:t>
+      </w:r>
+      <w:hyperlink w:anchor="ref_graph_versioning" w:history="1">
+        <w:r>
+          <w:rPr>
+            <w:rStyle w:val="Hyperlink"/>
+          </w:rPr>
+          <w:t>[26]</w:t>
+        </w:r>
+      </w:hyperlink>
+      <w:r>
+        <w:t xml:space="preserve">. A FAIR-compliant proposal focuses on identifying and describing dataset releases consistently </w:t>
+      </w:r>
+      <w:hyperlink w:anchor="ref_fair_versioning" w:history="1">
+        <w:r>
+          <w:rPr>
+            <w:rStyle w:val="Hyperlink"/>
+          </w:rPr>
+          <w:t>[27]</w:t>
+        </w:r>
+      </w:hyperlink>
+      <w:r>
+        <w:t>; it complements storage research but does not provide a diff algorithm. Revon addresses a narrower question with a key/value prototype and does not solve these broader dataset-management problems.</w:t>
       </w:r>
     </w:p>
     <w:p>
@@ -738,86 +733,74 @@
         </w:sectPr>
       </w:pPr>
       <w:r>
-        <w:rPr>
-          <w:rFonts w:eastAsia="Times New Roman" w:cs="Times New Roman" w:ascii="Times New Roman" w:hAnsi="Times New Roman"/>
-          <w:sz w:val="20"/>
-        </w:rPr>
-        <w:t xml:space="preserve">Noms represents structured data as a Merkle DAG of immutable chunks and supports efficient diff and synchronization </w:t>
+        <w:t xml:space="preserve">Noms stores structured values in a Merkle DAG and supports diff and synchronization </w:t>
       </w:r>
       <w:hyperlink w:anchor="ref_noms" w:history="1">
         <w:r>
           <w:rPr>
-            <w:color w:val="0000FF"/>
+            <w:rStyle w:val="Hyperlink"/>
           </w:rPr>
           <w:t>[14]</w:t>
         </w:r>
       </w:hyperlink>
       <w:r>
-        <w:rPr>
-          <w:rFonts w:eastAsia="Times New Roman" w:cs="Times New Roman" w:ascii="Times New Roman" w:hAnsi="Times New Roman"/>
-          <w:sz w:val="20"/>
-        </w:rPr>
-        <w:t xml:space="preserve">. ForkBase combines content addressing, fork semantics, and duplicate-content detection for forkable applications </w:t>
+        <w:t xml:space="preserve">. ForkBase combines content addressing with fork and deduplication semantics </w:t>
       </w:r>
       <w:hyperlink w:anchor="ref_forkbase" w:history="1">
         <w:r>
           <w:rPr>
-            <w:color w:val="0000FF"/>
+            <w:rStyle w:val="Hyperlink"/>
           </w:rPr>
           <w:t>[15]</w:t>
         </w:r>
       </w:hyperlink>
       <w:r>
-        <w:rPr>
-          <w:rFonts w:eastAsia="Times New Roman" w:cs="Times New Roman" w:ascii="Times New Roman" w:hAnsi="Times New Roman"/>
-          <w:sz w:val="20"/>
-        </w:rPr>
-        <w:t xml:space="preserve">. Dolt stores table indexes as content-addressed Prolly Trees: ordered, B-tree-like structures with history-independent chunk boundaries, structural sharing, and native diff </w:t>
+        <w:t xml:space="preserve">. Dolt’s content-addressed Prolly Trees combine ordered B-tree-like indexing, structural sharing, and native diff </w:t>
       </w:r>
       <w:hyperlink w:anchor="ref_dolt_block" w:history="1">
         <w:r>
           <w:rPr>
-            <w:color w:val="0000FF"/>
+            <w:rStyle w:val="Hyperlink"/>
           </w:rPr>
           <w:t>[2]</w:t>
         </w:r>
       </w:hyperlink>
       <w:r>
-        <w:rPr>
-          <w:rFonts w:eastAsia="Times New Roman" w:cs="Times New Roman" w:ascii="Times New Roman" w:hAnsi="Times New Roman"/>
-          <w:sz w:val="20"/>
-        </w:rPr>
         <w:t xml:space="preserve">, </w:t>
       </w:r>
       <w:hyperlink w:anchor="ref_dolt_prolly" w:history="1">
         <w:r>
           <w:rPr>
-            <w:color w:val="0000FF"/>
+            <w:rStyle w:val="Hyperlink"/>
           </w:rPr>
           <w:t>[3]</w:t>
         </w:r>
       </w:hyperlink>
       <w:r>
-        <w:rPr>
-          <w:rFonts w:eastAsia="Times New Roman" w:cs="Times New Roman" w:ascii="Times New Roman" w:hAnsi="Times New Roman"/>
-          <w:sz w:val="20"/>
-        </w:rPr>
-        <w:t>. Revon differs by using fixed-depth hash routing and by exposing an explicit alternative operation-log path. This simplifies instrumentation, but gives up Dolt's ordered range behavior, SQL surface, mature branching, merging, and production engineering.</w:t>
+        <w:t xml:space="preserve">. Git4Data is another nearby direction: it presents SQL-level snapshot, branch, diff, and merge operations over a relational engine </w:t>
+      </w:r>
+      <w:hyperlink w:anchor="ref_git4data" w:history="1">
+        <w:r>
+          <w:rPr>
+            <w:rStyle w:val="Hyperlink"/>
+          </w:rPr>
+          <w:t>[29]</w:t>
+        </w:r>
+      </w:hyperlink>
+      <w:r>
+        <w:t>. The available Git4Data manuscript is an arXiv preprint, so we do not treat its results here as peer-reviewed or independently reproduced evidence. Revon has a narrower scope: it is a single-writer, linear-history key/value prototype with fixed-depth hash routing, not a SQL database or branching system.</w:t>
       </w:r>
     </w:p>
     <w:p>
       <w:pPr>
         <w:pStyle w:val="Caption"/>
         <w:keepNext/>
+        <w:keepLines/>
         <w:spacing w:before="40" w:after="40"/>
         <w:jc w:val="center"/>
       </w:pPr>
       <w:r>
-        <w:rPr>
-          <w:rFonts w:ascii="Times New Roman" w:hAnsi="Times New Roman"/>
-          <w:sz w:val="16"/>
-        </w:rPr>
-        <w:t>TABLE I. Literature-review matrix and the gap addressed by Revon.</w:t>
+        <w:t>TABLE I. Related work and the scope of Revon.</w:t>
       </w:r>
     </w:p>
     <w:tbl>
@@ -858,18 +841,13 @@
           </w:tcPr>
           <w:p>
             <w:pPr>
-              <w:keepNext/>
-              <w:ind w:firstLine="0"/>
-              <w:jc w:val="left"/>
+              <w:keepLines/>
             </w:pPr>
             <w:r>
               <w:rPr>
-                <w:rFonts w:eastAsia="Times New Roman" w:cs="Times New Roman"/>
                 <w:b/>
-                <w:sz w:val="18"/>
               </w:rPr>
-              <w:lastRenderedPageBreak/>
-              <w:t>Prior work</w:t>
+              <w:t>System or study</w:t>
             </w:r>
           </w:p>
         </w:tc>
@@ -893,17 +871,13 @@
           </w:tcPr>
           <w:p>
             <w:pPr>
-              <w:keepNext/>
-              <w:ind w:firstLine="0"/>
-              <w:jc w:val="center"/>
+              <w:keepLines/>
             </w:pPr>
             <w:r>
               <w:rPr>
-                <w:rFonts w:eastAsia="Times New Roman" w:cs="Times New Roman"/>
                 <w:b/>
-                <w:sz w:val="18"/>
               </w:rPr>
-              <w:t>Core representation</w:t>
+              <w:t>Representation or focus</w:t>
             </w:r>
           </w:p>
         </w:tc>
@@ -927,17 +901,13 @@
           </w:tcPr>
           <w:p>
             <w:pPr>
-              <w:keepNext/>
-              <w:ind w:firstLine="0"/>
-              <w:jc w:val="center"/>
+              <w:keepLines/>
             </w:pPr>
             <w:r>
               <w:rPr>
-                <w:rFonts w:eastAsia="Times New Roman" w:cs="Times New Roman"/>
                 <w:b/>
-                <w:sz w:val="18"/>
               </w:rPr>
-              <w:t>Relationship to Revon</w:t>
+              <w:t>Relevance to Revon</w:t>
             </w:r>
           </w:p>
         </w:tc>
@@ -966,6 +936,7 @@
           <w:p>
             <w:pPr>
               <w:keepNext/>
+              <w:keepLines/>
               <w:spacing w:line="200" w:lineRule="exact"/>
               <w:ind w:firstLine="0"/>
               <w:jc w:val="left"/>
@@ -999,6 +970,7 @@
           <w:p>
             <w:pPr>
               <w:keepNext/>
+              <w:keepLines/>
               <w:spacing w:line="200" w:lineRule="exact"/>
               <w:ind w:firstLine="0"/>
               <w:jc w:val="center"/>
@@ -1032,6 +1004,7 @@
           <w:p>
             <w:pPr>
               <w:keepNext/>
+              <w:keepLines/>
               <w:spacing w:line="200" w:lineRule="exact"/>
               <w:ind w:firstLine="0"/>
               <w:jc w:val="center"/>
@@ -1070,6 +1043,7 @@
           <w:p>
             <w:pPr>
               <w:keepNext/>
+              <w:keepLines/>
               <w:spacing w:line="200" w:lineRule="exact"/>
               <w:ind w:firstLine="0"/>
               <w:jc w:val="left"/>
@@ -1103,6 +1077,7 @@
           <w:p>
             <w:pPr>
               <w:keepNext/>
+              <w:keepLines/>
               <w:spacing w:line="200" w:lineRule="exact"/>
               <w:ind w:firstLine="0"/>
               <w:jc w:val="center"/>
@@ -1136,6 +1111,7 @@
           <w:p>
             <w:pPr>
               <w:keepNext/>
+              <w:keepLines/>
               <w:spacing w:line="200" w:lineRule="exact"/>
               <w:ind w:firstLine="0"/>
               <w:jc w:val="center"/>
@@ -1174,6 +1150,7 @@
           <w:p>
             <w:pPr>
               <w:keepNext/>
+              <w:keepLines/>
               <w:spacing w:line="200" w:lineRule="exact"/>
               <w:ind w:firstLine="0"/>
               <w:jc w:val="left"/>
@@ -1207,6 +1184,7 @@
           <w:p>
             <w:pPr>
               <w:keepNext/>
+              <w:keepLines/>
               <w:spacing w:line="200" w:lineRule="exact"/>
               <w:ind w:firstLine="0"/>
               <w:jc w:val="center"/>
@@ -1240,6 +1218,7 @@
           <w:p>
             <w:pPr>
               <w:keepNext/>
+              <w:keepLines/>
               <w:spacing w:line="200" w:lineRule="exact"/>
               <w:ind w:firstLine="0"/>
               <w:jc w:val="center"/>
@@ -1278,6 +1257,7 @@
           <w:p>
             <w:pPr>
               <w:keepNext/>
+              <w:keepLines/>
               <w:spacing w:line="200" w:lineRule="exact"/>
               <w:ind w:firstLine="0"/>
               <w:jc w:val="left"/>
@@ -1311,6 +1291,7 @@
           <w:p>
             <w:pPr>
               <w:keepNext/>
+              <w:keepLines/>
               <w:spacing w:line="200" w:lineRule="exact"/>
               <w:ind w:firstLine="0"/>
               <w:jc w:val="center"/>
@@ -1344,6 +1325,7 @@
           <w:p>
             <w:pPr>
               <w:keepNext/>
+              <w:keepLines/>
               <w:spacing w:line="200" w:lineRule="exact"/>
               <w:ind w:firstLine="0"/>
               <w:jc w:val="center"/>
@@ -1382,6 +1364,7 @@
           <w:p>
             <w:pPr>
               <w:keepNext/>
+              <w:keepLines/>
               <w:spacing w:line="200" w:lineRule="exact"/>
               <w:ind w:firstLine="0"/>
               <w:jc w:val="left"/>
@@ -1415,6 +1398,7 @@
           <w:p>
             <w:pPr>
               <w:keepNext/>
+              <w:keepLines/>
               <w:spacing w:line="200" w:lineRule="exact"/>
               <w:ind w:firstLine="0"/>
               <w:jc w:val="center"/>
@@ -1448,6 +1432,7 @@
           <w:p>
             <w:pPr>
               <w:keepNext/>
+              <w:keepLines/>
               <w:spacing w:line="200" w:lineRule="exact"/>
               <w:ind w:firstLine="0"/>
               <w:jc w:val="center"/>
@@ -1486,6 +1471,7 @@
           <w:p>
             <w:pPr>
               <w:keepNext/>
+              <w:keepLines/>
               <w:spacing w:line="200" w:lineRule="exact"/>
               <w:ind w:firstLine="0"/>
               <w:jc w:val="left"/>
@@ -1519,6 +1505,7 @@
           <w:p>
             <w:pPr>
               <w:keepNext/>
+              <w:keepLines/>
               <w:spacing w:line="200" w:lineRule="exact"/>
               <w:ind w:firstLine="0"/>
               <w:jc w:val="center"/>
@@ -1552,6 +1539,7 @@
           <w:p>
             <w:pPr>
               <w:keepNext/>
+              <w:keepLines/>
               <w:spacing w:line="200" w:lineRule="exact"/>
               <w:ind w:firstLine="0"/>
               <w:jc w:val="center"/>
@@ -1590,6 +1578,7 @@
           <w:p>
             <w:pPr>
               <w:keepNext/>
+              <w:keepLines/>
               <w:spacing w:line="200" w:lineRule="exact"/>
               <w:ind w:firstLine="0"/>
               <w:jc w:val="left"/>
@@ -1623,6 +1612,7 @@
           <w:p>
             <w:pPr>
               <w:keepNext/>
+              <w:keepLines/>
               <w:spacing w:line="200" w:lineRule="exact"/>
               <w:ind w:firstLine="0"/>
               <w:jc w:val="center"/>
@@ -1656,6 +1646,7 @@
           <w:p>
             <w:pPr>
               <w:keepNext/>
+              <w:keepLines/>
               <w:spacing w:line="200" w:lineRule="exact"/>
               <w:ind w:firstLine="0"/>
               <w:jc w:val="center"/>
@@ -1694,6 +1685,7 @@
           <w:p>
             <w:pPr>
               <w:keepNext/>
+              <w:keepLines/>
               <w:spacing w:line="200" w:lineRule="exact"/>
               <w:ind w:firstLine="0"/>
               <w:jc w:val="left"/>
@@ -1727,6 +1719,7 @@
           <w:p>
             <w:pPr>
               <w:keepNext/>
+              <w:keepLines/>
               <w:spacing w:line="200" w:lineRule="exact"/>
               <w:ind w:firstLine="0"/>
               <w:jc w:val="center"/>
@@ -1760,6 +1753,7 @@
           <w:p>
             <w:pPr>
               <w:keepNext/>
+              <w:keepLines/>
               <w:spacing w:line="200" w:lineRule="exact"/>
               <w:ind w:firstLine="0"/>
               <w:jc w:val="center"/>
@@ -1798,6 +1792,7 @@
           <w:p>
             <w:pPr>
               <w:keepNext/>
+              <w:keepLines/>
               <w:spacing w:line="200" w:lineRule="exact"/>
               <w:ind w:firstLine="0"/>
               <w:jc w:val="left"/>
@@ -1831,6 +1826,7 @@
           <w:p>
             <w:pPr>
               <w:keepNext/>
+              <w:keepLines/>
               <w:spacing w:line="200" w:lineRule="exact"/>
               <w:ind w:firstLine="0"/>
               <w:jc w:val="center"/>
@@ -1864,6 +1860,7 @@
           <w:p>
             <w:pPr>
               <w:keepNext/>
+              <w:keepLines/>
               <w:spacing w:line="200" w:lineRule="exact"/>
               <w:ind w:firstLine="0"/>
               <w:jc w:val="center"/>
@@ -1902,6 +1899,7 @@
           <w:p>
             <w:pPr>
               <w:keepNext/>
+              <w:keepLines/>
               <w:spacing w:line="200" w:lineRule="exact"/>
               <w:ind w:firstLine="0"/>
               <w:jc w:val="left"/>
@@ -1935,6 +1933,7 @@
           <w:p>
             <w:pPr>
               <w:keepNext/>
+              <w:keepLines/>
               <w:spacing w:line="200" w:lineRule="exact"/>
               <w:ind w:firstLine="0"/>
               <w:jc w:val="center"/>
@@ -1968,6 +1967,7 @@
           <w:p>
             <w:pPr>
               <w:keepNext/>
+              <w:keepLines/>
               <w:spacing w:line="200" w:lineRule="exact"/>
               <w:ind w:firstLine="0"/>
               <w:jc w:val="center"/>
@@ -2006,6 +2006,7 @@
           <w:p>
             <w:pPr>
               <w:keepNext/>
+              <w:keepLines/>
               <w:spacing w:line="200" w:lineRule="exact"/>
               <w:ind w:firstLine="0"/>
               <w:jc w:val="left"/>
@@ -2039,6 +2040,7 @@
           <w:p>
             <w:pPr>
               <w:keepNext/>
+              <w:keepLines/>
               <w:spacing w:line="200" w:lineRule="exact"/>
               <w:ind w:firstLine="0"/>
               <w:jc w:val="center"/>
@@ -2072,6 +2074,7 @@
           <w:p>
             <w:pPr>
               <w:keepNext/>
+              <w:keepLines/>
               <w:spacing w:line="200" w:lineRule="exact"/>
               <w:ind w:firstLine="0"/>
               <w:jc w:val="center"/>
@@ -2120,71 +2123,73 @@
         <w:ind w:firstLine="0"/>
       </w:pPr>
       <w:r>
-        <w:rPr>
-          <w:rFonts w:eastAsia="Times New Roman" w:cs="Times New Roman" w:ascii="Times New Roman" w:hAnsi="Times New Roman"/>
-          <w:sz w:val="20"/>
-        </w:rPr>
-        <w:t xml:space="preserve">Three separate costs recur in the literature: retained history, creation of a new version, and later reconstruction or comparison. A snapshot keeps reconstruction straightforward by copying unchanged records. A log avoids that copy at commit time, but the deferred work returns during replay, compaction, or checkpointing. Path-copying persistent structures take a third route: only the paths changed by an update are new, while the remaining topology is shared </w:t>
+        <w:t xml:space="preserve">Versioning systems face three recurring costs: retaining history, creating a version, and later reconstructing or comparing versions. Snapshots simplify retrieval by copying unchanged records. Logs defer work until replay or checkpointing. Path copying creates only changed paths and shares the rest </w:t>
       </w:r>
       <w:hyperlink w:anchor="ref_persistent" w:history="1">
         <w:r>
           <w:rPr>
-            <w:color w:val="0000FF"/>
+            <w:rStyle w:val="Hyperlink"/>
           </w:rPr>
           <w:t>[5]</w:t>
         </w:r>
       </w:hyperlink>
       <w:r>
-        <w:rPr>
-          <w:rFonts w:eastAsia="Times New Roman" w:cs="Times New Roman" w:ascii="Times New Roman" w:hAnsi="Times New Roman"/>
-          <w:sz w:val="20"/>
-        </w:rPr>
-        <w:t xml:space="preserve">. The storage-versus-recreation model in </w:t>
+        <w:t xml:space="preserve">, </w:t>
       </w:r>
       <w:hyperlink w:anchor="ref_versioning" w:history="1">
         <w:r>
           <w:rPr>
-            <w:color w:val="0000FF"/>
+            <w:rStyle w:val="Hyperlink"/>
           </w:rPr>
           <w:t>[12]</w:t>
         </w:r>
       </w:hyperlink>
       <w:r>
-        <w:rPr>
-          <w:rFonts w:eastAsia="Times New Roman" w:cs="Times New Roman" w:ascii="Times New Roman" w:hAnsi="Times New Roman"/>
-          <w:sz w:val="20"/>
-        </w:rPr>
-        <w:t xml:space="preserve"> makes this trade-off explicit. Decibel and OrpheusDB likewise show that one physical layout does not dominate scans, version retrieval, and storage for every branching workload </w:t>
+        <w:t xml:space="preserve">. Decibel and OrpheusDB show that physical layout affects both version creation and retrieval </w:t>
       </w:r>
       <w:hyperlink w:anchor="ref_decibel" w:history="1">
         <w:r>
           <w:rPr>
-            <w:color w:val="0000FF"/>
+            <w:rStyle w:val="Hyperlink"/>
           </w:rPr>
           <w:t>[10]</w:t>
         </w:r>
       </w:hyperlink>
       <w:r>
-        <w:rPr>
-          <w:rFonts w:eastAsia="Times New Roman" w:cs="Times New Roman" w:ascii="Times New Roman" w:hAnsi="Times New Roman"/>
-          <w:sz w:val="20"/>
-        </w:rPr>
         <w:t xml:space="preserve">, </w:t>
       </w:r>
       <w:hyperlink w:anchor="ref_orpheus" w:history="1">
         <w:r>
           <w:rPr>
-            <w:color w:val="0000FF"/>
+            <w:rStyle w:val="Hyperlink"/>
           </w:rPr>
           <w:t>[11]</w:t>
         </w:r>
       </w:hyperlink>
       <w:r>
-        <w:rPr>
-          <w:rFonts w:eastAsia="Times New Roman" w:cs="Times New Roman" w:ascii="Times New Roman" w:hAnsi="Times New Roman"/>
-          <w:sz w:val="20"/>
-        </w:rPr>
-        <w:t>. For that reason, our evaluation reports import, commit, checkout, diff, and storage rather than using one measurement as a proxy for the system.</w:t>
+        <w:t xml:space="preserve">; graph-based analyses make the same storage/retrieval trade-off explicit </w:t>
+      </w:r>
+      <w:hyperlink w:anchor="ref_graph_versioning" w:history="1">
+        <w:r>
+          <w:rPr>
+            <w:rStyle w:val="Hyperlink"/>
+          </w:rPr>
+          <w:t>[26]</w:t>
+        </w:r>
+      </w:hyperlink>
+      <w:r>
+        <w:t xml:space="preserve">. Reproducible-research work addresses a separate problem: preserving builds and artifacts for later inspection does not show that one storage algorithm is faster </w:t>
+      </w:r>
+      <w:hyperlink w:anchor="ref_maneage" w:history="1">
+        <w:r>
+          <w:rPr>
+            <w:rStyle w:val="Hyperlink"/>
+          </w:rPr>
+          <w:t>[24]</w:t>
+        </w:r>
+      </w:hyperlink>
+      <w:r>
+        <w:t>. For that reason, Revon reports import, commit, checkout, diff, and storage measurements separately.</w:t>
       </w:r>
     </w:p>
     <w:p>
@@ -2192,71 +2197,62 @@
         <w:spacing w:line="240" w:lineRule="auto" w:after="0"/>
       </w:pPr>
       <w:r>
-        <w:rPr>
-          <w:rFonts w:eastAsia="Times New Roman" w:cs="Times New Roman" w:ascii="Times New Roman" w:hAnsi="Times New Roman"/>
-          <w:sz w:val="20"/>
-        </w:rPr>
-        <w:t xml:space="preserve">Change detection is another point of separation. Comparing two complete states does not need a detailed history, although its work grows with the states being scanned. Replaying changesets instead makes the interval length decisive and requires an unbroken ancestry path with complete changesets. With Merkle differencing, matching subtree hashes stop the search; only mismatching branches are opened. The observed cost then depends on trie shape, leaf occupancy, key distribution, and where updates land. The MST retains key order </w:t>
-      </w:r>
-      <w:hyperlink w:anchor="ref_mst" w:history="1">
+        <w:t xml:space="preserve">Different research areas also give “change” different meanings. Differential dataflow incrementally recomputes query results as timestamped inputs change </w:t>
+      </w:r>
+      <w:hyperlink w:anchor="ref_differential_dataflow" w:history="1">
         <w:r>
           <w:rPr>
-            <w:color w:val="0000FF"/>
+            <w:rStyle w:val="Hyperlink"/>
           </w:rPr>
-          <w:t>[7]</w:t>
+          <w:t>[23]</w:t>
         </w:r>
       </w:hyperlink>
       <w:r>
-        <w:rPr>
-          <w:rFonts w:eastAsia="Times New Roman" w:cs="Times New Roman" w:ascii="Times New Roman" w:hAnsi="Times New Roman"/>
-          <w:sz w:val="20"/>
-        </w:rPr>
-        <w:t xml:space="preserve">. Noms and Dolt use content-defined boundaries to form history-independent Prolly Trees </w:t>
-      </w:r>
-      <w:hyperlink w:anchor="ref_noms" w:history="1">
+        <w:t xml:space="preserve">. Data-provenance research asks why and where output facts were derived </w:t>
+      </w:r>
+      <w:hyperlink w:anchor="ref_provenance_whywhere" w:history="1">
         <w:r>
           <w:rPr>
-            <w:color w:val="0000FF"/>
+            <w:rStyle w:val="Hyperlink"/>
           </w:rPr>
-          <w:t>[14]</w:t>
+          <w:t>[22]</w:t>
         </w:r>
       </w:hyperlink>
       <w:r>
-        <w:rPr>
-          <w:rFonts w:eastAsia="Times New Roman" w:cs="Times New Roman" w:ascii="Times New Roman" w:hAnsi="Times New Roman"/>
-          <w:sz w:val="20"/>
-        </w:rPr>
-        <w:t xml:space="preserve">, </w:t>
-      </w:r>
-      <w:hyperlink w:anchor="ref_dolt_prolly" w:history="1">
+        <w:t xml:space="preserve">, and DSLog stores and queries fine-grained array lineage </w:t>
+      </w:r>
+      <w:hyperlink w:anchor="ref_dslog" w:history="1">
         <w:r>
           <w:rPr>
-            <w:color w:val="0000FF"/>
+            <w:rStyle w:val="Hyperlink"/>
           </w:rPr>
-          <w:t>[3]</w:t>
+          <w:t>[28]</w:t>
         </w:r>
       </w:hyperlink>
       <w:r>
-        <w:rPr>
-          <w:rFonts w:eastAsia="Times New Roman" w:cs="Times New Roman" w:ascii="Times New Roman" w:hAnsi="Times New Roman"/>
-          <w:sz w:val="20"/>
-        </w:rPr>
-        <w:t xml:space="preserve">, while ForkBase reuses addressed content across objects, branches, and versions </w:t>
-      </w:r>
-      <w:hyperlink w:anchor="ref_forkbase" w:history="1">
+        <w:t xml:space="preserve">. Explain-Da-V uses data transformations to explain semantic dataset changes </w:t>
+      </w:r>
+      <w:hyperlink w:anchor="ref_explain_dav" w:history="1">
         <w:r>
           <w:rPr>
-            <w:color w:val="0000FF"/>
+            <w:rStyle w:val="Hyperlink"/>
           </w:rPr>
-          <w:t>[15]</w:t>
+          <w:t>[25]</w:t>
         </w:r>
       </w:hyperlink>
       <w:r>
-        <w:rPr>
-          <w:rFonts w:eastAsia="Times New Roman" w:cs="Times New Roman" w:ascii="Times New Roman" w:hAnsi="Times New Roman"/>
-          <w:sz w:val="20"/>
-        </w:rPr>
-        <w:t>. Revon chooses fixed hash-derived routes. This choice removes ordered range access and adaptive boundaries, but gives the experiment a stable geometry whose depth and branching factor can be measured.</w:t>
+        <w:t xml:space="preserve">. Baseline uses operation-based differencing that can account for refactorings and schema changes </w:t>
+      </w:r>
+      <w:hyperlink w:anchor="ref_baseline" w:history="1">
+        <w:r>
+          <w:rPr>
+            <w:rStyle w:val="Hyperlink"/>
+          </w:rPr>
+          <w:t>[30]</w:t>
+        </w:r>
+      </w:hyperlink>
+      <w:r>
+        <w:t>. Revon reports a more limited result: which keys were added, removed, or changed in value between two states. It does not infer causes, transformation lineage, query impact, or schema intent. These systems offer useful context, but their outputs and workloads cannot be compared directly with Revon’s key/value diff timings.</w:t>
       </w:r>
     </w:p>
     <w:p>
@@ -2264,11 +2260,18 @@
         <w:spacing w:line="240" w:lineRule="auto" w:after="0"/>
       </w:pPr>
       <w:r>
-        <w:rPr>
-          <w:rFonts w:eastAsia="Times New Roman" w:cs="Times New Roman" w:ascii="Times New Roman" w:hAnsi="Times New Roman"/>
-          <w:sz w:val="20"/>
-        </w:rPr>
-        <w:t>The gap addressed here is not a new content-addressed store, but a controlled study in which two correct diff algorithms share one durable history and are chosen from observable properties of the requested interval. Every Revon-H commit records both a Merkle root and an addressed changeset, so changing the diff path does not change the meaning of a version. We expect log aggregation to suit short, sparse intervals and hash pruning to become preferable after many operations. We also expect b and d to change latency, examined work, and storage. Snapshot and Log-only provide representation baselines; Revon-M removes the selector; Revon-H retains it; and Dolt provides a production reference point. This design tests the hybrid mechanism while keeping the system-level Dolt comparison separate from any claim about intrinsic tree superiority.</w:t>
+        <w:t xml:space="preserve">Revon’s contribution is a controlled comparison of two correct diff paths over the same durable history, selected using properties of the requested interval. Each Revon-H commit stores both a Merkle root and an addressed changeset, so the choice of diff path does not change version semantics. We hypothesize that log aggregation suits short, sparse intervals and that hash pruning may help after longer operation sequences. The measured crossover depends on the workload and configuration. Work such as Git4Data also shows that database-native version control remains an active area </w:t>
+      </w:r>
+      <w:hyperlink w:anchor="ref_git4data" w:history="1">
+        <w:r>
+          <w:rPr>
+            <w:rStyle w:val="Hyperlink"/>
+          </w:rPr>
+          <w:t>[29]</w:t>
+        </w:r>
+      </w:hyperlink>
+      <w:r>
+        <w:t>, which narrows our claim: Revon evaluates adaptive differencing for a fixed-depth hash trie; it is not a general-purpose data-versioning platform. Snapshot and Log-only remain representation baselines. Our results do not establish performance on public datasets, independent hardware, concurrent workloads, or production systems.</w:t>
       </w:r>
     </w:p>
     <w:p>
@@ -2301,9 +2304,24 @@
           <w:noProof/>
           <w:sz w:val="20"/>
         </w:rPr>
+      </w:r>
+    </w:p>
+    <w:p>
+      <w:pPr>
+        <w:keepNext/>
+        <w:keepLines/>
+        <w:spacing w:before="40" w:line="240" w:lineRule="auto"/>
+        <w:ind w:firstLine="0"/>
+        <w:jc w:val="center"/>
+      </w:pPr>
+      <w:r>
+        <w:rPr>
+          <w:rFonts w:eastAsia="Times New Roman" w:cs="Times New Roman"/>
+          <w:noProof/>
+        </w:rPr>
         <w:drawing>
-          <wp:inline distT="0" distB="0" distL="0" distR="0" wp14:anchorId="413E2FC9" wp14:editId="09BC0E8F">
-            <wp:extent cx="3063240" cy="2950464"/>
+          <wp:inline distT="0" distB="0" distL="0" distR="0" wp14:anchorId="2A6C2A6C" wp14:editId="12A43832">
+            <wp:extent cx="2706624" cy="1587886"/>
             <wp:effectExtent l="0" t="0" r="0" b="0"/>
             <wp:docPr id="1" name="Picture 1" descr="Revon layered architecture showing the frontend, REST API, Revon-H core, SQLite object store, and the research contribution boundary." title="Revon layered architecture showing the frontend, REST API, Revon-H core, SQLite object store, and the research contribution boundary"/>
             <wp:cNvGraphicFramePr>
@@ -2317,7 +2335,7 @@
                     <pic:cNvPicPr/>
                   </pic:nvPicPr>
                   <pic:blipFill>
-                    <a:blip r:embed="rId13"/>
+                    <a:blip r:embed="rId22"/>
                     <a:stretch>
                       <a:fillRect/>
                     </a:stretch>
@@ -2325,7 +2343,7 @@
                   <pic:spPr>
                     <a:xfrm>
                       <a:off x="0" y="0"/>
-                      <a:ext cx="3063240" cy="2950464"/>
+                      <a:ext cx="2706624" cy="1587886"/>
                     </a:xfrm>
                     <a:prstGeom prst="rect">
                       <a:avLst/>
@@ -2342,15 +2360,12 @@
       <w:pPr>
         <w:pStyle w:val="Caption"/>
         <w:keepNext/>
+        <w:keepLines/>
         <w:spacing w:before="40" w:after="40"/>
         <w:jc w:val="center"/>
       </w:pPr>
       <w:r>
-        <w:rPr>
-          <w:rFonts w:ascii="Times New Roman" w:hAnsi="Times New Roman"/>
-          <w:sz w:val="16"/>
-        </w:rPr>
-        <w:t>Fig. 1. Revon system architecture and the boundary of its research contribution.</w:t>
+        <w:t>Fig. 1. Revon architecture and research scope.</w:t>
       </w:r>
     </w:p>
     <w:p>
@@ -2376,11 +2391,7 @@
         <w:ind w:firstLine="0"/>
       </w:pPr>
       <w:r>
-        <w:rPr>
-          <w:rFonts w:eastAsia="Times New Roman" w:cs="Times New Roman" w:ascii="Times New Roman" w:hAnsi="Times New Roman"/>
-          <w:sz w:val="20"/>
-        </w:rPr>
-        <w:t>Revon serializes trie nodes and changesets as canonical JSON, then names each object with its SHA-256 digest. The commit digest includes the root, parent, changeset, message, and timestamp. Labels such as v1 and v2 are only human-readable aliases; they do not determine object identity. The durable HEAD reference stores the current commit.</w:t>
+        <w:t>Revon serializes trie nodes and changesets as canonical JSON and names each object by its SHA-256 digest. A commit digest covers the root, parent, changeset, message, and timestamp. Labels such as v1 and v2 are readable aliases only; they do not affect object identity. A durable HEAD reference identifies the current commit.</w:t>
       </w:r>
     </w:p>
     <w:p>
@@ -2406,11 +2417,7 @@
         <w:ind w:firstLine="0"/>
       </w:pPr>
       <w:r>
-        <w:rPr>
-          <w:rFonts w:eastAsia="Times New Roman" w:cs="Times New Roman" w:ascii="Times New Roman" w:hAnsi="Times New Roman"/>
-          <w:sz w:val="20"/>
-        </w:rPr>
-        <w:t>For the main experiment we set b=8 and d=4. Each level reads three bits from SHA-256(key), so twelve routing bits address 4,096 possible leaf buckets. A bucket still stores the full key, which means that two keys sharing a routing prefix remain distinguishable. Under uniform hashes the expected bucket occupancy is N/b^d. We test other b,d pairs separately instead of assuming that this default is optimal.</w:t>
+        <w:t>The main experiment uses b=8 and d=4. At each level, Revon reads three bits from SHA-256(key), so twelve routing bits select among 4,096 possible leaf buckets. Each bucket retains the full key, allowing Revon to distinguish keys with the same routing prefix. With uniform hashes, expected bucket occupancy is N/b^d. We evaluate other b,d pairs separately rather than treating this default as optimal.</w:t>
       </w:r>
     </w:p>
     <w:p>
@@ -2436,11 +2443,7 @@
         <w:ind w:firstLine="0"/>
       </w:pPr>
       <w:r>
-        <w:rPr>
-          <w:rFonts w:eastAsia="Times New Roman" w:cs="Times New Roman" w:ascii="Times New Roman" w:hAnsi="Times New Roman"/>
-          <w:sz w:val="20"/>
-        </w:rPr>
-        <w:t>A mutation batch is canonicalized, routed, and grouped by shared prefixes. Each affected leaf is rewritten once, and only the union of affected ancestor paths is rebuilt. Unchanged child hashes are copied into new internal nodes, providing structural sharing. One SQLite transaction then inserts new objects, the changeset, commit metadata, version alias, measurements, and updated HEAD. Reopen verifies payload hashes and references.</w:t>
+        <w:t>Revon canonicalizes each mutation batch, routes the keys, and groups updates that share trie prefixes. It rewrites each affected leaf once, then rebuilds only the ancestor paths that contain changes. Unchanged child hashes are reused in the new internal nodes, which preserves structural sharing. A single SQLite transaction writes the new objects, changeset, commit metadata, version alias, measurements, and updated HEAD. On reopen, Revon verifies the stored payload hashes and references.</w:t>
       </w:r>
     </w:p>
     <w:p>
@@ -2456,10 +2459,24 @@
           <w:noProof/>
           <w:sz w:val="20"/>
         </w:rPr>
-        <w:lastRenderedPageBreak/>
+      </w:r>
+    </w:p>
+    <w:p>
+      <w:pPr>
+        <w:keepNext/>
+        <w:keepLines/>
+        <w:spacing w:before="40" w:line="240" w:lineRule="auto"/>
+        <w:ind w:firstLine="0"/>
+        <w:jc w:val="center"/>
+      </w:pPr>
+      <w:r>
+        <w:rPr>
+          <w:rFonts w:eastAsia="Times New Roman" w:cs="Times New Roman"/>
+          <w:noProof/>
+        </w:rPr>
         <w:drawing>
-          <wp:inline distT="0" distB="0" distL="0" distR="0" wp14:anchorId="0E8743F1" wp14:editId="76462CAB">
-            <wp:extent cx="3063240" cy="2615183"/>
+          <wp:inline distT="0" distB="0" distL="0" distR="0" wp14:anchorId="410C8A2A" wp14:editId="191D4959">
+            <wp:extent cx="2706624" cy="1407444"/>
             <wp:effectExtent l="0" t="0" r="0" b="0"/>
             <wp:docPr id="2" name="Picture 2" descr="Incremental commit workflow followed by Revon-H selection between addressed changeset aggregation and hash-pruned Merkle comparison." title="Incremental commit workflow followed by Revon-H selection between addressed changeset aggregation and hash-pruned Merkle comparison"/>
             <wp:cNvGraphicFramePr>
@@ -2473,7 +2490,7 @@
                     <pic:cNvPicPr/>
                   </pic:nvPicPr>
                   <pic:blipFill>
-                    <a:blip r:embed="rId14"/>
+                    <a:blip r:embed="rId23"/>
                     <a:stretch>
                       <a:fillRect/>
                     </a:stretch>
@@ -2481,7 +2498,7 @@
                   <pic:spPr>
                     <a:xfrm>
                       <a:off x="0" y="0"/>
-                      <a:ext cx="3063240" cy="2615183"/>
+                      <a:ext cx="2706624" cy="1407444"/>
                     </a:xfrm>
                     <a:prstGeom prst="rect">
                       <a:avLst/>
@@ -2498,15 +2515,12 @@
       <w:pPr>
         <w:pStyle w:val="Caption"/>
         <w:keepNext/>
+        <w:keepLines/>
         <w:spacing w:before="40" w:after="40"/>
         <w:jc w:val="center"/>
       </w:pPr>
       <w:r>
-        <w:rPr>
-          <w:rFonts w:ascii="Times New Roman" w:hAnsi="Times New Roman"/>
-          <w:sz w:val="16"/>
-        </w:rPr>
-        <w:t>Fig. 2. Incremental commit path and adaptive diff decision.</w:t>
+        <w:t>Fig. 2. Commit processing and adaptive diff selection.</w:t>
       </w:r>
     </w:p>
     <w:p>
@@ -2532,11 +2546,7 @@
         <w:ind w:firstLine="0"/>
       </w:pPr>
       <w:r>
-        <w:rPr>
-          <w:rFonts w:eastAsia="Times New Roman" w:cs="Times New Roman" w:ascii="Times New Roman" w:hAnsi="Times New Roman"/>
-          <w:sz w:val="20"/>
-        </w:rPr>
-        <w:t>The log path walks the ancestor chain and aggregates key operations. The Merkle path recursively compares roots, prunes equal subtree hashes, and examines full leaf entries only below unequal paths. Revon-H counts accumulated ancestor operations and uses the log at or below 4,096 operations; it uses Merkle above that boundary. Revon-M forces the Merkle path and therefore serves only as an ablation.</w:t>
+        <w:t>The log path walks the commit ancestry and aggregates key operations. The Merkle path compares roots recursively, skips subtrees with matching hashes, and examines full leaf entries only under changed paths. Revon-H counts the operations in the requested interval and uses the log path at or below 4,096 operations; above that threshold, it uses Merkle comparison. Revon-M always uses the Merkle path and serves as the ablation.</w:t>
       </w:r>
     </w:p>
     <w:p>
@@ -2585,26 +2595,20 @@
         </w:sectPr>
       </w:pPr>
       <w:r>
-        <w:rPr>
-          <w:rFonts w:eastAsia="Times New Roman" w:cs="Times New Roman" w:ascii="Times New Roman" w:hAnsi="Times New Roman"/>
-          <w:sz w:val="20"/>
-        </w:rPr>
-        <w:t>Five comparison systems receive identical logical states and mutation batches: a complete Snapshot per version, an initial state plus operation-log baseline, forced-Merkle Revon-M, adaptive Revon-H, and Dolt 2.3.1 using a keyed SQL table and native JSON diff. Dolt initial import is tested two ways: batched SQL INSERT and CSV loaded with `dolt table import -r`; CSV serialization is included in the latter workflow's initial-import time. The import variants share the same Dolt engine for later operations, and their import times are kept distinct.</w:t>
+        <w:t>We compare five systems on the same logical states and mutation batches: Snapshot stores a complete copy per version; Log-only stores an initial state and operation log; Revon-M forces Merkle diff; Revon-H selects its diff path adaptively; and Dolt 2.3.1 uses a keyed SQL table and native JSON diff. We measure Dolt’s initial import in two ways: batched SQL INSERT and CSV input through dolt table import -r. The CSV workflow includes serialization in its import time. Both import variants use the same Dolt engine for later operations, and we report their import results separately.</w:t>
       </w:r>
     </w:p>
     <w:p>
       <w:pPr>
         <w:pStyle w:val="Caption"/>
         <w:keepNext/>
+        <w:keepLines/>
+        <w:pageBreakBefore/>
         <w:spacing w:before="40" w:after="40"/>
         <w:jc w:val="center"/>
       </w:pPr>
       <w:r>
-        <w:rPr>
-          <w:rFonts w:ascii="Times New Roman" w:hAnsi="Times New Roman"/>
-          <w:sz w:val="16"/>
-        </w:rPr>
-        <w:t>TABLE II. Final evaluation workload matrix.</w:t>
+        <w:t>TABLE II. Workloads used in the final evaluation.</w:t>
       </w:r>
     </w:p>
     <w:tbl>
@@ -2615,11 +2619,11 @@
         <w:tblLook w:val="04A0" w:firstRow="1" w:lastRow="0" w:firstColumn="1" w:lastColumn="0" w:noHBand="0" w:noVBand="1"/>
       </w:tblPr>
       <w:tblGrid>
-        <w:gridCol w:w="2100"/>
+        <w:gridCol w:w="1950"/>
         <w:gridCol w:w="1100"/>
-        <w:gridCol w:w="800"/>
-        <w:gridCol w:w="900"/>
-        <w:gridCol w:w="4120"/>
+        <w:gridCol w:w="1300"/>
+        <w:gridCol w:w="1450"/>
+        <w:gridCol w:w="3220"/>
       </w:tblGrid>
       <w:tr>
         <w:trPr>
@@ -2629,7 +2633,7 @@
         </w:trPr>
         <w:tc>
           <w:tcPr>
-            <w:tcW w:w="2100" w:type="dxa"/>
+            <w:tcW w:w="1950" w:type="dxa"/>
             <w:tcBorders>
               <w:top w:val="single" w:sz="6" w:space="0" w:color="000000"/>
               <w:left w:val="nil"/>
@@ -2647,15 +2651,11 @@
           </w:tcPr>
           <w:p>
             <w:pPr>
-              <w:keepNext/>
-              <w:ind w:firstLine="0"/>
-              <w:jc w:val="left"/>
+              <w:keepLines/>
             </w:pPr>
             <w:r>
               <w:rPr>
-                <w:rFonts w:eastAsia="Times New Roman" w:cs="Times New Roman"/>
                 <w:b/>
-                <w:sz w:val="18"/>
               </w:rPr>
               <w:t>Scenario</w:t>
             </w:r>
@@ -2681,15 +2681,11 @@
           </w:tcPr>
           <w:p>
             <w:pPr>
-              <w:keepNext/>
-              <w:ind w:firstLine="0"/>
-              <w:jc w:val="center"/>
+              <w:keepLines/>
             </w:pPr>
             <w:r>
               <w:rPr>
-                <w:rFonts w:eastAsia="Times New Roman" w:cs="Times New Roman"/>
                 <w:b/>
-                <w:sz w:val="18"/>
               </w:rPr>
               <w:t>Rows</w:t>
             </w:r>
@@ -2697,7 +2693,7 @@
         </w:tc>
         <w:tc>
           <w:tcPr>
-            <w:tcW w:w="800" w:type="dxa"/>
+            <w:tcW w:w="1300" w:type="dxa"/>
             <w:tcBorders>
               <w:top w:val="single" w:sz="6" w:space="0" w:color="000000"/>
               <w:left w:val="nil"/>
@@ -2715,23 +2711,19 @@
           </w:tcPr>
           <w:p>
             <w:pPr>
-              <w:keepNext/>
-              <w:ind w:firstLine="0"/>
-              <w:jc w:val="center"/>
+              <w:keepLines/>
             </w:pPr>
             <w:r>
               <w:rPr>
-                <w:rFonts w:eastAsia="Times New Roman" w:cs="Times New Roman"/>
                 <w:b/>
-                <w:sz w:val="18"/>
               </w:rPr>
-              <w:t>Comm.</w:t>
+              <w:t>Commits</w:t>
             </w:r>
           </w:p>
         </w:tc>
         <w:tc>
           <w:tcPr>
-            <w:tcW w:w="900" w:type="dxa"/>
+            <w:tcW w:w="1450" w:type="dxa"/>
             <w:tcBorders>
               <w:top w:val="single" w:sz="6" w:space="0" w:color="000000"/>
               <w:left w:val="nil"/>
@@ -2749,23 +2741,19 @@
           </w:tcPr>
           <w:p>
             <w:pPr>
-              <w:keepNext/>
-              <w:ind w:firstLine="0"/>
-              <w:jc w:val="center"/>
+              <w:keepLines/>
             </w:pPr>
             <w:r>
               <w:rPr>
-                <w:rFonts w:eastAsia="Times New Roman" w:cs="Times New Roman"/>
                 <w:b/>
-                <w:sz w:val="18"/>
               </w:rPr>
-              <w:t>Changes</w:t>
+              <w:t>Changed keys</w:t>
             </w:r>
           </w:p>
         </w:tc>
         <w:tc>
           <w:tcPr>
-            <w:tcW w:w="4120" w:type="dxa"/>
+            <w:tcW w:w="3220" w:type="dxa"/>
             <w:tcBorders>
               <w:top w:val="single" w:sz="6" w:space="0" w:color="000000"/>
               <w:left w:val="nil"/>
@@ -2783,17 +2771,13 @@
           </w:tcPr>
           <w:p>
             <w:pPr>
-              <w:keepNext/>
-              <w:ind w:firstLine="0"/>
-              <w:jc w:val="center"/>
+              <w:keepLines/>
             </w:pPr>
             <w:r>
               <w:rPr>
-                <w:rFonts w:eastAsia="Times New Roman" w:cs="Times New Roman"/>
                 <w:b/>
-                <w:sz w:val="18"/>
               </w:rPr>
-              <w:t>Locality</w:t>
+              <w:t>Update locality</w:t>
             </w:r>
           </w:p>
         </w:tc>
@@ -2805,7 +2789,7 @@
         </w:trPr>
         <w:tc>
           <w:tcPr>
-            <w:tcW w:w="2100" w:type="dxa"/>
+            <w:tcW w:w="1950" w:type="dxa"/>
             <w:tcBorders>
               <w:top w:val="nil"/>
               <w:left w:val="nil"/>
@@ -2823,6 +2807,7 @@
           <w:p>
             <w:pPr>
               <w:keepNext/>
+              <w:keepLines/>
               <w:spacing w:line="200" w:lineRule="exact"/>
               <w:ind w:firstLine="0"/>
               <w:jc w:val="left"/>
@@ -2856,6 +2841,7 @@
           <w:p>
             <w:pPr>
               <w:keepNext/>
+              <w:keepLines/>
               <w:spacing w:line="200" w:lineRule="exact"/>
               <w:ind w:firstLine="0"/>
               <w:jc w:val="center"/>
@@ -2871,7 +2857,7 @@
         </w:tc>
         <w:tc>
           <w:tcPr>
-            <w:tcW w:w="800" w:type="dxa"/>
+            <w:tcW w:w="1300" w:type="dxa"/>
             <w:tcBorders>
               <w:top w:val="nil"/>
               <w:left w:val="nil"/>
@@ -2889,6 +2875,7 @@
           <w:p>
             <w:pPr>
               <w:keepNext/>
+              <w:keepLines/>
               <w:spacing w:line="200" w:lineRule="exact"/>
               <w:ind w:firstLine="0"/>
               <w:jc w:val="center"/>
@@ -2904,7 +2891,7 @@
         </w:tc>
         <w:tc>
           <w:tcPr>
-            <w:tcW w:w="900" w:type="dxa"/>
+            <w:tcW w:w="1450" w:type="dxa"/>
             <w:tcBorders>
               <w:top w:val="nil"/>
               <w:left w:val="nil"/>
@@ -2922,6 +2909,7 @@
           <w:p>
             <w:pPr>
               <w:keepNext/>
+              <w:keepLines/>
               <w:spacing w:line="200" w:lineRule="exact"/>
               <w:ind w:firstLine="0"/>
               <w:jc w:val="center"/>
@@ -2937,7 +2925,7 @@
         </w:tc>
         <w:tc>
           <w:tcPr>
-            <w:tcW w:w="4120" w:type="dxa"/>
+            <w:tcW w:w="3220" w:type="dxa"/>
             <w:tcBorders>
               <w:top w:val="nil"/>
               <w:left w:val="nil"/>
@@ -2955,6 +2943,7 @@
           <w:p>
             <w:pPr>
               <w:keepNext/>
+              <w:keepLines/>
               <w:spacing w:line="200" w:lineRule="exact"/>
               <w:ind w:firstLine="0"/>
               <w:jc w:val="center"/>
@@ -2976,7 +2965,7 @@
         </w:trPr>
         <w:tc>
           <w:tcPr>
-            <w:tcW w:w="2100" w:type="dxa"/>
+            <w:tcW w:w="1950" w:type="dxa"/>
             <w:tcBorders>
               <w:top w:val="nil"/>
               <w:left w:val="nil"/>
@@ -2994,6 +2983,7 @@
           <w:p>
             <w:pPr>
               <w:keepNext/>
+              <w:keepLines/>
               <w:spacing w:line="200" w:lineRule="exact"/>
               <w:ind w:firstLine="0"/>
               <w:jc w:val="left"/>
@@ -3027,6 +3017,7 @@
           <w:p>
             <w:pPr>
               <w:keepNext/>
+              <w:keepLines/>
               <w:spacing w:line="200" w:lineRule="exact"/>
               <w:ind w:firstLine="0"/>
               <w:jc w:val="center"/>
@@ -3042,7 +3033,7 @@
         </w:tc>
         <w:tc>
           <w:tcPr>
-            <w:tcW w:w="800" w:type="dxa"/>
+            <w:tcW w:w="1300" w:type="dxa"/>
             <w:tcBorders>
               <w:top w:val="nil"/>
               <w:left w:val="nil"/>
@@ -3060,6 +3051,7 @@
           <w:p>
             <w:pPr>
               <w:keepNext/>
+              <w:keepLines/>
               <w:spacing w:line="200" w:lineRule="exact"/>
               <w:ind w:firstLine="0"/>
               <w:jc w:val="center"/>
@@ -3075,7 +3067,7 @@
         </w:tc>
         <w:tc>
           <w:tcPr>
-            <w:tcW w:w="900" w:type="dxa"/>
+            <w:tcW w:w="1450" w:type="dxa"/>
             <w:tcBorders>
               <w:top w:val="nil"/>
               <w:left w:val="nil"/>
@@ -3093,6 +3085,7 @@
           <w:p>
             <w:pPr>
               <w:keepNext/>
+              <w:keepLines/>
               <w:spacing w:line="200" w:lineRule="exact"/>
               <w:ind w:firstLine="0"/>
               <w:jc w:val="center"/>
@@ -3108,7 +3101,7 @@
         </w:tc>
         <w:tc>
           <w:tcPr>
-            <w:tcW w:w="4120" w:type="dxa"/>
+            <w:tcW w:w="3220" w:type="dxa"/>
             <w:tcBorders>
               <w:top w:val="nil"/>
               <w:left w:val="nil"/>
@@ -3126,6 +3119,7 @@
           <w:p>
             <w:pPr>
               <w:keepNext/>
+              <w:keepLines/>
               <w:spacing w:line="200" w:lineRule="exact"/>
               <w:ind w:firstLine="0"/>
               <w:jc w:val="center"/>
@@ -3147,7 +3141,7 @@
         </w:trPr>
         <w:tc>
           <w:tcPr>
-            <w:tcW w:w="2100" w:type="dxa"/>
+            <w:tcW w:w="1950" w:type="dxa"/>
             <w:tcBorders>
               <w:top w:val="nil"/>
               <w:left w:val="nil"/>
@@ -3165,6 +3159,7 @@
           <w:p>
             <w:pPr>
               <w:keepNext/>
+              <w:keepLines/>
               <w:spacing w:line="200" w:lineRule="exact"/>
               <w:ind w:firstLine="0"/>
               <w:jc w:val="left"/>
@@ -3198,6 +3193,7 @@
           <w:p>
             <w:pPr>
               <w:keepNext/>
+              <w:keepLines/>
               <w:spacing w:line="200" w:lineRule="exact"/>
               <w:ind w:firstLine="0"/>
               <w:jc w:val="center"/>
@@ -3213,7 +3209,7 @@
         </w:tc>
         <w:tc>
           <w:tcPr>
-            <w:tcW w:w="800" w:type="dxa"/>
+            <w:tcW w:w="1300" w:type="dxa"/>
             <w:tcBorders>
               <w:top w:val="nil"/>
               <w:left w:val="nil"/>
@@ -3231,6 +3227,7 @@
           <w:p>
             <w:pPr>
               <w:keepNext/>
+              <w:keepLines/>
               <w:spacing w:line="200" w:lineRule="exact"/>
               <w:ind w:firstLine="0"/>
               <w:jc w:val="center"/>
@@ -3246,7 +3243,7 @@
         </w:tc>
         <w:tc>
           <w:tcPr>
-            <w:tcW w:w="900" w:type="dxa"/>
+            <w:tcW w:w="1450" w:type="dxa"/>
             <w:tcBorders>
               <w:top w:val="nil"/>
               <w:left w:val="nil"/>
@@ -3264,6 +3261,7 @@
           <w:p>
             <w:pPr>
               <w:keepNext/>
+              <w:keepLines/>
               <w:spacing w:line="200" w:lineRule="exact"/>
               <w:ind w:firstLine="0"/>
               <w:jc w:val="center"/>
@@ -3279,7 +3277,7 @@
         </w:tc>
         <w:tc>
           <w:tcPr>
-            <w:tcW w:w="4120" w:type="dxa"/>
+            <w:tcW w:w="3220" w:type="dxa"/>
             <w:tcBorders>
               <w:top w:val="nil"/>
               <w:left w:val="nil"/>
@@ -3297,6 +3295,7 @@
           <w:p>
             <w:pPr>
               <w:keepNext/>
+              <w:keepLines/>
               <w:spacing w:line="200" w:lineRule="exact"/>
               <w:ind w:firstLine="0"/>
               <w:jc w:val="center"/>
@@ -3318,7 +3317,7 @@
         </w:trPr>
         <w:tc>
           <w:tcPr>
-            <w:tcW w:w="2100" w:type="dxa"/>
+            <w:tcW w:w="1950" w:type="dxa"/>
             <w:tcBorders>
               <w:top w:val="nil"/>
               <w:left w:val="nil"/>
@@ -3336,6 +3335,7 @@
           <w:p>
             <w:pPr>
               <w:keepNext/>
+              <w:keepLines/>
               <w:spacing w:line="200" w:lineRule="exact"/>
               <w:ind w:firstLine="0"/>
               <w:jc w:val="left"/>
@@ -3369,6 +3369,7 @@
           <w:p>
             <w:pPr>
               <w:keepNext/>
+              <w:keepLines/>
               <w:spacing w:line="200" w:lineRule="exact"/>
               <w:ind w:firstLine="0"/>
               <w:jc w:val="center"/>
@@ -3384,7 +3385,7 @@
         </w:tc>
         <w:tc>
           <w:tcPr>
-            <w:tcW w:w="800" w:type="dxa"/>
+            <w:tcW w:w="1300" w:type="dxa"/>
             <w:tcBorders>
               <w:top w:val="nil"/>
               <w:left w:val="nil"/>
@@ -3402,6 +3403,7 @@
           <w:p>
             <w:pPr>
               <w:keepNext/>
+              <w:keepLines/>
               <w:spacing w:line="200" w:lineRule="exact"/>
               <w:ind w:firstLine="0"/>
               <w:jc w:val="center"/>
@@ -3417,7 +3419,7 @@
         </w:tc>
         <w:tc>
           <w:tcPr>
-            <w:tcW w:w="900" w:type="dxa"/>
+            <w:tcW w:w="1450" w:type="dxa"/>
             <w:tcBorders>
               <w:top w:val="nil"/>
               <w:left w:val="nil"/>
@@ -3435,6 +3437,7 @@
           <w:p>
             <w:pPr>
               <w:keepNext/>
+              <w:keepLines/>
               <w:spacing w:line="200" w:lineRule="exact"/>
               <w:ind w:firstLine="0"/>
               <w:jc w:val="center"/>
@@ -3450,7 +3453,7 @@
         </w:tc>
         <w:tc>
           <w:tcPr>
-            <w:tcW w:w="4120" w:type="dxa"/>
+            <w:tcW w:w="3220" w:type="dxa"/>
             <w:tcBorders>
               <w:top w:val="nil"/>
               <w:left w:val="nil"/>
@@ -3468,6 +3471,7 @@
           <w:p>
             <w:pPr>
               <w:keepNext/>
+              <w:keepLines/>
               <w:spacing w:line="200" w:lineRule="exact"/>
               <w:ind w:firstLine="0"/>
               <w:jc w:val="center"/>
@@ -3489,7 +3493,7 @@
         </w:trPr>
         <w:tc>
           <w:tcPr>
-            <w:tcW w:w="2100" w:type="dxa"/>
+            <w:tcW w:w="1950" w:type="dxa"/>
             <w:tcBorders>
               <w:top w:val="nil"/>
               <w:left w:val="nil"/>
@@ -3507,6 +3511,7 @@
           <w:p>
             <w:pPr>
               <w:keepNext/>
+              <w:keepLines/>
               <w:spacing w:line="200" w:lineRule="exact"/>
               <w:ind w:firstLine="0"/>
               <w:jc w:val="left"/>
@@ -3540,6 +3545,7 @@
           <w:p>
             <w:pPr>
               <w:keepNext/>
+              <w:keepLines/>
               <w:spacing w:line="200" w:lineRule="exact"/>
               <w:ind w:firstLine="0"/>
               <w:jc w:val="center"/>
@@ -3555,7 +3561,7 @@
         </w:tc>
         <w:tc>
           <w:tcPr>
-            <w:tcW w:w="800" w:type="dxa"/>
+            <w:tcW w:w="1300" w:type="dxa"/>
             <w:tcBorders>
               <w:top w:val="nil"/>
               <w:left w:val="nil"/>
@@ -3573,6 +3579,7 @@
           <w:p>
             <w:pPr>
               <w:keepNext/>
+              <w:keepLines/>
               <w:spacing w:line="200" w:lineRule="exact"/>
               <w:ind w:firstLine="0"/>
               <w:jc w:val="center"/>
@@ -3588,7 +3595,7 @@
         </w:tc>
         <w:tc>
           <w:tcPr>
-            <w:tcW w:w="900" w:type="dxa"/>
+            <w:tcW w:w="1450" w:type="dxa"/>
             <w:tcBorders>
               <w:top w:val="nil"/>
               <w:left w:val="nil"/>
@@ -3606,6 +3613,7 @@
           <w:p>
             <w:pPr>
               <w:keepNext/>
+              <w:keepLines/>
               <w:spacing w:line="200" w:lineRule="exact"/>
               <w:ind w:firstLine="0"/>
               <w:jc w:val="center"/>
@@ -3621,7 +3629,7 @@
         </w:tc>
         <w:tc>
           <w:tcPr>
-            <w:tcW w:w="4120" w:type="dxa"/>
+            <w:tcW w:w="3220" w:type="dxa"/>
             <w:tcBorders>
               <w:top w:val="nil"/>
               <w:left w:val="nil"/>
@@ -3639,6 +3647,7 @@
           <w:p>
             <w:pPr>
               <w:keepNext/>
+              <w:keepLines/>
               <w:spacing w:line="200" w:lineRule="exact"/>
               <w:ind w:firstLine="0"/>
               <w:jc w:val="center"/>
@@ -3660,7 +3669,7 @@
         </w:trPr>
         <w:tc>
           <w:tcPr>
-            <w:tcW w:type="dxa" w:w="2100"/>
+            <w:tcW w:type="dxa" w:w="1950"/>
             <w:tcBorders>
               <w:top w:val="nil"/>
               <w:left w:val="nil"/>
@@ -3678,6 +3687,7 @@
           <w:p>
             <w:pPr>
               <w:keepNext/>
+              <w:keepLines/>
               <w:spacing w:line="200" w:lineRule="exact"/>
               <w:ind w:firstLine="0"/>
               <w:jc w:val="left"/>
@@ -3711,6 +3721,7 @@
           <w:p>
             <w:pPr>
               <w:keepNext/>
+              <w:keepLines/>
               <w:spacing w:line="200" w:lineRule="exact"/>
               <w:ind w:firstLine="0"/>
               <w:jc w:val="center"/>
@@ -3726,7 +3737,7 @@
         </w:tc>
         <w:tc>
           <w:tcPr>
-            <w:tcW w:type="dxa" w:w="800"/>
+            <w:tcW w:type="dxa" w:w="1300"/>
             <w:tcBorders>
               <w:top w:val="nil"/>
               <w:left w:val="nil"/>
@@ -3744,6 +3755,7 @@
           <w:p>
             <w:pPr>
               <w:keepNext/>
+              <w:keepLines/>
               <w:spacing w:line="200" w:lineRule="exact"/>
               <w:ind w:firstLine="0"/>
               <w:jc w:val="center"/>
@@ -3759,7 +3771,7 @@
         </w:tc>
         <w:tc>
           <w:tcPr>
-            <w:tcW w:type="dxa" w:w="900"/>
+            <w:tcW w:type="dxa" w:w="1450"/>
             <w:tcBorders>
               <w:top w:val="nil"/>
               <w:left w:val="nil"/>
@@ -3777,6 +3789,7 @@
           <w:p>
             <w:pPr>
               <w:keepNext/>
+              <w:keepLines/>
               <w:spacing w:line="200" w:lineRule="exact"/>
               <w:ind w:firstLine="0"/>
               <w:jc w:val="center"/>
@@ -3792,7 +3805,7 @@
         </w:tc>
         <w:tc>
           <w:tcPr>
-            <w:tcW w:type="dxa" w:w="4120"/>
+            <w:tcW w:type="dxa" w:w="3220"/>
             <w:tcBorders>
               <w:top w:val="nil"/>
               <w:left w:val="nil"/>
@@ -3810,6 +3823,7 @@
           <w:p>
             <w:pPr>
               <w:keepNext/>
+              <w:keepLines/>
               <w:spacing w:line="200" w:lineRule="exact"/>
               <w:ind w:firstLine="0"/>
               <w:jc w:val="center"/>
@@ -3831,7 +3845,7 @@
         </w:trPr>
         <w:tc>
           <w:tcPr>
-            <w:tcW w:type="dxa" w:w="2100"/>
+            <w:tcW w:type="dxa" w:w="1950"/>
             <w:tcBorders>
               <w:top w:val="nil"/>
               <w:left w:val="nil"/>
@@ -3849,6 +3863,7 @@
           <w:p>
             <w:pPr>
               <w:keepNext/>
+              <w:keepLines/>
               <w:spacing w:line="200" w:lineRule="exact"/>
               <w:ind w:firstLine="0"/>
               <w:jc w:val="left"/>
@@ -3882,6 +3897,7 @@
           <w:p>
             <w:pPr>
               <w:keepNext/>
+              <w:keepLines/>
               <w:spacing w:line="200" w:lineRule="exact"/>
               <w:ind w:firstLine="0"/>
               <w:jc w:val="center"/>
@@ -3897,7 +3913,7 @@
         </w:tc>
         <w:tc>
           <w:tcPr>
-            <w:tcW w:type="dxa" w:w="800"/>
+            <w:tcW w:type="dxa" w:w="1300"/>
             <w:tcBorders>
               <w:top w:val="nil"/>
               <w:left w:val="nil"/>
@@ -3915,6 +3931,7 @@
           <w:p>
             <w:pPr>
               <w:keepNext/>
+              <w:keepLines/>
               <w:spacing w:line="200" w:lineRule="exact"/>
               <w:ind w:firstLine="0"/>
               <w:jc w:val="center"/>
@@ -3930,7 +3947,7 @@
         </w:tc>
         <w:tc>
           <w:tcPr>
-            <w:tcW w:type="dxa" w:w="900"/>
+            <w:tcW w:type="dxa" w:w="1450"/>
             <w:tcBorders>
               <w:top w:val="nil"/>
               <w:left w:val="nil"/>
@@ -3948,6 +3965,7 @@
           <w:p>
             <w:pPr>
               <w:keepNext/>
+              <w:keepLines/>
               <w:spacing w:line="200" w:lineRule="exact"/>
               <w:ind w:firstLine="0"/>
               <w:jc w:val="center"/>
@@ -3963,7 +3981,7 @@
         </w:tc>
         <w:tc>
           <w:tcPr>
-            <w:tcW w:type="dxa" w:w="4120"/>
+            <w:tcW w:type="dxa" w:w="3220"/>
             <w:tcBorders>
               <w:top w:val="nil"/>
               <w:left w:val="nil"/>
@@ -3981,6 +3999,7 @@
           <w:p>
             <w:pPr>
               <w:keepNext/>
+              <w:keepLines/>
               <w:spacing w:line="200" w:lineRule="exact"/>
               <w:ind w:firstLine="0"/>
               <w:jc w:val="center"/>
@@ -4002,7 +4021,7 @@
         </w:trPr>
         <w:tc>
           <w:tcPr>
-            <w:tcW w:type="dxa" w:w="2100"/>
+            <w:tcW w:type="dxa" w:w="1950"/>
             <w:tcBorders>
               <w:top w:val="nil"/>
               <w:left w:val="nil"/>
@@ -4020,6 +4039,7 @@
           <w:p>
             <w:pPr>
               <w:keepNext/>
+              <w:keepLines/>
               <w:spacing w:line="200" w:lineRule="exact"/>
               <w:ind w:firstLine="0"/>
               <w:jc w:val="left"/>
@@ -4053,6 +4073,7 @@
           <w:p>
             <w:pPr>
               <w:keepNext/>
+              <w:keepLines/>
               <w:spacing w:line="200" w:lineRule="exact"/>
               <w:ind w:firstLine="0"/>
               <w:jc w:val="center"/>
@@ -4068,7 +4089,7 @@
         </w:tc>
         <w:tc>
           <w:tcPr>
-            <w:tcW w:type="dxa" w:w="800"/>
+            <w:tcW w:type="dxa" w:w="1300"/>
             <w:tcBorders>
               <w:top w:val="nil"/>
               <w:left w:val="nil"/>
@@ -4086,6 +4107,7 @@
           <w:p>
             <w:pPr>
               <w:keepNext/>
+              <w:keepLines/>
               <w:spacing w:line="200" w:lineRule="exact"/>
               <w:ind w:firstLine="0"/>
               <w:jc w:val="center"/>
@@ -4101,7 +4123,7 @@
         </w:tc>
         <w:tc>
           <w:tcPr>
-            <w:tcW w:type="dxa" w:w="900"/>
+            <w:tcW w:type="dxa" w:w="1450"/>
             <w:tcBorders>
               <w:top w:val="nil"/>
               <w:left w:val="nil"/>
@@ -4119,6 +4141,7 @@
           <w:p>
             <w:pPr>
               <w:keepNext/>
+              <w:keepLines/>
               <w:spacing w:line="200" w:lineRule="exact"/>
               <w:ind w:firstLine="0"/>
               <w:jc w:val="center"/>
@@ -4134,7 +4157,7 @@
         </w:tc>
         <w:tc>
           <w:tcPr>
-            <w:tcW w:type="dxa" w:w="4120"/>
+            <w:tcW w:type="dxa" w:w="3220"/>
             <w:tcBorders>
               <w:top w:val="nil"/>
               <w:left w:val="nil"/>
@@ -4152,6 +4175,7 @@
           <w:p>
             <w:pPr>
               <w:keepNext/>
+              <w:keepLines/>
               <w:spacing w:line="200" w:lineRule="exact"/>
               <w:ind w:firstLine="0"/>
               <w:jc w:val="center"/>
@@ -4200,11 +4224,7 @@
         <w:ind w:firstLine="0"/>
       </w:pPr>
       <w:r>
-        <w:rPr>
-          <w:rFonts w:eastAsia="Times New Roman" w:cs="Times New Roman" w:ascii="Times New Roman" w:hAnsi="Times New Roman"/>
-          <w:sz w:val="20"/>
-        </w:rPr>
-        <w:t>Initial import measures the first durable state; incremental commit is the within-trial median across ten commits; diff and checkout both materialize common outputs inside their timed regions. Diff is sorted changed keys with old/new SHA-256 value hashes encoded as canonical JSON. Checkout is the complete sorted key/value state encoded as canonical UTF-8 JSON. Dolt JSON parsing and normalization are included. Correctness compares the full state and hash contract with the workload oracle. Dolt SQL-path commit timing includes SQL mutation, add, and commit; commit hashes are retained for historical checkout and no version tags are created. Timed operations run without tracemalloc. An external parent process samples process-tree RSS every 10 ms for each isolated primary trial, including Dolt children; sampling is outside timed operations. A separate Windows sensitivity telemetry run has 405 rows (315 measured) with RSS, CPU, read/write bytes, and serial commit throughput in every row; all rows passed correctness checks and the schema-2 audit. These counters include setup and correctness work, not only timed operations. The WSL2 replication has incomplete I/O coverage and used the same physical host. Work-examined units differ by system and are not normalized.</w:t>
+        <w:t>We time initial import through the first durable state. For each trial, incremental-commit time is the median across ten commits. Diff and checkout timers include construction of a common output: diff returns sorted changed keys with old and new SHA-256 value hashes as canonical JSON, while checkout returns the full sorted key/value state as canonical UTF-8 JSON. Dolt’s diff time includes JSON parsing and normalization. We check both outputs against the workload oracle. Dolt’s SQL-path commit time includes SQL mutations, add, and commit; we retain commit hashes for historical checkout and create no version tags. Timed operations run without tracemalloc. During each isolated primary trial, an external parent process samples process-tree RSS every 10 ms, including Dolt child processes; sampling happens outside the timed operations. A separate Windows telemetry run records RSS, CPU, read/write bytes, and serial commit throughput in 405 rows (315 measured). Every row passed correctness checks and the schema-2 audit. These counters include setup and correctness work, not just timed operations. The WSL2 replication has incomplete I/O coverage and ran on the same physical host. Work-examined units differ by system and are not normalized.</w:t>
       </w:r>
     </w:p>
     <w:p>
@@ -4230,17 +4250,7 @@
         <w:ind w:firstLine="0"/>
       </w:pPr>
       <w:r>
-        <w:rPr>
-          <w:rFonts w:eastAsia="Times New Roman" w:cs="Times New Roman" w:ascii="Times New Roman" w:hAnsi="Times New Roman"/>
-          <w:sz w:val="20"/>
-        </w:rPr>
-        <w:t>The primary matrix has two warm-ups and seven measured trials per configuration: 120 warm-ups and 420 measured runs across calibration and evaluation. The primary five-system evaluation contains 280 measured runs, including 56 SQL-path Dolt runs; 56 additional measured runs use Dolt bulk import. Model order is counterbalanced and recorded. Each system/trial runs in a clean worker. The primary run reuses one deterministic workload per scenario, regenerated and digest-checked by the internal audit. Run b7a4ec7b610742d9b827f43fd5092fe2 used Windows-11-10.0.26200-SP0 and Python 3.14.3. For each scenario and comparison, latency ratios are formed from matching trial numbers; a 20,000-resample percentile bootstrap of the seven paired ratios supplies a 95% interval. These intervals describe run-to-run variation conditional on the fixed workload and host, not variation across datasets or machines. Intervals that include parity are classified as inconclusive; a 5% practical margin is used as an analyst-selected label, not as an external standard.</w:t>
-      </w:r>
-      <w:r>
-        <w:rPr>
-          <w:rFonts w:eastAsia="Times New Roman" w:cs="Times New Roman" w:ascii="Times New Roman" w:hAnsi="Times New Roman"/>
-          <w:sz w:val="20"/>
-        </w:rPr>
+        <w:t>The primary matrix uses two warm-ups and seven measured trials per configuration, for 120 warm-ups and 420 measured runs across calibration and evaluation. Of these, 280 measured runs belong to the five-system evaluation, including 56 SQL-path Dolt runs; another 56 measured runs use Dolt bulk import. We counterbalance and record model order, and run each system/trial in a clean worker. Each scenario uses one deterministic workload, which the internal audit regenerates and checks by digest. The primary run used Windows 11 build 10.0.26200-SP0 and Python 3.14.3 (run b7a4ec7b610742d9b827f43fd5092fe2). For each scenario and comparison, we divide latency measurements from matching trial numbers and bootstrap the seven paired ratios 20,000 times to obtain a percentile 95% interval. These intervals describe variation across runs on this fixed workload and host; they do not measure variation across datasets or machines. We label intervals that include parity as inconclusive. The 5% practical margin is an analyst-selected label, not an external standard.</w:t>
       </w:r>
     </w:p>
     <w:p>
@@ -4256,9 +4266,24 @@
           <w:noProof/>
           <w:sz w:val="20"/>
         </w:rPr>
+      </w:r>
+    </w:p>
+    <w:p>
+      <w:pPr>
+        <w:keepNext/>
+        <w:keepLines/>
+        <w:spacing w:before="40" w:line="240" w:lineRule="auto"/>
+        <w:ind w:firstLine="0"/>
+        <w:jc w:val="center"/>
+      </w:pPr>
+      <w:r>
+        <w:rPr>
+          <w:rFonts w:eastAsia="Times New Roman" w:cs="Times New Roman"/>
+          <w:noProof/>
+        </w:rPr>
         <w:drawing>
-          <wp:inline distT="0" distB="0" distL="0" distR="0" wp14:anchorId="7D2C9E31" wp14:editId="33BDCA98">
-            <wp:extent cx="3063240" cy="2700338"/>
+          <wp:inline distT="0" distB="0" distL="0" distR="0" wp14:anchorId="139397E1" wp14:editId="20363D3A">
+            <wp:extent cx="2706624" cy="1522476"/>
             <wp:effectExtent l="0" t="0" r="0" b="0"/>
             <wp:docPr id="3" name="Picture 3" descr="Calibration plot comparing log aggregation and forced-Merkle diff latency across accumulated operation counts, with the frozen 4,096-operation boundary." title="Calibration plot comparing log aggregation and forced-Merkle diff latency across accumulated operation counts, with the frozen 4,096-operation boundary"/>
             <wp:cNvGraphicFramePr>
@@ -4272,7 +4297,7 @@
                     <pic:cNvPicPr/>
                   </pic:nvPicPr>
                   <pic:blipFill>
-                    <a:blip r:embed="rId15"/>
+                    <a:blip r:embed="rId24"/>
                     <a:stretch>
                       <a:fillRect/>
                     </a:stretch>
@@ -4280,7 +4305,7 @@
                   <pic:spPr>
                     <a:xfrm>
                       <a:off x="0" y="0"/>
-                      <a:ext cx="3063240" cy="2700338"/>
+                      <a:ext cx="2706624" cy="1522476"/>
                     </a:xfrm>
                     <a:prstGeom prst="rect">
                       <a:avLst/>
@@ -4297,15 +4322,12 @@
       <w:pPr>
         <w:pStyle w:val="Caption"/>
         <w:keepNext/>
+        <w:keepLines/>
         <w:spacing w:before="40" w:after="40"/>
         <w:jc w:val="center"/>
       </w:pPr>
       <w:r>
-        <w:rPr>
-          <w:rFonts w:ascii="Times New Roman" w:hAnsi="Times New Roman"/>
-          <w:sz w:val="16"/>
-        </w:rPr>
-        <w:t>Fig. 3. Independent threshold calibration; 4,096 is the largest sampled log-favorable point.</w:t>
+        <w:t>Fig. 3. Threshold calibration; 4,096 is the largest sampled point favoring the log path.</w:t>
       </w:r>
     </w:p>
     <w:p>
@@ -4313,11 +4335,7 @@
         <w:spacing w:line="240" w:lineRule="auto" w:after="0"/>
       </w:pPr>
       <w:r>
-        <w:rPr>
-          <w:rFonts w:eastAsia="Times New Roman" w:cs="Times New Roman" w:ascii="Times New Roman" w:hAnsi="Times New Roman"/>
-          <w:sz w:val="20"/>
-        </w:rPr>
-        <w:t>The 4,096-operation boundary is a frozen policy for this machine, not a universal crossover. All 540 primary executions completed successfully and passed state and diff checks. The audit retained all 127 Tukey outlier candidates; no observation was deleted. A separate sensitivity run varies seed, payload size, history length, and update pattern; it is kept separate from the primary tables.</w:t>
+        <w:t>We fixed the 4,096-operation threshold for this machine; it is not a universal crossover. All 540 primary executions completed and passed the state and diff checks. The audit retained all 127 Tukey outlier candidates rather than removing them. A separate sensitivity run varies the seed, payload size, history length, and update pattern; its results are reported apart from the primary tables.</w:t>
       </w:r>
     </w:p>
     <w:p>
@@ -4375,9 +4393,35 @@
           <w:noProof/>
           <w:sz w:val="20"/>
         </w:rPr>
+      </w:r>
+    </w:p>
+    <w:p>
+      <w:pPr>
+        <w:pStyle w:val="Caption"/>
+        <w:keepNext/>
+        <w:spacing w:before="40" w:after="40"/>
+        <w:jc w:val="center"/>
+        <w:rPr>
+          <w:rFonts w:eastAsia="Times New Roman" w:cs="Times New Roman"/>
+        </w:rPr>
+      </w:pPr>
+    </w:p>
+    <w:p>
+      <w:pPr>
+        <w:keepNext/>
+        <w:keepLines/>
+        <w:spacing w:before="40" w:line="240" w:lineRule="auto"/>
+        <w:ind w:firstLine="0"/>
+        <w:jc w:val="center"/>
+      </w:pPr>
+      <w:r>
+        <w:rPr>
+          <w:rFonts w:eastAsia="Times New Roman" w:cs="Times New Roman"/>
+          <w:noProof/>
+        </w:rPr>
         <w:drawing>
-          <wp:inline distT="0" distB="0" distL="0" distR="0" wp14:anchorId="1311E863" wp14:editId="48B78019">
-            <wp:extent cx="3063240" cy="2728762"/>
+          <wp:inline distT="0" distB="0" distL="0" distR="0" wp14:anchorId="5BD78D2C" wp14:editId="774FA62D">
+            <wp:extent cx="2578608" cy="1465735"/>
             <wp:effectExtent l="0" t="0" r="0" b="0"/>
             <wp:docPr id="4" name="Picture 4" descr="Log-scale grouped bar chart of final median diff latency with interquartile whiskers for Snapshot, Log-only, Revon-M, Revon-H, and Dolt across five workloads." title="Log-scale grouped bar chart of final median diff latency with interquartile whiskers for Snapshot, Log-only, Revon-M, Revon-H, and Dolt across five workloads"/>
             <wp:cNvGraphicFramePr>
@@ -4391,7 +4435,7 @@
                     <pic:cNvPicPr/>
                   </pic:nvPicPr>
                   <pic:blipFill>
-                    <a:blip r:embed="rId16"/>
+                    <a:blip r:embed="rId25"/>
                     <a:stretch>
                       <a:fillRect/>
                     </a:stretch>
@@ -4399,7 +4443,7 @@
                   <pic:spPr>
                     <a:xfrm>
                       <a:off x="0" y="0"/>
-                      <a:ext cx="3063240" cy="2728762"/>
+                      <a:ext cx="2578608" cy="1465735"/>
                     </a:xfrm>
                     <a:prstGeom prst="rect">
                       <a:avLst/>
@@ -4416,26 +4460,12 @@
       <w:pPr>
         <w:pStyle w:val="Caption"/>
         <w:keepNext/>
+        <w:keepLines/>
         <w:spacing w:before="40" w:after="40"/>
         <w:jc w:val="center"/>
-        <w:rPr>
-          <w:rFonts w:eastAsia="Times New Roman" w:cs="Times New Roman"/>
-        </w:rPr>
-      </w:pPr>
-    </w:p>
-    <w:p>
-      <w:pPr>
-        <w:pStyle w:val="Caption"/>
-        <w:keepNext/>
-        <w:spacing w:before="40" w:after="40"/>
-        <w:jc w:val="center"/>
-      </w:pPr>
-      <w:r>
-        <w:rPr>
-          <w:rFonts w:ascii="Times New Roman" w:hAnsi="Times New Roman"/>
-          <w:sz w:val="16"/>
-        </w:rPr>
-        <w:t>Fig. 4. Diff latency across eight scenarios, including separate application-key, range, repeated-key, and hash-route update locality; lower is better.</w:t>
+      </w:pPr>
+      <w:r>
+        <w:t>Fig. 4. Diff latency across eight update scenarios; lower values are better.</w:t>
       </w:r>
     </w:p>
     <w:p>
@@ -4459,15 +4489,12 @@
       <w:pPr>
         <w:pStyle w:val="Caption"/>
         <w:keepNext/>
+        <w:keepLines/>
         <w:spacing w:before="40" w:after="40"/>
         <w:jc w:val="center"/>
       </w:pPr>
       <w:r>
-        <w:rPr>
-          <w:rFonts w:ascii="Times New Roman" w:hAnsi="Times New Roman"/>
-          <w:sz w:val="16"/>
-        </w:rPr>
-        <w:t>TABLE III. Revon-H versus SQL-path Dolt diff latency; the final column reports the median paired trial ratio and percentile-bootstrap 95% interval.</w:t>
+        <w:t>TABLE III. Revon-H and SQL-path Dolt diff latency; the final column gives the median paired ratio and 95% bootstrap interval.</w:t>
       </w:r>
     </w:p>
     <w:tbl>
@@ -4478,11 +4505,11 @@
         <w:tblLook w:val="04A0" w:firstRow="1" w:lastRow="0" w:firstColumn="1" w:lastColumn="0" w:noHBand="0" w:noVBand="1"/>
       </w:tblPr>
       <w:tblGrid>
-        <w:gridCol w:w="2050"/>
-        <w:gridCol w:w="750"/>
-        <w:gridCol w:w="900"/>
-        <w:gridCol w:w="1250"/>
-        <w:gridCol w:w="4070"/>
+        <w:gridCol w:w="1950"/>
+        <w:gridCol w:w="1050"/>
+        <w:gridCol w:w="1200"/>
+        <w:gridCol w:w="1500"/>
+        <w:gridCol w:w="3320"/>
       </w:tblGrid>
       <w:tr>
         <w:trPr>
@@ -4492,7 +4519,7 @@
         </w:trPr>
         <w:tc>
           <w:tcPr>
-            <w:tcW w:w="2050" w:type="dxa"/>
+            <w:tcW w:w="1950" w:type="dxa"/>
             <w:tcBorders>
               <w:top w:val="single" w:sz="6" w:space="0" w:color="000000"/>
               <w:left w:val="nil"/>
@@ -4510,24 +4537,19 @@
           </w:tcPr>
           <w:p>
             <w:pPr>
-              <w:keepNext/>
-              <w:ind w:firstLine="0"/>
-              <w:jc w:val="left"/>
+              <w:keepLines/>
             </w:pPr>
             <w:r>
               <w:rPr>
-                <w:rFonts w:eastAsia="Times New Roman" w:cs="Times New Roman"/>
                 <w:b/>
-                <w:sz w:val="18"/>
               </w:rPr>
-              <w:lastRenderedPageBreak/>
               <w:t>Scenario</w:t>
             </w:r>
           </w:p>
         </w:tc>
         <w:tc>
           <w:tcPr>
-            <w:tcW w:w="750" w:type="dxa"/>
+            <w:tcW w:w="1050" w:type="dxa"/>
             <w:tcBorders>
               <w:top w:val="single" w:sz="6" w:space="0" w:color="000000"/>
               <w:left w:val="nil"/>
@@ -4545,23 +4567,19 @@
           </w:tcPr>
           <w:p>
             <w:pPr>
-              <w:keepNext/>
-              <w:ind w:firstLine="0"/>
-              <w:jc w:val="center"/>
+              <w:keepLines/>
             </w:pPr>
             <w:r>
               <w:rPr>
-                <w:rFonts w:eastAsia="Times New Roman" w:cs="Times New Roman"/>
                 <w:b/>
-                <w:sz w:val="18"/>
               </w:rPr>
-              <w:t>Path</w:t>
+              <w:t>Diff path</w:t>
             </w:r>
           </w:p>
         </w:tc>
         <w:tc>
           <w:tcPr>
-            <w:tcW w:w="900" w:type="dxa"/>
+            <w:tcW w:w="1200" w:type="dxa"/>
             <w:tcBorders>
               <w:top w:val="single" w:sz="6" w:space="0" w:color="000000"/>
               <w:left w:val="nil"/>
@@ -4579,23 +4597,19 @@
           </w:tcPr>
           <w:p>
             <w:pPr>
-              <w:keepNext/>
-              <w:ind w:firstLine="0"/>
-              <w:jc w:val="center"/>
+              <w:keepLines/>
             </w:pPr>
             <w:r>
               <w:rPr>
-                <w:rFonts w:eastAsia="Times New Roman" w:cs="Times New Roman"/>
                 <w:b/>
-                <w:sz w:val="18"/>
               </w:rPr>
-              <w:t>H ms</w:t>
+              <w:t>Revon-H (ms)</w:t>
             </w:r>
           </w:p>
         </w:tc>
         <w:tc>
           <w:tcPr>
-            <w:tcW w:w="1250" w:type="dxa"/>
+            <w:tcW w:w="1500" w:type="dxa"/>
             <w:tcBorders>
               <w:top w:val="single" w:sz="6" w:space="0" w:color="000000"/>
               <w:left w:val="nil"/>
@@ -4613,23 +4627,19 @@
           </w:tcPr>
           <w:p>
             <w:pPr>
-              <w:keepNext/>
-              <w:ind w:firstLine="0"/>
-              <w:jc w:val="center"/>
+              <w:keepLines/>
             </w:pPr>
             <w:r>
               <w:rPr>
-                <w:rFonts w:eastAsia="Times New Roman" w:cs="Times New Roman"/>
                 <w:b/>
-                <w:sz w:val="18"/>
               </w:rPr>
-              <w:t>Dolt ms</w:t>
+              <w:t>Dolt SQL (ms)</w:t>
             </w:r>
           </w:p>
         </w:tc>
         <w:tc>
           <w:tcPr>
-            <w:tcW w:w="4070" w:type="dxa"/>
+            <w:tcW w:w="3320" w:type="dxa"/>
             <w:tcBorders>
               <w:top w:val="single" w:sz="6" w:space="0" w:color="000000"/>
               <w:left w:val="nil"/>
@@ -4647,17 +4657,13 @@
           </w:tcPr>
           <w:p>
             <w:pPr>
-              <w:keepNext/>
-              <w:ind w:firstLine="0"/>
-              <w:jc w:val="center"/>
+              <w:keepLines/>
             </w:pPr>
             <w:r>
               <w:rPr>
-                <w:rFonts w:eastAsia="Times New Roman" w:cs="Times New Roman"/>
                 <w:b/>
-                <w:sz w:val="18"/>
               </w:rPr>
-              <w:t>Dolt/H ratio [95% CI]</w:t>
+              <w:t>Dolt/Revon-H ratio (95% CI)</w:t>
             </w:r>
           </w:p>
         </w:tc>
@@ -4669,7 +4675,7 @@
         </w:trPr>
         <w:tc>
           <w:tcPr>
-            <w:tcW w:w="2050" w:type="dxa"/>
+            <w:tcW w:w="1950" w:type="dxa"/>
             <w:tcBorders>
               <w:top w:val="nil"/>
               <w:left w:val="nil"/>
@@ -4687,6 +4693,7 @@
           <w:p>
             <w:pPr>
               <w:keepNext/>
+              <w:keepLines/>
               <w:spacing w:line="200" w:lineRule="exact"/>
               <w:ind w:firstLine="0"/>
               <w:jc w:val="left"/>
@@ -4702,7 +4709,7 @@
         </w:tc>
         <w:tc>
           <w:tcPr>
-            <w:tcW w:w="750" w:type="dxa"/>
+            <w:tcW w:w="1050" w:type="dxa"/>
             <w:tcBorders>
               <w:top w:val="nil"/>
               <w:left w:val="nil"/>
@@ -4720,6 +4727,7 @@
           <w:p>
             <w:pPr>
               <w:keepNext/>
+              <w:keepLines/>
               <w:spacing w:line="200" w:lineRule="exact"/>
               <w:ind w:firstLine="0"/>
               <w:jc w:val="center"/>
@@ -4735,7 +4743,7 @@
         </w:tc>
         <w:tc>
           <w:tcPr>
-            <w:tcW w:w="900" w:type="dxa"/>
+            <w:tcW w:w="1200" w:type="dxa"/>
             <w:tcBorders>
               <w:top w:val="nil"/>
               <w:left w:val="nil"/>
@@ -4753,6 +4761,7 @@
           <w:p>
             <w:pPr>
               <w:keepNext/>
+              <w:keepLines/>
               <w:spacing w:line="200" w:lineRule="exact"/>
               <w:ind w:firstLine="0"/>
               <w:jc w:val="center"/>
@@ -4768,7 +4777,7 @@
         </w:tc>
         <w:tc>
           <w:tcPr>
-            <w:tcW w:w="1250" w:type="dxa"/>
+            <w:tcW w:w="1500" w:type="dxa"/>
             <w:tcBorders>
               <w:top w:val="nil"/>
               <w:left w:val="nil"/>
@@ -4786,6 +4795,7 @@
           <w:p>
             <w:pPr>
               <w:keepNext/>
+              <w:keepLines/>
               <w:spacing w:line="200" w:lineRule="exact"/>
               <w:ind w:firstLine="0"/>
               <w:jc w:val="center"/>
@@ -4801,7 +4811,7 @@
         </w:tc>
         <w:tc>
           <w:tcPr>
-            <w:tcW w:w="4070" w:type="dxa"/>
+            <w:tcW w:w="3320" w:type="dxa"/>
             <w:tcBorders>
               <w:top w:val="nil"/>
               <w:left w:val="nil"/>
@@ -4819,6 +4829,7 @@
           <w:p>
             <w:pPr>
               <w:keepNext/>
+              <w:keepLines/>
               <w:spacing w:line="200" w:lineRule="exact"/>
               <w:ind w:firstLine="0"/>
               <w:jc w:val="center"/>
@@ -4840,7 +4851,7 @@
         </w:trPr>
         <w:tc>
           <w:tcPr>
-            <w:tcW w:w="2050" w:type="dxa"/>
+            <w:tcW w:w="1950" w:type="dxa"/>
             <w:tcBorders>
               <w:top w:val="nil"/>
               <w:left w:val="nil"/>
@@ -4858,6 +4869,7 @@
           <w:p>
             <w:pPr>
               <w:keepNext/>
+              <w:keepLines/>
               <w:spacing w:line="200" w:lineRule="exact"/>
               <w:ind w:firstLine="0"/>
               <w:jc w:val="left"/>
@@ -4873,7 +4885,7 @@
         </w:tc>
         <w:tc>
           <w:tcPr>
-            <w:tcW w:w="750" w:type="dxa"/>
+            <w:tcW w:w="1050" w:type="dxa"/>
             <w:tcBorders>
               <w:top w:val="nil"/>
               <w:left w:val="nil"/>
@@ -4891,6 +4903,7 @@
           <w:p>
             <w:pPr>
               <w:keepNext/>
+              <w:keepLines/>
               <w:spacing w:line="200" w:lineRule="exact"/>
               <w:ind w:firstLine="0"/>
               <w:jc w:val="center"/>
@@ -4906,7 +4919,7 @@
         </w:tc>
         <w:tc>
           <w:tcPr>
-            <w:tcW w:w="900" w:type="dxa"/>
+            <w:tcW w:w="1200" w:type="dxa"/>
             <w:tcBorders>
               <w:top w:val="nil"/>
               <w:left w:val="nil"/>
@@ -4924,6 +4937,7 @@
           <w:p>
             <w:pPr>
               <w:keepNext/>
+              <w:keepLines/>
               <w:spacing w:line="200" w:lineRule="exact"/>
               <w:ind w:firstLine="0"/>
               <w:jc w:val="center"/>
@@ -4939,7 +4953,7 @@
         </w:tc>
         <w:tc>
           <w:tcPr>
-            <w:tcW w:w="1250" w:type="dxa"/>
+            <w:tcW w:w="1500" w:type="dxa"/>
             <w:tcBorders>
               <w:top w:val="nil"/>
               <w:left w:val="nil"/>
@@ -4957,6 +4971,7 @@
           <w:p>
             <w:pPr>
               <w:keepNext/>
+              <w:keepLines/>
               <w:spacing w:line="200" w:lineRule="exact"/>
               <w:ind w:firstLine="0"/>
               <w:jc w:val="center"/>
@@ -4972,7 +4987,7 @@
         </w:tc>
         <w:tc>
           <w:tcPr>
-            <w:tcW w:w="4070" w:type="dxa"/>
+            <w:tcW w:w="3320" w:type="dxa"/>
             <w:tcBorders>
               <w:top w:val="nil"/>
               <w:left w:val="nil"/>
@@ -4990,6 +5005,7 @@
           <w:p>
             <w:pPr>
               <w:keepNext/>
+              <w:keepLines/>
               <w:spacing w:line="200" w:lineRule="exact"/>
               <w:ind w:firstLine="0"/>
               <w:jc w:val="center"/>
@@ -5011,7 +5027,7 @@
         </w:trPr>
         <w:tc>
           <w:tcPr>
-            <w:tcW w:w="2050" w:type="dxa"/>
+            <w:tcW w:w="1950" w:type="dxa"/>
             <w:tcBorders>
               <w:top w:val="nil"/>
               <w:left w:val="nil"/>
@@ -5029,6 +5045,7 @@
           <w:p>
             <w:pPr>
               <w:keepNext/>
+              <w:keepLines/>
               <w:spacing w:line="200" w:lineRule="exact"/>
               <w:ind w:firstLine="0"/>
               <w:jc w:val="left"/>
@@ -5044,7 +5061,7 @@
         </w:tc>
         <w:tc>
           <w:tcPr>
-            <w:tcW w:w="750" w:type="dxa"/>
+            <w:tcW w:w="1050" w:type="dxa"/>
             <w:tcBorders>
               <w:top w:val="nil"/>
               <w:left w:val="nil"/>
@@ -5062,6 +5079,7 @@
           <w:p>
             <w:pPr>
               <w:keepNext/>
+              <w:keepLines/>
               <w:spacing w:line="200" w:lineRule="exact"/>
               <w:ind w:firstLine="0"/>
               <w:jc w:val="center"/>
@@ -5077,7 +5095,7 @@
         </w:tc>
         <w:tc>
           <w:tcPr>
-            <w:tcW w:w="900" w:type="dxa"/>
+            <w:tcW w:w="1200" w:type="dxa"/>
             <w:tcBorders>
               <w:top w:val="nil"/>
               <w:left w:val="nil"/>
@@ -5095,6 +5113,7 @@
           <w:p>
             <w:pPr>
               <w:keepNext/>
+              <w:keepLines/>
               <w:spacing w:line="200" w:lineRule="exact"/>
               <w:ind w:firstLine="0"/>
               <w:jc w:val="center"/>
@@ -5110,7 +5129,7 @@
         </w:tc>
         <w:tc>
           <w:tcPr>
-            <w:tcW w:w="1250" w:type="dxa"/>
+            <w:tcW w:w="1500" w:type="dxa"/>
             <w:tcBorders>
               <w:top w:val="nil"/>
               <w:left w:val="nil"/>
@@ -5128,6 +5147,7 @@
           <w:p>
             <w:pPr>
               <w:keepNext/>
+              <w:keepLines/>
               <w:spacing w:line="200" w:lineRule="exact"/>
               <w:ind w:firstLine="0"/>
               <w:jc w:val="center"/>
@@ -5143,7 +5163,7 @@
         </w:tc>
         <w:tc>
           <w:tcPr>
-            <w:tcW w:w="4070" w:type="dxa"/>
+            <w:tcW w:w="3320" w:type="dxa"/>
             <w:tcBorders>
               <w:top w:val="nil"/>
               <w:left w:val="nil"/>
@@ -5161,6 +5181,7 @@
           <w:p>
             <w:pPr>
               <w:keepNext/>
+              <w:keepLines/>
               <w:spacing w:line="200" w:lineRule="exact"/>
               <w:ind w:firstLine="0"/>
               <w:jc w:val="center"/>
@@ -5182,7 +5203,7 @@
         </w:trPr>
         <w:tc>
           <w:tcPr>
-            <w:tcW w:w="2050" w:type="dxa"/>
+            <w:tcW w:w="1950" w:type="dxa"/>
             <w:tcBorders>
               <w:top w:val="nil"/>
               <w:left w:val="nil"/>
@@ -5200,6 +5221,7 @@
           <w:p>
             <w:pPr>
               <w:keepNext/>
+              <w:keepLines/>
               <w:spacing w:line="200" w:lineRule="exact"/>
               <w:ind w:firstLine="0"/>
               <w:jc w:val="left"/>
@@ -5215,7 +5237,7 @@
         </w:tc>
         <w:tc>
           <w:tcPr>
-            <w:tcW w:w="750" w:type="dxa"/>
+            <w:tcW w:w="1050" w:type="dxa"/>
             <w:tcBorders>
               <w:top w:val="nil"/>
               <w:left w:val="nil"/>
@@ -5233,6 +5255,7 @@
           <w:p>
             <w:pPr>
               <w:keepNext/>
+              <w:keepLines/>
               <w:spacing w:line="200" w:lineRule="exact"/>
               <w:ind w:firstLine="0"/>
               <w:jc w:val="center"/>
@@ -5248,7 +5271,7 @@
         </w:tc>
         <w:tc>
           <w:tcPr>
-            <w:tcW w:w="900" w:type="dxa"/>
+            <w:tcW w:w="1200" w:type="dxa"/>
             <w:tcBorders>
               <w:top w:val="nil"/>
               <w:left w:val="nil"/>
@@ -5266,6 +5289,7 @@
           <w:p>
             <w:pPr>
               <w:keepNext/>
+              <w:keepLines/>
               <w:spacing w:line="200" w:lineRule="exact"/>
               <w:ind w:firstLine="0"/>
               <w:jc w:val="center"/>
@@ -5281,7 +5305,7 @@
         </w:tc>
         <w:tc>
           <w:tcPr>
-            <w:tcW w:w="1250" w:type="dxa"/>
+            <w:tcW w:w="1500" w:type="dxa"/>
             <w:tcBorders>
               <w:top w:val="nil"/>
               <w:left w:val="nil"/>
@@ -5299,6 +5323,7 @@
           <w:p>
             <w:pPr>
               <w:keepNext/>
+              <w:keepLines/>
               <w:spacing w:line="200" w:lineRule="exact"/>
               <w:ind w:firstLine="0"/>
               <w:jc w:val="center"/>
@@ -5314,7 +5339,7 @@
         </w:tc>
         <w:tc>
           <w:tcPr>
-            <w:tcW w:w="4070" w:type="dxa"/>
+            <w:tcW w:w="3320" w:type="dxa"/>
             <w:tcBorders>
               <w:top w:val="nil"/>
               <w:left w:val="nil"/>
@@ -5332,6 +5357,7 @@
           <w:p>
             <w:pPr>
               <w:keepNext/>
+              <w:keepLines/>
               <w:spacing w:line="200" w:lineRule="exact"/>
               <w:ind w:firstLine="0"/>
               <w:jc w:val="center"/>
@@ -5353,7 +5379,7 @@
         </w:trPr>
         <w:tc>
           <w:tcPr>
-            <w:tcW w:w="2050" w:type="dxa"/>
+            <w:tcW w:w="1950" w:type="dxa"/>
             <w:tcBorders>
               <w:top w:val="nil"/>
               <w:left w:val="nil"/>
@@ -5371,6 +5397,7 @@
           <w:p>
             <w:pPr>
               <w:keepNext/>
+              <w:keepLines/>
               <w:spacing w:line="200" w:lineRule="exact"/>
               <w:ind w:firstLine="0"/>
               <w:jc w:val="left"/>
@@ -5386,7 +5413,7 @@
         </w:tc>
         <w:tc>
           <w:tcPr>
-            <w:tcW w:w="750" w:type="dxa"/>
+            <w:tcW w:w="1050" w:type="dxa"/>
             <w:tcBorders>
               <w:top w:val="nil"/>
               <w:left w:val="nil"/>
@@ -5404,6 +5431,7 @@
           <w:p>
             <w:pPr>
               <w:keepNext/>
+              <w:keepLines/>
               <w:spacing w:line="200" w:lineRule="exact"/>
               <w:ind w:firstLine="0"/>
               <w:jc w:val="center"/>
@@ -5419,7 +5447,7 @@
         </w:tc>
         <w:tc>
           <w:tcPr>
-            <w:tcW w:w="900" w:type="dxa"/>
+            <w:tcW w:w="1200" w:type="dxa"/>
             <w:tcBorders>
               <w:top w:val="nil"/>
               <w:left w:val="nil"/>
@@ -5437,6 +5465,7 @@
           <w:p>
             <w:pPr>
               <w:keepNext/>
+              <w:keepLines/>
               <w:spacing w:line="200" w:lineRule="exact"/>
               <w:ind w:firstLine="0"/>
               <w:jc w:val="center"/>
@@ -5452,7 +5481,7 @@
         </w:tc>
         <w:tc>
           <w:tcPr>
-            <w:tcW w:w="1250" w:type="dxa"/>
+            <w:tcW w:w="1500" w:type="dxa"/>
             <w:tcBorders>
               <w:top w:val="nil"/>
               <w:left w:val="nil"/>
@@ -5470,6 +5499,7 @@
           <w:p>
             <w:pPr>
               <w:keepNext/>
+              <w:keepLines/>
               <w:spacing w:line="200" w:lineRule="exact"/>
               <w:ind w:firstLine="0"/>
               <w:jc w:val="center"/>
@@ -5485,7 +5515,7 @@
         </w:tc>
         <w:tc>
           <w:tcPr>
-            <w:tcW w:w="4070" w:type="dxa"/>
+            <w:tcW w:w="3320" w:type="dxa"/>
             <w:tcBorders>
               <w:top w:val="nil"/>
               <w:left w:val="nil"/>
@@ -5503,6 +5533,7 @@
           <w:p>
             <w:pPr>
               <w:keepNext/>
+              <w:keepLines/>
               <w:spacing w:line="200" w:lineRule="exact"/>
               <w:ind w:firstLine="0"/>
               <w:jc w:val="center"/>
@@ -5524,7 +5555,7 @@
         </w:trPr>
         <w:tc>
           <w:tcPr>
-            <w:tcW w:type="dxa" w:w="2050"/>
+            <w:tcW w:type="dxa" w:w="1950"/>
             <w:tcBorders>
               <w:top w:val="nil"/>
               <w:left w:val="nil"/>
@@ -5542,6 +5573,7 @@
           <w:p>
             <w:pPr>
               <w:keepNext/>
+              <w:keepLines/>
               <w:spacing w:line="200" w:lineRule="exact"/>
               <w:ind w:firstLine="0"/>
               <w:jc w:val="left"/>
@@ -5557,7 +5589,7 @@
         </w:tc>
         <w:tc>
           <w:tcPr>
-            <w:tcW w:type="dxa" w:w="750"/>
+            <w:tcW w:type="dxa" w:w="1050"/>
             <w:tcBorders>
               <w:top w:val="nil"/>
               <w:left w:val="nil"/>
@@ -5575,6 +5607,7 @@
           <w:p>
             <w:pPr>
               <w:keepNext/>
+              <w:keepLines/>
               <w:spacing w:line="200" w:lineRule="exact"/>
               <w:ind w:firstLine="0"/>
               <w:jc w:val="center"/>
@@ -5590,7 +5623,7 @@
         </w:tc>
         <w:tc>
           <w:tcPr>
-            <w:tcW w:type="dxa" w:w="900"/>
+            <w:tcW w:type="dxa" w:w="1200"/>
             <w:tcBorders>
               <w:top w:val="nil"/>
               <w:left w:val="nil"/>
@@ -5608,6 +5641,7 @@
           <w:p>
             <w:pPr>
               <w:keepNext/>
+              <w:keepLines/>
               <w:spacing w:line="200" w:lineRule="exact"/>
               <w:ind w:firstLine="0"/>
               <w:jc w:val="center"/>
@@ -5623,7 +5657,7 @@
         </w:tc>
         <w:tc>
           <w:tcPr>
-            <w:tcW w:type="dxa" w:w="1250"/>
+            <w:tcW w:type="dxa" w:w="1500"/>
             <w:tcBorders>
               <w:top w:val="nil"/>
               <w:left w:val="nil"/>
@@ -5641,6 +5675,7 @@
           <w:p>
             <w:pPr>
               <w:keepNext/>
+              <w:keepLines/>
               <w:spacing w:line="200" w:lineRule="exact"/>
               <w:ind w:firstLine="0"/>
               <w:jc w:val="center"/>
@@ -5656,7 +5691,7 @@
         </w:tc>
         <w:tc>
           <w:tcPr>
-            <w:tcW w:type="dxa" w:w="4070"/>
+            <w:tcW w:type="dxa" w:w="3320"/>
             <w:tcBorders>
               <w:top w:val="nil"/>
               <w:left w:val="nil"/>
@@ -5674,6 +5709,7 @@
           <w:p>
             <w:pPr>
               <w:keepNext/>
+              <w:keepLines/>
               <w:spacing w:line="200" w:lineRule="exact"/>
               <w:ind w:firstLine="0"/>
               <w:jc w:val="center"/>
@@ -5695,7 +5731,7 @@
         </w:trPr>
         <w:tc>
           <w:tcPr>
-            <w:tcW w:type="dxa" w:w="2050"/>
+            <w:tcW w:type="dxa" w:w="1950"/>
             <w:tcBorders>
               <w:top w:val="nil"/>
               <w:left w:val="nil"/>
@@ -5713,6 +5749,7 @@
           <w:p>
             <w:pPr>
               <w:keepNext/>
+              <w:keepLines/>
               <w:spacing w:line="200" w:lineRule="exact"/>
               <w:ind w:firstLine="0"/>
               <w:jc w:val="left"/>
@@ -5728,7 +5765,7 @@
         </w:tc>
         <w:tc>
           <w:tcPr>
-            <w:tcW w:type="dxa" w:w="750"/>
+            <w:tcW w:type="dxa" w:w="1050"/>
             <w:tcBorders>
               <w:top w:val="nil"/>
               <w:left w:val="nil"/>
@@ -5746,6 +5783,7 @@
           <w:p>
             <w:pPr>
               <w:keepNext/>
+              <w:keepLines/>
               <w:spacing w:line="200" w:lineRule="exact"/>
               <w:ind w:firstLine="0"/>
               <w:jc w:val="center"/>
@@ -5761,7 +5799,7 @@
         </w:tc>
         <w:tc>
           <w:tcPr>
-            <w:tcW w:type="dxa" w:w="900"/>
+            <w:tcW w:type="dxa" w:w="1200"/>
             <w:tcBorders>
               <w:top w:val="nil"/>
               <w:left w:val="nil"/>
@@ -5779,6 +5817,7 @@
           <w:p>
             <w:pPr>
               <w:keepNext/>
+              <w:keepLines/>
               <w:spacing w:line="200" w:lineRule="exact"/>
               <w:ind w:firstLine="0"/>
               <w:jc w:val="center"/>
@@ -5794,7 +5833,7 @@
         </w:tc>
         <w:tc>
           <w:tcPr>
-            <w:tcW w:type="dxa" w:w="1250"/>
+            <w:tcW w:type="dxa" w:w="1500"/>
             <w:tcBorders>
               <w:top w:val="nil"/>
               <w:left w:val="nil"/>
@@ -5812,6 +5851,7 @@
           <w:p>
             <w:pPr>
               <w:keepNext/>
+              <w:keepLines/>
               <w:spacing w:line="200" w:lineRule="exact"/>
               <w:ind w:firstLine="0"/>
               <w:jc w:val="center"/>
@@ -5827,7 +5867,7 @@
         </w:tc>
         <w:tc>
           <w:tcPr>
-            <w:tcW w:type="dxa" w:w="4070"/>
+            <w:tcW w:type="dxa" w:w="3320"/>
             <w:tcBorders>
               <w:top w:val="nil"/>
               <w:left w:val="nil"/>
@@ -5845,6 +5885,7 @@
           <w:p>
             <w:pPr>
               <w:keepNext/>
+              <w:keepLines/>
               <w:spacing w:line="200" w:lineRule="exact"/>
               <w:ind w:firstLine="0"/>
               <w:jc w:val="center"/>
@@ -5866,7 +5907,7 @@
         </w:trPr>
         <w:tc>
           <w:tcPr>
-            <w:tcW w:type="dxa" w:w="2050"/>
+            <w:tcW w:type="dxa" w:w="1950"/>
             <w:tcBorders>
               <w:top w:val="nil"/>
               <w:left w:val="nil"/>
@@ -5884,6 +5925,7 @@
           <w:p>
             <w:pPr>
               <w:keepNext/>
+              <w:keepLines/>
               <w:spacing w:line="200" w:lineRule="exact"/>
               <w:ind w:firstLine="0"/>
               <w:jc w:val="left"/>
@@ -5899,7 +5941,7 @@
         </w:tc>
         <w:tc>
           <w:tcPr>
-            <w:tcW w:type="dxa" w:w="750"/>
+            <w:tcW w:type="dxa" w:w="1050"/>
             <w:tcBorders>
               <w:top w:val="nil"/>
               <w:left w:val="nil"/>
@@ -5917,6 +5959,7 @@
           <w:p>
             <w:pPr>
               <w:keepNext/>
+              <w:keepLines/>
               <w:spacing w:line="200" w:lineRule="exact"/>
               <w:ind w:firstLine="0"/>
               <w:jc w:val="center"/>
@@ -5932,7 +5975,7 @@
         </w:tc>
         <w:tc>
           <w:tcPr>
-            <w:tcW w:type="dxa" w:w="900"/>
+            <w:tcW w:type="dxa" w:w="1200"/>
             <w:tcBorders>
               <w:top w:val="nil"/>
               <w:left w:val="nil"/>
@@ -5950,6 +5993,7 @@
           <w:p>
             <w:pPr>
               <w:keepNext/>
+              <w:keepLines/>
               <w:spacing w:line="200" w:lineRule="exact"/>
               <w:ind w:firstLine="0"/>
               <w:jc w:val="center"/>
@@ -5965,7 +6009,7 @@
         </w:tc>
         <w:tc>
           <w:tcPr>
-            <w:tcW w:type="dxa" w:w="1250"/>
+            <w:tcW w:type="dxa" w:w="1500"/>
             <w:tcBorders>
               <w:top w:val="nil"/>
               <w:left w:val="nil"/>
@@ -5983,6 +6027,7 @@
           <w:p>
             <w:pPr>
               <w:keepNext/>
+              <w:keepLines/>
               <w:spacing w:line="200" w:lineRule="exact"/>
               <w:ind w:firstLine="0"/>
               <w:jc w:val="center"/>
@@ -5998,7 +6043,7 @@
         </w:tc>
         <w:tc>
           <w:tcPr>
-            <w:tcW w:type="dxa" w:w="4070"/>
+            <w:tcW w:type="dxa" w:w="3320"/>
             <w:tcBorders>
               <w:top w:val="nil"/>
               <w:left w:val="nil"/>
@@ -6016,6 +6061,7 @@
           <w:p>
             <w:pPr>
               <w:keepNext/>
+              <w:keepLines/>
               <w:spacing w:line="200" w:lineRule="exact"/>
               <w:ind w:firstLine="0"/>
               <w:jc w:val="center"/>
@@ -6046,11 +6092,7 @@
         <w:spacing w:line="240" w:lineRule="auto" w:after="0"/>
       </w:pPr>
       <w:r>
-        <w:rPr>
-          <w:rFonts w:eastAsia="Times New Roman" w:cs="Times New Roman" w:ascii="Times New Roman" w:hAnsi="Times New Roman"/>
-          <w:sz w:val="20"/>
-        </w:rPr>
-        <w:t>Across the eight scenarios, every paired Dolt/Revon-H diff ratio is above one and its 95% interval excludes parity, indicating lower Revon-H latency for this tested workflow. Table 3 reports the median of the seven same-trial ratios and its bootstrap interval. This remains an in-process Revon API versus Dolt CLI workflow comparison: Dolt's CLI and SQL costs are included, so the ratios are not engine-only speedups. The lexical-key case is application-key local; range-local, repeated-key, and hash-route-local updates remain distinct workloads.</w:t>
+        <w:t>In all eight scenarios, the paired Dolt/Revon-H diff ratio exceeded one and its 95% interval excluded parity. Revon-H therefore had lower diff latency in the workflows we tested. Table III gives the median of the seven same-trial ratios and the bootstrap interval. The comparison is between Revon’s in-process API and Dolt’s CLI workflow, which includes Dolt CLI and SQL costs; these ratios are not engine-only speedups. The lexically adjacent application-key workload is distinct from the range-local, repeated-key, and hash-route-local workloads.</w:t>
       </w:r>
     </w:p>
     <w:p>
@@ -6076,11 +6118,7 @@
         <w:ind w:firstLine="0"/>
       </w:pPr>
       <w:r>
-        <w:rPr>
-          <w:rFonts w:eastAsia="Times New Roman" w:cs="Times New Roman" w:ascii="Times New Roman" w:hAnsi="Times New Roman"/>
-          <w:sz w:val="20"/>
-        </w:rPr>
-        <w:t>In the primary run, 3 of eight paired Revon-M/Revon-H diff intervals include parity and are inconclusive. A separate robustness matrix covers 10,000 rows, three seeds, 32- and 128-byte values, 10- and 50-commit histories, and spread, range-local, and repeated-key updates. Revon-M/Revon-H diff ratios above one mean Revon-M was slower. On Windows, baseline, 128-byte payload, range-local, and repeated-key ratios were 1.58 [1.23, 1.87], 1.62 [1.38, 1.72], 1.64 [1.38, 1.77], and 2.24 [2.02, 2.38]. The 50-commit interval crossed parity. WSL2 showed the same direction for those four factors and parity overlap for the 50-commit history. The paired ablation is more direct evidence about adaptive selection than cross-system ratios, but this three-seed, one-host sensitivity study does not establish general superiority.</w:t>
+        <w:t>Three of the eight primary Revon-M/Revon-H diff intervals included parity, so those comparisons were inconclusive. The separate robustness matrix used 10,000 rows, three seeds, 32- and 128-byte values, histories of 10 and 50 commits, and spread, range-local, and repeated-key updates. A Revon-M/Revon-H ratio above one means Revon-M was slower. On Windows, the ratios for the baseline, 128-byte values, range-local updates, and repeated-key updates were 1.58 [1.23, 1.87], 1.62 [1.38, 1.72], 1.64 [1.38, 1.77], and 2.24 [2.02, 2.38]. The 50-commit interval crossed parity. WSL2 showed the same direction for the other four factors, while the 50-commit interval again overlapped parity. This three-seed sensitivity study on one physical host offers more direct evidence about adaptive selection than the cross-system ratios, but it does not establish general superiority.</w:t>
       </w:r>
     </w:p>
     <w:p>
@@ -6113,9 +6151,24 @@
           <w:noProof/>
           <w:sz w:val="20"/>
         </w:rPr>
+      </w:r>
+    </w:p>
+    <w:p>
+      <w:pPr>
+        <w:keepNext/>
+        <w:keepLines/>
+        <w:spacing w:before="40" w:line="240" w:lineRule="auto"/>
+        <w:ind w:firstLine="0"/>
+        <w:jc w:val="center"/>
+      </w:pPr>
+      <w:r>
+        <w:rPr>
+          <w:rFonts w:eastAsia="Times New Roman" w:cs="Times New Roman"/>
+          <w:noProof/>
+        </w:rPr>
         <w:drawing>
-          <wp:inline distT="0" distB="0" distL="0" distR="0" wp14:anchorId="5480C593" wp14:editId="6B287AB5">
-            <wp:extent cx="3063240" cy="2641172"/>
+          <wp:inline distT="0" distB="0" distL="0" distR="0" wp14:anchorId="45A6FA58" wp14:editId="31DECE52">
+            <wp:extent cx="2706624" cy="1396048"/>
             <wp:effectExtent l="0" t="0" r="0" b="0"/>
             <wp:docPr id="5" name="Picture 5" descr="Two-panel log-scale chart comparing Revon-H and Dolt median incremental commit and historical checkout latency with interquartile whiskers." title="Two-panel log-scale chart comparing Revon-H and Dolt median incremental commit and historical checkout latency with interquartile whiskers"/>
             <wp:cNvGraphicFramePr>
@@ -6129,7 +6182,7 @@
                     <pic:cNvPicPr/>
                   </pic:nvPicPr>
                   <pic:blipFill>
-                    <a:blip r:embed="rId17"/>
+                    <a:blip r:embed="rId26"/>
                     <a:stretch>
                       <a:fillRect/>
                     </a:stretch>
@@ -6137,7 +6190,7 @@
                   <pic:spPr>
                     <a:xfrm>
                       <a:off x="0" y="0"/>
-                      <a:ext cx="3063240" cy="2641172"/>
+                      <a:ext cx="2706624" cy="1396048"/>
                     </a:xfrm>
                     <a:prstGeom prst="rect">
                       <a:avLst/>
@@ -6154,15 +6207,12 @@
       <w:pPr>
         <w:pStyle w:val="Caption"/>
         <w:keepNext/>
+        <w:keepLines/>
         <w:spacing w:before="40" w:after="40"/>
         <w:jc w:val="center"/>
       </w:pPr>
       <w:r>
-        <w:rPr>
-          <w:rFonts w:ascii="Times New Roman" w:hAnsi="Times New Roman"/>
-          <w:sz w:val="16"/>
-        </w:rPr>
-        <w:t>Fig. 5. Revon-H and Dolt operational latency; lower is better.</w:t>
+        <w:t>Fig. 5. Operational latency for Revon-H and Dolt; lower values are better.</w:t>
       </w:r>
     </w:p>
     <w:p>
@@ -6170,11 +6220,7 @@
         <w:spacing w:line="240" w:lineRule="auto" w:after="0"/>
       </w:pPr>
       <w:r>
-        <w:rPr>
-          <w:rFonts w:eastAsia="Times New Roman" w:cs="Times New Roman" w:ascii="Times New Roman" w:hAnsi="Times New Roman"/>
-          <w:sz w:val="20"/>
-        </w:rPr>
-        <w:t>Across all eight scenarios, paired Dolt/Revon-H intervals exclude parity for initial import, incremental commit, diff, and historical checkout. The full paired ratios and intervals are in paired_ratio_uncertainty.csv. Initial-import workflow medians across scenario medians were 1,814.83 ms for batched SQL INSERT, 1,701.25 ms for Dolt bulk import, and 1,131.24 ms for Revon-H. In the paired SQL/bulk-import analysis, four scenario intervals favor bulk import and four include parity; there is no general bulk-import advantage. These are workflow measurements; they do not establish engine-level or production-system superiority.</w:t>
+        <w:t>Across all eight scenarios, the paired Dolt/Revon-H intervals excluded parity for initial import, incremental commit, diff, and historical checkout. Full ratios and intervals appear in paired_ratio_uncertainty.csv. Median initial-import times across scenario medians were 1,814.83 ms for batched SQL INSERT, 1,701.25 ms for Dolt bulk import, and 1,131.24 ms for Revon-H. In the paired SQL-versus-bulk-import analysis, four scenario intervals favored bulk import and four included parity; the results do not show a general bulk-import advantage. These are workflow measurements, not evidence of engine-level or production-system superiority.</w:t>
       </w:r>
     </w:p>
     <w:p>
@@ -6182,11 +6228,7 @@
         <w:spacing w:line="240" w:lineRule="auto" w:after="0"/>
       </w:pPr>
       <w:r>
-        <w:rPr>
-          <w:rFonts w:eastAsia="Times New Roman" w:cs="Times New Roman" w:ascii="Times New Roman" w:hAnsi="Times New Roman"/>
-          <w:sz w:val="20"/>
-        </w:rPr>
-        <w:t>Repository directory size is a whole-workflow footprint, not normalized algorithm storage. Across the eight scenarios, Revon-H/Dolt repository-footprint ratios ranged from 1.99 to 6.90. Median Revon-H/Dolt ratios after dividing each directory by final UTF-8 logical key/value payload bytes were 3.82; the corresponding residual ratio was 6.82. The residual is not pure metadata: it includes serialization, indexes, metadata, and compression effects. Post-compaction mean footprints for one measured sample per scenario were Revon-M 22.08 MiB, Revon-H 22.08 MiB, Dolt SQL 2.17 MiB, and Dolt bulk import 2.19 MiB. Dolt was compacted offline with `dolt gc` and Revon SQLite repositories with `VACUUM`; compaction time is outside latency and RSS. These are sampled outcomes, not a pure metadata comparison or universal steady-state result.</w:t>
+        <w:t>Repository directory size measures the footprint of the full workflow, not storage normalized to the algorithms alone. Across the eight scenarios, Revon-H’s repository footprint was 1.99–6.90 times Dolt’s. After dividing each directory size by the final UTF-8 key/value payload, the median Revon-H/Dolt ratio was 3.82; the corresponding ratio for the residual was 6.82. That residual is not pure metadata: it also includes serialization, indexes, other metadata, and compression effects. After compaction, mean sampled footprints were 22.08 MiB for Revon-M, 22.08 MiB for Revon-H, 2.17 MiB for Dolt SQL, and 2.19 MiB for Dolt bulk import. We compacted Dolt offline with `dolt gc` and the Revon SQLite repositories with `VACUUM`; compaction time is excluded from latency and RSS. These are sampled outcomes, not a pure metadata comparison or a universal steady-state result.</w:t>
       </w:r>
     </w:p>
     <w:p>
@@ -6219,9 +6261,24 @@
           <w:noProof/>
           <w:sz w:val="20"/>
         </w:rPr>
+      </w:r>
+    </w:p>
+    <w:p>
+      <w:pPr>
+        <w:keepNext/>
+        <w:keepLines/>
+        <w:spacing w:before="40" w:line="240" w:lineRule="auto"/>
+        <w:ind w:firstLine="0"/>
+        <w:jc w:val="center"/>
+      </w:pPr>
+      <w:r>
+        <w:rPr>
+          <w:rFonts w:eastAsia="Times New Roman" w:cs="Times New Roman"/>
+          <w:noProof/>
+        </w:rPr>
         <w:drawing>
-          <wp:inline distT="0" distB="0" distL="0" distR="0" wp14:anchorId="0AF85796" wp14:editId="7444C345">
-            <wp:extent cx="3063240" cy="2700338"/>
+          <wp:inline distT="0" distB="0" distL="0" distR="0" wp14:anchorId="4B9DFD26" wp14:editId="07058116">
+            <wp:extent cx="2706624" cy="1522476"/>
             <wp:effectExtent l="0" t="0" r="0" b="0"/>
             <wp:docPr id="6" name="Picture 6" descr="Scatter plot of forced-Merkle median diff latency against repository storage for five branching-factor and depth configurations, highlighting b8-d4." title="Scatter plot of forced-Merkle median diff latency against repository storage for five branching-factor and depth configurations, highlighting b8-d4"/>
             <wp:cNvGraphicFramePr>
@@ -6235,7 +6292,7 @@
                     <pic:cNvPicPr/>
                   </pic:nvPicPr>
                   <pic:blipFill>
-                    <a:blip r:embed="rId18"/>
+                    <a:blip r:embed="rId27"/>
                     <a:stretch>
                       <a:fillRect/>
                     </a:stretch>
@@ -6243,7 +6300,7 @@
                   <pic:spPr>
                     <a:xfrm>
                       <a:off x="0" y="0"/>
-                      <a:ext cx="3063240" cy="2700338"/>
+                      <a:ext cx="2706624" cy="1522476"/>
                     </a:xfrm>
                     <a:prstGeom prst="rect">
                       <a:avLst/>
@@ -6260,15 +6317,12 @@
       <w:pPr>
         <w:pStyle w:val="Caption"/>
         <w:keepNext/>
+        <w:keepLines/>
         <w:spacing w:before="40" w:after="40"/>
         <w:jc w:val="center"/>
       </w:pPr>
       <w:r>
-        <w:rPr>
-          <w:rFonts w:ascii="Times New Roman" w:hAnsi="Times New Roman"/>
-          <w:sz w:val="16"/>
-        </w:rPr>
-        <w:t>Fig. 6. Fixed-trie sensitivity; dots show median diff latency, and the axis extends above the largest measured p75.</w:t>
+        <w:t>Fig. 6. Fixed-trie sensitivity; points show median diff latency, and the axis extends beyond the largest measured 75th percentile.</w:t>
       </w:r>
     </w:p>
     <w:p>
@@ -6276,11 +6330,7 @@
         <w:spacing w:line="240" w:lineRule="auto" w:after="0"/>
       </w:pPr>
       <w:r>
-        <w:rPr>
-          <w:rFonts w:eastAsia="Times New Roman" w:cs="Times New Roman" w:ascii="Times New Roman" w:hAnsi="Times New Roman"/>
-          <w:sz w:val="20"/>
-        </w:rPr>
-        <w:t>The corrected fixed-trie sensitivity run contains 45 successful executions: 10 warm-ups and 35 measured runs. b16-d3 had the lowest median diff (21.46 ms) but used 8.12 MiB; b8-d4 measured 26.74 ms and used the least storage (4.26 MiB). The over-deep b8-d5 design measured 33.68 ms for diff and used 44.5% more storage than b8-d4. Thus b8-d4 is a storage-conscious balanced default, not a universal optimum.</w:t>
+        <w:t>The corrected fixed-trie sensitivity run completed 45 executions: 10 warm-ups and 35 measured runs. The b16-d3 configuration had the lowest median diff time (21.46 ms), but used 8.12 MiB. The b8-d4 configuration took 26.74 ms and used the least storage (4.26 MiB). The over-deep b8-d5 configuration took 33.68 ms to diff and used 44.5% more storage than b8-d4. Thus, b8-d4 balances latency and storage in this sample; it is not a universal optimum.</w:t>
       </w:r>
     </w:p>
     <w:p>
@@ -6306,11 +6356,7 @@
         <w:ind w:firstLine="0"/>
       </w:pPr>
       <w:r>
-        <w:rPr>
-          <w:rFonts w:eastAsia="Times New Roman" w:cs="Times New Roman" w:ascii="Times New Roman" w:hAnsi="Times New Roman"/>
-          <w:sz w:val="20"/>
-        </w:rPr>
-        <w:t>RQ1 shows scenario-dependent workflow latency and storage trade-offs across the declared synthetic update patterns. A separate three-seed sensitivity study found consistent Revon-H diff advantages over the forced-Merkle ablation for four tested factors on Windows and WSL2. The 50-commit case remained inconclusive on both. Lexically adjacent application keys, sorted-range updates, repeated-key updates, and hash-route locality are different update patterns. None of these experiments measures ordered range queries, concurrent reads or writes, or production throughput.</w:t>
+        <w:t>For RQ1, the results show workload-dependent latency and storage trade-offs across the synthetic update patterns we tested. In a separate three-seed study, Revon-H had lower diff times than the forced-Merkle ablation for four factors on both Windows and WSL2. The 50-commit comparison remained inconclusive on both. Lexically adjacent application keys, sorted-range updates, repeated-key updates, and hash-route locality represent different patterns. We did not test ordered range queries, concurrent readers or writers, or production throughput.</w:t>
       </w:r>
     </w:p>
     <w:p>
@@ -6318,11 +6364,7 @@
         <w:spacing w:line="240" w:lineRule="auto" w:after="0"/>
       </w:pPr>
       <w:r>
-        <w:rPr>
-          <w:rFonts w:eastAsia="Times New Roman" w:cs="Times New Roman" w:ascii="Times New Roman" w:hAnsi="Times New Roman"/>
-          <w:sz w:val="20"/>
-        </w:rPr>
-        <w:t>RQ2 is supported more directly for the tested short and sparse histories: the paired Revon-M/Revon-H ablation shares the durable trie, while the added 50-commit case that crossed the frozen operation boundary showed no resolved difference. This does not establish a universal selector advantage.</w:t>
+        <w:t>For RQ2, the paired Revon-M/Revon-H ablation provides the clearest comparison: both variants use the same durable trie, and differ in diff-path selection. Revon-H showed advantages for the tested short and sparse histories. The 50-commit case, which crossed the fixed operation threshold, showed no resolved difference. These results do not establish a universal advantage for the selector.</w:t>
       </w:r>
     </w:p>
     <w:p>
@@ -6330,11 +6372,7 @@
         <w:spacing w:line="240" w:lineRule="auto" w:after="0"/>
       </w:pPr>
       <w:r>
-        <w:rPr>
-          <w:rFonts w:eastAsia="Times New Roman" w:cs="Times New Roman" w:ascii="Times New Roman" w:hAnsi="Times New Roman"/>
-          <w:sz w:val="20"/>
-        </w:rPr>
-        <w:t>RQ3 rejects a universal geometry. Shallow routing lowers internal traversal but creates larger leaf buckets and higher storage; deeper routing lowers occupancy but increases internal-node work. The suitable configuration therefore depends on which requirement dominates the workload: latency, storage, or worst-case leaf-bucket scanning.</w:t>
+        <w:t>For RQ3, the results rule out one trie geometry as best for every workload. Shallow routing reduces internal traversal but leaves larger buckets and higher storage use. Deeper routing reduces bucket occupancy but adds internal-node work. The suitable configuration depends on whether a workload prioritizes latency, storage, or limiting leaf scans.</w:t>
       </w:r>
     </w:p>
     <w:p>
@@ -6342,11 +6380,7 @@
         <w:spacing w:line="240" w:lineRule="auto" w:after="0"/>
       </w:pPr>
       <w:r>
-        <w:rPr>
-          <w:rFonts w:eastAsia="Times New Roman" w:cs="Times New Roman" w:ascii="Times New Roman" w:hAnsi="Times New Roman"/>
-          <w:sz w:val="20"/>
-        </w:rPr>
-        <w:t>The Dolt ratios need a system-level interpretation. Dolt performs SQL parsing, schema management, version-control operations, and production durability work that the Revon prototype does not. Dolt's Prolly Trees also serve ordered queries, branches, merges, and remote workflows. Our timings compare the declared interfaces used in the experiment. They do not isolate the tree algorithms and therefore cannot show that a fixed trie is inherently faster than a Prolly Tree.</w:t>
+        <w:t>The Dolt ratios reflect the complete systems and interfaces we measured. Dolt handles SQL parsing, schema management, version-control operations, and production durability, which the Revon prototype does not. Its Prolly Trees also support ordered queries, branches, merges, and remote workflows. Because our timings include each system’s declared interface, they do not isolate the tree algorithms. We therefore cannot conclude that a fixed trie is inherently faster than a Prolly Tree.</w:t>
       </w:r>
     </w:p>
     <w:p>
@@ -6371,10 +6405,7 @@
         <w:pStyle w:val="ListBullet"/>
       </w:pPr>
       <w:r>
-        <w:rPr>
-          <w:rFonts w:eastAsia="Times New Roman" w:cs="Times New Roman"/>
-        </w:rPr>
-        <w:t>Runtime and interface asymmetry: Revon executes in-process in Python, whereas Dolt is a mature Go executable invoked repeatedly through CLI and SQL interfaces.</w:t>
+        <w:t>Runtime and interface: Revon runs in-process in Python; Dolt is a mature Go executable invoked through CLI and SQL interfaces. This difference affects the measured workflow.</w:t>
       </w:r>
     </w:p>
     <w:p>
@@ -6382,10 +6413,7 @@
         <w:pStyle w:val="ListBullet"/>
       </w:pPr>
       <w:r>
-        <w:rPr>
-          <w:rFonts w:eastAsia="Times New Roman" w:cs="Times New Roman"/>
-        </w:rPr>
-        <w:t>Feature asymmetry: Revon supports one writer and a linear history, but not SQL, branches, merges, remotes, schema evolution, or production concurrency.</w:t>
+        <w:t>Feature set: Revon supports one writer and a linear history. It does not support SQL, branches, merges, remotes, schema evolution, or production concurrency.</w:t>
       </w:r>
     </w:p>
     <w:p>
@@ -6393,10 +6421,7 @@
         <w:pStyle w:val="ListBullet"/>
       </w:pPr>
       <w:r>
-        <w:rPr>
-          <w:rFonts w:eastAsia="Times New Roman" w:cs="Times New Roman"/>
-        </w:rPr>
-        <w:t>Synthetic scope: the primary study reaches 100,000 rows; the additional sensitivity study uses 10,000-row flat key-value tables, three seeds, 32- and 128-byte values, 10- and 50-commit histories, and three update patterns. It does not cover alternate schemas, public multi-table datasets, or one-million-row data.</w:t>
+        <w:t>Dataset scope: The primary study reaches 100,000 rows. The sensitivity study uses flat key/value tables with 10,000 rows, three seeds, 32- and 128-byte values, histories of 10 and 50 commits, and three update patterns. We did not test alternate schemas, public multi-table datasets, or one-million-row datasets.</w:t>
       </w:r>
     </w:p>
     <w:p>
@@ -6404,10 +6429,7 @@
         <w:pStyle w:val="ListBullet"/>
       </w:pPr>
       <w:r>
-        <w:rPr>
-          <w:rFonts w:eastAsia="Times New Roman" w:cs="Times New Roman"/>
-        </w:rPr>
-        <w:t>Environment scope: the primary run used one Windows 11 host. The sensitivity run also used WSL2 Ubuntu on that same physical computer, not an independent Linux machine. No external researcher or clean clone has independently reproduced the timings; the internal audit checks evidence consistency but does not reproduce wall-clock results.</w:t>
+        <w:t>Environment and replication: The primary run used one Windows 11 host. The WSL2 Ubuntu sensitivity run used the same physical computer, not an independent Linux machine. No external researcher or clean clone has reproduced the timings. The internal audit checks evidence consistency; it does not reproduce wall-clock performance.</w:t>
       </w:r>
     </w:p>
     <w:p>
@@ -6415,10 +6437,7 @@
         <w:pStyle w:val="ListBullet"/>
       </w:pPr>
       <w:r>
-        <w:rPr>
-          <w:rFonts w:eastAsia="Times New Roman" w:cs="Times New Roman"/>
-        </w:rPr>
-        <w:t>Calibration boundary: 4,096 is the largest sampled operation count that favored the log; this does not establish a universal crossover.</w:t>
+        <w:t>Calibration: The log path was faster at the largest sampled operation count that favored it, 4,096. This result does not establish a universal crossover.</w:t>
       </w:r>
     </w:p>
     <w:p>
@@ -6426,10 +6445,7 @@
         <w:pStyle w:val="ListBullet"/>
       </w:pPr>
       <w:r>
-        <w:rPr>
-          <w:rFonts w:eastAsia="Times New Roman" w:cs="Times New Roman"/>
-        </w:rPr>
-        <w:t>Memory result: Across eight primary-evaluation scenarios, median sampled whole-worker process-tree RSS was collected for Snapshot, Log-only, Revon-M, Revon-H, and SQL-path Dolt. The values include common workload/oracle state and adapter processes, so they are not product-only memory. The parent sampled every 10 ms outside timed operations; peaks shorter than 10 ms may be missed, and the monitor can create small system-level scheduling pressure. Dolt bulk-import rows are not pooled with SQL-path Dolt for this comparison.</w:t>
+        <w:t>Memory: We measured median whole-worker process-tree RSS in eight primary scenarios for Snapshot, Log-only, Revon-M, Revon-H, and SQL-path Dolt. These measurements include shared workload/oracle state and adapter processes, so they are not product-only memory figures. The parent process sampled every 10 ms outside timed operations. It may miss shorter peaks, and monitoring may add small scheduling pressure. Dolt bulk-import measurements are reported separately from SQL-path Dolt.</w:t>
       </w:r>
     </w:p>
     <w:p>
@@ -6437,10 +6453,7 @@
         <w:pStyle w:val="ListBullet"/>
       </w:pPr>
       <w:r>
-        <w:rPr>
-          <w:rFonts w:eastAsia="Times New Roman" w:cs="Times New Roman"/>
-        </w:rPr>
-        <w:t>Work-unit mismatch: keys, log operations, trie-node pairs, and Dolt's internal work do not form a single normalized measure.</w:t>
+        <w:t>Work units: Keys, log operations, trie-node pairs, and Dolt’s internal work are different quantities. We do not combine them into a normalized work measure.</w:t>
       </w:r>
     </w:p>
     <w:p>
@@ -6448,10 +6461,7 @@
         <w:pStyle w:val="ListBullet"/>
       </w:pPr>
       <w:r>
-        <w:rPr>
-          <w:rFonts w:eastAsia="Times New Roman" w:cs="Times New Roman"/>
-        </w:rPr>
-        <w:t>Uncertainty: all Tukey candidates were retained. The primary seven-trial ratio intervals are paired bootstrap intervals conditional on each fixed scenario. The additional seed-cluster bootstrap used only three seeds. Neither analysis establishes performance over a population of datasets or machines.</w:t>
+        <w:t>Uncertainty: We retained every Tukey outlier candidate. The primary seven-trial ratio intervals are paired bootstrap intervals for each fixed scenario. The additional seed-cluster bootstrap uses only three seeds. Neither analysis estimates performance across a population of datasets or machines.</w:t>
       </w:r>
     </w:p>
     <w:p>
@@ -6477,11 +6487,7 @@
         <w:ind w:firstLine="0"/>
       </w:pPr>
       <w:r>
-        <w:rPr>
-          <w:rFonts w:eastAsia="Times New Roman" w:cs="Times New Roman" w:ascii="Times New Roman" w:hAnsi="Times New Roman"/>
-          <w:sz w:val="20"/>
-        </w:rPr>
-        <w:t>A next version should choose its structure from observed workload statistics. Key count, prefix skew, mutation density, and leaf occupancy could guide the choice among measured trie geometries instead of fixing b and d for every repository. The diff selector could recalibrate periodically and consider history distance, changed-prefix density, and observed I/O cost alongside its present operation-count rule.</w:t>
+        <w:t>A future version could select its structure from observed workload statistics. Key count, prefix skew, mutation density, and leaf occupancy may help choose among the tested trie geometries instead of fixing b and d for every repository. The diff selector could also recalibrate over time, using history distance, changed-prefix density, and observed I/O alongside operation count.</w:t>
       </w:r>
     </w:p>
     <w:p>
@@ -6489,11 +6495,7 @@
         <w:spacing w:line="240" w:lineRule="auto" w:after="0"/>
       </w:pPr>
       <w:r>
-        <w:rPr>
-          <w:rFonts w:eastAsia="Times New Roman" w:cs="Times New Roman" w:ascii="Times New Roman" w:hAnsi="Times New Roman"/>
-          <w:sz w:val="20"/>
-        </w:rPr>
-        <w:t>Storage efficiency could be improved with binary node records, separate value chunks, packed objects, compression, reachability checks, and garbage collection. An ordered Merkle index or content-defined chunk boundaries could add range scans and a history-independent layout while leaving the fixed trie as the controlled baseline.</w:t>
+        <w:t>Revon’s storage could be reduced through binary node records, separate value chunks, packed objects, compression, reachability checks, and garbage collection. An ordered Merkle index or content-defined chunking could add range scans and history-independent boundaries while retaining the fixed trie as a controlled baseline.</w:t>
       </w:r>
     </w:p>
     <w:p>
@@ -6501,11 +6503,7 @@
         <w:spacing w:line="240" w:lineRule="auto" w:after="0"/>
       </w:pPr>
       <w:r>
-        <w:rPr>
-          <w:rFonts w:ascii="Times New Roman" w:hAnsi="Times New Roman"/>
-          <w:sz w:val="20"/>
-        </w:rPr>
-        <w:t>To move beyond a linear prototype, Revon still needs named branches, merge commits, conflict reporting, schema-aware records, concurrent readers and writers, ordered range scans, and remote synchronization. Evaluation still needs public structured datasets, one-million-row workloads, and independent researcher and hardware replications. WSL2 I/O counters remain incomplete; Windows sensitivity counters are workflow-level and do not isolate operation costs.</w:t>
+        <w:t>Moving beyond a linear prototype will require named branches, merge commits, conflict reporting, schema-aware records, concurrent readers and writers, ordered range scans, and remote synchronization. Evaluation also needs public structured datasets, workloads with one million rows, and replications by independent researchers on separate hardware. WSL2 I/O counters remain incomplete, and the Windows sensitivity counters cover the workflow rather than isolating individual operation costs.</w:t>
       </w:r>
     </w:p>
     <w:p>
@@ -6531,11 +6529,7 @@
         <w:ind w:firstLine="0"/>
       </w:pPr>
       <w:r>
-        <w:rPr>
-          <w:rFonts w:eastAsia="Times New Roman" w:cs="Times New Roman" w:ascii="Times New Roman" w:hAnsi="Times New Roman"/>
-          <w:sz w:val="20"/>
-        </w:rPr>
-        <w:t>Revon demonstrates a content-addressed versioning path for structured key/value data through immutable objects, incremental Merkle updates, SQLite persistence, historical checkout, and adaptive differencing. Paired intervals and a three-seed sensitivity study support workload-specific differences between Revon-H and the forced-Merkle ablation; the long-history result remains inconclusive. The primary benchmark and follow-up runs do not establish performance across real schemas, public datasets, independent hardware, concurrent workloads, or ordered range queries. These measurements describe a reproducible prototype, not a production-system replacement.</w:t>
+        <w:t>Revon demonstrates one way to version structured key/value data using immutable objects, incremental Merkle updates, SQLite persistence, historical checkout, and adaptive differencing. Paired intervals and a three-seed sensitivity study show workload-specific differences between Revon-H and the forced-Merkle ablation; the long-history result remains inconclusive. The experiments do not establish performance on real schemas or public datasets, or across independent hardware, concurrent workloads, and ordered range queries. The evidence describes a prototype, not a production-system replacement.</w:t>
       </w:r>
     </w:p>
     <w:p>
@@ -6561,11 +6555,7 @@
         <w:ind w:firstLine="0"/>
       </w:pPr>
       <w:r>
-        <w:rPr>
-          <w:rFonts w:eastAsia="Times New Roman" w:cs="Times New Roman" w:ascii="Times New Roman" w:hAnsi="Times New Roman"/>
-          <w:sz w:val="20"/>
-        </w:rPr>
-        <w:t>The authors acknowledge the open-source Dolt project and the researchers whose dataset-versioning systems informed the experimental design.</w:t>
+        <w:t>We thank the open-source Dolt project and the researchers whose work on dataset versioning informed our experimental design.</w:t>
       </w:r>
     </w:p>
     <w:p>
@@ -6597,7 +6587,7 @@
           <w:rFonts w:ascii="Times New Roman" w:hAnsi="Times New Roman"/>
           <w:sz w:val="16"/>
         </w:rPr>
-        <w:t>[1] S. Chacon and B. Straub, “Git Internals—Git Objects,” in Pro Git, 2nd ed., 2014. [Online]. Available: https://git-scm.com/book/en/v2/Git-Internals-Git-Objects.</w:t>
+        <w:t>[1] S. Chacon and B. Straub, “Git Internals: Git Objects,” in Pro Git, 2nd ed., 2014. [Online]. Available: https://git-scm.com/book/en/v2/Git-Internals-Git-Objects.</w:t>
       </w:r>
       <w:bookmarkEnd w:id="100"/>
     </w:p>
@@ -6645,7 +6635,7 @@
           <w:rFonts w:ascii="Times New Roman" w:hAnsi="Times New Roman"/>
           <w:sz w:val="16"/>
         </w:rPr>
-        <w:t>[4] R. C. Merkle, “A digital signature based on a conventional encryption function,” in Advances in Cryptology—CRYPTO ’87, Lecture Notes in Computer Science, vol. 293, 1988, pp. 369–378, doi: 10.1007/3-540-48184-2_32.</w:t>
+        <w:t>[4] R. C. Merkle, “A digital signature based on a conventional encryption function,” in Advances in Cryptology: CRYPTO ’87, Lecture Notes in Computer Science, vol. 293, 1988, pp. 369–378, doi: 10.1007/3-540-48184-2_32.</w:t>
       </w:r>
       <w:bookmarkEnd w:id="103"/>
     </w:p>
@@ -6677,7 +6667,7 @@
           <w:rFonts w:ascii="Times New Roman" w:hAnsi="Times New Roman"/>
           <w:sz w:val="16"/>
         </w:rPr>
-        <w:t>[6] J. Benet, “IPFS—Content Addressed, Versioned, P2P File System,” arXiv:1407.3561, 2014.</w:t>
+        <w:t>[6] J. Benet, “IPFS: Content Addressed, Versioned, P2P File System,” arXiv:1407.3561, 2014.</w:t>
       </w:r>
       <w:bookmarkEnd w:id="105"/>
     </w:p>
@@ -6824,6 +6814,201 @@
         <w:t>[15] S. Wang et al., “ForkBase: An Efficient Storage Engine for Blockchain and Forkable Applications,” Proc. VLDB Endowment, vol. 11, no. 10, pp. 1137–1150, 2018, doi: 10.14778/3231751.3231762.</w:t>
       </w:r>
       <w:bookmarkEnd w:id="114"/>
+    </w:p>
+    <w:p>
+      <w:pPr>
+        <w:pStyle w:val="IEEEReference"/>
+      </w:pPr>
+      <w:bookmarkStart w:id="115" w:name="ref_stratified"/>
+      <w:r>
+        <w:t xml:space="preserve">[16] </w:t>
+      </w:r>
+      <w:r>
+        <w:t>A. Twigg, A. Byde, G. Miłos, T. Moreton, J. Wilkes, and T. Wilkie, “Stratified B-trees and versioning dictionaries,” in Proc. 3rd USENIX Workshop on Hot Topics in Storage and File Systems (HotStorage), 2011. [Online]. Available: https://arxiv.org/abs/1103.4282.</w:t>
+      </w:r>
+      <w:bookmarkEnd w:id="115"/>
+    </w:p>
+    <w:p>
+      <w:pPr>
+        <w:pStyle w:val="IEEEReference"/>
+      </w:pPr>
+      <w:bookmarkStart w:id="116" w:name="ref_scidb_version"/>
+      <w:r>
+        <w:t xml:space="preserve">[17] </w:t>
+      </w:r>
+      <w:r>
+        <w:t>A. Seering, P. Cudré-Mauroux, S. Madden, and M. Stonebraker, “Efficient versioning for scientific array databases,” in Proc. IEEE 28th Int. Conf. Data Engineering (ICDE), 2012, pp. 1013–1024, doi: 10.1109/ICDE.2012.102. [Online]. Available: https://www.researchgate.net/publication/241633210_Efficient_Versioning_for_Scientific_Array_Databases.</w:t>
+      </w:r>
+      <w:bookmarkEnd w:id="116"/>
+    </w:p>
+    <w:p>
+      <w:pPr>
+        <w:pStyle w:val="IEEEReference"/>
+      </w:pPr>
+      <w:bookmarkStart w:id="117" w:name="ref_timearr"/>
+      <w:r>
+        <w:t xml:space="preserve">[18] </w:t>
+      </w:r>
+      <w:r>
+        <w:t>E. Soroush and M. Balazinska, “Time travel in a scientific array database,” in Proc. IEEE 29th Int. Conf. Data Engineering (ICDE), 2013, pp. 98–109, doi: 10.1109/ICDE.2013.6544817. [Online]. Available: https://scidb.cs.washington.edu/paper/ICDE13_conf_full_422.pdf.</w:t>
+      </w:r>
+      <w:bookmarkEnd w:id="117"/>
+    </w:p>
+    <w:p>
+      <w:pPr>
+        <w:pStyle w:val="IEEEReference"/>
+      </w:pPr>
+      <w:bookmarkStart w:id="118" w:name="ref_fully_persistent_btree"/>
+      <w:r>
+        <w:t xml:space="preserve">[19] </w:t>
+      </w:r>
+      <w:r>
+        <w:t>G. S. Brodal, S. Sioutas, K. Tsakalidis, and K. Tsichlas, “Fully persistent B-trees,” Theoretical Computer Science, vol. 841, pp. 10–26, 2020, doi: 10.1016/j.tcs.2020.06.027. [Online]. Available: https://cs.au.dk/~gerth/papers/tcs20.pdf.</w:t>
+      </w:r>
+      <w:bookmarkEnd w:id="118"/>
+    </w:p>
+    <w:p>
+      <w:pPr>
+        <w:pStyle w:val="IEEEReference"/>
+      </w:pPr>
+      <w:bookmarkStart w:id="119" w:name="ref_replicated_versioned"/>
+      <w:r>
+        <w:t xml:space="preserve">[20] </w:t>
+      </w:r>
+      <w:r>
+        <w:t>N. Saquib, C. Krintz, and R. Wolski, “Replicated versioned data structures for wide-area distributed systems,” IEEE Transactions on Parallel and Distributed Systems, vol. 34, no. 1, pp. 207–224, 2023, doi: 10.1109/TPDS.2022.3217969. [Online]. Available: https://racelab.cs.ucsb.edu/papers/tpds22-versioned.pdf.</w:t>
+      </w:r>
+      <w:bookmarkEnd w:id="119"/>
+    </w:p>
+    <w:p>
+      <w:pPr>
+        <w:pStyle w:val="IEEEReference"/>
+      </w:pPr>
+      <w:bookmarkStart w:id="120" w:name="ref_tardisdb"/>
+      <w:r>
+        <w:t xml:space="preserve">[21] </w:t>
+      </w:r>
+      <w:r>
+        <w:t>M. E. Schüle, L. Karnowski, J. Schmeißer, B. Kleiner, A. Kemper, and T. Neumann, “Versioning in main-memory database systems: From MusaeusDB to TardisDB,” in Proc. 31st Int. Conf. Scientific and Statistical Database Management (SSDBM), 2019, pp. 169–180, doi: 10.1145/3335783.3335792. [Online]. Available: https://www-db.cs.tum.edu/~schuele/data/tardis.pdf.</w:t>
+      </w:r>
+      <w:bookmarkEnd w:id="120"/>
+    </w:p>
+    <w:p>
+      <w:pPr>
+        <w:pStyle w:val="IEEEReference"/>
+      </w:pPr>
+      <w:bookmarkStart w:id="121" w:name="ref_provenance_whywhere"/>
+      <w:r>
+        <w:t xml:space="preserve">[22] </w:t>
+      </w:r>
+      <w:r>
+        <w:t>P. Buneman, S. Khanna, and W.-C. Tan, “Why and where: A characterization of data provenance,” in Database Theory: ICDT 2001, Lecture Notes in Computer Science, vol. 1973, 2001, pp. 316–330, doi: 10.1007/3-540-44503-X_20. [Online]. Available: https://www.research.ed.ac.uk/files/16509989/Why_and_Where_A_Characterization_of_Data_Provenance.pdf.</w:t>
+      </w:r>
+      <w:bookmarkEnd w:id="121"/>
+    </w:p>
+    <w:p>
+      <w:pPr>
+        <w:pStyle w:val="IEEEReference"/>
+      </w:pPr>
+      <w:bookmarkStart w:id="122" w:name="ref_differential_dataflow"/>
+      <w:r>
+        <w:t xml:space="preserve">[23] </w:t>
+      </w:r>
+      <w:r>
+        <w:t>F. McSherry, D. G. Murray, R. Isaacs, and M. Isard, “Differential dataflow,” in Proc. 6th Biennial Conf. Innovative Data Systems Research (CIDR), 2013. [Online]. Available: https://www.cidrdb.org/cidr2013/Papers/CIDR13_Paper111.pdf.</w:t>
+      </w:r>
+      <w:bookmarkEnd w:id="122"/>
+    </w:p>
+    <w:p>
+      <w:pPr>
+        <w:pStyle w:val="IEEEReference"/>
+      </w:pPr>
+      <w:bookmarkStart w:id="123" w:name="ref_maneage"/>
+      <w:r>
+        <w:t xml:space="preserve">[24] </w:t>
+      </w:r>
+      <w:r>
+        <w:t>M. Akhlaghi et al., “Toward long-term and archivable reproducibility,” Computing in Science &amp; Engineering, vol. 23, no. 3, pp. 82–91, 2021, doi: 10.1109/MCSE.2021.3072860. [Online]. Available: https://arxiv.org/abs/2006.03018.</w:t>
+      </w:r>
+      <w:bookmarkEnd w:id="123"/>
+    </w:p>
+    <w:p>
+      <w:pPr>
+        <w:pStyle w:val="IEEEReference"/>
+      </w:pPr>
+      <w:bookmarkStart w:id="124" w:name="ref_explain_dav"/>
+      <w:r>
+        <w:t xml:space="preserve">[25] </w:t>
+      </w:r>
+      <w:r>
+        <w:t>R. Shraga and R. J. Miller, “Explaining dataset changes for semantic data versioning with Explain-Da-V,” arXiv:2301.13095, 2023, technical report/preprint. [Online]. Available: https://arxiv.org/abs/2301.13095.</w:t>
+      </w:r>
+      <w:bookmarkEnd w:id="124"/>
+    </w:p>
+    <w:p>
+      <w:pPr>
+        <w:pStyle w:val="IEEEReference"/>
+      </w:pPr>
+      <w:bookmarkStart w:id="125" w:name="ref_graph_versioning"/>
+      <w:r>
+        <w:t xml:space="preserve">[26] </w:t>
+      </w:r>
+      <w:r>
+        <w:t>A. Guo, J. Li, P. Sukprasert, S. Khuller, A. Deshpande, and K. Mukherjee, “To store or not to store: A graph theoretical approach for dataset versioning,” in Proc. IEEE Int. Parallel and Distributed Processing Symposium (IPDPS), 2024, doi: 10.1109/IPDPS57955.2024.00049. [Online]. Available: https://arxiv.org/abs/2402.11741.</w:t>
+      </w:r>
+      <w:bookmarkEnd w:id="125"/>
+    </w:p>
+    <w:p>
+      <w:pPr>
+        <w:pStyle w:val="IEEEReference"/>
+      </w:pPr>
+      <w:bookmarkStart w:id="126" w:name="ref_fair_versioning"/>
+      <w:r>
+        <w:t xml:space="preserve">[27] </w:t>
+      </w:r>
+      <w:r>
+        <w:t>A. González-Cebrián, M. Bradford, A. E. Chis, and H. González-Vélez, “Standardised versioning of datasets: A FAIR-compliant proposal,” Scientific Data, vol. 11, art. 358, 2024, doi: 10.1038/s41597-024-03153-y. [Online]. Available: https://www.nature.com/articles/s41597-024-03153-y.</w:t>
+      </w:r>
+      <w:bookmarkEnd w:id="126"/>
+    </w:p>
+    <w:p>
+      <w:pPr>
+        <w:pStyle w:val="IEEEReference"/>
+      </w:pPr>
+      <w:bookmarkStart w:id="127" w:name="ref_dslog"/>
+      <w:r>
+        <w:t xml:space="preserve">[28] </w:t>
+      </w:r>
+      <w:r>
+        <w:t>J. Zhao and S. Krishnan, “Compression and in-situ query processing for fine-grained array lineage,” arXiv:2405.17701, 2024. [Online]. Available: https://arxiv.org/abs/2405.17701.</w:t>
+      </w:r>
+      <w:bookmarkEnd w:id="127"/>
+    </w:p>
+    <w:p>
+      <w:pPr>
+        <w:pStyle w:val="IEEEReference"/>
+      </w:pPr>
+      <w:bookmarkStart w:id="128" w:name="ref_git4data"/>
+      <w:r>
+        <w:t xml:space="preserve">[29] </w:t>
+      </w:r>
+      <w:r>
+        <w:t>H. Gou, Z. Zhang, Y. Sun, P. Xu, F. Tian, L. Wang, and J. Wang, “Git4Data: Database-native version control for AI agents,” arXiv:2609.02106, 2026, preprint. [Online]. Available: https://arxiv.org/abs/2609.02106.</w:t>
+      </w:r>
+      <w:bookmarkEnd w:id="128"/>
+    </w:p>
+    <w:p>
+      <w:pPr>
+        <w:pStyle w:val="IEEEReference"/>
+      </w:pPr>
+      <w:bookmarkStart w:id="129" w:name="ref_baseline"/>
+      <w:r>
+        <w:t xml:space="preserve">[30] </w:t>
+      </w:r>
+      <w:r>
+        <w:t>J. Edwards and T. Petricek, “Baseline: Operation-based evolution and versioning of data,” arXiv:2512.09762, 2025, preprint, updated 2026. [Online]. Available: https://arxiv.org/abs/2512.09762.</w:t>
+      </w:r>
+      <w:bookmarkEnd w:id="129"/>
     </w:p>
     <w:p>
       <w:pPr>
@@ -6849,11 +7034,7 @@
         <w:jc w:val="left"/>
       </w:pPr>
       <w:r>
-        <w:rPr>
-          <w:rFonts w:ascii="Times New Roman" w:hAnsi="Times New Roman"/>
-          <w:sz w:val="20"/>
-        </w:rPr>
-        <w:t>The repository contains the benchmark harness, evidence audit, paired-ratio analysis, multi-seed robustness study, and manuscript validation tools. The primary corrected paper-profile bundle is evidence/paper-corrected-issues13-17-counterbalanced-final-20260923. The primary paired ratio intervals are in evidence/paper-corrected-issues13-17-counterbalanced-final-20260923/paired_ratio_uncertainty.csv. The Windows and WSL2 sensitivity bundles are evidence/paper-issues18-20-robustness-20260923 and evidence/paper-issues18-20-linux-wsl-20260923; the supplemental Windows telemetry bundle is evidence/paper-issues14-windows-telemetry-20260924. Their raw rows, manifests, audits, summaries, and seed-cluster intervals are retained. The trie-sensitivity bundle is evidence/trie-sensitivity-issues8-20260923. These artifacts validate evidence consistency; they do not independently reproduce timings. Project repository: https://github.com/atharvasheersh/Revon</w:t>
+        <w:t>The repository includes the benchmark harness, evidence audit, paired-ratio analysis, multi-seed robustness study, and manuscript validation tools. The corrected primary paper-profile bundle is evidence/paper-corrected-issues13-17-counterbalanced-final-20260923; its paired ratio intervals are in paired_ratio_uncertainty.csv. The Windows and WSL2 sensitivity bundles are evidence/paper-issues18-20-robustness-20260923 and evidence/paper-issues18-20-linux-wsl-20260923. Supplemental Windows telemetry is in evidence/paper-issues14-windows-telemetry-20260924, and trie sensitivity results are in evidence/trie-sensitivity-issues8-20260923. These bundles retain raw rows, manifests, audits, summaries, and seed-cluster intervals. They support checks of evidence consistency; they do not independently reproduce timing results. The project repository is https://github.com/atharvasheersh/Revon.</w:t>
       </w:r>
     </w:p>
     <w:p>

</xml_diff>